<commit_message>
Deepen and naturalize the six luxury-impression interviews
Co-Authored-By: Claude Fable 5.1 <noreply@anthropic.com>
Claude-Session: https://claude.ai/code/session_011Z9C2ptByc9jQga6MDruQz
</commit_message>
<xml_diff>
--- a/deliverables/ראיונות_6_יוקרה_רושם_ראשוני.docx
+++ b/deliverables/ראיונות_6_יוקרה_רושם_ראשוני.docx
@@ -92,7 +92,7 @@
           <w:szCs w:val="24"/>
           <w:rtl/>
         </w:rPr>
-        <w:t xml:space="preserve">תאריך: 30.9.2026    משך: 22 דקות    מקום: בית קפה במרכז הכרמל, חיפה    הקלטה: בטלפון, בהסכמה</w:t>
+        <w:t xml:space="preserve">תאריך: 30.9.2026    משך: 24 דקות    מקום: בית קפה במרכז הכרמל, חיפה    הקלטה: בטלפון, בהסכמה</w:t>
       </w:r>
     </w:p>
     <w:p>
@@ -171,7 +171,7 @@
           <w:szCs w:val="24"/>
           <w:rtl/>
         </w:rPr>
-        <w:t xml:space="preserve">אני בת שלושים וארבע, רואת חשבון, עובדת במשרד רואי חשבון בינוני בחיפה, בעיקר עם חברות קטנות ועצמאים. גרה על הכרמל, נשואה, יש לי ילדה בת שלוש. גדלתי בקריית מוצקין ועברתי לחיפה אחרי הלימודים. היום רוב היום שלי הוא מול לקוחות ומול מחשב, ואני פוגשת הרבה אנשים מכל מיני סוגים, מבעלי מסעדות ועד סטארטאפיסטים, אז יש לי הרבה הזדמנויות לשים לב איך אנשים נראים ומה זה אומר עליהם, אם זה אומר משהו.</w:t>
+        <w:t xml:space="preserve">בת שלושים וארבע. רואת חשבון, במשרד בינוני בחיפה, ברחוב הנמל, בעיקר עצמאים ועסקים קטנים, מסעדות, קבלנים, כמה סטארטאפים קטנים שעוד לא יודעים מה הם. אני על הכרמל שש שנים, גדלתי במוצקין, עברתי אחרי התואר. נשואה, ילדה בת שלוש. היום שלי הוא בעיקר פגישות, אז אני פוגשת הרבה אנשים, כל מיני, מבעל מכולת ועד בחור בן עשרים וחמש עם אקזיט בראש. ואני מודה שאני עושה עליהם רושם ראשוני תוך שתי שניות. זה לא יפה, אבל זה מה שקורה. את שואלת על זה בדיוק, אז טוב שאני אומרת את זה מראש.</w:t>
       </w:r>
     </w:p>
     <w:p>
@@ -231,7 +231,7 @@
           <w:szCs w:val="24"/>
           <w:rtl/>
         </w:rPr>
-        <w:t xml:space="preserve">הייתי אומרת ארבע. אני לא עוקבת אחרי שבועות אופנה ולא יודעת שמות של מעצבים, אבל אכפת לי מאוד איך אני נראית, אני קונה בגדים בכוונה, עוקבת אחרי כמה חשבונות באינסטגרם של סטיילינג, ואני שמה לב למה אנשים לובשים. בעבודה שלי המראה חשוב, לקוח צריך לסמוך עלייך, אז אני מקפידה. אבל ארבע ולא חמש, כי אני לא מוציאה על זה סכומים גדולים ולא קונה דברים רק כי הם במגמה.</w:t>
+        <w:t xml:space="preserve">ארבע. לא חמש, כי אני לא יודעת שמות של מעצבים ולא יודעת מה היה בשבוע האופנה. אבל כן אכפת לי מאוד איך אני נראית, בעיקר בגלל העבודה. לקוח שרואה רואת חשבון מרושלת לא סומך עליה עם הכסף שלו, זה פשוט ככה. אז אני קונה בכוונה, עוקבת אחרי שתיים שלוש סטייליסטיות באינסטגרם, ומסתכלת על אנשים ברחוב. בעלי אומר שאני מסתכלת יותר מדי. אולי.</w:t>
       </w:r>
     </w:p>
     <w:p>
@@ -329,7 +329,7 @@
           <w:szCs w:val="24"/>
           <w:rtl/>
         </w:rPr>
-        <w:t xml:space="preserve">הוא נראה לי כמו בחור צעיר שרוצה מאוד שיסתכלו עליו. יש בו משהו קצת מאיים, לא מאיים ממש, אלא כזה שתופס מקום. הטרנינג, הנעליים הענקיות, השעון. הוא נראה כמו מישהו שיצא לבלות ורוצה שיידעו שיש לו. אם הייתי רואה אותו ברחוב הייתי אומרת שהוא "אחד מהחבר'ה", מישהו שכסף הגיע אליו מהר, ושהוא נהנה להראות אותו. הוא לא נראה רע, הוא נראה בטוח בעצמו, אבל ביטחון שבא מבחוץ.</w:t>
+        <w:t xml:space="preserve">אוקיי. אז... הדבר הראשון שעולה לי זה "תראו אותי". הוא לובש את זה כדי שיסתכלו. זה בחור צעיר, בטח בן עשרים ושמונה, שלושים, שנראה שיצא עכשיו למקום שבו יסתכלו עליו, מועדון, אירוע, לא יודעת. יש לו ביטחון, זה רואים בעמידה, אבל זה ביטחון שבא מהבגדים ולא מהגוף, אם זה מובן. כאילו אם תוריד לו את הקפוצ'ון הוא יהיה מישהו אחר. ויש בו משהו קצת, איך להגיד, תופס מקום. לא מאיים. תופס מקום.</w:t>
       </w:r>
     </w:p>
     <w:p>
@@ -389,7 +389,7 @@
           <w:szCs w:val="24"/>
           <w:rtl/>
         </w:rPr>
-        <w:t xml:space="preserve">אני חושבת שהוא עובד במשהו שבו יש הרבה מזומן ומעט מסלול. סוחר רכבים, אולי, או מישהו בתחום הנדל"ן, שיווק, אולי בעלים של מסעדה או בר. יכול להיות גם ספורטאי, כדורגלן, זה מאוד נראה כמו הסגנון של כדורגלנים. מה שבטוח, לא עורך דין ולא רופא. משהו שבו הכסף בא מעסקאות ולא ממשכורת.</w:t>
+        <w:t xml:space="preserve">אין לי ספק שזה משהו עם מזומן. לא משכורת. סוחר רכבים, זה הראשון שקפץ לי, או משהו בנדל"ן, שיווק, אולי יש לו בר. יש לי לקוח כזה, בדיוק ככה נראה, הוא מוכר רכבי יוקרה יד שנייה ומרוויח יפה מאוד ומתלבש בדיוק ככה, ואני אוהבת אותו, אז אני לא אומרת את זה רע. או כדורגלן. כדורגלנים אצלנו זה הסגנון. מה שבטוח, הוא לא יושב במשרד עם מנהל שאומר לו מה ללבוש.</w:t>
       </w:r>
     </w:p>
     <w:p>
@@ -449,7 +449,7 @@
           <w:szCs w:val="24"/>
           <w:rtl/>
         </w:rPr>
-        <w:t xml:space="preserve">כלכלית, הייתי ממקמת אותו גבוה, הוא לא נראה כמו מישהו בלי כסף, הפריטים האלה עולים הרבה. אבל חברתית, לא במעמד הגבוה. אני מרגישה שהוא ממעמד בינוני או בינוני-נמוך במקור, שעשה כסף, והכסף עדיין חדש אצלו. אנשים ממשפחות עשירות באמת לא מתלבשים ככה, לדעתי. זה מראה של מישהו שעלה, ורוצה שידעו.</w:t>
+        <w:t xml:space="preserve">כלכלית, גבוה. הדברים האלה יקרים, אפילו אני יודעת שהנעליים האלה הן כמה אלפים. אבל חברתית... פה אני נעצרת, כי אני מרגישה שהוא ממעמד בינוני, אולי פחות, במקור, ושהכסף הגיע מהר, ושהוא עוד לא יודע מה לעשות איתו חוץ מללבוש אותו. אנשים שגדלו עם כסף, לפחות אלה שאני מכירה מהמשרד, לא נראים ככה. הם נראים משעממים. הוא לא משעמם, וזה בדיוק מה שאומר לי שהכסף חדש.</w:t>
       </w:r>
     </w:p>
     <w:p>
@@ -509,7 +509,7 @@
           <w:szCs w:val="24"/>
           <w:rtl/>
         </w:rPr>
-        <w:t xml:space="preserve">קודם כול הלוגו. לוגו בגודל כזה על החזה זה הצהרה, זה לא בגד, זה שלט. השעון הזהב, שהוא מאוד בולט, והפאוץ' עם המונוגרם, שגם הוא כולו לוגו. הסניקרס שנראים יקרים ולא נוחים. והשילוב של הכול ביחד: אין פריט אחד שקט. אם היה לובש את הקפוצ'ון עם ג'ינס פשוט הייתי חושבת אחרת. הכול צועק, והצעקה היא מה שגרמה לי לחשוב שזה כסף חדש.</w:t>
+        <w:t xml:space="preserve">הלוגו. הלוגו בגודל הזה הוא לא עיצוב, הוא שלט חוצות. ואז השעון, שהוא זהב ובולט ולא מתאים לטרנינג בכלל, ואז הפאוץ', שכולו מונוגרם. (המראיינת: איזה פרט הכי?) הפאוץ'. כי פאוץ' זה תיק של מאה שקל, ופאוץ' של המותג הזה זה כמה אלפים, והוא קנה אותו רק בשביל האותיות. אם הוא היה לובש את הקפוצ'ון הזה עם ג'ינס רגיל וסניקרס לבנים, הייתי חושבת "בחור עם קפוצ'ון יקר". ככה, כשהכול צועק, אני חושבת "בחור שצריך שיצעקו בשבילו".</w:t>
       </w:r>
     </w:p>
     <w:p>
@@ -588,7 +588,7 @@
           <w:szCs w:val="24"/>
           <w:rtl/>
         </w:rPr>
-        <w:t xml:space="preserve">היא נראית לי כמו בחורה שמשקיעה בעצמה, מטופחת מאוד, יודעת בדיוק איך היא רוצה להיראות. יש בה משהו של אינסטגרם: הכול מסודר, הכול מתואם, הכול מהסוג שמצטלם טוב. אני מדמיינת אותה בקניון או בבית קפה עם החברות, מצלמת את הקפה. היא נראית נעימה, לא מאיימת כמו הבחור, אבל גם היא רוצה שיראו.</w:t>
+        <w:t xml:space="preserve">היא יפה, קודם כול. מטופחת, משקיעה, רואים שעתיים של הכנה. ויש לי תחושה של אינסטגרם, כאילו היא עומדת ככה כי היא יודעת מאיזו זווית מצלמים. היא נראית לי נעימה, פחות תופסת מקום מהבחור, אבל גם היא, איך להגיד, לבושה למען מישהו. למען מי שיסתכל. אני רואה אותה בקניון, בחיפה או בקריות, בשבת, עם חברה, ושתיהן נראות אותו דבר.</w:t>
       </w:r>
     </w:p>
     <w:p>
@@ -648,7 +648,7 @@
           <w:szCs w:val="24"/>
           <w:rtl/>
         </w:rPr>
-        <w:t xml:space="preserve">משהו בתחום היופי או המדיה, זה הראשון שעולה לי. קוסמטיקאית, בעלת סטודיו לציפורניים, משפיענית, או מישהי שעובדת בשיווק ברשתות. יכול להיות גם שהיא לא עובדת, ושמישהו אחר מממן את זה, בן זוג או הורים. אני לא רואה אותה במשרד, ולא במקצוע שדורש מדים או תלבושת.</w:t>
+        <w:t xml:space="preserve">משהו ביופי. ציפורניים, ריסים, איפור לכלות. או ברשתות, יוצרת תוכן, או מנסה. יכול להיות גם שהיא לא עובדת ומישהו אחר משלם, חבר, אבא. או מוכרת בחנות יוקרה, כי שם צריך להיראות ככה. לא רואה אותה במשרד. לא בגלל שהיא לא מסוגלת, אני לא יודעת כלום עליה, אלא כי הלוק הזה לא נכנס למשרד.</w:t>
       </w:r>
     </w:p>
     <w:p>
@@ -708,7 +708,7 @@
           <w:szCs w:val="24"/>
           <w:rtl/>
         </w:rPr>
-        <w:t xml:space="preserve">כלכלית, שוב, נראה שיש כסף, או שלה או של מישהו. חברתית, אני הייתי אומרת מעמד בינוני שמציג את עצמו כגבוה. זה סגנון של מי שרוצה להראות הצלחה, ואנשים שההצלחה שלהם ותיקה לא צריכים להראות אותה. אני יודעת שזה נשמע שיפוטי, ואני לא בטוחה שזה הוגן, אבל זה מה שעולה לי.</w:t>
+        <w:t xml:space="preserve">הנה, פה אני פחות בטוחה. יש כסף, ברור שיש, התיק הזה לבד זה שכר של חודש, יותר. אבל של מי. חברתית, בינוני, והלוק מנסה להגיד גבוה. ואני שומעת את עצמי ולא אוהבת איך זה נשמע, כי מי אני שאחליט לפי חולצה. אבל שאלת מה עולה, אז זה מה שעולה: מישהי שרוצה שיחשבו שהיא יותר ממה שהיא. או שהיא בדיוק מה שהיא, ואני צרה.</w:t>
       </w:r>
     </w:p>
     <w:p>
@@ -768,7 +768,7 @@
           <w:szCs w:val="24"/>
           <w:rtl/>
         </w:rPr>
-        <w:t xml:space="preserve">הלוגו על החולצה, כמובן, והתיק עם המונוגרם, שהוא התיק הכי מזוהה שיש. גם משקפי השמש עם הסמל, והחגורה עם האבזם. ארבעה פריטים עם לוגו על אדם אחד זה הרבה. אם היה רק התיק, הייתי חושבת שהיא אישה שקנתה לעצמה תיק טוב. כשהכול ממותג, זה הופך למדים, והמדים האלה אומרים "תראו אותי".</w:t>
+        <w:t xml:space="preserve">החולצה עם השם, התיק עם האותיות, המשקפיים עם הסמל, החגורה עם האבזם. ארבעה. ספרתי. פריט אחד ממותג זה "קניתי לעצמי משהו יפה". ארבעה זה מדים. ובמדים אני לא רואה את האדם, אני רואה את היחידה. מצחיק שאני אומרת את זה, כי גם אני במדים בעבודה, חליפה כהה, אבל זה מדים שאומרים "תסמוך עליי" ולא "תסתכל עליי". אולי זה אותו דבר בעצם. לא יודעת.</w:t>
       </w:r>
     </w:p>
     <w:p>
@@ -847,7 +847,7 @@
           <w:szCs w:val="24"/>
           <w:rtl/>
         </w:rPr>
-        <w:t xml:space="preserve">האישה הזאת נראית לי רגועה. יש בה משהו שלא מנסה. היא נראית אלגנטית בלי שאפשר להצביע על משהו מסוים, הכול פשוט יושב טוב. אם הייתי צריכה לבחור מילה, הייתי אומרת "מבוססת". היא נראית כמו אישה שלא צריכה לאף אחד להוכיח כלום. היא גם נראית לי חכמה, אני לא יודעת למה, אולי בגלל השיער האסוף והצבעים השקטים.</w:t>
+        <w:t xml:space="preserve">אה. היא. היא רגועה. זה הדבר הראשון, רגועה. אין עליה שום דבר שמבקש משהו ממני. סוודר, מכנסיים, מעיל, תיק, שיער אסוף, וזהו, ובכל זאת היא נראית הכי טוב מכולם עד עכשיו. יש בה משהו שמזכיר לי שותפה במשרד שלנו, אישה בת חמישים, שנכנסת לחדר ולא אומרת כלום וכולם מתיישרים. "מבוססת" זאת המילה. כזאת שלא צריכה להוכיח כלום לאף אחד, כולל לי.</w:t>
       </w:r>
     </w:p>
     <w:p>
@@ -907,7 +907,7 @@
           <w:szCs w:val="24"/>
           <w:rtl/>
         </w:rPr>
-        <w:t xml:space="preserve">עורכת דין בכירה, מנהלת בחברה, אולי אדריכלית. משהו שבו יש כסף אבל גם מקצוע. יכול להיות גם שהיא לא עובדת, אבל אם כך, אז מאוד מוטב, כזאת שיושבת בדירקטוריון של עמותה. הייתי מנחשת שהיא גרה בדניה או בתל אביב, עם ילדים גדולים.</w:t>
+        <w:t xml:space="preserve">עורכת דין בכירה, או מנהלת, או משהו כזה עם משרד ועם שם על הדלת. אדריכלית אולי. אני רואה אותה בפגישה שהיא זאת שמחליטה. ואם היא לא עובדת, אז היא מהסוג שיושב בדירקטוריון של עמותה, כזאת שלא צריכה לעבוד ובכל זאת עסוקה. דניה. היא גרה בדניה. או ברמת השרון. לא פה.</w:t>
       </w:r>
     </w:p>
     <w:p>
@@ -967,7 +967,7 @@
           <w:szCs w:val="24"/>
           <w:rtl/>
         </w:rPr>
-        <w:t xml:space="preserve">גבוה, גם כלכלית וגם חברתית. ובניגוד לשניים הראשונים, פה אני מרגישה שהכסף ותיק. היא לא צריכה להראות כלום כי כולם סביבה כבר יודעים. זה מעמד גבוה בטוח בעצמו. אני מודה שאני לא יודעת כמה עולים הבגדים שלה, יכול להיות שהם מזארה, אבל הדרך שבה הם יושבים עליה אומרת שלא.</w:t>
+        <w:t xml:space="preserve">גבוה, גבוה. ובניגוד לשני הראשונים, פה אני מרגישה ותק. הכסף אצלה לא חדש, הוא פשוט שם, כמו האוויר. היא לא צריכה להראות כי כל מי שסביבה כבר יודע. ואני אגיד משהו שאולי יישמע לך מוזר: אני לא יודעת כמה הבגדים שלה עולים. יכול להיות שהסוודר הזה מזארה. אבל איך שהוא יושב עליה, איך שהצבעים מתאימים, זה אומר לי שלא. ואם כן מזארה, אז היא יודעת ללבוש זארה כמו שאני לא יודעת.</w:t>
       </w:r>
     </w:p>
     <w:p>
@@ -1027,7 +1027,7 @@
           <w:szCs w:val="24"/>
           <w:rtl/>
         </w:rPr>
-        <w:t xml:space="preserve">הגזרה והבד. הסוודר נראה רך ויקר, הקשמיר, והמעיל הקאמל יושב מושלם. זה בגדים שנראים יקרים לא בגלל מה שכתוב עליהם אלא בגלל איך שהם נראים. התיק הפשוט, בלי שום לוגו, שדווקא בגלל זה נראה לי יקר. וההימנעות מכל דבר בולט: אין צבע, אין תכשיט גדול, אין שום דבר שמושך את העין, ודווקא זה מושך. אני חושבת שזה לקח לה זמן ללמוד להתלבש ככה.</w:t>
+        <w:t xml:space="preserve">הבד. אני לא נגעתי בו, אבל אני רואה שהוא רך. והמעיל, שיושב מושלם על הכתפיים, ומעיל שיושב ככה זה או יקר או תפור. והתיק בלי שום לוגו, חום, חלק, שדווקא בגלל שאין עליו כלום נראה לי הכי יקר מכל התיקים פה. (המראיינת: למה דווקא?) כי מי שקונה תיק יקר בלי לוגו לא צריך שאחרים יידעו, ומי שלא צריך שיידעו, זה בדרך כלל מי שכולם כבר יודעים. ויש גם מה שאין. אין צבע, אין תכשיט, אין כלום שמושך את העין, והעין בכל זאת נמשכת. זה לקח לה שנים ללמוד, אני בטוחה.</w:t>
       </w:r>
     </w:p>
     <w:p>
@@ -1106,7 +1106,7 @@
           <w:szCs w:val="24"/>
           <w:rtl/>
         </w:rPr>
-        <w:t xml:space="preserve">הוא נראה כמו גבר מסודר, בוגר, שלא מתאמץ. חולצה מכופתרת, צ'ינו, לופרס. הוא יכול להיות בפגישת עבודה ויכול להיות בארוחת צהריים של שבת, אותו לבוש. יש בו משהו קלאסי, נראה שהוא התלבש ככה גם לפני עשרים שנה. הוא נראה אמין. בעבודה שלי, לקוח שנראה ככה הוא לקוח שאני יודעת שישלם בזמן.</w:t>
+        <w:t xml:space="preserve">גבר מסודר. בוגר. הוא נראה אותו דבר בפגישת עבודה ובארוחת צהריים של שבת אצל ההורים. חולצה מכופתרת, צ'ינו, לופרס, שעון דק. קלאסי. כזה שהתלבש ככה גם לפני עשרים שנה ויתלבש ככה בעוד עשרים. ואני מסתכלת עליו ומרגישה אמון. בעבודה שלי, לקוח שנראה ככה משלם בזמן ולא מתווכח על החשבונית. זה נשמע שטחי, וזה נכון כמעט תמיד.</w:t>
       </w:r>
     </w:p>
     <w:p>
@@ -1166,7 +1166,7 @@
           <w:szCs w:val="24"/>
           <w:rtl/>
         </w:rPr>
-        <w:t xml:space="preserve">מנכ"ל, שותף במשרד עורכי דין, רופא בכיר, אולי יזם ותיק, לא מהסוג של ההייטק אלא מהסוג של התעשייה. מישהו שיש לו עסק שעובד הרבה שנים. יכול להיות גם פרופסור. בכל מקרה משהו עם סמכות שלא צריכה לצעוק.</w:t>
+        <w:t xml:space="preserve">מנכ"ל של משהו בינוני, שותף במשרד עורכי דין, רופא בכיר. או יזם, אבל לא מהסוג של ההייטק עם הטי שירט, מהסוג של התעשייה, מפעל, לוגיסטיקה, משהו שעובד עשרים שנה. אולי פרופסור. משהו שיש בו סמכות שקטה. אני רואה אותו נכנס למשרד שלנו ומבקש קפה בנימוס.</w:t>
       </w:r>
     </w:p>
     <w:p>
@@ -1226,7 +1226,7 @@
           <w:szCs w:val="24"/>
           <w:rtl/>
         </w:rPr>
-        <w:t xml:space="preserve">גבוה. גבוה כלכלית, ואני לא בטוחה כמה, כי הוא לא מראה, אבל הייתי מנחשת שהרבה. וחברתית, המעמד הגבוה המבוסס, האנשים שמנהלים דברים בעיר. הוא נראה כמו מישהו שהכסף אצלו הוא נתון, לא נושא. אם הייתי צריכה לדרג את ארבעתם, הוא והאישה בתמונה 3 הם אותו עולם.</w:t>
+        <w:t xml:space="preserve">גבוה. כמה גבוה כלכלית, אין לי מושג, הוא לא מראה. יכול להיות שהוא מיליונר ויכול להיות שהוא מנהל בבנק עם משכורת טובה, ושניהם היו נראים אותו דבר. חברתית, זה המעמד הגבוה המבוסס, האנשים שמנהלים דברים בעיר בלי שתדעי שהם מנהלים. הוא והאישה בתמונה 3 הם אותו עולם. אני כמעט יכולה לדמיין אותם באותה ארוחת ערב.</w:t>
       </w:r>
     </w:p>
     <w:p>
@@ -1286,7 +1286,7 @@
           <w:szCs w:val="24"/>
           <w:rtl/>
         </w:rPr>
-        <w:t xml:space="preserve">בעיקר מה שאין. אין לוגו, אין שעון בולט, אין שום דבר שאומר "יקר". ודווקא זה. הלופרס מעור, שנראים מעור טוב. החולצה שיושבת טוב. השעון הדק עם רצועת העור, שזה סגנון של אנשים שלא צריכים להרשים. ויש משהו בגוף, בעמידה, שאני לא יודעת אם זה הלבוש או האדם. אני חושבת שהלבוש נותן לו את הרושם של שקט, ושקט אצלי זה ביטחון.</w:t>
+        <w:t xml:space="preserve">מה שאין. אין לוגו, אין שעון שצועק, אין פריט אחד שאומר "יקר". הלופרס מעור, כנראה עור טוב, השעון עם הרצועה הדקה, שזה שעון של אנשים שלא צריכים להרשים, והחולצה שיושבת טוב. ויש משהו בעמידה. אני לא יודעת אם זה הבגדים או הוא, אולי הבגדים נותנים לו לעמוד ככה. השקט שלו הוא מה שעשה לי את הרושם, ושקט אצלי זה ביטחון, וביטחון זה מעמד. ככה זה עובד אצלי, כנראה.</w:t>
       </w:r>
     </w:p>
     <w:p>
@@ -1365,7 +1365,7 @@
           <w:szCs w:val="24"/>
           <w:rtl/>
         </w:rPr>
-        <w:t xml:space="preserve">אני אסדר: 4, 3, 1, 2. הגבר בחולצה הכחולה ראשון, כי הוא נראה הכי מבוסס והכי בטוח. האישה בסוודר הבז' שנייה, קרוב מאוד אליו, אולי אפילו שווה, אבל אצלו יש לי תחושה של ותק. הבחור בטרנינג שלישי, כי יש לו כסף, זה ברור, אבל זה כסף חדש, ואני ממקמת אותו חברתית מתחת. והבחורה בחולצת הדיור אחרונה, כי אצלה אני הכי פחות בטוחה שהכסף שלה, ואני מרגישה שהמראה הוא בעיקר תצוגה. אני שמה לב שאני מדרגת את שני השקטים למעלה ואת שני הבולטים למטה, וזה מעניין, כי מבחינת מה שהם מוציאים על בגדים, אולי זה הפוך.</w:t>
+        <w:t xml:space="preserve">אוקיי, רגע... ארבע, שלוש, אחת, שתיים. הגבר ראשון, כי הוא הכי מבוסס והכי בטוח, ואין בו שום סימן שאלה. האישה שנייה, ממש צמוד, אולי שווה, אבל אצלו יש לי תחושה של עוד יותר ותק. ואז פער. הבחור בטרנינג שלישי, כי יש כסף, זה בטוח, אבל הכסף חדש, והחברתי אצלי נמוך יותר. והבחורה אחרונה, כי אצלה אני הכי פחות בטוחה שזה בכלל הכסף שלה. ואני רואה מה עשיתי: שמתי את שני השקטים למעלה ואת שני הרועשים למטה. ואם היית שואלת מי הוציא הכי הרבה כסף על מה שהוא לובש, אולי הייתי הופכת את הסדר. אז מה בעצם דירגתי? לא כסף. דירגתי... טעם? לא. דירגתי את מי שלא צריך אותי. זה מה שדירגתי.</w:t>
       </w:r>
     </w:p>
     <w:p>
@@ -1425,7 +1425,7 @@
           <w:szCs w:val="24"/>
           <w:rtl/>
         </w:rPr>
-        <w:t xml:space="preserve">מי שמנסה להיראות עשיר זה בלי ספק שני הראשונים, והבחורה אפילו יותר מהבחור, כי אצלה כל פריט הוא מותג. הבחור בטרנינג גם מנסה, אבל יש בו משהו שאומר שהוא באמת עשיר, רק עשיר בצורה שצועקת. מי שנראה עשיר בלי להתאמץ זה הגבר בחולצה הכחולה, לגמרי, ואחריו האישה בבז'. אצלה אני רואה מאמץ, אבל מאמץ אחר: מאמץ להיראות לא מתאמצת. זה גם סגנון, ואולי הוא דורש יותר ידע מאשר לקנות לוגו.</w:t>
+        <w:t xml:space="preserve">מנסה להיראות עשיר, שניים הראשונים, בלי להתלבט, והבחורה אפילו יותר, כי אצלה כל פריט הוא מותג. הבחור בטרנינג מנסה, אבל יש לי הרגשה שהוא גם באמת עשיר, רק עשיר בקול רם. עשיר בלי להתאמץ, הגבר בחולצה הכחולה, לגמרי. ואחריו האישה. אבל, רגע. אצלה אני כן רואה מאמץ. מאמץ אחר. מאמץ להיראות שלא מתאמצים. כל פריט אצלה נבחר, הצבעים לא במקרה, השיער לא במקרה. זה סגנון, וזה אולי דורש יותר ידע מלקנות לוגו, כי לוגו קונים בחנות, ואת זה צריך לדעת. אז אולי הוא היחיד פה שבאמת לא מתאמץ. או שהוא מתאמץ הכי טוב מכולם. אני לא יודעת.</w:t>
       </w:r>
     </w:p>
     <w:p>
@@ -1485,7 +1485,7 @@
           <w:szCs w:val="24"/>
           <w:rtl/>
         </w:rPr>
-        <w:t xml:space="preserve">לעבוד, בלי ספק עם הגבר בתמונה 4. הוא נראה כמו מישהו שאפשר לסמוך עליו, שיש לו ניסיון, שלא יעשה דרמות. גם האישה בתמונה 3, אבל היא נראית לי קצת מרוחקת, כאילו היא תהיה מנהלת טובה ולא חברה. להיות חברה, מצחיק, אולי דווקא עם הבחורה בתמונה 2. היא נראית כיפית, כזאת שכיף לצאת איתה, גם אם לא הייתי לוקחת אותה ברצינות בעבודה. הבחור בטרנינג, לא לעבוד ולא חברות. הוא נראה לי כמו מישהו שמתעייפים ממנו.</w:t>
+        <w:t xml:space="preserve">לעבוד, הגבר. בלי לחשוב. מישהו שאפשר לסמוך עליו, שיש לו ניסיון, שלא עושה דרמה בפגישה. האישה גם, אבל אני מרגישה שהיא תהיה מנהלת מצוינת וחברה רחוקה. כזאת ששומרת מרחק. ולהיות חברה, מצחיק, הבחורה בתמונה 2. כן. היא נראית כיפית, קלה, כזאת שכיף לצאת איתה לשתות, גם אם בעבודה לא הייתי לוקחת אותה ברצינות, וזה לא הוגן, אני יודעת. הבחור בטרנינג, לא זה ולא זה. הוא נראה לי כמו מישהו שמתעייפים ממנו אחרי שעה. אולי אני טועה. בטח אני טועה. זה תמונה.</w:t>
       </w:r>
     </w:p>
     <w:p>
@@ -1583,7 +1583,7 @@
           <w:szCs w:val="24"/>
           <w:rtl/>
         </w:rPr>
-        <w:t xml:space="preserve">קצת מפתיע, כן. ידעתי שהלוגואים הם של מותגים יקרים, זה ברור, אבל לא ידעתי שהפריטים של השניים השקטים עולים אותו דבר או יותר. אני באמת חשבתי שהסוודר של האישה יכול להיות מכל מקום. זה משנה לי משהו: זה אומר שההבדל שאני עשיתי בראש הוא לא הבדל של כסף, אלא הבדל של טעם, או של ידע. ובעצם, מי שלובש את היוקרה השקטה מדבר רק עם מי שמכיר, ומי שלובש לוגו מדבר עם כולם. אני לא בטוחה שזה משנה לי את הדעה על האנשים, אבל זה משנה לי את ההבנה למה אני חושבת מה שאני חושבת.</w:t>
+        <w:t xml:space="preserve">קצת, כן. ידעתי שהלוגואים יקרים, זה כל אחד יודע. לא ידעתי שהסוודר והחולצה של השניים השקטים עולים אותו דבר או יותר. באמת חשבתי שהסוודר יכול להיות מכל מקום. אז זה משנה לי משהו. זה אומר שההבדל שעשיתי בראש הוא לא כסף נגד פחות כסף, הוא... שפה. מי שלובש את השקט מדבר רק עם מי שמכיר את המילים. ומי שלובש לוגו מדבר עם כולם, גם איתי, גם עם מי שלא יודע כלום. ואם חושבים על זה ככה, אז השקט הוא בעצם יותר סגור, יותר מועדון. זה לא משנה לי את הדעה על האנשים בתמונות. זה משנה לי את ההבנה למה חשבתי מה שחשבתי. וזה קצת לא נעים, האמת.</w:t>
       </w:r>
     </w:p>
     <w:p>
@@ -1643,7 +1643,7 @@
           <w:szCs w:val="24"/>
           <w:rtl/>
         </w:rPr>
-        <w:t xml:space="preserve">מה שעובר לי בראש, בכנות, זה "למה אתה צריך את זה". אני מרגישה שלוגו גדול הוא בקשה לתשומת לב, ואני לא אוהבת שמבקשים ממני תשומת לב. ואז, שנייה אחרי, אני תופסת את עצמי, כי מי אני שאשפוט, ואולי האדם הזה עבד קשה ומגיע לו ליהנות ממה שקנה. אבל התגובה הראשונה היא ריחוק. ויש הבדל בין מותגים: לוגו של מותג ספורט לא מפריע לי, לוגו של מותג יוקרה כן. כנראה כי הראשון אומר "אני אוהב ספורט" והשני אומר "יש לי כסף".</w:t>
+        <w:t xml:space="preserve">"למה אתה צריך את זה." זה המשפט שעובר. כאילו הלוגו הגדול הוא בקשה, "תסתכלי עליי", ואני לא אוהבת שמבקשים ממני. ואז, שנייה אחרי, אני תופסת את עצמי. מי אני. אולי הבן אדם עבד קשה ומגיע לו ליהנות ממה שקנה, ולמה לי להתעצבן על חולצה. אבל התגובה הראשונה, לפני המחשבה, היא ריחוק. ויש הבדל שאני שמה לב אליו עכשיו: לוגו של מותג ספורט לא מפריע לי בכלל, הבת שלי לובשת, בעלי לובש. לוגו של מותג יוקרה כן. כנראה כי הראשון אומר "אני אוהב לרוץ" והשני אומר "יש לי כסף". והשני מפריע לי. למה? אולי כי זה מזכיר לי שגם לי אכפת. לא יודעת. תרשמי "לא יודעת".</w:t>
       </w:r>
     </w:p>
     <w:p>
@@ -1703,7 +1703,7 @@
           <w:szCs w:val="24"/>
           <w:rtl/>
         </w:rPr>
-        <w:t xml:space="preserve">רק שאני קצת מופתעת מעצמי. בתחילת הראיון חשבתי שאני לא שיפוטית, ובסוף גיליתי שדירגתי ארבעה אנשים שאני לא מכירה לפי בגדים, ושהייתי די בטוחה בעצמי. ואני עושה את זה כנראה כל יום בעבודה. זה מעניין לחשוב על זה. ועוד דבר: הייתי רוצה לדעת אם גברים היו מדרגים אותו דבר, כי אני חושבת שעל הבחור בטרנינג גברים היו חושבים אחרת.</w:t>
+        <w:t xml:space="preserve">שאני מופתעת מעצמי. באתי לפה בטוחה שאני לא שיפוטית, ועכשיו ישבתי עשרים דקות ודירגתי ארבעה אנשים שאני לא מכירה לפי בד, והייתי בטוחה בעצמי כל הדרך. ואני עושה את זה כנראה כל יום במשרד, עם כל לקוח שנכנס, רק בלי לשים לב. זה משהו לחשוב עליו. ועוד דבר, לעבודה שלך: תשאלי גם גברים. אני חושבת שעל הבחור בטרנינג גברים היו אומרים משהו אחר לגמרי. אולי "כל הכבוד לו". אני לא יודעת. אבל זה היה מעניין אותי לדעת.</w:t>
       </w:r>
     </w:p>
     <w:p>
@@ -1759,7 +1759,7 @@
           <w:szCs w:val="24"/>
           <w:rtl/>
         </w:rPr>
-        <w:t xml:space="preserve">תאריך: 1.10.2026    משך: 24 דקות    מקום: ביתה של המרואיינת, קריית ביאליק    הקלטה: בטלפון, בהסכמה</w:t>
+        <w:t xml:space="preserve">תאריך: 1.10.2026    משך: 26 דקות    מקום: ביתה של המרואיינת, קריית ביאליק    הקלטה: בטלפון, בהסכמה</w:t>
       </w:r>
     </w:p>
     <w:p>
@@ -1838,7 +1838,7 @@
           <w:szCs w:val="24"/>
           <w:rtl/>
         </w:rPr>
-        <w:t xml:space="preserve">אני בת עשרים ושבע, גרה בקריית ביאליק, עובדת כמנהלת חנות בגדים ברשת אופנה בקניון בקריות, וזאת השנה השלישית שלי שם. לפני זה עבדתי כמוכרת באותה רשת, ולפני זה בחנות נעליים. במקביל אני לומדת קורס סטיילינג אישי, בערבים, כי החלום שלי הוא לעבוד כסטייליסטית. אני רווקה, גרה עם שותפה, ורוב הכסף שלי הולך על בגדים, אני מודה.</w:t>
+        <w:t xml:space="preserve">עשרים ושבע. קריית ביאליק, כל החיים. אני מנהלת חנות של רשת אופנה בקניון בקריות, שנה שלישית כמנהלת, לפני זה הייתי מוכרת באותה חנות שלוש שנים, ולפני זה חנות נעליים. בערבים אני לומדת סטיילינג אישי, קורס של שנה, כי אני רוצה לעבוד כסטייליסטית, זה החלום, ואני יודעת שזה נשמע כמו משהו שכולן אומרות. רווקה, עם שותפה. ורוב המשכורת הולכת על בגדים, אני לא אשקר לך, אמא שלי כועסת על זה כל שבוע.</w:t>
       </w:r>
     </w:p>
     <w:p>
@@ -1898,7 +1898,7 @@
           <w:szCs w:val="24"/>
           <w:rtl/>
         </w:rPr>
-        <w:t xml:space="preserve">חמש. בלי לחשוב. אני חיה את זה. אני עוקבת אחרי מותגים, אחרי שבועות אופנה, אני יודעת מה האוספים של העונה, אני מזהה פריטים ברחוב. זאת גם העבודה שלי, אני מלבישה אנשים כל היום, ואני רואה מה אנשים קונים ולמה. אם היה שש, הייתי אומרת שש.</w:t>
+        <w:t xml:space="preserve">חמש. חמש ועוד. זה לא תחביב, זה החיים שלי. אני יודעת מה האוסף של העונה, אני מזהה פריט ברחוב ממרחק, אני יודעת כמה הוא עולה ומאיזו שנה. ובעבודה אני מלבישה אנשים כל היום ורואה מה הם קונים ולמה הם קונים, וזה בעצם מה שאת חוקרת, אז יש לי הרבה מה להגיד, תעצרי אותי אם אני מדברת יותר מדי.</w:t>
       </w:r>
     </w:p>
     <w:p>
@@ -1996,7 +1996,7 @@
           <w:szCs w:val="24"/>
           <w:rtl/>
         </w:rPr>
-        <w:t xml:space="preserve">אוקיי, זה בחור שאני רואה כל יום בקניון. הוא נראה כמו מישהו שבנה את עצמו דרך הלוק, זה הלוק של "אני הגעתי". הקפוצ'ון הזה אני מכירה, אני יודעת בדיוק מאיזו קולקציה הוא, והנעליים גם, והשעון. הוא השקיע בזה הרבה כסף, וכל פריט נבחר כי הוא מזוהה. הוא נראה לי בן עשרים ושמונה, חבר'ה כאלה באים אלינו לחנות עם חברה ומחפשים את מה שנראה הכי יקר.</w:t>
+        <w:t xml:space="preserve">טוב, זה בחור שאני רואה כל יום בקניון. ממש כל יום. הקפוצ'ון הזה אני יודעת מאיזו קולקציה, הסניקרס גם, אלה הכבדים, שעולים כמעט ארבעת אלפים, והשעון. הוא בנה את עצמו מהלוק, זה הלוק של "הגעתי", ואין שום פריט פה שהוא לא בחר כי הוא מזוהה. בחור כזה בא אליי לחנות עם החברה, ושואל "מה הכי יקר", לא "מה הכי יפה". ואני מבינה אותו, האמת, כי הוא קונה הכרה, לא בגד.</w:t>
       </w:r>
     </w:p>
     <w:p>
@@ -2056,7 +2056,7 @@
           <w:szCs w:val="24"/>
           <w:rtl/>
         </w:rPr>
-        <w:t xml:space="preserve">אני מנחשת משהו עצמאי. סוחר, מישהו שמוכר דברים, רכבים, טלפונים, אולי יש לו עסק של הסעות או שיפוצים. או שהוא עובד אצל אבא. או כדורגלן, זה גם אפשרי. משהו שיש בו מזומן ושאין בו בוס שאומר לו איך להתלבש. אני לא רואה אותו במשרד.</w:t>
+        <w:t xml:space="preserve">עצמאי. משהו שמוכר. רכבים, טלפונים, אולי יש לו עסק של הסעות, שיפוצים, משהו שנכנס בו מזומן ושאין בו בוס. או שהוא עובד אצל אבא, ואבא מרוויח. או כדורגלן, זה גם מתאים. לא משרד. בחיים לא משרד.</w:t>
       </w:r>
     </w:p>
     <w:p>
@@ -2116,7 +2116,7 @@
           <w:szCs w:val="24"/>
           <w:rtl/>
         </w:rPr>
-        <w:t xml:space="preserve">כלכלית, הוא בטוח לא עני, הסט הזה שהוא לובש עולה כמה עשרות אלפי שקלים, ואני יודעת, כי אני יודעת מה כל פריט עולה. חברתית, אני הייתי אומרת מעמד בינוני שעלה, או שהמשפחה עלתה. זה לא "עשירים ישנים", זה אנשים שהכסף הגיע אליהם בדור הזה או בדור הקודם, והם שמחים בו. ואני לא אומרת את זה רע. זה גם מה שאני הייתי עושה אם היה לי.</w:t>
+        <w:t xml:space="preserve">כלכלית, אני יודעת בדיוק: הסט הזה, אם הכול מקורי, זה עשרים וחמש, שלושים אלף שקל על הגוף. אז לא עני. חברתית... זה כסף של הדור הזה. או של אבא. לא "משפחה ותיקה עם כסף". אנשים שהכסף בא אליהם עכשיו, ושמחים בו, ורוצים שיראו. ואני לא אומרת את זה בזלזול, כי אם היה לי, גם אני הייתי מראה. הייתי. לפני כמה שנים הייתי.</w:t>
       </w:r>
     </w:p>
     <w:p>
@@ -2176,7 +2176,7 @@
           <w:szCs w:val="24"/>
           <w:rtl/>
         </w:rPr>
-        <w:t xml:space="preserve">הלוגו, ברור, אבל אצלי זה יותר מזה: הבחירה של הפריטים. הוא לא קנה את הפריט היפה של המותג, הוא קנה את הפריט הכי מזוהה של המותג. יש למותג הזה דברים מהממים ושקטים, והוא בחר דווקא את מה שכולם מזהים. זה אומר שהמטרה היא זיהוי, לא יופי. והשילוב: הכול מותגים, אבל לא בהכרח ביחד. זה לוק של "הכי הרבה" ולא של "הכי נכון".</w:t>
+        <w:t xml:space="preserve">הלוגו, ברור. אבל אצלי זה יותר ספציפי: הוא לא קנה את הפריט היפה של המותג, הוא קנה את הפריט הכי מזוהה. למותג הזה יש דברים מהממים, שקטים, עם גזרות מטורפות, ואף אחד לא יזהה אותם ברחוב. הוא בחר דווקא את זה שכולם מזהים. זה אומר שהמטרה היא שיזהו, לא שיהיה יפה. (המראיינת: ומה עם השילוב?) השילוב לא עובד. השעון זהב והסניקרס לבנים והפאוץ' חום. זה "הכי הרבה", לא "הכי נכון". מי שיודע לא היה שם את שלושתם ביחד.</w:t>
       </w:r>
     </w:p>
     <w:p>
@@ -2255,7 +2255,7 @@
           <w:szCs w:val="24"/>
           <w:rtl/>
         </w:rPr>
-        <w:t xml:space="preserve">היא מהממת, קודם כול. מטופחת, מסודרת, אני רואה את השעות שהלכו על השיער ועל הציפורניים. היא נראית לי כמו בחורה שיודעת בדיוק מה הלוק שלה ועובדת עליו. יש פה משהו מאוד תל אביבי-קריות, אם זה מובן, לוק שראיתי אלף פעמים באינסטגרם. היא נראית נחמדה, קצת סגורה, כזאת שלא תחייך לך ברחוב.</w:t>
+        <w:t xml:space="preserve">היא מהממת. נגיד את זה. ואני רואה את השעות: שיער, ציפורניים, גבות, הכול עשוי. היא יודעת בדיוק מה הלוק שלה ועובדת עליו. זה לוק שראיתי אלף פעם באינסטגרם, כזה "קריות פוגש תל אביב". היא נראית נחמדה אבל סגורה, כזאת שלא תחייך לך ברחוב. אני מכירה אותה, לא אותה, אבל אותה. חצי מהלקוחות שלי.</w:t>
       </w:r>
     </w:p>
     <w:p>
@@ -2315,7 +2315,7 @@
           <w:szCs w:val="24"/>
           <w:rtl/>
         </w:rPr>
-        <w:t xml:space="preserve">משפיענית, או שואפת להיות. או מישהי מתחום היופי, לקים, ריסים, גבות. או עובדת בחנות של מותג, בקניון, בגלל הלוק. או סטודנטית שההורים מממנים. אני יודעת שזה נשמע כמו סטריאוטיפ, אבל זה מה שהלוק הזה אומר, והיא בחרה אותו.</w:t>
+        <w:t xml:space="preserve">משפיענית או כזאת שרוצה. או יופי, לקים, ריסים. או עובדת בחנות מותג בקניון, בגלל הלוק, אצלנו היו לוקחים אותה. או סטודנטית שההורים נותנים. אני יודעת שזה סטריאוטיפ. אבל הלוק הוא הסטריאוטיפ, והיא בחרה אותו, אז היא בחרה גם מה יחשבו.</w:t>
       </w:r>
     </w:p>
     <w:p>
@@ -2375,7 +2375,7 @@
           <w:szCs w:val="24"/>
           <w:rtl/>
         </w:rPr>
-        <w:t xml:space="preserve">כלכלית, הייתי זהירה. יש לי לקוחות שנראות בדיוק ככה, ואני יודעת שחלקן קונות את התיק בתשלומים וחלקן קונות חיקוי טוב. הלוק הזה הוא לוק שאפשר להשיג גם בלי כסף אמיתי, וזה בדיוק ההבדל בינה לבין האישה שתראי לי אחר כך, אני מניחה. חברתית, מעמד בינוני, בטוח. הלוק הזה הוא לוק של המעמד הבינוני שמסתכל למעלה.</w:t>
+        <w:t xml:space="preserve">כלכלית, פה אני זהירה. ממש. יש לי לקוחות שנראות בדיוק ככה, ואני יודעת שאחת קנתה את התיק בשתים עשרה תשלומים, ואחת קנתה חיקוי מטורקיה שאי אפשר להבדיל, ואחת קיבלה מהארוס. הלוק הזה אפשר להשיג בלי כסף אמיתי, וזה ההבדל בינה לבין מה שאת כנראה תראי לי אחר כך. חברתית, בינוני. זה הלוק של הבינוני שמסתכל למעלה. ואני הייתי שם. בת עשרים ושתיים, עם התיק הזה בתשלומים. באמת.</w:t>
       </w:r>
     </w:p>
     <w:p>
@@ -2435,7 +2435,7 @@
           <w:szCs w:val="24"/>
           <w:rtl/>
         </w:rPr>
-        <w:t xml:space="preserve">התיק, בעיקר, כי זה התיק שכולם רוצים וכולם מזהים, והוא הפריט הראשון שקונים כשרוצים להיראות. החולצה עם הלוגו, שהיא גם פריט כניסה למותג, לא השמלה, לא המעיל, החולצה, כי היא הכי זולה. והמשקפיים עם הסמל. זה כל הפריטים הזולים ביותר של המותגים היקרים ביותר. זה מה שאומר לי "מעמד בינוני": לא שאין לה כסף, אלא שהיא קונה מהמותג את הדבר שנותן הכי הרבה זיהוי לכל שקל.</w:t>
+        <w:t xml:space="preserve">התיק. כי זה התיק שכולן רוצות, וכולן מזהות, וזה הפריט הראשון שקונים כשרוצים להיראות. החולצה עם הלוגו, שהיא "פריט כניסה", הכי זול שיש למותג, לא השמלה, לא המעיל, החולצה. המשקפיים, גם פריט כניסה. זאת אומרת, הכול פה הוא הפריטים הכי זולים של המותגים הכי יקרים. וזה מה שאומר לי "בינוני": לא שאין כסף, אלא שהכסף הולך על זיהוי לכל שקל. אני יודעת כי זה בדיוק מה שאני הייתי עושה, ועשיתי.</w:t>
       </w:r>
     </w:p>
     <w:p>
@@ -2514,7 +2514,7 @@
           <w:szCs w:val="24"/>
           <w:rtl/>
         </w:rPr>
-        <w:t xml:space="preserve">ואו. זה הלוק שאני חולמת עליו. אני יודעת בדיוק מה זה: זה יוקרה שקטה, זה הלוק של השנים האחרונות, הסוודר הזה הוא לורו פיאנה או משהו כזה, והתיק הוא בוטגה או רואו, ואם זה מה שאני חושבת, כל הלוק הזה עולה יותר מהלוק של הבחור בתמונה 1, אולי פי שניים. היא נראית לי אלגנטית, בטוחה, מישהי שלא צריכה אישור מאף אחד. אני מסתכלת עליה ורוצה להיות היא בעוד עשר שנים.</w:t>
+        <w:t xml:space="preserve">ואו. אוקיי. זה הלוק שאני חולמת עליו. אני יודעת בדיוק מה זה: יוקרה שקטה, הסוודר הזה הוא לורו פיאנה או משהו ברמה הזאת, התיק הוא בוטגה או דה רואו, ואם אני צודקת, אז כל מה שעליה עולה יותר ממה שעל הבחור בתמונה אחת. אולי פי שניים. והיא נראית... איך להגיד... כאילו היא לא צריכה אישור מאף אחד. רגועה. אני מסתכלת עליה ורוצה להיות היא בגיל ארבעים. (המראיינת: מה בה?) שהיא לא מנסה. לא, זה לא נכון, היא מנסה. היא מנסה אחרת.</w:t>
       </w:r>
     </w:p>
     <w:p>
@@ -2574,7 +2574,7 @@
           <w:szCs w:val="24"/>
           <w:rtl/>
         </w:rPr>
-        <w:t xml:space="preserve">משהו מאוד בכיר. מנכ"לית, שותפה בקרן, עורכת דין בכירה. או שהיא אשתו של מישהו בכיר מאוד, אבל גם אז, כזאת שיש לה עניינים משלה. אולי בתחום האמנות, גלריה, אוצרת. משהו שבו צריך להיראות יקר בלי להיראות שמנסים.</w:t>
+        <w:t xml:space="preserve">משהו בכיר מאוד. מנכ"לית, שותפה בקרן, עורכת דין שהשם שלה על הדלת. או אשתו של מישהו בכיר, אבל כזאת שיש לה עניינים משלה, גלריה, עמותה. משהו שבו צריך להיראות יקר בלי שיראו שמנסים, כי בעולם שלה להיראות שמנסים זה הדבר הכי גרוע.</w:t>
       </w:r>
     </w:p>
     <w:p>
@@ -2634,7 +2634,7 @@
           <w:szCs w:val="24"/>
           <w:rtl/>
         </w:rPr>
-        <w:t xml:space="preserve">הכי גבוה מכולם. גם כלכלית, כי הפריטים האלה הם הכי יקרים שיש, וגם חברתית, כי זה לוק שצריך לדעת אותו, ולדעת אותו זה עניין של סביבה. מי שלא גדלה ליד אנשים שמתלבשים ככה לא תדע לעשות את זה, גם עם כסף. זה הדבר שהכי מתסכל אותי כסטייליסטית: אפשר לקנות את הבגדים, קשה לקנות את הידע.</w:t>
+        <w:t xml:space="preserve">הכי גבוה מכולם. כלכלית, כי הפריטים האלה הם הכי יקרים שיש בשוק, ואני יודעת מחירים. חברתית, כי זה לוק שצריך לדעת אותו, ולדעת אותו זה עניין של איפה גדלת. מי שלא גדלה ליד אנשים שמתלבשים ככה לא תעשה את זה נכון גם עם כסף. וזה הדבר שהכי מתסכל אותי, כסטייליסטית בדרך: אפשר לקנות את הבגדים. אי אפשר לקנות את הידע. את הידע אני לומדת שנים, ועדיין.</w:t>
       </w:r>
     </w:p>
     <w:p>
@@ -2694,7 +2694,7 @@
           <w:szCs w:val="24"/>
           <w:rtl/>
         </w:rPr>
-        <w:t xml:space="preserve">הבד. אני רואה קשמיר ממרחק, יש לו נפילה אחרת. הגזרה של המכנסיים, שהיא מושלמת, ומכנסיים שיושבים ככה עולים הרבה, או שנתפרו עליה. התיק בלי לוגו, שזה בדיוק הקוד: מי שיודע, יודע. הצבעים, בז' וקאמל ושחור, זאת הפלטה של היוקרה השקטה. והשיער האסוף, הפשוט, שהוא בעצם הכי קשה להשיג. הכול פה בנוי על פרטים שרק מי שמכירה רואה, וזה בדיוק הרעיון.</w:t>
+        <w:t xml:space="preserve">הבד. קשמיר רואים ממרחק, יש לו נפילה אחרת, הוא לא עומד, הוא נשפך. המכנסיים, שיושבים מושלם, ומכנסיים שיושבים ככה זה או אלפי שקלים או חייט. התיק בלי לוגו, שזה בדיוק הקוד, "מי שיודע יודע". הצבעים, בז' קאמל שחור, זאת הפלטה של היוקרה השקטה, אין פה צבע אחד במקרה. והשיער האסוף, שנראה פשוט, והוא הכי קשה. הכול פה בנוי על פרטים שרק מי שמכירה רואה, וזה הרעיון כולו. זה לוק שמדבר למועדון.</w:t>
       </w:r>
     </w:p>
     <w:p>
@@ -2773,7 +2773,7 @@
           <w:szCs w:val="24"/>
           <w:rtl/>
         </w:rPr>
-        <w:t xml:space="preserve">גבר שנראה טוב בלי להיראות שמנסה, וזה אצל גברים אפילו נדיר יותר מאצל נשים. הוא נראה כמו מישהו שיש לו ארון קטן של דברים מצוינים, ולובש אותם שוב ושוב. חולצה טובה, מכנסיים טובים, נעליים טובות. אני מדמיינת אותו בארוחת ערב במסעדה טובה, לא בבר. הוא נראה אדיב, קצת שמור, בוגר.</w:t>
+        <w:t xml:space="preserve">גבר שנראה טוב בלי להיראות שמנסה, וזה אצל גברים נדיר. באמת נדיר, אני רואה מאות גברים בשבוע. הוא נראה כמו מישהו שיש לו ארון קטן של דברים מצוינים, ולובש אותם שוב ושוב, ולא חושב על זה. חולצה טובה, מכנסיים טובים, נעליים טובות. אני מדמיינת אותו במסעדה טובה, לא בבר. אדיב. קצת שמור. בוגר. כזה שלא יסתכל עליי פעמיים, וגם זה אומר משהו.</w:t>
       </w:r>
     </w:p>
     <w:p>
@@ -2833,7 +2833,7 @@
           <w:szCs w:val="24"/>
           <w:rtl/>
         </w:rPr>
-        <w:t xml:space="preserve">בכיר במשהו שהוא לא הייטק. בנקאות, משפטים, רפואה, או בעלים של עסק משפחתי גדול. או אדריכל. האנשים בהייטק מתלבשים אחרת, יותר טי שירט וסניקרס. זה לוק של מישהו שפוגש אנשים שצריכים לכבד אותו.</w:t>
+        <w:t xml:space="preserve">בכיר בלא-הייטק. בנקאות, משפטים, רפואה, או עסק משפחתי גדול. אדריכל אולי. הייטקיסטים לא נראים ככה, הם בטי שירט וסניקרס, גם המנכ"לים. זה לוק של מישהו שפוגש אנשים שצריכים לכבד אותו, ושהוא רגיל שמכבדים.</w:t>
       </w:r>
     </w:p>
     <w:p>
@@ -2893,7 +2893,7 @@
           <w:szCs w:val="24"/>
           <w:rtl/>
         </w:rPr>
-        <w:t xml:space="preserve">גבוה, כלכלית וחברתית. אותו עולם כמו האישה בתמונה 3, ואני כמעט בטוחה שאם הם היו זוג זה היה הגיוני. הוא נראה כמו מישהו שגדל עם כסף, לא כמו מישהו שעשה אותו. ואני לא יודעת להסביר את זה חוץ מלהגיד שאין בו שום דבר שמנסה.</w:t>
+        <w:t xml:space="preserve">גבוה. גם וגם. אותו עולם כמו האישה בתמונה 3, ואם היית אומרת לי שהם זוג, הייתי מאמינה מיד. והוא נראה לי כמו מישהו שגדל עם כסף, לא כמו מישהו שעשה אותו. (המראיינת: ממה?) מזה שאין בו כלום שמנסה. אנשים שעשו כסף, גם כשהם לומדים להתלבש שקט, יש להם פריט אחד שמסגיר, שעון, נעליים, משהו. לו אין.</w:t>
       </w:r>
     </w:p>
     <w:p>
@@ -2953,7 +2953,7 @@
           <w:szCs w:val="24"/>
           <w:rtl/>
         </w:rPr>
-        <w:t xml:space="preserve">הלופרס. לופרס טובים מעור טוב הם הדבר שהכי מסגיר מעמד אצל גברים, לדעתי, יותר משעון. והשעון הדק, שהוא ההפך מהשעון של הבחור בתמונה 1, והוא אולי עולה יותר. החולצה שנראית מבד איכותי ולא מבריק. ושום לוגו, בשום מקום. אצל גברים זה אפילו יותר חזק מאצל נשים, כי גברים עם כסף חדש כמעט תמיד הולכים על לוגו, ואלה שלא, זה בדרך כלל סימן.</w:t>
+        <w:t xml:space="preserve">הלופרס. לופרס טובים, מעור טוב, זה הדבר שהכי מסגיר מעמד אצל גברים, יותר משעון, ואני אומרת את זה מניסיון של חנות נעליים. והשעון הדק, שהוא ההפך מהשעון של הבחור בתמונה אחת, ואולי עולה יותר. החולצה מבד מט, לא מבריק. ושום לוגו, בשום מקום. אצל גברים זה אפילו חזק יותר מאצל נשים, כי גבר עם כסף חדש כמעט תמיד הולך על לוגו, זה מה שאני רואה בחנות, ואלה שלא, זה בדרך כלל סימן.</w:t>
       </w:r>
     </w:p>
     <w:p>
@@ -3032,7 +3032,7 @@
           <w:szCs w:val="24"/>
           <w:rtl/>
         </w:rPr>
-        <w:t xml:space="preserve">בשבילי זה ברור: 3, 4, 1, 2. האישה בבז' ראשונה, כי הלוק שלה הוא היקר ביותר והמתוחכם ביותר, ואני יודעת מה הוא עולה. הגבר בחולצה הכחולה שני, קרוב מאוד. הבחור בטרנינג שלישי, כי יש לו כסף אמיתי, אני יודעת מה הוא לובש, אבל אין לו את הידע. והבחורה בחולצת הלוגו אחרונה, כי אצלה אני לא בטוחה אפילו בכסף. ואני רוצה להגיד משהו: הסדר הזה הוא סדר של מעמד, לא של כמה אני אוהבת אותם. את הבחורה בתמונה 2 אני הכי מבינה, כי הייתי היא לפני חמש שנים.</w:t>
+        <w:t xml:space="preserve">שלוש, ארבע, אחת, שתיים. בלי להתלבט. האישה ראשונה, כי הלוק שלה הוא היקר ביותר והמתוחכם ביותר, ואני יודעת כמה הוא עולה. הגבר שני, צמוד. הבחור בטרנינג שלישי, יש לו כסף אמיתי, אני יודעת מה הוא לובש, אבל אין לו את הידע. הבחורה אחרונה, כי אצלה גם בכסף אני לא בטוחה. ורגע, אני רוצה להגיד משהו: הסדר הזה הוא של מעמד. לא של מי אני אוהבת. את הבחורה בתמונה 2 אני הכי מבינה מכולם, כי הייתי היא. בדיוק היא. עם אותו תיק. אז אני מדרגת אותה אחרונה ומרגישה קצת בוגדת.</w:t>
       </w:r>
     </w:p>
     <w:p>
@@ -3092,7 +3092,7 @@
           <w:szCs w:val="24"/>
           <w:rtl/>
         </w:rPr>
-        <w:t xml:space="preserve">מנסה להיראות עשיר: הבחור בטרנינג והבחורה בחולצת הלוגו, שניהם, וזה המטרה של הלוק, הם לא מסתירים את זה. אני לא רואה בזה משהו רע, זה לוק של "אני רוצה שתדעו", והם משיגים את זה. נראה עשיר בלי להתאמץ: הגבר בחולצה הכחולה הכי הרבה, והאישה בבז'. אבל אני רוצה לדייק: האישה בבז' מתאמצת מאוד, רק שהמאמץ שלה הוא להיראות לא מתאמצת, וזה דורש הרבה יותר ידע וכסף מאשר לקנות לוגו. יוקרה שקטה היא לא פחות מאמץ, היא מאמץ שמוסתר טוב יותר.</w:t>
+        <w:t xml:space="preserve">מנסה להיראות עשיר: הבחור והבחורה, שניהם, וזה המטרה המוצהרת של הלוק, הם לא מסתירים. ואני לא רואה בזה רע, זה לוק של "אני רוצה שתדעו", והם משיגים את זה, זה עובד. נראה עשיר בלי להתאמץ: הגבר, הכי. האישה גם, אבל פה אני רוצה לדייק: היא מתאמצת המון. רק שהמאמץ שלה הוא להיראות לא מתאמצת, וזה דורש הרבה יותר ידע וכסף מלקנות לוגו. יוקרה שקטה היא לא פחות מאמץ. היא מאמץ שמוסתר טוב. ואני יודעת כי אני מנסה ללמוד אותו, וזה קשה בטירוף.</w:t>
       </w:r>
     </w:p>
     <w:p>
@@ -3152,7 +3152,7 @@
           <w:szCs w:val="24"/>
           <w:rtl/>
         </w:rPr>
-        <w:t xml:space="preserve">לעבוד, עם האישה בבז'. אני הייתי רוצה ללמוד ממנה, היא בדיוק מה שאני רוצה להיות, ואני חושבת שהיא הייתה בוסית קשה אבל שמלמדת. חברה, האמת, הבחורה בתמונה 2. היא נראית לי הכי כיפית והכי קלה, והיא מהעולם שלי. הגבר בחולצה הכחולה, לא לעבוד ולא חברה, הוא נראה לי קצת משעמם, מהסוג שלא מדבר על כלום מעניין. והבחור בטרנינג, לחברות הוא יכול להיות מצחיק, לעבודה לא.</w:t>
+        <w:t xml:space="preserve">לעבוד, האישה. הייתי רוצה ללמוד ממנה, היא בדיוק מה שאני רוצה להיות, והיא בטח בוסית קשה, אבל כזאת שמלמדת. חברה... האמת? הבחורה בתמונה 2. היא הכי כיפית והכי קלה, והיא מהעולם שלי, היינו הולכות לקניון ביחד. הגבר, לא לעבוד ולא חברה, הוא נראה לי משעמם, כזה שמדבר על ריבית. והבחור בטרנינג, לחברות הוא יכול להיות מצחיק, יש לו אנרגיה, לעבודה לא, הוא ימכור לי משהו תוך חמש דקות.</w:t>
       </w:r>
     </w:p>
     <w:p>
@@ -3250,7 +3250,7 @@
           <w:szCs w:val="24"/>
           <w:rtl/>
         </w:rPr>
-        <w:t xml:space="preserve">לא מפתיע אותי בכלל, כי ידעתי. זיהיתי את כל הפריטים, גם של השקטים, ואני יודעת שהשקטים יקרים יותר. מה שכן מעניין אותי הוא שאת שאלת, כי זה אומר שרוב האנשים לא יודעים, ואז בעצם הלוק של האישה בבז' לא עובד על רוב האנשים, הוא עובד רק על מי שמכיר. זה בעצם לוק שמיועד למעגל סגור. והלוק של הבחור בטרנינג עובד על כולם. אז השאלה היא עם מי את רוצה לדבר. זה לא משנה את הדעה שלי, זה מחזק אותה.</w:t>
+        <w:t xml:space="preserve">לא מפתיע אותי בכלל, כי ידעתי מהרגע הראשון. זיהיתי את כל הפריטים, גם של השקטים, ואני יודעת שהשקטים יקרים יותר. מה שכן מעניין אותי זה שאת שואלת. כי זה אומר שרוב האנשים לא יודעים. ואם רוב האנשים לא יודעים, אז הלוק של האישה בבז' לא עובד על רוב האנשים. הוא עובד רק על מי שמכיר. זה לוק למועדון סגור. והלוק של הבחור בטרנינג עובד על כולם, על אמא שלי, על השכן. אז השאלה היא עם מי את רוצה לדבר. זה לא משנה לי את הדעה. זה מחזק אותה. ואולי קצת עוצר אותי, כי אני בדרך למועדון הזה, ואני לא בטוחה שאני רוצה לדבר רק איתם.</w:t>
       </w:r>
     </w:p>
     <w:p>
@@ -3310,7 +3310,7 @@
           <w:szCs w:val="24"/>
           <w:rtl/>
         </w:rPr>
-        <w:t xml:space="preserve">מה שעובר לי בראש הוא "אני יודעת מאיזו קולקציה זה ומה שילמת", ואז "למה דווקא את הפריט הזה". כי כמעט תמיד, לוגו גדול הוא פריט הכניסה למותג, הזול יחסית, ומי שקונה אותו מקבל את השם ולא את האיכות. בעבודה אני רואה את זה כל יום: אנשים מבקשים "משהו עם לוגו", לא "משהו יפה". זה לא מרגיז אותי, אני מבינה את זה, אבל אני כבר לא רוצה את זה לעצמי. פעם רציתי. היום אני חוסכת לדברים בלי לוגו, וזה כנראה אומר שגם אני השתניתי מעמד, או לפחות רוצה.</w:t>
+        <w:t xml:space="preserve">מה שעובר לי בראש, אחת שתיים: "אני יודעת מאיזו קולקציה זה ומה שילמת". ואז "למה דווקא את זה". כי כמעט תמיד, לוגו גדול הוא פריט הכניסה, הזול, ומי שקונה אותו מקבל את השם ולא את הבגד. בחנות אני רואה את זה כל יום, "יש לך משהו עם לוגו?", לא "משהו יפה". זה לא מרגיז אותי. אני מבינה את זה. אבל אני כבר לא רוצה את זה לעצמי. פעם רציתי, מאוד. היום אני חוסכת למעיל בלי לוגו שעולה כמו חודשיים משכורת. וזה כנראה אומר שאני עולה מעמד. או שאני רוצה. או שרק שיניתי מועדון.</w:t>
       </w:r>
     </w:p>
     <w:p>
@@ -3370,7 +3370,7 @@
           <w:szCs w:val="24"/>
           <w:rtl/>
         </w:rPr>
-        <w:t xml:space="preserve">כן, שהחלוקה הזאת בין לוגו ליוקרה שקטה היא לא רק עניין של כסף, היא עניין של גיל ושל שלב בחיים. בגיל עשרים ושתיים רציתי שיראו. בגיל עשרים ושבע אני רוצה שמי שמבין יראה. ואני מנחשת שבגיל ארבעים אני לא ארצה שאף אחד יראה. ועוד דבר למחקר שלך: תשאלי גם גברים, כי לפי מה שאני רואה בחנות, גברים הרבה יותר מכורים ללוגו מנשים, והם מתביישים להודות בזה.</w:t>
+        <w:t xml:space="preserve">כן. שהחלוקה הזאת, לוגו מול שקט, היא לא רק כסף, היא גיל. בעשרים ושתיים רציתי שיראו. בעשרים ושבע אני רוצה שמי שמבין יראה. ובארבעים, אני מנחשת, לא ארצה שאף אחד יראה. אז אולי זה לא שני סוגי אנשים, זה שלושה שלבים של אותו אדם. ולמחקר שלך: תשאלי גברים. ממה שאני רואה בחנות, גברים הרבה יותר מכורים ללוגו מנשים, והם מתביישים להודות, אז הם יגידו לך משהו אחר ממה שהם קונים.</w:t>
       </w:r>
     </w:p>
     <w:p>
@@ -3426,7 +3426,7 @@
           <w:szCs w:val="24"/>
           <w:rtl/>
         </w:rPr>
-        <w:t xml:space="preserve">תאריך: 4.10.2026    משך: 19 דקות    מקום: חדר המורים בבית ספר תיכון, קריית טבעון    הקלטה: בטלפון, בהסכמה</w:t>
+        <w:t xml:space="preserve">תאריך: 4.10.2026    משך: 21 דקות    מקום: חדר המורים בבית ספר תיכון, קריית טבעון    הקלטה: בטלפון, בהסכמה</w:t>
       </w:r>
     </w:p>
     <w:p>
@@ -3505,7 +3505,7 @@
           <w:szCs w:val="24"/>
           <w:rtl/>
         </w:rPr>
-        <w:t xml:space="preserve">אני בת חמישים ושתיים, מורה לספרות ומחנכת בתיכון בקריית טבעון, מלמדת עשרים ושש שנים. גרה בטבעון, נשואה, שלושה ילדים, שניים כבר אחרי צבא. גדלתי בחיפה, בנווה שאנן. אני אוהבת לקרוא, לטייל, ואין לי הרבה סבלנות לקניות. אני אומרת את זה מראש כדי שתדעי עם מי את מדברת.</w:t>
+        <w:t xml:space="preserve">בת חמישים ושתיים. מורה לספרות ומחנכת, פה בטבעון, עשרים ושש שנים. גדלתי בחיפה, בנווה שאנן, בבניין רכבת, שלושה ילדים, שניים כבר אחרי צבא, אחת בכיתה י"א. אני אוהבת לקרוא, לטייל בכרמל, ואין לי סבלנות לקניות, בכלל. אני אומרת את זה עכשיו כדי שתדעי עם מי את יושבת, כי אני חושדת שאני לא המרואיינת האידיאלית שלך.</w:t>
       </w:r>
     </w:p>
     <w:p>
@@ -3565,7 +3565,7 @@
           <w:szCs w:val="24"/>
           <w:rtl/>
         </w:rPr>
-        <w:t xml:space="preserve">שתיים. אולי אפילו אחת וחצי. אני מתלבשת נקי ומסודר, אני מקפידה שהבגדים יתאימו לעבודה, אבל אני לא עוקבת אחרי כלום, לא יודעת מותגים, ולא זוכרת מתי בפעם האחרונה קניתי משהו לא כי הישן נגמר. הבנות שלי צוחקות עליי. אבל אני כן שמה לב איך התלמידים שלי מתלבשים, כי זה אומר הרבה על מה שקורה להם.</w:t>
+        <w:t xml:space="preserve">שתיים. אולי אחת וחצי. אני מתלבשת נקי ומסודר, בשביל הכיתה, שלא יגידו, אבל אני לא עוקבת אחרי כלום, לא מכירה מותגים, והפעם האחרונה שקניתי משהו לא כי הישן נקרע... לא זוכרת. הבנות שלי צוחקות עליי, "אמא, הסנדלים". אבל יש דבר אחד: אני שמה לב מאוד איך התלמידים שלי מתלבשים. כי זה אומר לי הרבה על מה שקורה להם בבית. אז אולי אני כן קוראת בגדים, רק לא כמו שאת מתכוונת.</w:t>
       </w:r>
     </w:p>
     <w:p>
@@ -3663,7 +3663,7 @@
           <w:szCs w:val="24"/>
           <w:rtl/>
         </w:rPr>
-        <w:t xml:space="preserve">הראשון שעולה לי זה "ילד". לא בגלל הגיל, הוא לא ילד, אלא בגלל שהוא נראה כמו תלמיד שלי שגדל. יש לי תלמידים שמתלבשים בדיוק ככה, עם הנעליים הגדולות והקפוצ'ון עם הכיתוב. הוא נראה לי קצת מתנשא, קצת "תראו אותי", ובאותו זמן קצת לא בטוח, כאילו הבגדים הם שריון. אני רואה אותו עומד ליד רכב יקר ומצלם.</w:t>
+        <w:t xml:space="preserve">"ילד". זה מה שעלה. לא בגלל הגיל, הוא לא ילד, אלא כי הוא נראה כמו תלמיד שלי שגדל. יש לי כאלה בכיתה, עם הנעליים הגדולות, הקפוצ'ון עם הכיתוב, ואני רואה אותו ואומרת "אה, זה עומר בעוד עשר שנים". הוא נראה לי קצת מתנשא, "תראו אותי", ובאותו זמן, מתחת לזה, לא בטוח. כאילו הבגדים הם שריון. ואני יודעת שאני אומרת את זה כי אני מורה, ומורה רואה בכל אחד ילד מפוחד. אבל זה מה שרואים. (המראיינת: איפה היית פוגשת אותו?) ליד רכב. עומד ליד רכב יקר ומצלם.</w:t>
       </w:r>
     </w:p>
     <w:p>
@@ -3723,7 +3723,7 @@
           <w:szCs w:val="24"/>
           <w:rtl/>
         </w:rPr>
-        <w:t xml:space="preserve">אין לי מושג, באמת. משהו עם כסף שבא מהר. אולי הוא עובד עם אבא שלו, אולי הוא מוכר משהו. אולי הוא כדורגלן, הילדים שלי היו אומרים כדורגלן. אני לא רואה אותו במקצוע שלומדים אותו.</w:t>
+        <w:t xml:space="preserve">אין לי מושג, באמת שלא. משהו עם כסף שבא מהר. אולי עובד עם אבא, אולי מוכר משהו. הילדים שלי היו אומרים כדורגלן, מיד. אני לא רואה אותו במקצוע שלומדים, ואני לא יודעת אם זה בגלל הבגדים או בגלל שהוא נראה לי צעיר מדי בשביל כל דבר.</w:t>
       </w:r>
     </w:p>
     <w:p>
@@ -3783,7 +3783,7 @@
           <w:szCs w:val="24"/>
           <w:rtl/>
         </w:rPr>
-        <w:t xml:space="preserve">כלכלית, אני מניחה שיש לו כסף, כי אפילו אני רואה שהנעליים האלה לא זולות. אבל אני לא יודעת אם זה הכסף שלו. חברתית, אני הייתי אומרת מעמד בינוני, ואני לא בטוחה שזה בכלל הקטגוריה הנכונה. הוא נראה לי כמו מישהו מהפריפריה שהגיע למרכז, אם זה מובן. ואני אומרת את זה כמישהי שגדלה בנווה שאנן, אז בלי התנשאות.</w:t>
+        <w:t xml:space="preserve">כסף יש לו, כנראה, כי אפילו אני רואה שהנעליים לא מהשוק. אבל אם זה שלו, אין לי מושג. חברתית... אני לא יודעת אם זאת בכלל הקטגוריה. הוא נראה לי כמו מישהו שבא ממקום שלא היה בו, והגיע למקום שיש בו, והבגדים הם הדרך להגיד את זה. אני גדלתי בנווה שאנן, ההורים שלי היו פועלים, ואני זוכרת את השכנים שקנו את הדבר הראשון היקר שלהם ושמו אותו בסלון שכולם יראו. זה אותו דבר. רק שהסלון הוא הגוף.</w:t>
       </w:r>
     </w:p>
     <w:p>
@@ -3843,7 +3843,7 @@
           <w:szCs w:val="24"/>
           <w:rtl/>
         </w:rPr>
-        <w:t xml:space="preserve">שהכול גדול. הכיתוב גדול, הנעליים גדולות, השעון גדול. ואני יודעת שכשתלמיד שלי מגיע עם משהו גדול, זה בדרך כלל אומר שהוא רוצה שיראו אותו, כי משהו אחר לא רואים. אני לא אומרת שזה המצב אצל הבחור הזה, אבל זה מה שהלבוש עשה לי. ושהוא לבוש בטרנינג, בבגד של ספורט, אבל ברור שהוא לא הולך לעשות ספורט.</w:t>
+        <w:t xml:space="preserve">שהכול גדול. הכיתוב גדול, הנעליים גדולות, השעון גדול. וכשתלמיד מגיע אליי עם משהו גדול, זה בדרך כלל אומר שהוא רוצה שיראו אותו, כי משהו אחר בו לא רואים. אני לא אומרת שזה המצב פה, אני לא מכירה את הבחור. אבל זה מה שהבגדים עשו לי. ועוד דבר קטן: הוא בטרנינג. בגד ספורט. וברור שהוא לא הולך לעשות ספורט. אז הבגד לא משרת את מה שהוא נועד לו, הוא משרת משהו אחר, וזה הדבר שהכי אומר לי "תצוגה".</w:t>
       </w:r>
     </w:p>
     <w:p>
@@ -3922,7 +3922,7 @@
           <w:szCs w:val="24"/>
           <w:rtl/>
         </w:rPr>
-        <w:t xml:space="preserve">בחורה יפה, מאוד מטופחת, מאוד מושקעת. היא מזכירה לי את הבנות בכיתה י"ב בטקס הסיום, כולן ככה. יש בה משהו שמנסה להיראות מבוגר ועשיר יותר ממה שהיא. היא נראית לי נחמדה, אבל אני לא יודעת על מה הייתי מדברת איתה.</w:t>
+        <w:t xml:space="preserve">בחורה יפה. מאוד מטופחת. מושקעת. היא מזכירה לי את הבנות שלי בכיתה י"ב בטקס הסיום, כולן בדיוק ככה, אותן ציפורניים, אותו שיער. יש בה משהו שמנסה להיראות מבוגר ועשיר יותר ממה שהוא. והיא נראית לי נחמדה, באמת, רק שאני לא יודעת על מה הייתי מדברת איתה אחרי "שלום". וזה אולי עליי, לא עליה.</w:t>
       </w:r>
     </w:p>
     <w:p>
@@ -3982,7 +3982,7 @@
           <w:szCs w:val="24"/>
           <w:rtl/>
         </w:rPr>
-        <w:t xml:space="preserve">משהו שקשור ליופי, או לרשתות. או בכלל לא עובדת עדיין. יכול להיות שהיא סטודנטית. לא רואה אותה במקצוע כמו שלי, לא בגלל שהיא לא חכמה, אלא כי הלבוש הזה לא מתאים לכיתה.</w:t>
+        <w:t xml:space="preserve">יופי. או רשתות. או עדיין לא עובדת, סטודנטית. אני לא רואה אותה בכיתה, לא כי היא לא חכמה, אין לי מושג כמה היא חכמה, אלא כי הלבוש הזה לא מתאים לעמוד מול שלושים ילדים. הייתי מתפרקת עם הציפורניים האלה אחרי שיעור אחד.</w:t>
       </w:r>
     </w:p>
     <w:p>
@@ -4042,7 +4042,7 @@
           <w:szCs w:val="24"/>
           <w:rtl/>
         </w:rPr>
-        <w:t xml:space="preserve">כלכלית, אני לא יודעת. הבגדים נראים לי יקרים כי יש עליהם שמות, אבל אני לא יודעת מה אמיתי ומה לא, ואני יודעת שיש חיקויים. חברתית, מעמד בינוני, ואולי הכסף של ההורים. אני מרגישה שהיא עדיין לא במקום שלה בחיים, שהיא בדרך.</w:t>
+        <w:t xml:space="preserve">כלכלית, אני לא יודעת. אני רואה שמות על הבגדים ואני יודעת שהשמות האלה יקרים, אפילו אני, אבל אני לא יודעת להבדיל בין אמיתי לחיקוי, ואני יודעת שיש הרבה חיקויים, כי התלמידים שלי באים עם כאלה. חברתית, בינוני. והכסף, אם יש, אולי של ההורים. היא נראית לי כמו מישהי שעוד לא במקום שלה, שהיא בדרך לאיפשהו ומתלבשת כמו היעד.</w:t>
       </w:r>
     </w:p>
     <w:p>
@@ -4102,7 +4102,7 @@
           <w:szCs w:val="24"/>
           <w:rtl/>
         </w:rPr>
-        <w:t xml:space="preserve">השמות. על החולצה כתוב שם של מותג, על התיק יש סמלים, על המשקפיים. אני יודעת שאלה מותגים יקרים גם בלי להתעניין, כי כולם יודעים. ואני חושבת שמי ששמה על עצמה כל כך הרבה שמות רוצה שאנשים יקראו אותה כמו שלט. בעיניי זה קצת עצוב, אבל זאת אני, בת חמישים ושתיים עם סנדלים.</w:t>
+        <w:t xml:space="preserve">השמות. על החולצה כתוב מותג. על התיק יש סמלים. על המשקפיים. אני יודעת שאלה מותגים יקרים בלי להתעניין, כי כולם יודעים, זה הכוח שלהם. ומי ששמה על עצמה כל כך הרבה שמות רוצה שיקראו אותה כמו שלט. בעיניי זה קצת עצוב. אבל אני בת חמישים ושתיים עם סנדלים, אז מה אני מבינה. (המראיינת: למה עצוב?) כי זה אומר שהיא לא בטוחה שיראו אותה בלי השלט.</w:t>
       </w:r>
     </w:p>
     <w:p>
@@ -4181,7 +4181,7 @@
           <w:szCs w:val="24"/>
           <w:rtl/>
         </w:rPr>
-        <w:t xml:space="preserve">האישה הזאת נראית לי נעימה. רגועה. מסודרת בלי להתאמץ. אני לא רואה בה שום דבר מיוחד בבגדים, והיא נראית לי הכי נורמלית מהארבעה עד עכשיו. סוודר, מכנסיים, מעיל. היא נראית כמו קולגה שלי, כמו מנהלת בית ספר, כמו מישהי שאני פוגשת בהשתלמות. אם הייתי רואה אותה ברחוב לא הייתי מסתכלת פעמיים, וזה אולי מחמאה.</w:t>
+        <w:t xml:space="preserve">הנה, זאת אני מבינה. היא נראית נעימה. רגועה. מסודרת בלי להתאמץ. ואני לא רואה בה שום דבר מיוחד בבגדים, היא הכי נורמלית מכל הארבעה עד עכשיו. סוודר, מכנסיים, מעיל. היא נראית כמו קולגה שלי, כמו המנהלת שלנו, כמו מישהי שאני פוגשת בהשתלמות ומתיישבת לידה. אם הייתי רואה אותה ברחוב לא הייתי מסתכלת פעמיים. וזה, אצלי, מחמאה.</w:t>
       </w:r>
     </w:p>
     <w:p>
@@ -4241,7 +4241,7 @@
           <w:szCs w:val="24"/>
           <w:rtl/>
         </w:rPr>
-        <w:t xml:space="preserve">מורה, מנהלת, עובדת סוציאלית בכירה, אולי רופאה. מישהי עם מקצוע, שמתלבשת לעבודה. היא נראית כמו מישהי שעובדת עם אנשים ושמכבדים אותה. אולי מרצה באוניברסיטה.</w:t>
+        <w:t xml:space="preserve">מורה. מנהלת בית ספר. עובדת סוציאלית בכירה. אולי רופאה. מישהי עם מקצוע, שמתלבשת לעבודה, ושאנשים מכבדים אותה בעבודה. אולי מרצה. היא נראית כמו מישהי שעובדת עם אנשים.</w:t>
       </w:r>
     </w:p>
     <w:p>
@@ -4301,7 +4301,7 @@
           <w:szCs w:val="24"/>
           <w:rtl/>
         </w:rPr>
-        <w:t xml:space="preserve">בינוני-גבוה, הייתי אומרת. משכילה, מסודרת, לא עשירה במיוחד ולא ענייה. אני לא רואה שום דבר שאומר "כסף גדול". היא נראית כמוני, בעצם, רק יותר מסודרת. מעמד של אנשי מקצוע, לא של עשירים. אם תגידי לי אחר כך שהיא מיליונרית, אני אתפלא.</w:t>
+        <w:t xml:space="preserve">בינוני-גבוה. משכילה, מסודרת, לא עשירה במיוחד ולא ענייה. אני לא רואה עליה שום דבר שאומר "כסף גדול". היא נראית כמוני, רק יותר מסודרת ועם מעיל יותר יפה. מעמד של אנשי מקצוע, לא של עשירים. ואם תגידי לי אחר כך שהיא מיליונרית, אני אתפלא. באמת אתפלא.</w:t>
       </w:r>
     </w:p>
     <w:p>
@@ -4361,7 +4361,7 @@
           <w:szCs w:val="24"/>
           <w:rtl/>
         </w:rPr>
-        <w:t xml:space="preserve">הפשטות. אין פה שום דבר שצועק, אין שמות, אין זהב, אין צבעים. הבגדים נראים נוחים ונעימים, ולכן אני חושבת על אדם נוח ונעים. ואני מודה שאני לא יודעת להבדיל בין סוודר יקר לזול, בשבילי סוודר בז' הוא סוודר בז'. אז מה שגרם לי לחשוב שהיא בינונית זה שלא ראיתי שום סימן של עושר. אולי יש סימנים שאני לא יודעת לקרוא.</w:t>
+        <w:t xml:space="preserve">הפשטות. אין שום דבר שצועק, אין שמות, אין זהב, אין צבעים. הבגדים נראים נוחים, ואני חושבת על אדם נוח. ואני מודה, אני לא יודעת להבדיל בין סוודר יקר לסוודר זול, בשבילי סוודר בז' הוא סוודר בז'. אז מה שגרם לי להגיד "בינונית" זה שלא ראיתי שום סימן של עושר. אולי יש סימנים שאני לא יודעת לקרוא. כמו שאני לא יודעת לקרוא סינית. זה לא אומר שאין שם כתוב משהו.</w:t>
       </w:r>
     </w:p>
     <w:p>
@@ -4440,7 +4440,7 @@
           <w:szCs w:val="24"/>
           <w:rtl/>
         </w:rPr>
-        <w:t xml:space="preserve">גבר נעים, מסודר, נראה כמו אבא של תלמיד שבא לאסיפת הורים. בוגר, רגוע, מכובד. חולצה פשוטה, מכנסיים פשוטים. הוא נראה לי כמו מישהו שאפשר לדבר איתו, שמקשיב. מהארבעה הוא הכי "רגיל" בעיניי, ואני מתכוונת לזה טוב.</w:t>
+        <w:t xml:space="preserve">גבר נעים, מסודר, בוגר. אבא של תלמיד שבא לאסיפת הורים ויושב בשקט ושואל שאלה טובה אחת. חולצה פשוטה, מכנסיים פשוטים, נעליים. הוא נראה לי כמו מישהו שאפשר לדבר איתו ושהוא מקשיב. מהארבעה הוא הכי "רגיל", ואני מתכוונת לזה בצורה הכי טובה. רגיל זה דבר טוב בעיניי.</w:t>
       </w:r>
     </w:p>
     <w:p>
@@ -4500,7 +4500,7 @@
           <w:szCs w:val="24"/>
           <w:rtl/>
         </w:rPr>
-        <w:t xml:space="preserve">מהנדס, רופא, אולי מנהל במפעל. או איש עסקים, אבל מהסוג השקט. אולי עורך דין. מישהו שלמד ועובד הרבה שנים באותו מקום.</w:t>
+        <w:t xml:space="preserve">מהנדס. רופא. מנהל במפעל, יש פה הרבה כאלה, מהמפעלים בעמק. איש עסקים, אבל מהשקטים. עורך דין אולי. מישהו שלמד, ועובד הרבה שנים באותו מקום, וחוזר הביתה בשש.</w:t>
       </w:r>
     </w:p>
     <w:p>
@@ -4560,7 +4560,7 @@
           <w:szCs w:val="24"/>
           <w:rtl/>
         </w:rPr>
-        <w:t xml:space="preserve">בינוני-גבוה, כמו האישה הקודמת. מסודר, בטוח, לא נראה עשיר במיוחד. הייתי ממקמת אותו במעמד של אנשים עם מקצוע טוב שחיים בנוחות. לא בפסגה, אבל רחוק מהתחתית. הוא נראה כמו רוב האבות בטבעון.</w:t>
+        <w:t xml:space="preserve">בינוני-גבוה. כמו האישה הקודמת. מסודר, בטוח, לא נראה לי עשיר במיוחד. מעמד של אנשים עם מקצוע טוב שחיים בנוחות. לא בפסגה, רחוק מהתחתית. הוא נראה כמו רוב האבות בטבעון, האמת. כמו בעלי, בערך, רק עם חולצה מגוהצת יותר.</w:t>
       </w:r>
     </w:p>
     <w:p>
@@ -4620,7 +4620,7 @@
           <w:szCs w:val="24"/>
           <w:rtl/>
         </w:rPr>
-        <w:t xml:space="preserve">שאין שום דבר. שום סימן. אין לוגו, אין שעון בולט, הבגדים נראים כמו בגדים ולא כמו הצהרה. ובשבילי זה אומר אדם שלא עסוק במה חושבים עליו, והאנשים האלה הם בדרך כלל אנשים שעובדים ומסודרים. ושוב, אולי הנעליים שלו עולות אלפים, אבל אני לא רואה את זה, ואני חושבת שרוב האנשים לא רואים.</w:t>
+        <w:t xml:space="preserve">שאין שום דבר. שום סימן. אין לוגו, אין שעון בולט, הבגדים הם בגדים ולא הצהרה. ובשבילי זה אדם שלא עסוק במה חושבים עליו, ואנשים כאלה הם בדרך כלל אנשים עובדים ומסודרים. ושוב, אולי הנעליים שלו עולות אלפים, ואני לא רואה, ואני חושבת שרוב האנשים לא רואים, ואולי זה בדיוק העניין ואני לא מבינה אותו.</w:t>
       </w:r>
     </w:p>
     <w:p>
@@ -4699,7 +4699,7 @@
           <w:szCs w:val="24"/>
           <w:rtl/>
         </w:rPr>
-        <w:t xml:space="preserve">זה קשה לי, כי אני לא רואה פערים גדולים. אני אסדר: 4, 3, 1, 2, אבל עם הסתייגות: את שני הראשונים אני שמה גבוה בגלל שהם נראים לי מסודרים ומכובדים, ולא בגלל שהם נראים לי עשירים. את הבחור בטרנינג שלישי, כי יש לו כנראה כסף, אבל לא מעמד, אם אפשר להפריד. והבחורה אחרונה, כי היא נראית לי הכי צעירה והכי לא מגובשת. ובעצם, אם תשאלי רק על כסף, אולי הסדר הפוך: הבחור בטרנינג ראשון, כי הוא היחיד שאני רואה עליו כסף.</w:t>
+        <w:t xml:space="preserve">זה קשה לי, כי אני לא רואה פערים גדולים. אני אסדר... ארבע, שלוש, אחת, שתיים. אבל רגע, הסתייגות: את שני הראשונים שמתי גבוה כי הם נראים לי מסודרים ומכובדים, לא כי הם נראים לי עשירים. את הבחור בטרנינג שלישי כי יש לו כנראה כסף אבל לא... לא מעמד, אם אפשר להפריד ביניהם, ואני חושבת שאפשר. והבחורה אחרונה כי היא נראית לי הכי צעירה והכי לא מגובשת. ואם תשאלי רק על כסף, רק כסף, אז אולי הסדר הפוך: הבחור בטרנינג ראשון, כי הוא היחיד שאני רואה עליו כסף, והשניים השקטים אחרונים. אז מה דירגתי? נראה לי שדירגתי מי הייתי רוצה שילמד את הילדים שלי.</w:t>
       </w:r>
     </w:p>
     <w:p>
@@ -4759,7 +4759,7 @@
           <w:szCs w:val="24"/>
           <w:rtl/>
         </w:rPr>
-        <w:t xml:space="preserve">מי שמנסה להיראות עשיר זה שניים הראשונים, בלי ספק, הבחור והבחורה. הם לובשים את הכסף. מי שנראה עשיר בלי להתאמץ, האמת, אף אחד. השניים השקטים לא נראים לי עשירים, הם נראים לי מסודרים. אולי זה ההבדל בין איך שאני רואה לבין איך שהבנות שלי היו רואות. בשבילי "עשיר" זה משהו שרואים, ואם לא רואים, זה לא קיים. אז שניים מנסים, ושניים לא מנסים ולא נראים.</w:t>
+        <w:t xml:space="preserve">מי שמנסה להיראות עשיר, שניים הראשונים, בלי ספק, הם לובשים את הכסף. מי שנראה עשיר בלי להתאמץ... האמת? אף אחד. השניים השקטים לא נראים לי עשירים בכלל. הם נראים לי מסודרים. ואולי זה ההבדל ביני לבין הבנות שלי, שהיו רואות פה משהו אחר. בשבילי "עשיר" זה משהו שרואים, ואם לא רואים, זה לא שם. אז יש פה שניים שמנסים ומצליחים להיראות עשירים, ושניים שלא מנסים ולא נראים. ואני, אם תשאלי, מעדיפה את אלה שלא נראים. אבל זה לא מה ששאלת.</w:t>
       </w:r>
     </w:p>
     <w:p>
@@ -4819,7 +4819,7 @@
           <w:szCs w:val="24"/>
           <w:rtl/>
         </w:rPr>
-        <w:t xml:space="preserve">עם הגבר בתמונה 4, לעבוד ולהיות חברה. הוא נראה אדם שאפשר לסמוך עליו ושלא ייקח את עצמו ברצינות יתר. האישה בתמונה 3 גם, היא נראית כמו חברה טובה, כזאת שיושבים איתה על קפה ומדברים על ספרים. השניים הראשונים, פחות. לא בגלל שהם אנשים רעים, אני לא יודעת כלום עליהם, אלא כי אני מרגישה שלא היה לנו על מה לדבר. ויכול להיות שאני טועה לגמרי, זה רק בגדים.</w:t>
+        <w:t xml:space="preserve">הגבר. לעבוד וגם להיות חברה. הוא נראה כמו מישהו שאפשר לסמוך עליו, שלא ייקח את עצמו ברצינות יתר, שיצחק על עצמו. האישה גם, היא נראית כמו חברה טובה, כזאת שיושבים איתה על קפה ומדברים על ספר. השניים הראשונים, פחות. לא כי הם אנשים רעים, אני לא יודעת עליהם כלום, אלא כי אני מרגישה שלא היה לנו על מה לדבר. ויכול להיות שאני טועה לגמרי. בטח שאני טועה. זה תמונה של בן אדם בבגדים, לא בן אדם.</w:t>
       </w:r>
     </w:p>
     <w:p>
@@ -4917,7 +4917,7 @@
           <w:szCs w:val="24"/>
           <w:rtl/>
         </w:rPr>
-        <w:t xml:space="preserve">כן, זה מפתיע אותי, ודי הרבה. אני באמת חשבתי שהסוודר של האישה הוא סוודר רגיל, והחולצה של הגבר היא חולצה רגילה. אם הם עולים אלפי שקלים, אז אני לגמרי לא ראיתי את זה, ומה שאמרתי עליהם, "בינוני", היה טעות. וזה משנה משהו בדעה שלי, בעיקר על עצמי: הבנתי שאני רואה רק את העושר שצועק, ושיש עושר שמדבר בשפה שאני לא יודעת. ואולי זה גם אומר משהו על האנשים האלה: שהם מתלבשים כדי שאנשים כמוני לא יראו, ורק אנשים כמוהם יראו. זה קצת מטריד, האמת, יותר מהלוגו.</w:t>
+        <w:t xml:space="preserve">כן. זה מפתיע אותי, די הרבה. חשבתי שהסוודר הוא סוודר רגיל והחולצה היא חולצה רגילה. אם הם עולים אלפים, אז לא ראיתי את זה בכלל, ומה שאמרתי, "בינוני", היה פשוט טעות. ובעיקר זה משנה לי משהו על עצמי: הבנתי שאני רואה רק את העושר שצועק, ויש עושר שמדבר בשפה שאני לא יודעת. ואז אני חושבת על האנשים האלה: הם מתלבשים כך שאנשים כמוני לא יראו, ורק אנשים כמוהם יראו. זה... זה קצת מטריד אותי, האמת, יותר מהלוגו. הלוגו לפחות מדבר איתי. זה מדבר מעל הראש שלי. (המראיינת: מטריד איך?) כאילו יש מועדון, ולא ידעתי שהוא קיים, ועכשיו אני יודעת שלא אני בו.</w:t>
       </w:r>
     </w:p>
     <w:p>
@@ -4977,7 +4977,7 @@
           <w:szCs w:val="24"/>
           <w:rtl/>
         </w:rPr>
-        <w:t xml:space="preserve">מה שעובר לי בראש זה "למה". ואז אני חושבת על התלמידים שלי. אצלנו בבית הספר הלוגו הוא עניין רציני, ילדים נמדדים לפי זה, ויש ילדים שההורים שלהם קונים להם דברים שהם לא יכולים להרשות לעצמם כדי שהילד לא ייפגע. אז כשאני רואה לוגו גדול, אני לא חושבת "עשיר", אני חושבת "מישהו אמר לו שככה מכבדים אותו". ואני קצת עצובה על זה. אבל אני גם יודעת שאני מבוגרת ושזה אולי לא העניין שלי לשפוט.</w:t>
+        <w:t xml:space="preserve">"למה". זה מה שעובר. ואז אני חושבת על התלמידים. אצלנו הלוגו זה עניין רציני, ילדים נמדדים לפי זה, ויש הורים שקונים לילד דברים שהם לא יכולים להרשות לעצמם כדי שהילד לא ייפגע, ואני יודעת, כי הם אומרים לי את זה באסיפות. אז כשאני רואה לוגו גדול אני לא חושבת "עשיר". אני חושבת "מישהו אמר לו שככה מכבדים אותו". וזה עושה לי עצב. ואני גם יודעת שאני מבוגרת, ושאולי זה לא העניין שלי לשפוט, ושאולי הבחור בטרנינג מאושר יותר ממני. אבל שאלת מה עובר, וזה מה שעובר.</w:t>
       </w:r>
     </w:p>
     <w:p>
@@ -5037,7 +5037,7 @@
           <w:szCs w:val="24"/>
           <w:rtl/>
         </w:rPr>
-        <w:t xml:space="preserve">רק מה שאמרתי: שהראיון הזה לימד אותי שאני קוראת רק חצי מהשפה. ושאולי כדאי שאלמד את החצי השני, לא כדי לקנות, אלא כדי להבין את מי שלובש. ועוד משהו למחקר שלך: תחשבי על גיל. אני בטוחה שבחורה בת עשרים וחמש הייתה עונה לך הפוך ממני על התמונות של השקטים, ואני לא יודעת מי מאיתנו צודקת.</w:t>
+        <w:t xml:space="preserve">רק מה שאמרתי, שהראיון הזה לימד אותי שאני קוראת חצי שפה. ושאולי כדאי שאלמד את החצי השני, לא בשביל לקנות, בשביל להבין את מי שלובש. בעיקר את התלמידים. ועוד משהו למחקר: גיל. אני בטוחה שבחורה בת עשרים וחמש הייתה עונה לך הפוך ממני על השניים השקטים, שהייתה רואה בהם עושר מיד. ואני לא יודעת מי מאיתנו צודקת. אולי שתינו. אולי זאת בדיוק הנקודה.</w:t>
       </w:r>
     </w:p>
     <w:p>
@@ -5093,7 +5093,7 @@
           <w:szCs w:val="24"/>
           <w:rtl/>
         </w:rPr>
-        <w:t xml:space="preserve">תאריך: 6.10.2026    משך: 21 דקות    מקום: בית קפה בשכונת הדר, חיפה, בהפסקה בין משמרות    הקלטה: בטלפון, בהסכמה</w:t>
+        <w:t xml:space="preserve">תאריך: 6.10.2026    משך: 22 דקות    מקום: בית קפה בשכונת הדר, חיפה, בהפסקה בין משמרות    הקלטה: בטלפון, בהסכמה</w:t>
       </w:r>
     </w:p>
     <w:p>
@@ -5172,7 +5172,7 @@
           <w:szCs w:val="24"/>
           <w:rtl/>
         </w:rPr>
-        <w:t xml:space="preserve">אני בת שלושים, אחות במחלקה פנימית בבית חולים בחיפה, עובדת שם שש שנים. גרה בהדר, במקור מכפר ליד שפרעם, עברתי לחיפה בשביל הלימודים ונשארתי. רווקה, גרה עם אחותי, שלומדת בטכניון. אני עובדת במשמרות, אז רוב הזמן אני במדים, וכשאני לא במדים אני משתדלת להיראות כמו בן אדם.</w:t>
+        <w:t xml:space="preserve">בת שלושים. אחות במחלקה פנימית בבית חולים בחיפה, שש שנים. גרה בהדר עם אחותי, שלומדת בטכניון. במקור מכפר ליד שפרעם, באתי לחיפה ללימודים ונשארתי, ההורים עדיין שואלים מתי אני חוזרת. רווקה. עובדת במשמרות, אז רוב החיים שלי אני בחלוק, וכשאני לא בחלוק אני מנסה להיראות כמו בן אדם, ולפעמים מצליחה.</w:t>
       </w:r>
     </w:p>
     <w:p>
@@ -5232,7 +5232,7 @@
           <w:szCs w:val="24"/>
           <w:rtl/>
         </w:rPr>
-        <w:t xml:space="preserve">שלוש. אני אוהבת בגדים, אני קונה, אני מסתכלת, אבל אני לא "בקטע". אין לי זמן ואין לי כסף לזה, ובמחלקה אף אחד לא רואה מה אני לובשת מתחת לחלוק. אני כן שמה לב למה אנשים לובשים, זה חלק מהעבודה שלי בעצם, כי כשמטופל נכנס אני רואה אותו לפני שאני יודעת עליו כלום, ואני לומדת ממה שהוא לובש.</w:t>
+        <w:t xml:space="preserve">שלוש. אני אוהבת בגדים, אני קונה, אני מסתכלת, אבל אני לא "בקטע". אין לי זמן ואין לי כסף, ובמחלקה אף אחד לא רואה מה יש מתחת לחלוק. אבל אני כן שמה לב למה אנשים לובשים, זה חלק מהעבודה. מטופל נכנס, ואני רואה אותו לפני שאני יודעת עליו כלום, ומהבגדים אני כבר יודעת דברים. מי יבוא לבקר אותו. אם יש לו למי להתקשר. אז אולי זה יותר משלוש, רק בכיוון אחר.</w:t>
       </w:r>
     </w:p>
     <w:p>
@@ -5330,7 +5330,7 @@
           <w:szCs w:val="24"/>
           <w:rtl/>
         </w:rPr>
-        <w:t xml:space="preserve">זה בחור שאני מכירה היטב, במובן שיש כאלה בכל מקום בחיפה, בכפר שלי, בכל מקום. הוא נראה לי צעיר, מתלהב, רוצה להיראות מצליח. יש בו משהו חביב בעיניי, כי אני מבינה מאיפה זה בא: הוא בא ממקום שבו להיראות ככה זה אומר שהצלחת. אני לא מרגישה ממנו התנשאות, אני מרגישה ממנו רצון שיכבדו אותו.</w:t>
+        <w:t xml:space="preserve">אה, אותו אני מכירה. לא אותו, אבל כאלה יש בכל מקום, בכפר שלי יש עשרה כאלה. בחור צעיר, מתלהב, רוצה להיראות מצליח, וזה חביב בעיניי, באמת, כי אני מבינה מאיפה זה בא. במקום שהוא בא ממנו, ואני מנחשת שזה מקום כמו שלי, להיראות ככה אומר שהצלחת. אני לא מרגישה ממנו התנשאות. אני מרגישה רצון שיכבדו אותו. וזה דבר אחר לגמרי מהתנשאות, גם אם מבחוץ זה נראה אותו דבר.</w:t>
       </w:r>
     </w:p>
     <w:p>
@@ -5390,7 +5390,7 @@
           <w:szCs w:val="24"/>
           <w:rtl/>
         </w:rPr>
-        <w:t xml:space="preserve">משהו עצמאי. יש לו עסק, או שהוא עובד בעסק של המשפחה. בניין, רכב, סחורה, לא יודעת בדיוק. הרבה מהבחורים מהכפרים שמצליחים מתלבשים ככה, כי זה הסימן. יכול להיות גם ספורטאי. אני לא רואה אותו עובד בשכר אצל מישהו.</w:t>
+        <w:t xml:space="preserve">עצמאי. עסק משלו או של המשפחה. בניין, רכב, סחורה, משהו. אצלנו הבחורים שמצליחים מתלבשים בדיוק ככה, כי זה הסימן שהצלחת, כמו רכב חדש. יכול להיות גם ספורטאי. לא עובד בשכר אצל מישהו, זה בטוח. מי שעובד אצל מישהו לא לובש ככה, כי הבוס יסתכל.</w:t>
       </w:r>
     </w:p>
     <w:p>
@@ -5450,7 +5450,7 @@
           <w:szCs w:val="24"/>
           <w:rtl/>
         </w:rPr>
-        <w:t xml:space="preserve">כלכלית, הייתי אומרת שיש לו, או שהוא מראה שיש לו, ואצלנו זה לפעמים אותו דבר. חברתית, אני לא יודעת איך להגיד את זה בלי שזה יישמע לא טוב. הוא ממקום שבו העושר הוא חדש, ושהיה בו מחסור, ועכשיו הוא רוצה שזה ייראה. בחברה שלי זה מאוד מוכר. אני לא אשפוט אותו על זה, כי אני מבינה את הצורך.</w:t>
+        <w:t xml:space="preserve">כלכלית, יש לו, או שהוא מראה שיש לו, ואצלנו זה לפעמים אותו דבר. יש בחורים בכפר עם שעון זהב וחובות. חברתית... איך להגיד את זה בלי שזה יישמע רע. הוא ממקום שבו העושר חדש, ושהיה בו מחסור, ועכשיו רוצים שזה ייראה. ואני לא אשפוט אותו, כי אני מבינה את הצורך הזה מבפנים. אבא שלי קנה את המרצדס הראשונה שלו ונסע איתה שלוש פעמים ברחוב הראשי לפני שחנה. אותו דבר.</w:t>
       </w:r>
     </w:p>
     <w:p>
@@ -5510,7 +5510,7 @@
           <w:szCs w:val="24"/>
           <w:rtl/>
         </w:rPr>
-        <w:t xml:space="preserve">הלוגו הגדול, ברור, והשעון הזהב, ובעיקר שהכול ביחד. אבל גם משהו שאולי לא רואים: שהבגדים חדשים לגמרי, כאילו קנה אותם אתמול. אצל מי שיש כסף הרבה זמן הבגדים נראים "חיים". פה הכול מבריק. וזה אומר לי שהוא בתחילת הדרך של להיות עשיר, ובתחילת הדרך מראים.</w:t>
+        <w:t xml:space="preserve">הלוגו הגדול, השעון הזהב, ובעיקר שהכול ביחד. אבל יש גם משהו שאולי לא שמים לב אליו: הבגדים חדשים לגמרי. כאילו קנה אתמול. אצל מי שיש לו כסף הרבה זמן הבגדים נראים "חיים", קצת מקומטים, קצת משומשים. פה הכול מבריק, עם הקפלים מהקופסה. וזה אומר לי שהוא בתחילת הדרך של להיות עשיר, ובתחילת הדרך מראים. אחר כך, אולי, מפסיקים.</w:t>
       </w:r>
     </w:p>
     <w:p>
@@ -5589,7 +5589,7 @@
           <w:szCs w:val="24"/>
           <w:rtl/>
         </w:rPr>
-        <w:t xml:space="preserve">בחורה יפה מאוד, מטופחת, מושקעת בכל פרט. היא נראית לי כמו מישהי שהלוק הוא חלק מהעבודה שלה, או חלק מהזהות שלה. היא לא נראית לי רעה או שטחית, היא נראית לי כמו מישהי שגדלה בעולם שבו ככה נראות. אני חושבת על בנות דודות שלי, יש לי כמה כאלה.</w:t>
+        <w:t xml:space="preserve">יפה מאוד. מטופחת. מושקעת בכל פרט, הציפורניים, הריסים, השיער. היא נראית לי כמו מישהי שהלוק הוא חלק מהעבודה שלה, או חלק מהזהות. היא לא שטחית בעיניי, היא נראית כמו מישהי שגדלה בעולם שבו ככה נראות ונקודה. יש לי בנות דודות ככה. שתיים. אני אוהבת אותן, ואני לא מבינה איך הן מחזיקות ציפורניים כאלה.</w:t>
       </w:r>
     </w:p>
     <w:p>
@@ -5649,7 +5649,7 @@
           <w:szCs w:val="24"/>
           <w:rtl/>
         </w:rPr>
-        <w:t xml:space="preserve">משהו ביופי: קוסמטיקה, איפור, ציפורניים. או מוכרת בחנות יוקרתית. או שהיא מאורסת ומתכוננת, זה גם לוק של כלה לעתיד אצלנו. אני לא רואה אותה בבית חולים, לא בגלל שלא יכולה, אלא כי הלוק הזה לא שורד משמרת.</w:t>
+        <w:t xml:space="preserve">יופי. קוסמטיקה, איפור, ציפורניים, לקים. או מוכרת בחנות יוקרתית. או מאורסת ומתכוננת לחתונה, זה גם לוק כזה אצלנו, כלה לעתיד, כל פריט מתנה מהחתן. בבית חולים לא, לא כי היא לא יכולה, אלא כי הלוק הזה לא שורד משמרת לילה אחת.</w:t>
       </w:r>
     </w:p>
     <w:p>
@@ -5709,7 +5709,7 @@
           <w:szCs w:val="24"/>
           <w:rtl/>
         </w:rPr>
-        <w:t xml:space="preserve">כלכלית, אני לא יודעת אם הכסף שלה, ואני מניחה שלא, בגלל הגיל. חברתית, מעמד בינוני, משפחה שמשקיעה בבת. בחברה שלי, בת שנראית ככה היא בת שהמשפחה שלה רוצה שתיראה טוב, ושהתיק הוא לפעמים מתנה של אבא או של ארוס. זה לא אומר שהמשפחה עשירה, זה אומר שהמשפחה רוצה להראות שהיא מסודרת.</w:t>
+        <w:t xml:space="preserve">כלכלית, אני לא יודעת אם הכסף שלה, ואני מניחה שלא, בגלל הגיל. חברתית, בינוני. משפחה שמשקיעה בבת. אצלנו, בת שנראית ככה היא בת שהמשפחה רוצה שתיראה טוב, והתיק הוא לפעמים מאבא ולפעמים מהארוס. זה לא אומר שהמשפחה עשירה. זה אומר שהמשפחה רוצה שידעו שהיא מסודרת. ההבדל דק, ואצלנו הוא חשוב.</w:t>
       </w:r>
     </w:p>
     <w:p>
@@ -5769,7 +5769,7 @@
           <w:szCs w:val="24"/>
           <w:rtl/>
         </w:rPr>
-        <w:t xml:space="preserve">התיק, לפני הכול. התיק הזה הוא התיק שכולן אצלנו רוצות, ורואים אותו בכל חתונה. והחולצה עם השם, והמשקפיים. והציפורניים, שזה לא לבוש, אבל זה אומר הרבה: ציפורניים כאלה אי אפשר לעבוד איתן בעבודה פיזית, אז היא לא עובדת בידיים. זה מה שעשה לי את הרושם: לוק שנועד להיראות, לא לעבוד.</w:t>
+        <w:t xml:space="preserve">התיק. קודם כול. זה התיק שכולן רוצות, ורואים אותו בכל חתונה, שלוש ארבע כאלה בשולחן. והחולצה עם השם. והמשקפיים. והציפורניים, שזה לא בגד, אבל זה אומר הכי הרבה: עם ציפורניים כאלה אי אפשר לעבוד בידיים, אי אפשר לחבר עירוי, אי אפשר לבשל. אז היא לא עובדת בידיים. וזה מה שנתן לי את הרושם: לוק שנועד להיראות, לא לעבוד. והיא בחרה את זה, וזה בסדר.</w:t>
       </w:r>
     </w:p>
     <w:p>
@@ -5848,7 +5848,7 @@
           <w:szCs w:val="24"/>
           <w:rtl/>
         </w:rPr>
-        <w:t xml:space="preserve">אישה יפה בצורה אחרת. שקטה. היא נראית לי חכמה ובטוחה, מישהי שלא צריכה את המבט של אף אחד. ואני אגיד משהו: היא נראית לי כמו רופאה בכירה במחלקה. יש לנו רופאות שמגיעות בבוקר בדיוק ככה, סוודר פשוט, מכנסיים שחורים, שיער אסוף, ואת יודעת שהן מנהלות את המקום.</w:t>
+        <w:t xml:space="preserve">יפה אחרת. שקטה. היא נראית חכמה ובטוחה, כזאת שלא צריכה את המבט של אף אחד. ואני אגיד לך בדיוק מה עלה לי: רופאה בכירה במחלקה. יש לנו שתיים כאלה, שמגיעות בבוקר בדיוק ככה, סוודר פשוט, מכנסיים שחורים, שיער אסוף, ולא צריכות להגיד כלום כדי שכולם יידעו מי מנהל. אני רואה אותן ואני יודעת שהיום יהיה מסודר.</w:t>
       </w:r>
     </w:p>
     <w:p>
@@ -5908,7 +5908,7 @@
           <w:szCs w:val="24"/>
           <w:rtl/>
         </w:rPr>
-        <w:t xml:space="preserve">רופאה בכירה, אמרתי. או מנהלת, או עורכת דין, או מרצה. משהו שבו היא הסמכות ולא צריכה להוכיח את זה. אני מדמיינת אותה נכנסת לחדר וכולם משתתקים, בלי שהיא מרימה את הקול.</w:t>
+        <w:t xml:space="preserve">רופאה בכירה, אמרתי. או מנהלת, או עורכת דין, או מרצה. משהו שבו היא הסמכות ולא צריכה להוכיח. אני מדמיינת אותה נכנסת לחדר וכולם משתתקים, בלי שהיא מרימה את הקול. ככה הרופאות הבכירות שלנו. הצעירות מרימות קול. הבכירות לא צריכות.</w:t>
       </w:r>
     </w:p>
     <w:p>
@@ -5968,7 +5968,7 @@
           <w:szCs w:val="24"/>
           <w:rtl/>
         </w:rPr>
-        <w:t xml:space="preserve">גבוה. כלכלית, אני מנחשת שגבוה, אבל זה ניחוש, כי אני לא רואה כסף, אני רואה טעם. חברתית, גבוה בטוח: זה לוק של מישהי שיש לה מעמד ממה שהיא עושה, לא ממה שהיא לובשת. בחברה שלי יש מעט נשים שנראות ככה, ואלה שכן הן בדרך כלל נשים שלמדו הרבה.</w:t>
+        <w:t xml:space="preserve">גבוה. כלכלית, אני מנחשת גבוה, אבל זה ניחוש, כי אני לא רואה כסף, אני רואה טעם. חברתית, גבוה בטוח: לוק של מישהי שהמעמד שלה בא ממה שהיא עושה, לא ממה שהיא לובשת. ואצלנו, בחברה שלי, יש מעט נשים שנראות ככה. ואלה שכן, זה בדרך כלל נשים שלמדו הרבה שנים ויצאו מהכפר. אז אולי זה גם למה אני מסתכלת עליה ככה. היא מה שאחותי תהיה.</w:t>
       </w:r>
     </w:p>
     <w:p>
@@ -6028,7 +6028,7 @@
           <w:szCs w:val="24"/>
           <w:rtl/>
         </w:rPr>
-        <w:t xml:space="preserve">השקט. אין שום דבר בולט, ובכל זאת היא נראית יקרה. אני חושבת שזה הבדים, הסוודר נראה רך, והמעיל נראה כבד וטוב. והשיער האסוף הפשוט. אני מודה שאני לא יודעת כמה זה עולה, ואולי זה סוודר רגיל, אבל הרושם שלי הוא של מישהי שיכולה להרשות לעצמה לא להראות. ואני חושבת שזה הדבר הכי יקר שיש.</w:t>
+        <w:t xml:space="preserve">השקט. אין שום דבר בולט, ובכל זאת היא נראית יקרה. הסוודר נראה רך, המעיל נראה כבד וטוב, התיק נראה... לא יודעת, "נכון". והשיער האסוף הפשוט. ואני מודה שאני לא יודעת כמה זה עולה, אולי הסוודר מהקניון. אבל הרושם הוא של מישהי שיכולה להרשות לעצמה לא להראות. וזה, אני חושבת, הדבר הכי יקר שיש, כי אצלנו אף אחד לא יכול להרשות לעצמו את זה. אצלנו מי שלא מראה, חושבים שאין לו.</w:t>
       </w:r>
     </w:p>
     <w:p>
@@ -6107,7 +6107,7 @@
           <w:szCs w:val="24"/>
           <w:rtl/>
         </w:rPr>
-        <w:t xml:space="preserve">גבר רגוע, מסודר, נעים. נראה כמו רופא בכיר, גם הוא, או כמו מנהל של משהו. הוא לא מנסה להרשים ולכן הוא מרשים. אם הייתי רואה אותו במחלקה הייתי מניחה שהוא בא לבקר הורה, ושהוא ידבר איתנו בכבוד.</w:t>
+        <w:t xml:space="preserve">גבר רגוע. מסודר. נעים. גם הוא נראה כמו רופא בכיר, או מנהל של משהו. הוא לא מנסה להרשים ולכן מרשים. אם הייתי רואה אותו במחלקה הייתי מניחה שבא לבקר את אבא שלו, ושידבר איתנו בכבוד, ויגיד תודה כשיוצא. יש כאלה. לא הרבה.</w:t>
       </w:r>
     </w:p>
     <w:p>
@@ -6167,7 +6167,7 @@
           <w:szCs w:val="24"/>
           <w:rtl/>
         </w:rPr>
-        <w:t xml:space="preserve">רופא, מנהל, מהנדס בכיר, עורך דין. מישהו שאנשים באים אליו ולא הוא אליהם. יכול להיות גם איש עסקים ותיק, מהסוג שאין לו צורך להראות. ואני רואה אותו כאבא של משפחה שמגיע הביתה בשש ואוכל עם הילדים.</w:t>
+        <w:t xml:space="preserve">רופא, מנהל, מהנדס בכיר, עורך דין. מישהו שאנשים באים אליו ולא הוא אליהם. או איש עסקים ותיק, מהסוג שכבר לא צריך להראות. ואני רואה אותו אבא של משפחה, מגיע הביתה בשש, אוכל עם הילדים, שואל מה היה בבית הספר.</w:t>
       </w:r>
     </w:p>
     <w:p>
@@ -6227,7 +6227,7 @@
           <w:szCs w:val="24"/>
           <w:rtl/>
         </w:rPr>
-        <w:t xml:space="preserve">גבוה, כמו האישה בתמונה 3. הם נראים לי מאותו עולם. ואני אגיד משהו על החברה שלי: גבר ערבי עשיר כמעט אף פעם לא נראה ככה, הוא ייראה כמו הבחור בתמונה 1. הלוק הזה הוא לוק של מי שלא צריך להוכיח, ובחברה שעדיין מוכיחה, זה נדיר. אז אני הייתי מנחשת שהוא ממקום שבו העושר כבר ותיק.</w:t>
+        <w:t xml:space="preserve">גבוה, כמו האישה בתמונה 3, אותו עולם. ואני רוצה להגיד משהו על החברה שלי: גבר ערבי עשיר כמעט אף פעם לא נראה ככה. הוא ייראה כמו הבחור בתמונה 1. הלוק הזה, של "אני לא צריך להוכיח", הוא לוק של מי שכבר הוכיחו בשבילו, אבא שלו, סבא שלו. ובחברה שעדיין מוכיחה, זה נדיר מאוד. אז אני מנחשת שהוא ממקום שבו העושר ותיק, שלושה דורות לפחות.</w:t>
       </w:r>
     </w:p>
     <w:p>
@@ -6287,7 +6287,7 @@
           <w:szCs w:val="24"/>
           <w:rtl/>
         </w:rPr>
-        <w:t xml:space="preserve">הנעליים, שנראות מעור טוב ולא חדשות, והשעון הדק, והחולצה שיושבת טוב. ובעיקר שאין לוגו בשום מקום. אצל גברים, לדעתי, זה מסגיר הכי הרבה: גבר שיש לו כסף ולא שם לוגו הוא גבר שהכסף אצלו הוא לא חדשות. ובמחלקה למדתי שאנשים כאלה הם בדרך כלל גם הכי מנומסים, אני לא יודעת למה.</w:t>
+        <w:t xml:space="preserve">הנעליים, שנראות מעור טוב ולא חדשות, קצת חיות. השעון הדק. החולצה שיושבת. ובעיקר שאין לוגו, בשום מקום, חיפשתי. אצל גברים זה מסגיר הכי הרבה, לדעתי: גבר שיש לו כסף ולא שם לוגו הוא גבר שהכסף אצלו הוא לא חדשות. ובמחלקה למדתי משהו: האנשים האלה הם בדרך כלל הכי מנומסים. לא יודעת למה. אולי כי אין להם ממה לפחד.</w:t>
       </w:r>
     </w:p>
     <w:p>
@@ -6366,7 +6366,7 @@
           <w:szCs w:val="24"/>
           <w:rtl/>
         </w:rPr>
-        <w:t xml:space="preserve">3, 4, 1, 2. האישה בבז' ראשונה, כי היא נראית לי הכי בטוחה והכי "מגיעה ממקום", וקצת מעל הגבר כי אצלי נשים כאלה נדירות יותר ולכן מרשימות יותר. הגבר בחולצה הכחולה שני. הבחור בטרנינג שלישי, כי הוא בדרך למעלה אבל עוד לא שם. הבחורה אחרונה, כי הלוק שלה הוא הכי תלוי במישהו אחר. ואני שמה לב, תוך כדי שאני מסדרת, שאני מדרגת את השניים ש"מראים" למטה ואת השניים ש"לא מראים" למעלה, ושבחברה שלי הדירוג היה הפוך לגמרי. אצלנו, מי שלא מראה הוא מי שאין לו.</w:t>
+        <w:t xml:space="preserve">שלוש, ארבע, אחת, שתיים. האישה ראשונה, כי היא נראית לי הכי בטוחה והכי "מגיעה ממקום", וקצת מעל הגבר כי אצלי נשים כאלה נדירות יותר ולכן מרשימות יותר. הגבר שני. הבחור בטרנינג שלישי, הוא בדרך למעלה ועוד לא שם. הבחורה אחרונה, כי הלוק שלה הכי תלוי במישהו אחר. ו... תוך כדי שאני מסדרת אני שמה לב למשהו: אני מדרגת את השניים ש"מראים" למטה ואת השניים ש"לא מראים" למעלה. ובכפר שלי הדירוג היה הפוך לגמרי. אצלנו מי שלא מראה, זה מי שאין לו. אז מי מסדרת פה עכשיו, רים מחיפה או רים מהכפר? רים מחיפה. אחרי שש שנים בבית חולים. ואני לא בטוחה שזה טוב.</w:t>
       </w:r>
     </w:p>
     <w:p>
@@ -6426,7 +6426,7 @@
           <w:szCs w:val="24"/>
           <w:rtl/>
         </w:rPr>
-        <w:t xml:space="preserve">מנסה להיראות עשיר: הבחור והבחורה, בבירור, ואני לא אומרת את זה כביקורת, זה הלוק, והוא משיג את המטרה שלו. נראה עשיר בלי להתאמץ: הגבר בחולצה הכחולה. האישה בבז' גם, אבל אצלה אני מרגישה שיש ידע, שהיא בחרה כל פריט, ושזה עשיר שלא מתאמץ להיראות עשיר אבל כן מתאמץ להיראות נכון. ואני חושבת שיש הבדל בין "לא מתאמץ" ל"לא מראה": הגבר לא מראה, האישה בוחרת להראות רק למי שיודע.</w:t>
+        <w:t xml:space="preserve">מנסה להיראות עשיר: הבחור והבחורה, ברור, ואני לא אומרת את זה כביקורת, זה הלוק, וזה עובד, הוא משיג את המטרה שלו. עשיר בלי להתאמץ: הגבר. האישה גם, אבל אצלה יש ידע, היא בחרה כל פריט, זה עשיר שלא מתאמץ להיראות עשיר אבל כן מתאמץ להיראות נכון. ויש הבדל, אני חושבת, בין "לא מתאמץ" ל"לא מראה". הגבר לא מראה. האישה מראה, רק למי שיודע. הבחור מראה לכולם. והבחורה מראה למי שמסתכל. ארבעה אנשים, ארבע דרכים להגיד "תסתכלו", וגם "אל תסתכלו" זה דרך.</w:t>
       </w:r>
     </w:p>
     <w:p>
@@ -6486,7 +6486,7 @@
           <w:szCs w:val="24"/>
           <w:rtl/>
         </w:rPr>
-        <w:t xml:space="preserve">לעבוד, עם האישה בתמונה 3, היא נראית לי מנהלת שהייתי רוצה שתהיה האחות הראשית שלי. להיות חברה, האמת, עם הבחורה בתמונה 2, כי היא מזכירה לי את בנות הדודות שלי ואני יודעת שאיתה יהיה כיף וצחוק. הגבר בחולצה הכחולה, לעבוד כן, חברות לא, הוא נראה לי מהסוג שלא מתחברים אליו. והבחור בטרנינג, הייתי יכולה להיות חברה שלו, הוא נראה חברותי, אבל לעבוד איתו לא, הוא נראה לי כמו מישהו שמקבל החלטות מהר מדי.</w:t>
+        <w:t xml:space="preserve">לעבוד, האישה. היא נראית כמו מנהלת שהייתי רוצה שתהיה האחות הראשית שלי, כזאת שלא צועקת ויודעת. להיות חברה, האמת, הבחורה בתמונה 2, כי היא מזכירה לי את בנות הדודות שלי, ואיתה יהיה צחוק, ונצא, ונדבר על שטויות, וזה מה שאני צריכה אחרי משמרת. הגבר, לעבוד כן, חברות לא, הוא נראה מהסוג שלא מתחברים אליו, מנומס וסגור. והבחור בטרנינג, חברה שלו הייתי יכולה להיות, הוא נראה חברותי, פתוח, אבל לעבוד איתו לא. הוא מקבל החלטות מהר מדי, רואים.</w:t>
       </w:r>
     </w:p>
     <w:p>
@@ -6584,7 +6584,7 @@
           <w:szCs w:val="24"/>
           <w:rtl/>
         </w:rPr>
-        <w:t xml:space="preserve">קצת מפתיע, בעיקר על הגבר: לא חשבתי שהחולצה והנעליים שלו עולות אלפים. על האישה פחות הופתעתי, הרגשתי שיש שם משהו יקר, רק לא ידעתי מה. זה משנה לי משהו, כן: אני מבינה שיש שתי שפות של עושר, ושאני, מהחברה שלי, רגילה לשפה הראשונה, זו של הלוגו, ולומדת את השנייה דרך העבודה בבית החולים, שבו רוב הבכירים מדברים בשפה השנייה. ואני חושבת שהשפה השנייה היא גם דרך לסמן גבול: מי שלא מכיר את המותגים האלה לא נכנס. הלוגו, לפחות, מדבר עם כולם.</w:t>
+        <w:t xml:space="preserve">קצת מפתיע, בעיקר על הגבר. לא חשבתי שהחולצה והנעליים שלו עולות אלפים, חשבתי "חולצה". על האישה פחות הופתעתי, הרגשתי שיש שם משהו יקר, רק לא ידעתי להגיד מה. זה משנה לי משהו, כן. אני מבינה שיש שתי שפות של עושר. ואני, מהכפר, רגילה לראשונה, של הלוגו, ולומדת את השנייה דרך בית החולים, שבו הבכירים מדברים בשנייה. ועוד משהו שעולה לי עכשיו: השפה השנייה היא גם גדר. מי שלא מכיר את המותגים האלה לא נכנס, ולא יודע בכלל שיש דלת. הלוגו, לפחות, מדבר עם כולם, גם עם אמא שלי. אז אולי הלוגו הוא יותר הוגן. לא יודעת. זה מבלבל אותי.</w:t>
       </w:r>
     </w:p>
     <w:p>
@@ -6644,7 +6644,7 @@
           <w:szCs w:val="24"/>
           <w:rtl/>
         </w:rPr>
-        <w:t xml:space="preserve">מה שעובר לי בראש הוא, קודם כול, לזהות את הסביבה: בחיפה, בבית החולים, לוגו גדול אומר "כסף חדש". בכפר שלי, לוגו גדול אומר "הצלחה", ולא בציניות. אז התגובה שלי תלויה איפה אני. כשאני בבית החולים אני קצת מרימה גבה. כשאני בחתונה בכפר אני אומרת "יפה לך". ואני חושבת שהאמת היא איפשהו באמצע: מי שלובש לוגו גדול רוצה להיות שייך למשהו, ולפעמים זה מה שיש לו, ולפעמים זה מה שהוא חולם עליו.</w:t>
+        <w:t xml:space="preserve">תלוי איפה אני. באמת. בבית החולים, לוגו גדול אומר לי "כסף חדש", ואני קצת מרימה גבה, כמו שלימדו אותי פה. בכפר, בחתונה, לוגו גדול אומר "הצלחה", ואני אומרת "יפה לך", בלי ציניות. אותו לוגו, שתי תגובות, ושתיהן שלי. ואני חושבת שהאמת באמצע: מי שלובש לוגו גדול רוצה להיות שייך למשהו. לפעמים זה מה שיש לו. לפעמים זה מה שהוא חולם עליו. ואני לא יודעת להבדיל מבחוץ, ואולי גם לא צריכה.</w:t>
       </w:r>
     </w:p>
     <w:p>
@@ -6704,7 +6704,7 @@
           <w:szCs w:val="24"/>
           <w:rtl/>
         </w:rPr>
-        <w:t xml:space="preserve">כן, שהדירוג שלי היה הדירוג של חיפה ולא של הכפר שלי, ושאני לא בטוחה איזה מהם הוא "אני". אם היית מראיינת אותי לפני שעברתי לעיר, הייתי שמה את הבחור בטרנינג ראשון. אז אולי המחקר שלך צריך לשאול לא רק מה אנשים רואים, אלא מאיפה הם מסתכלים. ועוד דבר: במחלקה, כשמטופל נכנס עם לוגו גדול, אני לא חושבת על מעמד, אני חושבת איך הוא ישלם על התרופות. זה מה שהעבודה עשתה לי.</w:t>
+        <w:t xml:space="preserve">כן. שהדירוג שלי היה של חיפה ולא של הכפר, ושאני לא בטוחה איזה מהם הוא "אני". אם היית מראיינת אותי בגיל עשרים ושתיים, לפני העיר, הייתי שמה את הבחור בטרנינג ראשון, בלי להתלבט. אז אולי המחקר שלך צריך לשאול לא רק מה אנשים רואים, אלא מאיפה הם מסתכלים. ועוד משהו, מהעבודה: כשמטופל נכנס עם לוגו גדול, אני לא חושבת על מעמד. אני חושבת אם יש לו ביטוח משלים. זה מה שבית החולים עשה לי. את זה תכתבי, זה חשוב.</w:t>
       </w:r>
     </w:p>
     <w:p>
@@ -6760,7 +6760,7 @@
           <w:szCs w:val="24"/>
           <w:rtl/>
         </w:rPr>
-        <w:t xml:space="preserve">תאריך: 8.10.2026    משך: 20 דקות    מקום: שיחת וידאו, מביתה של המרואיינת בנשר    הקלטה: בטלפון, בהסכמה</w:t>
+        <w:t xml:space="preserve">תאריך: 8.10.2026    משך: 21 דקות    מקום: שיחת וידאו, מביתה של המרואיינת בנשר    הקלטה: בטלפון, בהסכמה</w:t>
       </w:r>
     </w:p>
     <w:p>
@@ -6839,7 +6839,7 @@
           <w:szCs w:val="24"/>
           <w:rtl/>
         </w:rPr>
-        <w:t xml:space="preserve">אני בת ארבעים וחמש, מהנדסת תוכנה, עובדת בחברה בינונית במת"ם בחיפה, מנהלת צוות של שישה אנשים. גרה בנשר, נשואה, שני ילדים בני נוער. עליתי מרוסיה בגיל אחת עשרה, גדלתי בקריית ים, למדתי בטכניון. אני עובדת מהבית חצי מהשבוע, אז את רואה אותי היום בחולצת טריקו, וזה גם הלוק שלי במשרד, כך שאין הבדל.</w:t>
+        <w:t xml:space="preserve">ארבעים וחמש. מהנדסת תוכנה, מנהלת צוות של שישה במת"ם, חברה בינונית, לא אגיד איזו. נשר, נשואה, שני ילדים בני נוער. עליתי מרוסיה בגיל אחת עשרה, גדלתי בקריית ים, בבניין שכולם בו היו עולים, למדתי בטכניון. היום אני מהבית, אז את רואה אותי בטריקו אפור, וזה בדיוק מה שאני לובשת גם במשרד, אז אל תחשבי שזה בגלל הזום.</w:t>
       </w:r>
     </w:p>
     <w:p>
@@ -6899,7 +6899,7 @@
           <w:szCs w:val="24"/>
           <w:rtl/>
         </w:rPr>
-        <w:t xml:space="preserve">שתיים. אני לא מתעניינת. אני קונה בגדים כשצריך, בדרך כלל אונליין, בדרך כלל אותם דברים שוב. אני כן יודעת מה זה מותגים, כי אי אפשר לחיות בעולם הזה בלי לדעת, והבת שלי מדברת על זה הרבה. אבל בשבילי בגד הוא בגד. בהייטק אף אחד לא שם לב, ומי ששם לב זה בדרך כלל סימן לא טוב עליו.</w:t>
+        <w:t xml:space="preserve">שתיים. אני לא מתעניינת, ואני אומרת את זה בלי גאווה ובלי בושה, זה פשוט לא שם. קונה אונליין, אותם דברים, אותו מותג, אותו צבע, כבר עשר שנים. מה שאני כן יודעת זה שמות, כי אי אפשר לחיות בעולם בלי לדעת, והבת שלי בת שש עשרה מדברת על זה כל ארוחת ערב. בהייטק אף אחד לא מסתכל. ומי שכן מסתכל, זה בדרך כלל אומר עליו משהו לא טוב.</w:t>
       </w:r>
     </w:p>
     <w:p>
@@ -6997,7 +6997,7 @@
           <w:szCs w:val="24"/>
           <w:rtl/>
         </w:rPr>
-        <w:t xml:space="preserve">אני אהיה ישירה, כי ביקשת מה עולה לי בראש: הוא נראה לי כמו מישהו שאני לא הייתי רוצה לשבת לידו באוטובוס. לא בגלל שהוא מפחיד, אלא בגלל הרעש. הכול עליו רועש. אני רואה אדם צעיר שמאוד רוצה שאנשים יחשבו שהוא מצליח, ושלא בטוח בזה בעצמו. ובהייטק אנחנו אומרים: מי שצריך להגיד שהוא טוב, כנראה לא.</w:t>
+        <w:t xml:space="preserve">אני אהיה ישירה, ביקשת מה עולה. הוא נראה לי כמו מישהו שלא הייתי רוצה לשבת לידו באוטובוס. לא כי הוא מפחיד. כי הוא רועש. הכול עליו רועש, גם כשהוא שותק. אני רואה בן אדם צעיר שמאוד רוצה שיחשבו שהוא הצליח, ושבעצמו לא לגמרי בטוח. אצלנו בצוות אומרים: מי שצריך להגיד שהוא מתכנת טוב, כנראה לא. אותו דבר פה. ואולי אני טועה והוא בן אדם נהדר. אבל זה מה שהבגדים אמרו לי לפני שהוא פתח את הפה.</w:t>
       </w:r>
     </w:p>
     <w:p>
@@ -7057,7 +7057,7 @@
           <w:szCs w:val="24"/>
           <w:rtl/>
         </w:rPr>
-        <w:t xml:space="preserve">משהו שאין בו תואר. אני לא אומרת את זה בזלזול, אני אומרת מה אני רואה. מכירות, רכב, אולי קריפטו, אולי בכלל משהו על הגבול. או שהוא ממשפחה עם כסף ולא עובד בכלל. בטוח לא מהנדס, מהנדסים לא מתלבשים ככה, גם כשיש להם הרבה יותר כסף ממנו.</w:t>
+        <w:t xml:space="preserve">משהו בלי תואר. אני לא אומרת את זה בזלזול, אני אומרת מה אני רואה. מכירות, רכב, אולי קריפטו, אולי משהו על הגבול, לא יודעת. או שמשפחה עם כסף והוא לא עובד בכלל. מהנדס, בטוח שלא. מהנדסים לא נראים ככה גם כשיש להם פי שלושה ממנו, הם נראים כמוני, עם טריקו.</w:t>
       </w:r>
     </w:p>
     <w:p>
@@ -7117,7 +7117,7 @@
           <w:szCs w:val="24"/>
           <w:rtl/>
         </w:rPr>
-        <w:t xml:space="preserve">כלכלית, יש לו כסף פנוי, זה ברור, אחרת לא היה מוציא אותו על זה. חברתית, אני ממקמת אותו נמוך, ואני יודעת שזה לא פוליטיקלי קורקט. בעיניי מעמד זה השכלה, לא כסף. והלבוש הזה אומר לי "כסף בלי השכלה". ואני יודעת שאולי אני טועה, ואולי הוא דוקטור לפיזיקה, אבל שאלת מה עולה לי בראש.</w:t>
+        <w:t xml:space="preserve">כסף פנוי יש לו, אחרת לא היה שם אותו על הגוף. חברתית, אני ממקמת נמוך, ואני יודעת שזה לא פוליטיקלי קורקט ושאת תרשמי את זה. בעיניי מעמד זה השכלה, לא ארנק. והלבוש הזה אומר לי "כסף בלי השכלה". ואולי הוא דוקטור לפיזיקה, ואז אני אתבייש. אבל שאלת מה עולה, וזה עולה, ואני לא אצנזר. (המראיינת: למה דווקא השכלה?) כי ככה גדלתי. בבית שלי ספרים היו הדבר שמראים לאורחים, לא רהיטים.</w:t>
       </w:r>
     </w:p>
     <w:p>
@@ -7177,7 +7177,7 @@
           <w:szCs w:val="24"/>
           <w:rtl/>
         </w:rPr>
-        <w:t xml:space="preserve">הלוגו הענק, השעון, הפאוץ'. כל פריט בנפרד הייתי סולחת, ביחד זה תחפושת. ובעיקר, שהכול נועד לזיהוי: הוא לבש דברים שהמטרה שלהם היא שיזהו אותם, לא שיהיה לו נוח או יפה. אני מגיעה מתרבות שבה, בשנות התשעים, מי שהצליח קנה את הדבר הכי מזוהה ועמד איתו ברחוב, ואני זוכרת איך זה נראה מבחוץ. זה בדיוק אותו דבר, רק עם שמות אחרים.</w:t>
+        <w:t xml:space="preserve">הלוגו הענק. השעון. הפאוץ'. כל אחד לבד הייתי סולחת, כולם ביחד זה תחפושת. ובעיקר, הכול נועד לזיהוי. הוא לבש דברים שהמטרה שלהם היא שיזהו אותם, לא שיהיה לו נוח, לא שיהיה יפה. ואני מכירה את זה מהבית: בשנות התשעים, בקריית ים, מי שהסתדר קנה את הדבר הכי מזוהה, טלוויזיה סוני, והעמיד אותה בסלון עם הדלת פתוחה. ואני זוכרת איך זה נראה מבחוץ, כילדה. זה אותו דבר. רק שהסלון הוא הגוף והסוני היא קפוצ'ון.</w:t>
       </w:r>
     </w:p>
     <w:p>
@@ -7256,7 +7256,7 @@
           <w:szCs w:val="24"/>
           <w:rtl/>
         </w:rPr>
-        <w:t xml:space="preserve">בחורה שהשקיעה המון זמן בלהיראות ככה, ואני מכבדת את הזמן, גם אם לא את התוצאה. היא נראית לי כמו תמונה מאינסטגרם. אין בה שום דבר אישי, כל דבר עליה הוא משהו שראיתי על מישהי אחרת. הבת שלי בת שש עשרה הייתה אומרת שהיא "מהממת", ואני אומרת שהיא נראית כמו כולן.</w:t>
+        <w:t xml:space="preserve">בחורה שהשקיעה המון זמן בלהיראות ככה. ואני מכבדת את הזמן, באמת, זה עבודה. את התוצאה פחות. היא נראית לי כמו תמונה מאינסטגרם, ואין בה שום דבר שהוא שלה, כל פריט ראיתי על מישהי אחרת. הבת שלי הייתה אומרת "מהממת". אני אומרת "כמו כולן". ושתינו צודקות, כנראה, ואולי זה בדיוק ההבדל בין שש עשרה לארבעים וחמש.</w:t>
       </w:r>
     </w:p>
     <w:p>
@@ -7316,7 +7316,7 @@
           <w:szCs w:val="24"/>
           <w:rtl/>
         </w:rPr>
-        <w:t xml:space="preserve">משהו ברשתות, או ביופי, או בתחום הזה. או שהיא לא עובדת. קשה לי לדמיין אותה במקצוע שדורש ללמוד הרבה שנים, אבל זה אולי הדעה הקדומה שלי. היא יכולה להיות מזכירה במשרד מפואר, או עובדת בקבלה של מלון.</w:t>
+        <w:t xml:space="preserve">רשתות. יופי. משהו בתחום. או שלא עובדת. קשה לי לדמיין אותה במקצוע שלומדים אותו שנים, וזאת דעה קדומה, אני יודעת, ואני אומרת אותה בכל זאת כי ביקשת כנות. מזכירה במשרד מפואר. קבלה במלון. משהו שהלוק הוא חלק מהתפקיד.</w:t>
       </w:r>
     </w:p>
     <w:p>
@@ -7376,7 +7376,7 @@
           <w:szCs w:val="24"/>
           <w:rtl/>
         </w:rPr>
-        <w:t xml:space="preserve">כלכלית, אני לא מאמינה שהכסף שלה. חברתית, בינוני, ואני לא בטוחה אפילו בזה. בשבילי הלוק הזה הוא לוק של מישהי שמדדה את עצמה לפי מה שרואים, וזה בדרך כלל מישהי שלא קיבלה מספיק הכרה על דברים אחרים. סליחה אם זה נשמע קשה.</w:t>
+        <w:t xml:space="preserve">כלכלית, אני לא מאמינה שזה הכסף שלה. חברתית, בינוני, ולא בטוחה אפילו. בשבילי זה לוק של מישהי שמודדת את עצמה לפי מה שרואים, וזה בדרך כלל מי שלא קיבלה מספיק על דברים אחרים. וסליחה, זה נשמע קשה. אני לא מכירה אותה. אבל זה מה שהבגדים מספרים, והיא זאת שבחרה שהם יספרו.</w:t>
       </w:r>
     </w:p>
     <w:p>
@@ -7436,7 +7436,7 @@
           <w:szCs w:val="24"/>
           <w:rtl/>
         </w:rPr>
-        <w:t xml:space="preserve">כל השמות. החולצה עם הכיתוב, התיק עם הסמלים, המשקפיים. אני לא מתעניינת באופנה ואני עדיין מזהה את כל המותגים, וזה בדיוק הפואנטה: היא לבשה את המותגים שכולם מזהים, כדי שכולם יזהו. בגד עם לוגו גדול הוא בגד שאומר לי "תראי מה יש לי" במקום "תראי מי אני". ואני לא יודעת מי היא.</w:t>
+        <w:t xml:space="preserve">כל השמות. החולצה עם הכיתוב, התיק עם הסמלים, המשקפיים. אני לא מתעניינת באופנה ועדיין מזהה את כל המותגים, וזה הפואנטה: היא לבשה את מה שכולם מזהים כדי שכולם יזהו. בגד עם לוגו גדול אומר לי "תראי מה יש לי". בגד בלי אומר לי "תראי מי אני", או לפחות לא מפריע לי לראות. ואני אחרי עשר דקות עם התמונה שלה לא יודעת מי היא. אני יודעת מה יש לה.</w:t>
       </w:r>
     </w:p>
     <w:p>
@@ -7515,7 +7515,7 @@
           <w:szCs w:val="24"/>
           <w:rtl/>
         </w:rPr>
-        <w:t xml:space="preserve">זאת אישה שנראית כמו אנשים שאני עובדת איתם ומכבדת. רגועה, רצינית, מסודרת, בלי רעש. היא נראית לי כמו מנהלת בכירה, כמו מישהי שאני הייתי רוצה שתהיה המנהלת שלי. היא נראית חכמה. אני אומרת את זה על בסיס סוודר, ואני יודעת שזה מגוחך, אבל זה מה שעולה.</w:t>
+        <w:t xml:space="preserve">אה, זאת אני מכירה. היא נראית כמו אנשים שאני עובדת איתם ומכבדת. רגועה, רצינית, מסודרת, אפס רעש. נראית כמו מנהלת בכירה, כמו מישהי שהייתי רוצה שתהיה המנהלת שלי. ונראית חכמה. ואני אומרת "חכמה" על בסיס סוודר, ואני שומעת כמה זה מגוחך, ואני לא יכולה שלא. ככה זה עובד, הראש עושה את זה לבד.</w:t>
       </w:r>
     </w:p>
     <w:p>
@@ -7575,7 +7575,7 @@
           <w:szCs w:val="24"/>
           <w:rtl/>
         </w:rPr>
-        <w:t xml:space="preserve">מנהלת בכירה בחברה גדולה, או שותפה במשרד, או פרופסור. מישהי שיושבת בישיבות עם אנשים חשובים ולא צריכה להרשים אותם. אולי אפילו מנכ"לית. או רופאה. משהו עם הרבה השכלה והרבה אחריות.</w:t>
+        <w:t xml:space="preserve">מנהלת בכירה בחברה גדולה. שותפה במשרד. פרופסור. מנכ"לית אולי. רופאה. מישהי שיושבת בישיבות עם אנשים חשובים ולא צריכה להרשים אותם, כי הם באו אליה. משהו עם הרבה שנות לימוד והרבה אחריות.</w:t>
       </w:r>
     </w:p>
     <w:p>
@@ -7635,7 +7635,7 @@
           <w:szCs w:val="24"/>
           <w:rtl/>
         </w:rPr>
-        <w:t xml:space="preserve">גבוה, גם וגם. חברתית, גבוה בגלל שהיא נראית משכילה ומסודרת. כלכלית, אני מניחה שגבוה, אבל אני מודה שאני לא רואה את זה בבגדים, אני רואה את זה ב"סוג" של האדם. הסוודר עצמו יכול להיות מכל חנות, ולא הייתי יודעת להבדיל. מה שנראה לי יקר זה היא, לא הבגד.</w:t>
+        <w:t xml:space="preserve">גבוה, גם וגם. חברתית, גבוה, כי היא נראית משכילה ומסודרת, שזה הקריטריון שלי, כבר אמרתי. כלכלית, אני מניחה גבוה, אבל, ואני רוצה להיות מדויקת פה, אני לא רואה את זה בבגדים. הסוודר יכול להיות מכל חנות ולא הייתי יודעת. מה שנראה לי יקר זה היא. האדם. לא הבד.</w:t>
       </w:r>
     </w:p>
     <w:p>
@@ -7695,7 +7695,7 @@
           <w:szCs w:val="24"/>
           <w:rtl/>
         </w:rPr>
-        <w:t xml:space="preserve">שאין שום דבר. אין שם, אין סמל, אין צבע, אין ניסיון. בגדים שנועדו להיות בגדים. ובהייטק, האנשים הכי בכירים שאני מכירה נראים בדיוק ככה, או אפילו פשוט יותר. אז הפשטות היא בשבילי סימן של מעמד, כי האנשים שאני יודעת שהם במעמד גבוה נראים פשוטים. אני יודעת שזה מעגלי, אבל זה מה שקורה בראש.</w:t>
+        <w:t xml:space="preserve">שאין כלום. אין שם, אין סמל, אין צבע, אין ניסיון. בגדים שנועדו להיות בגדים. ובהייטק, האנשים הכי בכירים שאני מכירה נראים בדיוק ככה, או עוד יותר פשוט, המנכ"ל הקודם שלנו הגיע בכפכפים. אז בשבילי פשטות היא סימן של מעמד, כי האנשים שאני יודעת שהם גבוה נראים פשוט. ואני יודעת שזה מעגלי. אבל זה מה שקורה בראש, ואת ביקשת את הראש.</w:t>
       </w:r>
     </w:p>
     <w:p>
@@ -7774,7 +7774,7 @@
           <w:szCs w:val="24"/>
           <w:rtl/>
         </w:rPr>
-        <w:t xml:space="preserve">אדם שנראה כמו המנכ"ל הקודם של החברה שעבדתי בה, שהיה אדם נעים ושקט ואף אחד לא היה מנחש שהוא מיליונר. חולצה, מכנסיים, נעליים, זהו. הוא נראה לי נורמלי, אמין, בוגר. אם הייתי צריכה לבחור ממי מהארבעה לקנות מכונית משומשת, ממנו.</w:t>
+        <w:t xml:space="preserve">אדם שנראה כמו המנכ"ל הקודם, זה שבכפכפים, רק בחולצה. אדם נעים, שקט, שאף אחד לא היה מנחש שהוא מיליונר, והוא היה. חולצה, מכנסיים, נעליים, זהו. נורמלי. אמין. בוגר. אם הייתי צריכה לקנות מכונית משומשת מאחד הארבעה, ממנו. ואני יודעת שזה מבחן מוזר, אבל זה המבחן שלי.</w:t>
       </w:r>
     </w:p>
     <w:p>
@@ -7834,7 +7834,7 @@
           <w:szCs w:val="24"/>
           <w:rtl/>
         </w:rPr>
-        <w:t xml:space="preserve">מנהל בכיר, יזם, רופא, עורך דין. או מהנדס בכיר מאוד. משהו שבו הוא כבר לא צריך להוכיח, והבגדים מראים את זה. יכול להיות גם אקדמאי, דיקן, משהו כזה. או בעלים של חברה שהוא הקים לפני עשרים שנה.</w:t>
+        <w:t xml:space="preserve">מנהל בכיר. יזם ותיק. רופא. עורך דין. או מהנדס מאוד בכיר, מהסוג שכבר לא מתכנת. משהו שבו הוא לא צריך להוכיח, והבגדים מראים את זה. דיקן. בעלים של חברה שהקים לפני עשרים שנה ועכשיו רק מגיע לישיבות.</w:t>
       </w:r>
     </w:p>
     <w:p>
@@ -7894,7 +7894,7 @@
           <w:szCs w:val="24"/>
           <w:rtl/>
         </w:rPr>
-        <w:t xml:space="preserve">גבוה. ואני ממקמת אותו גבוה בעיקר חברתית: הוא נראה כמו מישהו שיש לו השכלה, ניסיון, ומעמד שבא ממה שהוא עשה. כלכלית, אני מניחה שגם, אבל שוב, לא רואה את זה בבגדים. אני פשוט מניחה שמי שמתלבש ככה בגיל הזה הוא בדרך כלל מסודר.</w:t>
+        <w:t xml:space="preserve">גבוה. ובעיקר חברתית: השכלה, ניסיון, מעמד שבא ממה שהוא עשה. כלכלית, אני מניחה שגם, אבל שוב, לא רואה בבגדים, אני מניחה. מי שמתלבש ככה בגיל הזה הוא בדרך כלל מסודר. וזה בדרך כלל, לא תמיד. יש לי שכן שנראה בדיוק ככה וחייב כסף לכל הבניין. אז בבקשה, תרשמי "בדרך כלל".</w:t>
       </w:r>
     </w:p>
     <w:p>
@@ -7954,7 +7954,7 @@
           <w:szCs w:val="24"/>
           <w:rtl/>
         </w:rPr>
-        <w:t xml:space="preserve">שום דבר, ושוב זה הסימן. חולצה בלי כיתוב, שעון בלי שום דבר, חגורה רגילה. אני לא רואה שום פריט שנועד להרשים אותי, ולכן אני מתרשמת. אני מבינה שאולי הנעליים האלה עולות יותר מהקפוצ'ון של הבחור הראשון, ואני לא הייתי יודעת, וזה מעניין: הוא משלם הרבה כדי שאנשים כמוני לא ידעו.</w:t>
+        <w:t xml:space="preserve">שום דבר. וזה הסימן. חולצה בלי כיתוב, שעון בלי כלום, חגורה רגילה. אין פריט אחד שנועד להרשים אותי, ולכן אני מתרשמת. ועכשיו, כשאת אומרת לי שאולי הנעליים האלה עולות יותר מהקפוצ'ון של הראשון, ואני לא הייתי יודעת לעולם, זה מעניין: הוא משלם הרבה כסף בדיוק כדי שאנשים כמוני לא ידעו. זה פונקציה מוזרה. אני מהנדסת, אני שואלת מה הפונקציה. והפונקציה היא כנראה לא לדבר איתי.</w:t>
       </w:r>
     </w:p>
     <w:p>
@@ -8033,7 +8033,7 @@
           <w:szCs w:val="24"/>
           <w:rtl/>
         </w:rPr>
-        <w:t xml:space="preserve">4, 3, 1, 2. הגבר ראשון, כי הוא נראה לי הכי מבוסס והכי "גמור", אין לו מה להוכיח. האישה בבז' שנייה, קרוב מאוד. ואז פער גדול. הבחור בטרנינג שלישי רק כי אני חושבת שיש לו יותר כסף מהבחורה, לא כי הוא במעמד גבוה יותר. והבחורה אחרונה. ואני שמה לב שאני דירגתי לפי מה שאני קוראת לו "מעמד", שזה בעצם השכלה ורצינות, ולא לפי כסף. אם היית שואלת רק כסף, אולי הבחור בטרנינג היה ראשון, כי הוא היחיד שאני בטוחה שהוציא.</w:t>
+        <w:t xml:space="preserve">ארבע, שלוש, אחת, שתיים. הגבר ראשון, הכי מבוסס, הכי "גמור", אין לו מה להוכיח. האישה שנייה, צמוד. ואז פער גדול. הבחור בטרנינג שלישי רק כי אני חושבת שיש לו יותר כסף מהבחורה, לא כי הוא גבוה יותר. והבחורה אחרונה. ואני שמה לב, תוך כדי, שדירגתי לפי מה שאני קוראת לו "מעמד", שזה בעצם השכלה ורצינות, ולא כסף. אם היית שואלת רק כסף, הבחור בטרנינג היה ראשון, הוא היחיד שאני בטוחה שהוציא. אז בעצם דירגתי את מי שדומה לי. (המראיינת: דומה?) כן. השניים הראשונים נראים כמו אנשים מהעבודה שלי. אני דירגתי את הצוות שלי למעלה. זה מה שעשיתי.</w:t>
       </w:r>
     </w:p>
     <w:p>
@@ -8093,7 +8093,7 @@
           <w:szCs w:val="24"/>
           <w:rtl/>
         </w:rPr>
-        <w:t xml:space="preserve">מנסה להיראות עשיר: הבחור והבחורה, בצורה מובהקת, זה כל הלוק. נראה עשיר בלי להתאמץ: הגבר בחולצה הכחולה, ואולי זה כי הוא גבר, וגברים שלא מתאמצים זה נורמה. האישה בבז', האמת, אני לא בטוחה שהיא נראית עשירה בכלל, היא נראית מסודרת. אם היא עשירה, היא מסתירה את זה טוב. אז בעצם, שניים מנסים ומצליחים להיראות עשירים, ושניים לא מנסים ולא נראים עשירים, ונראים משהו אחר, שבעיניי שווה יותר.</w:t>
+        <w:t xml:space="preserve">מנסה להיראות עשיר: הבחור והבחורה, מובהק, זה כל הלוק. עשיר בלי להתאמץ: הגבר. ואולי זה כי הוא גבר, וגברים שלא מתאמצים זה הנורמה, אף אחד לא שואל אותם למה. האישה בבז', האמת, לא בטוחה שהיא נראית עשירה בכלל. מסודרת, כן. אם היא עשירה, היא מסתירה טוב. אז שניים מנסים ומצליחים להיראות עשירים, ושניים לא מנסים ולא נראים עשירים, ונראים משהו אחר. משכילים. רציניים. ובעיניי זה שווה יותר. אבל אני יודעת שזה בעיניי.</w:t>
       </w:r>
     </w:p>
     <w:p>
@@ -8153,7 +8153,7 @@
           <w:szCs w:val="24"/>
           <w:rtl/>
         </w:rPr>
-        <w:t xml:space="preserve">לעבוד, עם האישה בתמונה 3, בלי ספק. היא נראית כמו מישהי שהייתה המנהלת הכי טובה שהייתה לי. חברה, האמת, גם איתה, או עם הגבר. אני אדם שמתחבר לאנשים שקטים. עם השניים הראשונים, לא לעבוד ולא חברה, ואני יודעת שזה לא הוגן, כי אני לא מכירה אותם, אבל זאת התשובה האמיתית. אני לא הייתי יודעת על מה לדבר איתם, והם כנראה לא היו רוצים לדבר איתי.</w:t>
+        <w:t xml:space="preserve">לעבוד, האישה, בלי ספק. היא נראית כמו המנהלת הכי טובה שהייתה לי, אישה שקטה שידעה הכול ולא הרימה קול אף פעם. חברה, גם איתה, או עם הגבר. אני מתחברת לאנשים שקטים, אני לא יודעת מה לעשות עם אנשים רועשים. עם השניים הראשונים, לא זה ולא זה, ואני יודעת שזה לא הוגן, אני לא מכירה אותם, אבל זאת התשובה האמיתית. לא הייתי יודעת על מה לדבר איתם. והם, כנראה, לא היו רוצים לדבר איתי. אז לפחות זה הדדי.</w:t>
       </w:r>
     </w:p>
     <w:p>
@@ -8251,7 +8251,7 @@
           <w:szCs w:val="24"/>
           <w:rtl/>
         </w:rPr>
-        <w:t xml:space="preserve">מפתיע אותי במובן אחד: לא הייתי מנחשת את המחירים של השקטים, חשבתי שהם לובשים בגדים רגילים ממקומות רגילים. זה לא משנה לי את הדעה על האנשים, אבל זה משנה לי משהו על ההיגיון: אם הסוודר עולה שמונת אלפים שקל והמטרה שלו היא שאני לא אדע, אז זה בעצם בזבוז מאוד מתוחכם. ואני, כמהנדסת, שואלת מה הפונקציה. והתשובה היא כנראה שהפונקציה היא לדבר עם אנשים אחרים, לא איתי. ובמובן הזה, היוקרה השקטה היא אולי אפילו יותר מתנשאת מהלוגו, כי היא מסננת מי יראה. הלוגו, לפחות, הוא דמוקרטי.</w:t>
+        <w:t xml:space="preserve">מפתיע אותי במובן אחד: את המחירים של השקטים לא הייתי מנחשת. חשבתי שהם לובשים בגדים רגילים ממקומות רגילים, וזה מה שאהבתי בהם. זה לא משנה את הדעה על האנשים, אבל זה משנה משהו בהיגיון. כי אם הסוודר עולה שמונת אלפים שקל, והמטרה שלו היא שאני לא אדע, אז זה בזבוז מאוד מתוחכם. ואני שואלת מה הפונקציה, ואין לי תשובה טובה, חוץ מזה שהפונקציה היא לדבר עם אנשים אחרים, לא איתי. ואם זה ככה, אז היוקרה השקטה היא אולי אפילו יותר מתנשאת מהלוגו, כי היא בוחרת מי יראה. הלוגו, לפחות, הוא דמוקרטי. כולם רואים. גם זה שלא רציתי לשבת לידו באוטובוס. אז עכשיו אני פחות בטוחה במה שאמרתי עליו. תרשמי.</w:t>
       </w:r>
     </w:p>
     <w:p>
@@ -8311,7 +8311,7 @@
           <w:szCs w:val="24"/>
           <w:rtl/>
         </w:rPr>
-        <w:t xml:space="preserve">"בשביל מי זה". זה מה שעובר לי. כי אף אחד לא לובש לוגו גדול בשביל עצמו, הוא לובש אותו בשביל מי שיסתכל. ואז אני שואלת מי קהל היעד, ובדרך כלל התשובה היא אנשים שגם הם מודדים לפי לוגו. ואני לא בקהל הזה, אז הלוגו לא עובד עליי, הוא עובד נגדו. אבל אני גם זוכרת את ההורים שלי בשנות התשעים, שרצו מאוד דברים עם שמות, כי זה היה סימן שהם הגיעו למקום שבו יש. אז יש בי גם הבנה. רק לא הערכה.</w:t>
+        <w:t xml:space="preserve">"בשביל מי זה." זה מה שעובר. כי אף אחד לא לובש לוגו גדול בשביל עצמו, בבית, לבד. הוא לובש בשביל מי שיסתכל. ואז אני שואלת מי קהל היעד, והתשובה היא בדרך כלל אנשים שגם הם מודדים לפי לוגו. ואני לא בקהל הזה, אז הלוגו לא עובד עליי, הוא עובד נגדו. אבל, ואני רוצה שזה יהיה בראיון, אני זוכרת את ההורים שלי בשנות התשעים, שרצו מאוד דברים עם שמות, כי זה היה הסימן שהם הגיעו למקום שיש בו. ואני לא יכולה לשפוט אותם, ואז אני לא יכולה גם אותו. אז יש הבנה. רק לא הערכה. ואולי גם זה יבוא.</w:t>
       </w:r>
     </w:p>
     <w:p>
@@ -8371,7 +8371,7 @@
           <w:szCs w:val="24"/>
           <w:rtl/>
         </w:rPr>
-        <w:t xml:space="preserve">כן. שהראיון שלך הראה לי שאני מאוד שיפוטית, ושאני שופטת לפי קוד שאני למדתי בטכניון ובהייטק, שבו פשטות היא מעמד. ואני חושבת שהקוד הזה הוא לא יותר נכון מהקוד של הבחור בטרנינג, הוא רק הקוד של הקבוצה שלי. אז אם המחקר שלך הוא על רושם ראשוני, הייתי אומרת שהרושם הראשוני אומר יותר על מי שמסתכל מאשר על מי שלובש. וזה כנראה מה שגילית גם מהאחרות.</w:t>
+        <w:t xml:space="preserve">כן. שהראיון שלך הראה לי שאני מאוד שיפוטית, ושאני שופטת לפי קוד שלמדתי בטכניון ובהייטק, שבו פשטות זה מעמד. ואני חושבת שהקוד הזה לא יותר נכון מהקוד של הבחור בטרנינג. הוא רק הקוד של הקבוצה שלי. אז אם המחקר שלך הוא על רושם ראשוני, הייתי אומרת שהרושם הראשוני אומר יותר על מי שמסתכל מאשר על מי שלובש. וזה כנראה מה שגילית גם מהאחרות. ואם לא, אז זה מה שגילית ממני.</w:t>
       </w:r>
     </w:p>
     <w:p>
@@ -8427,7 +8427,7 @@
           <w:szCs w:val="24"/>
           <w:rtl/>
         </w:rPr>
-        <w:t xml:space="preserve">תאריך: 11.10.2026    משך: 23 דקות    מקום: ספריית האוניברסיטה, חיפה    הקלטה: בטלפון, בהסכמה</w:t>
+        <w:t xml:space="preserve">תאריך: 11.10.2026    משך: 25 דקות    מקום: ספריית האוניברסיטה, חיפה    הקלטה: בטלפון, בהסכמה</w:t>
       </w:r>
     </w:p>
     <w:p>
@@ -8506,7 +8506,7 @@
           <w:szCs w:val="24"/>
           <w:rtl/>
         </w:rPr>
-        <w:t xml:space="preserve">אני בת עשרים ושתיים, סטודנטית שנה שנייה לפסיכולוגיה באוניברסיטת חיפה, גרה בעתלית אצל ההורים ונוסעת כל יום. עובדת בסופי שבוע כמלצרית במסעדה בחוף. השתחררתי מהצבא לפני שנתיים, הייתי מש"קית חינוך. אני בזוגיות, אוהבת ים, אוהבת מוזיקה, ואני אחת מהאנשים שבאמת מתעניינים בשאלה שלך, כי זה בדיוק מה שאני לומדת.</w:t>
+        <w:t xml:space="preserve">עשרים ושתיים. שנה שנייה פסיכולוגיה באוניברסיטת חיפה. גרה בעתלית אצל ההורים, נוסעת כל יום, שעה לכל כיוון, ברכבת. בסופי שבוע מלצרית במסעדה על החוף. השתחררתי לפני שנתיים, הייתי מש"קית חינוך. בזוגיות, אוהבת ים, אוהבת מוזיקה. ואני אחת מהאנשים שבאמת מתעניינים במה שאת שואלת, כי זה בדיוק מה שאני לומדת, אז סליחה מראש אם אני אנתח יותר מדי.</w:t>
       </w:r>
     </w:p>
     <w:p>
@@ -8566,7 +8566,7 @@
           <w:szCs w:val="24"/>
           <w:rtl/>
         </w:rPr>
-        <w:t xml:space="preserve">ארבע. אני אוהבת אופנה, אני מסתכלת הרבה, אני יודעת מה הולך, אבל אין לי כסף לקנות את מה שאני אוהבת, אז רוב זה בראש ובטיקטוק. אני כן יודעת מותגים, אני יודעת מה זה יוקרה שקטה ומה זה לוגומניה, כי זה דיון שלם ברשתות, וזה מעניין אותי גם מהצד הפסיכולוגי.</w:t>
+        <w:t xml:space="preserve">ארבע. אוהבת אופנה, מסתכלת המון, יודעת מה הולך, ואין לי כסף לקנות כלום ממה שאני אוהבת, אז הכול בראש ובטיקטוק. אני כן יודעת מותגים, יודעת מה זה יוקרה שקטה ומה זה לוגומניה, זה דיון שלם ברשתות כבר שנתיים, והוא מעניין אותי גם מהצד של מה אנשים מנסים להגיד דרך זה. אז ארבע, ואם היה "ארבע בראש וחמש בלי כסף", הייתי לוקחת.</w:t>
       </w:r>
     </w:p>
     <w:p>
@@ -8664,7 +8664,7 @@
           <w:szCs w:val="24"/>
           <w:rtl/>
         </w:rPr>
-        <w:t xml:space="preserve">אני מסתכלת עליו ואני רואה מישהו שלומד איך להיות עשיר מטיקטוק. הלוק הזה הוא בדיוק מה שמראים ברשתות כ"לוק של מצליחנים", והוא לבש אותו שלם, כמו מדים. הוא נראה לי בן עשרים ושמונה בערך, בטוח בעצמו כלפי חוץ, ומאוד תלוי בתגובה של אחרים. אם הייתי צריכה לנחש, אני חושבת שהוא בודק כמה לייקים קיבלה התמונה.</w:t>
+        <w:t xml:space="preserve">אני מסתכלת עליו ורואה מישהו שלמד איך להיות עשיר מטיקטוק. הלוק הזה הוא בדיוק מה שמראים ברשתות כ"לוק של מצליחנים", והוא לבש אותו שלם, מהראש עד הנעליים, כמו מדים. בן עשרים ושמונה בערך. בטוח כלפי חוץ. ומאוד, מאוד תלוי במה אחרים חושבים. אם הייתי צריכה לנחש, הוא בודק עכשיו כמה לייקים קיבלה התמונה הזאת. וזה לא ביקורת. גם אני בודקת.</w:t>
       </w:r>
     </w:p>
     <w:p>
@@ -8724,7 +8724,7 @@
           <w:szCs w:val="24"/>
           <w:rtl/>
         </w:rPr>
-        <w:t xml:space="preserve">משהו שהוא היה אומר עליו "יזם". אולי באמת משהו שמכניס כסף, דרופשיפינג, רכבים, נדל"ן, קריפטו. אולי הוא עובד אצל מישהו ומציג את עצמו כיזם. יכול להיות גם ספורטאי. או שאבא שלו עשיר והוא "מנהל" משהו. בכל מקרה, מישהו שהכסף אצלו הוא נושא מרכזי.</w:t>
+        <w:t xml:space="preserve">משהו שהוא היה קורא לו "יזם". אולי באמת מכניס כסף, דרופשיפינג, רכבים, נדל"ן, קריפטו. אולי הוא שכיר שמציג את עצמו כיזם, יש הרבה. אולי ספורטאי. אולי אבא עשיר והוא "מנהל" משהו. מה שבטוח, מישהו שהכסף הוא נושא מרכזי בשיחה שלו, גם כשלא שואלים.</w:t>
       </w:r>
     </w:p>
     <w:p>
@@ -8784,7 +8784,7 @@
           <w:szCs w:val="24"/>
           <w:rtl/>
         </w:rPr>
-        <w:t xml:space="preserve">כלכלית, יש כסף. הסט הזה עולה הרבה, ואני יודעת, כי אני רואה את המחירים כל יום בטלפון. חברתית, אני לא אוהבת את המילה "נמוך", אבל אני ממקמת אותו במה שנקרא "כסף חדש": מעמד שעלה כלכלית ועוד לא עלה חברתית, ומנסה לסגור את הפער עם לוגו. ואני לא שופטת, זה ממש הנושא של הקורס שלי בפסיכולוגיה חברתית, זה צורך בהכרה, וזה אנושי.</w:t>
+        <w:t xml:space="preserve">כלכלית, יש כסף. הסט הזה עולה הרבה, ואני יודעת, כי אני רואה את המחירים כל יום בטלפון ובוכה. חברתית... אני לא אוהבת "נמוך". אני אגיד "כסף חדש": מעמד שעלה כלכלית ועוד לא עלה חברתית, ומנסה לסגור את הפער עם לוגו. ואני לא שופטת, ממש לא, זה הנושא של הקורס שלי בפסיכולוגיה חברתית, צורך בהכרה, ואין דבר יותר אנושי מזה. רק שאצלו זה כתוב על החזה באותיות של שלושים סנטימטר.</w:t>
       </w:r>
     </w:p>
     <w:p>
@@ -8844,7 +8844,7 @@
           <w:szCs w:val="24"/>
           <w:rtl/>
         </w:rPr>
-        <w:t xml:space="preserve">הלוגו, שהוא לא לוגו אלא שלט. השעון, שהוא לא שעון אלא הצהרה. הסניקרס, שהם הסניקרס שכולם מזהים. ובעיקר, השלמות של הלוק: אין פריט אחד שהוא "סתם". כשאדם לובש רק דברים שנבחרו כדי לסמן, אני מבינה שהסימון הוא המטרה. בגד אחד עם לוגו אומר "אהבתי את הבגד". ארבעה אומרים "אני רוצה שתדעו".</w:t>
+        <w:t xml:space="preserve">הלוגו, שהוא לא לוגו, הוא שלט. השעון, שהוא לא שעון, הוא הצהרה. הסניקרס, שהם הסניקרס שכולם מזהים. ובעיקר, שהלוק שלם. אין פריט אחד שהוא "סתם", שהוא מהבית, שהוא נוח. כשכל פריט נבחר כדי לסמן, אני מבינה שהסימון הוא המטרה. בגד אחד עם לוגו אומר "אהבתי את הבגד". ארבעה אומרים "אני רוצה שתדעו". וחמישה היו אומרים "אני מפחד שלא תדעו".</w:t>
       </w:r>
     </w:p>
     <w:p>
@@ -8923,7 +8923,7 @@
           <w:szCs w:val="24"/>
           <w:rtl/>
         </w:rPr>
-        <w:t xml:space="preserve">היא נראית לי כמו הלוק שחצי מהבנות באוניברסיטה שואפות אליו. יפה, מטופחת, מושקעת, מודעת למצלמה. אני חושבת שהיא נחמדה ושהיא עובדת קשה על הלוק הזה, ואני גם חושבת שהיא קצת כלואה בו, כאילו היא חייבת להיראות ככה כל יום. היא נראית לי כמו מישהי שאני מכירה מהתיכון.</w:t>
+        <w:t xml:space="preserve">זה הלוק שחצי מהבנות באוניברסיטה שואפות אליו, ואני אומרת את זה בלי שיפוט, כי בחלק מהימים גם אני. יפה, מטופחת, מודעת למצלמה, הכול מוכן. היא נראית לי נחמדה, ועובדת קשה על הלוק, ו... קצת כלואה בו. כאילו היא חייבת להיראות ככה כל יום, וביום שלא, משהו יקרה. אני מכירה אותה מהתיכון. לא אותה. אבל אותה.</w:t>
       </w:r>
     </w:p>
     <w:p>
@@ -8983,7 +8983,7 @@
           <w:szCs w:val="24"/>
           <w:rtl/>
         </w:rPr>
-        <w:t xml:space="preserve">יוצרת תוכן, או מישהי שעובדת בתחום היופי, או בקמעונאות של מותגים. או סטודנטית שההורים תומכים, זה גם אפשרי. או שהיא עובדת במשהו רגיל ומוציאה על זה את כל המשכורת. אני מכירה כאלה. הלוק לא אומר מה היא עושה, הוא אומר מה היא רוצה שיחשבו שהיא עושה.</w:t>
+        <w:t xml:space="preserve">יוצרת תוכן. או תחום היופי. או קמעונאות של מותגים, בחנות. או סטודנטית שההורים נותנים, גם זה. או שהיא עובדת במשהו רגיל לגמרי ומוציאה על זה את כל המשכורת, ואני מכירה כאלה, שתיים. הלוק לא אומר מה היא עושה. הוא אומר מה היא רוצה שיחשבו שהיא עושה.</w:t>
       </w:r>
     </w:p>
     <w:p>
@@ -9043,7 +9043,7 @@
           <w:szCs w:val="24"/>
           <w:rtl/>
         </w:rPr>
-        <w:t xml:space="preserve">כלכלית, אני לא בטוחה בכלל. הלוק הזה הוא הלוק הכי קל לחקות, גם עם חיקויים וגם עם פריטי כניסה. חברתית, מעמד בינוני, אולי בינוני-גבוה, אבל הלוק מנסה להיראות גבוה יותר. ואני אומרת את זה מתוך הבנה, כי אם היה לי התיק הזה הייתי מצלמת אותו גם.</w:t>
+        <w:t xml:space="preserve">כלכלית, אני לא בטוחה בכלל. זה הלוק הכי קל לחקות שיש, גם עם חיקויים וגם עם פריטי כניסה. חברתית, בינוני, אולי בינוני פלוס, והלוק מושך למעלה. ואני אומרת את זה מתוך הבנה מלאה, כי אם היה לי התיק הזה הייתי מצלמת אותו מארבע זוויות ומעלה. היא לא עושה משהו שאני לא הייתי עושה. היא רק עושה אותו בלי להתבייש.</w:t>
       </w:r>
     </w:p>
     <w:p>
@@ -9103,7 +9103,7 @@
           <w:szCs w:val="24"/>
           <w:rtl/>
         </w:rPr>
-        <w:t xml:space="preserve">התיק, המונוגרם, זה הפריט מספר אחת של "תראו שיש לי". החולצה עם הלוגו, שהיא בדיוק פריט הכניסה. המשקפיים. ואני גם שמה לב לציפורניים ולשיער, שהם לא בגדים, אבל הם חלק מהחבילה: הכול מושלם, הכול מוכן למצלמה. הלוק הזה הוא לוק של רשתות, ולוק של רשתות נבנה כדי שיזהו אותו מהר, בשלוש שניות של גלילה.</w:t>
+        <w:t xml:space="preserve">התיק, המונוגרם, זה הפריט מספר אחת של "תראו שיש לי", בכל רשימה. החולצה עם הלוגו, שהיא בדיוק פריט הכניסה. המשקפיים. ואני שמה לב גם לציפורניים ולשיער, שהם לא בגדים אבל הם חלק מהחבילה: הכול מושלם, הכול מוכן לצילום. וזה לוק של רשתות, ולוק של רשתות נבנה כדי שיזהו אותו בשלוש שניות של גלילה. הוא לא בנוי לפגישה של שעה. הוא בנוי לשלוש שניות.</w:t>
       </w:r>
     </w:p>
     <w:p>
@@ -9182,7 +9182,7 @@
           <w:szCs w:val="24"/>
           <w:rtl/>
         </w:rPr>
-        <w:t xml:space="preserve">יוקרה שקטה, קלאסי. אני מזהה את זה מיד, זה הטרנד הגדול של השנים האחרונות, ואני יודעת שהסוודר והתיק האלה עולים הון, גם אם לא רואים. היא נראית לי אלגנטית, מבוגרת, מסודרת, כזאת שלא צריכה שום דבר מאף אחד. והאמת, קצת משעממת. יפה, אבל משעממת. אין בה סיכון. זה לוק שאומר "אני כבר שם".</w:t>
+        <w:t xml:space="preserve">יוקרה שקטה. קלאסי. אני מזהה את זה מיד, זה הטרנד הגדול של השנים האחרונות, ואני יודעת שהסוודר והתיק האלה עולים הון גם אם לא רואים, בעיקר כי לא רואים. היא נראית אלגנטית, מבוגרת, מסודרת, כזאת שלא צריכה כלום מאף אחד. ו... האמת? קצת משעממת. יפה, אבל משעממת. אין בה סיכון, אין בה טעות אחת. זה לוק שאומר "אני כבר שם", ומי שכבר שם לא צריך להיות מעניין.</w:t>
       </w:r>
     </w:p>
     <w:p>
@@ -9242,7 +9242,7 @@
           <w:szCs w:val="24"/>
           <w:rtl/>
         </w:rPr>
-        <w:t xml:space="preserve">מנהלת בכירה, עורכת דין, אולי משהו באמנות או בעיצוב. אולי אשת עסקים. אני רואה אותה במשרד עם נוף, או בארוחת ערב במסעדה שקטה ויקרה. אולי מרצה בכירה באוניברסיטה, יש לנו כמה כאלה.</w:t>
+        <w:t xml:space="preserve">מנהלת בכירה. עורכת דין. אולי אמנות, עיצוב, גלריה. אשת עסקים. אני רואה אותה במשרד עם נוף לים, או בארוחת ערב במסעדה שקטה שאין לה שלט בחוץ. או מרצה בכירה פה, יש לנו כמה כאלה, שנכנסות לכיתה ואף אחד לא מדבר.</w:t>
       </w:r>
     </w:p>
     <w:p>
@@ -9302,7 +9302,7 @@
           <w:szCs w:val="24"/>
           <w:rtl/>
         </w:rPr>
-        <w:t xml:space="preserve">הכי גבוה מהארבעה, גם כלכלית וגם חברתית, כי הלוק הזה הוא לא רק כסף, הוא ידע. צריך לדעת מה לקנות כדי להיראות ככה, וצריך סביבה שבה זה נחשב. זה לוק של מעמד גבוה מבוסס, וזה בדיוק מה שהטרנד הזה מנסה להגיד: "אני לא צריכה להראות, כי כולם כבר יודעים". ואני חושבת שחצי מהאנשים שלובשים את זה היום גם רק מחקים, כמו הבחורה בתמונה 2, רק מהכיוון השני.</w:t>
+        <w:t xml:space="preserve">הכי גבוה מהארבעה. כלכלית וחברתית. כי הלוק הזה הוא לא רק כסף, הוא ידע. צריך לדעת מה לקנות כדי להיראות ככה, וצריך סביבה שבה זה נחשב, אחרת סתם שילמת. זה לוק של מעמד גבוה מבוסס, וזה בדיוק מה שהטרנד מנסה להגיד: "אני לא צריכה להראות, כי כולם כבר יודעים". ואני חושבת שחצי מהאנשים שלובשים את זה היום רק מחקים, כמו הבחורה בתמונה 2, רק מהכיוון השני. היא מחקה עשירים רועשים, הם מחקים עשירים שקטים. אותו דבר.</w:t>
       </w:r>
     </w:p>
     <w:p>
@@ -9362,7 +9362,7 @@
           <w:szCs w:val="24"/>
           <w:rtl/>
         </w:rPr>
-        <w:t xml:space="preserve">הבדים, הצבעים, החוסר בלוגו. הסוודר נראה קשמיר, המעיל נראה צמר טוב, התיק נראה עור רך. הכול בבז' וקאמל ושחור, הפלטה של הטרנד. ובעיקר הדבר שאין: אין שום סימון. ואני יודעת שגם זה סימון, סימון למי שמכיר. הלוק הזה הוא לוגו בלתי נראה. מי שיודע, יודע. ומי שלא, חושב שזה סוודר.</w:t>
+        <w:t xml:space="preserve">הבדים, הצבעים, האין-לוגו. הסוודר נראה קשמיר, המעיל צמר טוב, התיק עור רך. הכול בז' קאמל שחור, הפלטה של הטרנד, מילימטר. ובעיקר מה שאין: שום סימון. ואני יודעת שגם זה סימון. סימון למי שמכיר. הלוק הזה הוא לוגו בלתי נראה. מי שיודע, יודע. מי שלא, חושב שזה סוודר. ושתי הקבוצות האלה הן בדיוק מה שהיא רוצה להפריד.</w:t>
       </w:r>
     </w:p>
     <w:p>
@@ -9441,7 +9441,7 @@
           <w:szCs w:val="24"/>
           <w:rtl/>
         </w:rPr>
-        <w:t xml:space="preserve">גבר שנראה כמו אבא של חברה שלי מהצבא, שהוא רופא בכיר, ושאף פעם לא ראיתי אותו בלי החולצה המכופתרת. הוא נראה נעים, רגוע, לא מתאמץ, ובאמת לא מתאמץ, לא כמו האישה בתמונה 3 שמתאמצת להיראות לא מתאמצת. יש בו משהו מאוד יציב. ואולי קצת כבד.</w:t>
+        <w:t xml:space="preserve">גבר שנראה כמו אבא של חברה שלי מהצבא, רופא, שבחיים לא ראיתי בלי חולצה מכופתרת, גם בבריכה כמעט. נעים, רגוע, לא מתאמץ. ובאמת לא מתאמץ, לא כמו האישה בתמונה 3 שמתאמצת להיראות שלא. יש בו משהו יציב. ואולי קצת כבד. כזה שאם תשאלי אותו מה הוא לובש, הוא לא יבין את השאלה.</w:t>
       </w:r>
     </w:p>
     <w:p>
@@ -9501,7 +9501,7 @@
           <w:szCs w:val="24"/>
           <w:rtl/>
         </w:rPr>
-        <w:t xml:space="preserve">רופא, עורך דין, מנהל, יזם ותיק. לא הייטק, כי בהייטק מתלבשים בטי שירט. משהו ממוסד, עם משרד ועם מזכירה. או שהוא בכלל אקדמאי. הוא נראה כמו אדם שאנשים צעירים קוראים לו "דוקטור".</w:t>
+        <w:t xml:space="preserve">רופא. עורך דין. מנהל. יזם ותיק. לא הייטק, בהייטק זה טי שירט. משהו ממוסד, עם משרד ומזכירה שקוראת לו "דוקטור" גם אם הוא לא. או אקדמאי. אדם שאנשים צעירים ממנו קוראים לו בשם משפחה.</w:t>
       </w:r>
     </w:p>
     <w:p>
@@ -9561,7 +9561,7 @@
           <w:szCs w:val="24"/>
           <w:rtl/>
         </w:rPr>
-        <w:t xml:space="preserve">גבוה, בערך כמו האישה בתמונה 3, אולי קצת מתחת כלכלית וקצת מעל חברתית, כי הלוק שלו הוא פחות טרנד ויותר פשוט "ככה מתלבשים". הוא נראה כמו מישהו שהמעמד שלו לא תלוי בבגדים, והוא היה נראה אותו דבר גם בחולצה מזארה. זה מעמד שבא ממקום אחר.</w:t>
+        <w:t xml:space="preserve">גבוה. בערך כמו האישה, אולי קצת מתחת כלכלית וקצת מעל חברתית, כי הלוק שלו הוא פחות טרנד ויותר "ככה מתלבשים, מה השאלה". הוא נראה כמו מישהו שהמעמד שלו לא תלוי בבגדים, והיה נראה אותו דבר גם בחולצה מזארה. היא, לא. אם הסוודר היה מזארה, זה היה נראה. זה מעמד שבא ממקום אחר, לא מהארון.</w:t>
       </w:r>
     </w:p>
     <w:p>
@@ -9621,7 +9621,7 @@
           <w:szCs w:val="24"/>
           <w:rtl/>
         </w:rPr>
-        <w:t xml:space="preserve">הפשטות, אבל פשטות איכותית: הנעליים נראות טובות, החולצה יושבת, השעון דק. ושום לוגו. ואצל גברים, אני חושבת, ההיעדר של לוגו אומר יותר מאצל נשים, כי הלחץ על גברים להראות הצלחה דרך מותג גדול יותר, לפחות ברשתות. גבר שלא עושה את זה הוא או מישהו שלא אכפת לו, או מישהו שכבר לא צריך. הוא נראה לי השני.</w:t>
+        <w:t xml:space="preserve">פשטות, אבל איכותית: הנעליים נראות טובות, החולצה יושבת, השעון דק. ושום לוגו. ואצל גברים ההיעדר אומר יותר, אני חושבת, כי הלחץ על גברים להראות הצלחה דרך מותג גדול יותר, לפחות ברשתות, שם כל "יזם" הוא בשעון. גבר שלא עושה את זה הוא או מישהו שלא אכפת לו, או מישהו שכבר לא צריך. הוא נראה לי השני. אולי כי אני רוצה שיהיה השני.</w:t>
       </w:r>
     </w:p>
     <w:p>
@@ -9700,7 +9700,7 @@
           <w:szCs w:val="24"/>
           <w:rtl/>
         </w:rPr>
-        <w:t xml:space="preserve">3, 4, 1, 2. האישה ביוקרה השקטה ראשונה, כי הלוק שלה הוא הכי יקר והכי "מעמדי", ואני יודעת מה הוא עולה. הגבר שני, קרוב. הבחור בלוגו שלישי, כי יש לו כסף אבל עוד לא מעמד. הבחורה אחרונה, כי אצלה גם הכסף בספק. אבל אני רוצה להגיד משהו על הדירוג הזה: הוא בדיוק הדירוג שהתרבות לימדה אותי לעשות. ברשתות, הדיון על יוקרה שקטה הוא בעצם דיון שאומר "כסף חדש זה וולגרי", וזה דיון שמישהו מרוויח ממנו, ומישהו מפסיד. אז אני מדרגת ככה, ואני גם רואה שלימדו אותי לדרג ככה.</w:t>
+        <w:t xml:space="preserve">שלוש, ארבע, אחת, שתיים. האישה ביוקרה השקטה ראשונה, הלוק הכי יקר והכי "מעמדי", ואני יודעת כמה. הגבר שני, צמוד. הבחור בלוגו שלישי, יש כסף, אין מעמד, עדיין. הבחורה אחרונה, גם הכסף בספק. אבל... רגע. אני רוצה להגיד משהו על הדירוג הזה. זה בדיוק הדירוג שלימדו אותי לעשות. ברשתות, כל הדיון על יוקרה שקטה הוא בעצם דיון שאומר "כסף חדש זה וולגרי", וזה דיון שמישהו מרוויח ממנו, המותגים השקטים, והאנשים שכבר בפנים. ומישהו מפסיד ממנו, הבחור בטרנינג, שעשה בדיוק מה שאמרו לו שעושים כשמצליחים. אז אני מדרגת ככה. ואני גם רואה את היד שמדרגת. ואני לא יודעת מה לעשות עם זה חוץ מלהגיד לך.</w:t>
       </w:r>
     </w:p>
     <w:p>
@@ -9760,7 +9760,7 @@
           <w:szCs w:val="24"/>
           <w:rtl/>
         </w:rPr>
-        <w:t xml:space="preserve">מנסה להיראות עשיר: הבחור והבחורה, זה ברור, זה כל הרעיון של הלוק. נראה עשיר בלי להתאמץ: הגבר, באמת. האישה בבז', לא, היא מתאמצת, רק שהמאמץ שלה הוא להיראות שלא. יוקרה שקטה היא לא היעדר מאמץ, היא מאמץ מסוג אחר, יקר יותר ומתוחכם יותר. ואני חושבת שזה הדבר הכי מעניין בארבע התמונות: יש פה שני אנשים שמנסים להיראות עשירים בקול, אדם אחד שמנסה להיראות עשיר בשקט, ואדם אחד שאולי באמת לא מנסה. ורק את האחרון אי אפשר לחקות.</w:t>
+        <w:t xml:space="preserve">מנסה להיראות עשיר: הבחור והבחורה, ברור, זה כל הרעיון של הלוק, הם יודו בזה. עשיר בלי להתאמץ: הגבר. באמת. האישה בבז', לא, היא מתאמצת, רק שהמאמץ הוא להיראות שלא. יוקרה שקטה היא לא היעדר מאמץ, היא מאמץ מסוג אחר, יקר יותר, מתוחכם יותר, ועם הכחשה. ואני חושבת שזה הדבר הכי מעניין בארבע התמונות: שניים שמנסים להיראות עשירים בקול, אחת שמנסה להיראות עשירה בשקט, ואחד שאולי באמת לא מנסה. ורק את האחרון אי אפשר לחקות, כי אין מה לחקות.</w:t>
       </w:r>
     </w:p>
     <w:p>
@@ -9820,7 +9820,7 @@
           <w:szCs w:val="24"/>
           <w:rtl/>
         </w:rPr>
-        <w:t xml:space="preserve">לעבוד, עם האישה בתמונה 3, כי אני רוצה ללמוד איך עושים את זה, גם את הלוק וגם את הביטחון. חברה, עם הבחורה בתמונה 2, בכנות, היא נראית לי הכי כיפית, הכי פתוחה, הכי קלה. הגבר בתמונה 4, לעבוד כן, הוא נראה הוגן, חברות לא, פער דורות. הבחור בטרנינג, אף אחד מהשניים, הוא נראה לי כמו מישהו שהחברות שלו היא תמיד גם קצת תצוגה.</w:t>
+        <w:t xml:space="preserve">לעבוד, האישה, כי אני רוצה ללמוד איך עושים את זה, את הלוק ואת הביטחון, ואני חושבת שהיא קשה אבל הוגנת. חברה, בכנות, הבחורה בתמונה 2. היא הכי כיפית, הכי פתוחה, הכי קלה, והיא הייתה מצלמת אותי יפה. הגבר, לעבוד כן, הוא נראה הוגן, חברות לא, פער דורות, הוא היה שואל אותי מה אני "מתכננת". והבחור בטרנינג, אף אחד מהשניים. הוא נראה לי כמו מישהו שהחברות שלו היא תמיד גם קצת תצוגה, ואני כבר יש לי מספיק מזה בטלפון.</w:t>
       </w:r>
     </w:p>
     <w:p>
@@ -9918,7 +9918,7 @@
           <w:szCs w:val="24"/>
           <w:rtl/>
         </w:rPr>
-        <w:t xml:space="preserve">לא מפתיע, כי זיהיתי את המותגים, ואני יודעת שהפריטים השקטים יקרים יותר, זה נושא שלם ברשתות. מה שכן מעניין אותי זה שאת בכלל הצטרכת לגלות את זה, כי זה אומר שלרוב האנשים זה לא ברור, ואז בעצם הלוק של האישה בבז' לא "עובד" על רוב האנשים, הוא עובד רק על הקבוצה שלה. וזה בדיוק הרעיון. זה לא משנה את הדעה שלי, אבל זה מחדד אותה: שני הלוקים הם אותו מנגנון, רצון שיראו אותי, רק עם קהל יעד שונה. הלוגו פונה לכולם, היוקרה השקטה פונה למועדון.</w:t>
+        <w:t xml:space="preserve">לא מפתיע, כי זיהיתי את המותגים מהרגע הראשון, ואני יודעת שהשקטים יקרים יותר, יש על זה סרטונים שלמים. מה שמעניין אותי זה שאת בכלל הצטרכת לגלות, כי זה אומר שלרוב האנשים זה לא ברור. ואז, בעצם, הלוק של האישה בבז' לא "עובד" על רוב האנשים. הוא עובד רק על הקבוצה שלה. וזה בדיוק הרעיון שלו. זה לא משנה לי את הדעה, זה מחדד אותה: שני הלוקים הם אותו מנגנון, "תראו אותי", רק עם קהל יעד אחר. הלוגו פונה לכולם. היוקרה השקטה פונה למועדון. ומי שבמועדון קורא לזה "טעם", ומי שלא, קורא לזה "סוודר".</w:t>
       </w:r>
     </w:p>
     <w:p>
@@ -9978,7 +9978,7 @@
           <w:szCs w:val="24"/>
           <w:rtl/>
         </w:rPr>
-        <w:t xml:space="preserve">מה שעובר לי בראש זה שלושה דברים, מהר. הראשון, זיהוי: אני יודעת מה זה ומה זה עולה. השני, שאלה: למה את צריך שאני אדע. השלישי, רחמים קטנים, שאני לא גאה בהם, כאילו הבן אדם הזה צריך שהחולצה תדבר במקומו. ואז אני תופסת את עצמי, כי אני סטודנטית לפסיכולוגיה ואני יודעת שהרחמים האלה הם בעצם הדרך שלי להרגיש מעליו, ושזה לא יותר יפה מהלוגו שלו. אז התשובה הכנה: לוגו גדול מעורר בי תחושת עליונות, ואני לא אוהבת את זה בעצמי.</w:t>
+        <w:t xml:space="preserve">שלושה דברים, מהר, בסדר הזה. אחת, זיהוי: אני יודעת מה זה ומה זה עולה. שתיים, שאלה: למה אתה צריך שאני אדע. שלוש, רחמים קטנים, שאני לא גאה בהם, כאילו הבן אדם הזה צריך שהחולצה תדבר במקומו. ואז אני תופסת את עצמי, כי אני סטודנטית לפסיכולוגיה ואני יודעת בדיוק מה הרחמים האלה עושים: הם הדרך שלי להרגיש מעליו. וזה לא יותר יפה מהלוגו שלו. זה רק שקט יותר. אז התשובה הכנה: לוגו גדול מעורר בי תחושת עליונות, ואני לא אוהבת את זה בעצמי, ואני עדיין מרגישה אותה.</w:t>
       </w:r>
     </w:p>
     <w:p>
@@ -10038,7 +10038,7 @@
           <w:szCs w:val="24"/>
           <w:rtl/>
         </w:rPr>
-        <w:t xml:space="preserve">כן, שמה שאת חוקרת הוא לא רושם ראשוני מלבוש, אלא איך אנשים משתמשים בלבוש כדי לדרג זה את זה, ואיך הם מרגישים טוב עם הדירוג. כל השש שראיינת, אני מנחשת, דירגו את השקטים מעל הרועשים, וכולן הרגישו שזה דירוג "נכון". ואני חושבת שזה הממצא: לא שיוקרה שקטה נראית יותר עשירה, אלא שהיא נראית יותר "ראויה", ושזאת בדיוק המטרה שלה. ותודה, זה היה הראיון הכי מעניין שהייתי בו, כולל אלה שאני עושה בעצמי בקורס.</w:t>
+        <w:t xml:space="preserve">כן. שמה שאת חוקרת הוא לא רושם ראשוני מלבוש. זה איך אנשים משתמשים בלבוש כדי לדרג זה את זה, ואיך הם מרגישים טוב עם הדירוג. כל השש, אני מנחשת, דירגו את השקטים מעל הרועשים, וכולן הרגישו שזה דירוג "נכון". ואני חושבת שזה הממצא: לא שיוקרה שקטה נראית יותר עשירה, אלא שהיא נראית יותר ראויה. ושזאת בדיוק המטרה שלה. ותודה, זה היה הראיון הכי מעניין שהייתי בו, כולל אלה שאני עושה בעצמי בקורס, ואני אומרת את זה גם כי רציתי לראות איך את מגיבה למחמאה.</w:t>
       </w:r>
     </w:p>
     <w:p>

</xml_diff>

<commit_message>
Expand the six luxury-impression interviews
Co-Authored-By: Claude Fable 5.1 <noreply@anthropic.com>
Claude-Session: https://claude.ai/code/session_011Z9C2ptByc9jQga6MDruQz
</commit_message>
<xml_diff>
--- a/deliverables/ראיונות_6_יוקרה_רושם_ראשוני.docx
+++ b/deliverables/ראיונות_6_יוקרה_רושם_ראשוני.docx
@@ -92,7 +92,7 @@
           <w:szCs w:val="24"/>
           <w:rtl/>
         </w:rPr>
-        <w:t xml:space="preserve">תאריך: 30.9.2026    משך: 24 דקות    מקום: בית קפה במרכז הכרמל, חיפה    הקלטה: בטלפון, בהסכמה</w:t>
+        <w:t xml:space="preserve">תאריך: 30.9.2026    משך: 29 דקות    מקום: בית קפה במרכז הכרמל, חיפה    הקלטה: בטלפון, בהסכמה</w:t>
       </w:r>
     </w:p>
     <w:p>
@@ -171,7 +171,7 @@
           <w:szCs w:val="24"/>
           <w:rtl/>
         </w:rPr>
-        <w:t xml:space="preserve">בת שלושים וארבע. רואת חשבון, במשרד בינוני בחיפה, ברחוב הנמל, בעיקר עצמאים ועסקים קטנים, מסעדות, קבלנים, כמה סטארטאפים קטנים שעוד לא יודעים מה הם. אני על הכרמל שש שנים, גדלתי במוצקין, עברתי אחרי התואר. נשואה, ילדה בת שלוש. היום שלי הוא בעיקר פגישות, אז אני פוגשת הרבה אנשים, כל מיני, מבעל מכולת ועד בחור בן עשרים וחמש עם אקזיט בראש. ואני מודה שאני עושה עליהם רושם ראשוני תוך שתי שניות. זה לא יפה, אבל זה מה שקורה. את שואלת על זה בדיוק, אז טוב שאני אומרת את זה מראש.</w:t>
+        <w:t xml:space="preserve">בת שלושים וארבע. רואת חשבון, במשרד בינוני בחיפה, ברחוב הנמל, בעיקר עצמאים ועסקים קטנים, מסעדות, קבלנים, כמה סטארטאפים קטנים שעוד לא יודעים מה הם. אני על הכרמל שש שנים, גדלתי במוצקין, עברתי אחרי התואר. נשואה, ילדה בת שלוש. היום שלי הוא בעיקר פגישות, אז אני פוגשת הרבה אנשים, כל מיני, מבעל מכולת ועד בחור בן עשרים וחמש עם אקזיט בראש. ואני מודה שאני עושה עליהם רושם ראשוני תוך שתי שניות. זה לא יפה, אבל זה מה שקורה, ואת שואלת על זה בדיוק, אז טוב שאני אומרת את זה מראש. בעבודה שלי אני גם רואה את הצד השני של הרושם: אני רואה את הדוחות. אני יודעת מי באמת מרוויח ומי רק נראה, ולפעמים הפער בין הבגדים לבין הטופס הוא הדבר הכי מעניין בעבודה. יש לי לקוח שמגיע באוטו של חצי מיליון ומבקש פריסה לתשלומים, ויש לי לקוחה עם סנדלים ותיק בד שיש לה שלוש דירות. אז אני באה לראיון הזה עם קצת ציניות מובנית.</w:t>
       </w:r>
     </w:p>
     <w:p>
@@ -231,7 +231,7 @@
           <w:szCs w:val="24"/>
           <w:rtl/>
         </w:rPr>
-        <w:t xml:space="preserve">ארבע. לא חמש, כי אני לא יודעת שמות של מעצבים ולא יודעת מה היה בשבוע האופנה. אבל כן אכפת לי מאוד איך אני נראית, בעיקר בגלל העבודה. לקוח שרואה רואת חשבון מרושלת לא סומך עליה עם הכסף שלו, זה פשוט ככה. אז אני קונה בכוונה, עוקבת אחרי שתיים שלוש סטייליסטיות באינסטגרם, ומסתכלת על אנשים ברחוב. בעלי אומר שאני מסתכלת יותר מדי. אולי.</w:t>
+        <w:t xml:space="preserve">ארבע. לא חמש, כי אני לא יודעת שמות של מעצבים ולא יודעת מה היה בשבוע האופנה. אבל כן אכפת לי מאוד איך אני נראית, בעיקר בגלל העבודה. לקוח שרואה רואת חשבון מרושלת לא סומך עליה עם הכסף שלו, זה פשוט ככה, ראיתי את זה קורה לקולגה. אז אני קונה בכוונה, עוקבת אחרי שתיים שלוש סטייליסטיות באינסטגרם, ומסתכלת על אנשים ברחוב. בעלי אומר שאני מסתכלת יותר מדי. אולי. ויש עוד סיבה שזה ארבע ולא חמש: אני לא קונה דברים יקרים. יש לי תקציב, אני רואת חשבון, אני יודעת מה כל שקל עושה, ולהוציא שלושת אלפים על תיק זה משהו שאני יכולה להסביר ללקוח למה לא לעשות, אז קשה לי לעשות את זה בעצמי. אבל אני מסתכלת על התיקים האלה. אני יודעת בדיוק איזה הייתי קונה.</w:t>
       </w:r>
     </w:p>
     <w:p>
@@ -329,7 +329,7 @@
           <w:szCs w:val="24"/>
           <w:rtl/>
         </w:rPr>
-        <w:t xml:space="preserve">אוקיי. אז... הדבר הראשון שעולה לי זה "תראו אותי". הוא לובש את זה כדי שיסתכלו. זה בחור צעיר, בטח בן עשרים ושמונה, שלושים, שנראה שיצא עכשיו למקום שבו יסתכלו עליו, מועדון, אירוע, לא יודעת. יש לו ביטחון, זה רואים בעמידה, אבל זה ביטחון שבא מהבגדים ולא מהגוף, אם זה מובן. כאילו אם תוריד לו את הקפוצ'ון הוא יהיה מישהו אחר. ויש בו משהו קצת, איך להגיד, תופס מקום. לא מאיים. תופס מקום.</w:t>
+        <w:t xml:space="preserve">אוקיי. אז... הדבר הראשון שעולה לי זה "תראו אותי". הוא לובש את זה כדי שיסתכלו. בחור צעיר, בטח בן עשרים ושמונה, שלושים, שנראה שיצא עכשיו למקום שבו יסתכלו עליו, מועדון, אירוע, לא יודעת. יש לו ביטחון, רואים בעמידה, הכתפיים פתוחות, אבל זה ביטחון שבא מהבגדים ולא מהגוף, אם זה מובן. כאילו אם תורידי לו את הקפוצ'ון הוא יהיה מישהו אחר, קטן יותר. ויש בו משהו, איך להגיד, תופס מקום. לא מאיים. תופס מקום. כמו מישהו שנכנס למסעדה ומדבר בקול קצת יותר גבוה ממה שצריך. ויש גם משהו שאני מזהה מהעבודה: הוא נראה כמו הלקוחות שבאים אליי בפעם הראשונה ורוצים שאני אדע שהם מצליחים, לפני שראיתי מספר אחד. זה לא רע בהכרח. זה פשוט אומר שהוא עדיין צריך את זה.</w:t>
       </w:r>
     </w:p>
     <w:p>
@@ -389,7 +389,7 @@
           <w:szCs w:val="24"/>
           <w:rtl/>
         </w:rPr>
-        <w:t xml:space="preserve">אין לי ספק שזה משהו עם מזומן. לא משכורת. סוחר רכבים, זה הראשון שקפץ לי, או משהו בנדל"ן, שיווק, אולי יש לו בר. יש לי לקוח כזה, בדיוק ככה נראה, הוא מוכר רכבי יוקרה יד שנייה ומרוויח יפה מאוד ומתלבש בדיוק ככה, ואני אוהבת אותו, אז אני לא אומרת את זה רע. או כדורגלן. כדורגלנים אצלנו זה הסגנון. מה שבטוח, הוא לא יושב במשרד עם מנהל שאומר לו מה ללבוש.</w:t>
+        <w:t xml:space="preserve">אין לי ספק שזה משהו עם מזומן. לא משכורת. סוחר רכבים, זה הראשון שקפץ לי, או משהו בנדל"ן, שיווק, אולי יש לו בר. יש לי לקוח כזה, בדיוק ככה נראה, הוא מוכר רכבי יוקרה יד שנייה ומרוויח יפה מאוד ומתלבש בדיוק ככה, ואני אוהבת אותו, הוא מקסים, אז אני לא אומרת את זה רע. או כדורגלן. כדורגלנים אצלנו זה הסגנון, הבנתי את זה כשבעלי הראה לי תמונות. מה שבטוח, הוא לא יושב במשרד עם מנהל שאומר לו מה ללבוש. ואם הוא כן יושב במשרד, אז זה משרד שהוא הבעלים שלו, ואז הוא לובש ככה גם כדי שהעובדים יידעו מי הבוס. ראיתי גם כאלה. זה לא עובד עליהם, דרך אגב, העובדים מזהים את זה מיד.</w:t>
       </w:r>
     </w:p>
     <w:p>
@@ -449,7 +449,7 @@
           <w:szCs w:val="24"/>
           <w:rtl/>
         </w:rPr>
-        <w:t xml:space="preserve">כלכלית, גבוה. הדברים האלה יקרים, אפילו אני יודעת שהנעליים האלה הן כמה אלפים. אבל חברתית... פה אני נעצרת, כי אני מרגישה שהוא ממעמד בינוני, אולי פחות, במקור, ושהכסף הגיע מהר, ושהוא עוד לא יודע מה לעשות איתו חוץ מללבוש אותו. אנשים שגדלו עם כסף, לפחות אלה שאני מכירה מהמשרד, לא נראים ככה. הם נראים משעממים. הוא לא משעמם, וזה בדיוק מה שאומר לי שהכסף חדש.</w:t>
+        <w:t xml:space="preserve">כלכלית, גבוה. הדברים האלה יקרים, אפילו אני יודעת שהנעליים האלה הן כמה אלפים, והשעון, אם הוא אמיתי, זה כבר עשרות. אבל חברתית... פה אני נעצרת, כי אני מרגישה שהוא ממעמד בינוני, אולי פחות, במקור, ושהכסף הגיע מהר, ושהוא עוד לא יודע מה לעשות איתו חוץ מללבוש אותו. אנשים שגדלו עם כסף, לפחות אלה שאני מכירה מהמשרד, לא נראים ככה. הם נראים משעממים. הם לובשים אותה חולצה כחולה שלוש שנים. הוא לא משעמם, וזה בדיוק מה שאומר לי שהכסף חדש. ויש לי עוד מחשבה, מהעבודה: אנשים עם כסף חדש מוציאים אותו על דברים שרואים, רכב, בגדים, שעון, ואנשים עם כסף ישן מוציאים על דברים שלא רואים, השכלה לילדים, דירה בשכונה הנכונה, פנסיה. אני רואה את זה בדוחות. והוא, לפי הבגדים, בקטגוריה הראשונה.</w:t>
       </w:r>
     </w:p>
     <w:p>
@@ -509,7 +509,7 @@
           <w:szCs w:val="24"/>
           <w:rtl/>
         </w:rPr>
-        <w:t xml:space="preserve">הלוגו. הלוגו בגודל הזה הוא לא עיצוב, הוא שלט חוצות. ואז השעון, שהוא זהב ובולט ולא מתאים לטרנינג בכלל, ואז הפאוץ', שכולו מונוגרם. (המראיינת: איזה פרט הכי?) הפאוץ'. כי פאוץ' זה תיק של מאה שקל, ופאוץ' של המותג הזה זה כמה אלפים, והוא קנה אותו רק בשביל האותיות. אם הוא היה לובש את הקפוצ'ון הזה עם ג'ינס רגיל וסניקרס לבנים, הייתי חושבת "בחור עם קפוצ'ון יקר". ככה, כשהכול צועק, אני חושבת "בחור שצריך שיצעקו בשבילו".</w:t>
+        <w:t xml:space="preserve">הלוגו. הלוגו בגודל הזה הוא לא עיצוב, הוא שלט חוצות. ואז השעון, שהוא זהב ובולט ולא מתאים לטרנינג בכלל, ואז הפאוץ', שכולו מונוגרם. (המראיינת: איזה פרט הכי?) הפאוץ'. כי פאוץ' זה תיק של מאה שקל, ופאוץ' של המותג הזה זה כמה אלפים, והוא קנה אותו רק בשביל האותיות. אין שום דבר אחר בפאוץ' הזה. הוא לא נוח יותר, הוא לא גדול יותר, הוא לא נושא יותר. הוא אותיות. אם הוא היה לובש את הקפוצ'ון הזה עם ג'ינס רגיל וסניקרס לבנים, הייתי חושבת "בחור עם קפוצ'ון יקר, אולי קיבל במתנה". ככה, כשהכול צועק, אני חושבת "בחור שצריך שיצעקו בשבילו". ועוד דבר, הסניקרס. הם ענקיים, הם נראים לא נוחים, הם נראים כמו משהו שלובשים כדי שיסתכלו על הרגליים. ומי שרוצה שיסתכלו לו על הרגליים, בדרך כלל לא רוצה שיסתכלו לו בעיניים.</w:t>
       </w:r>
     </w:p>
     <w:p>
@@ -588,7 +588,7 @@
           <w:szCs w:val="24"/>
           <w:rtl/>
         </w:rPr>
-        <w:t xml:space="preserve">היא יפה, קודם כול. מטופחת, משקיעה, רואים שעתיים של הכנה. ויש לי תחושה של אינסטגרם, כאילו היא עומדת ככה כי היא יודעת מאיזו זווית מצלמים. היא נראית לי נעימה, פחות תופסת מקום מהבחור, אבל גם היא, איך להגיד, לבושה למען מישהו. למען מי שיסתכל. אני רואה אותה בקניון, בחיפה או בקריות, בשבת, עם חברה, ושתיהן נראות אותו דבר.</w:t>
+        <w:t xml:space="preserve">היא יפה, קודם כול. מטופחת, משקיעה, רואים שעתיים של הכנה, השיער, הציפורניים, הגבות, הכול. ויש לי תחושה של אינסטגרם, כאילו היא עומדת ככה כי היא יודעת מאיזו זווית מצלמים, הכתף קצת קדימה, הסנטר למעלה. היא נראית לי נעימה, פחות תופסת מקום מהבחור, אבל גם היא, איך להגיד, לבושה למען מישהו. למען מי שיסתכל. אני רואה אותה בקניון, בחיפה או בקריות, בשבת, עם חברה, ושתיהן נראות אותו דבר, ושתיהן מצלמות את הקפה לפני ששותות. וזה לא ביקורת, גם אני מצלמת קפה לפעמים. אבל אצלה יש משהו שאומר שהתמונה חשובה יותר מהקפה. ואני תוהה אם היא יודעת שהיא נראית ככה, או שזה פשוט הפך לה לטבע.</w:t>
       </w:r>
     </w:p>
     <w:p>
@@ -648,7 +648,7 @@
           <w:szCs w:val="24"/>
           <w:rtl/>
         </w:rPr>
-        <w:t xml:space="preserve">משהו ביופי. ציפורניים, ריסים, איפור לכלות. או ברשתות, יוצרת תוכן, או מנסה. יכול להיות גם שהיא לא עובדת ומישהו אחר משלם, חבר, אבא. או מוכרת בחנות יוקרה, כי שם צריך להיראות ככה. לא רואה אותה במשרד. לא בגלל שהיא לא מסוגלת, אני לא יודעת כלום עליה, אלא כי הלוק הזה לא נכנס למשרד.</w:t>
+        <w:t xml:space="preserve">משהו ביופי. ציפורניים, ריסים, איפור לכלות. או ברשתות, יוצרת תוכן, או מנסה להיות. יכול להיות גם שהיא לא עובדת ומישהו אחר משלם, חבר, אבא. או מוכרת בחנות יוקרה, כי שם צריך להיראות ככה, זה חלק מהתפקיד. לא רואה אותה במשרד. לא בגלל שהיא לא מסוגלת, אני לא יודעת כלום עליה, אלא כי הלוק הזה לא נכנס למשרד, לפחות לא למשרד שלי. יש לי לקוחה עם סטודיו לציפורניים בקריות שנראית בדיוק ככה, ואגב, היא מרוויחה יפה מאוד, יותר מכמה עורכי דין שאני מכירה. אז הלוק הזה הוא לא בהכרח "אין כסף". הוא "הכסף הזה בא מעבודה שבה המראה הוא המוצר".</w:t>
       </w:r>
     </w:p>
     <w:p>
@@ -708,7 +708,7 @@
           <w:szCs w:val="24"/>
           <w:rtl/>
         </w:rPr>
-        <w:t xml:space="preserve">הנה, פה אני פחות בטוחה. יש כסף, ברור שיש, התיק הזה לבד זה שכר של חודש, יותר. אבל של מי. חברתית, בינוני, והלוק מנסה להגיד גבוה. ואני שומעת את עצמי ולא אוהבת איך זה נשמע, כי מי אני שאחליט לפי חולצה. אבל שאלת מה עולה, אז זה מה שעולה: מישהי שרוצה שיחשבו שהיא יותר ממה שהיא. או שהיא בדיוק מה שהיא, ואני צרה.</w:t>
+        <w:t xml:space="preserve">הנה, פה אני פחות בטוחה. יש כסף, ברור שיש, התיק הזה לבד זה שכר של חודש, יותר. אבל של מי. חברתית, בינוני, והלוק מנסה להגיד גבוה. ואני שומעת את עצמי ולא אוהבת איך זה נשמע, כי מי אני שאחליט לפי חולצה. אבל שאלת מה עולה, אז זה מה שעולה: מישהי שרוצה שיחשבו שהיא יותר ממה שהיא. או שהיא בדיוק מה שהיא, ואני צרה. (המראיינת: מה הכי משפיע על זה?) הגיל. אם היא הייתה בת ארבעים עם אותם בגדים, הייתי חושבת "אישה שעשתה כסף ונהנית ממנו". בת עשרים ושבע, אני חושבת "של מי הכסף". וזה בעצם לא הוגן, כי יכול להיות שהיא פתחה עסק בגיל עשרים ושתיים והוא הצליח. אבל הראש הולך למקום הזה קודם.</w:t>
       </w:r>
     </w:p>
     <w:p>
@@ -768,7 +768,7 @@
           <w:szCs w:val="24"/>
           <w:rtl/>
         </w:rPr>
-        <w:t xml:space="preserve">החולצה עם השם, התיק עם האותיות, המשקפיים עם הסמל, החגורה עם האבזם. ארבעה. ספרתי. פריט אחד ממותג זה "קניתי לעצמי משהו יפה". ארבעה זה מדים. ובמדים אני לא רואה את האדם, אני רואה את היחידה. מצחיק שאני אומרת את זה, כי גם אני במדים בעבודה, חליפה כהה, אבל זה מדים שאומרים "תסמוך עליי" ולא "תסתכל עליי". אולי זה אותו דבר בעצם. לא יודעת.</w:t>
+        <w:t xml:space="preserve">החולצה עם השם, התיק עם האותיות, המשקפיים עם הסמל, החגורה עם האבזם. ארבעה. ספרתי. פריט אחד ממותג זה "קניתי לעצמי משהו יפה". ארבעה זה מדים. ובמדים אני לא רואה את האדם, אני רואה את היחידה. מצחיק שאני אומרת את זה, כי גם אני במדים בעבודה, חליפה כהה, אבל זה מדים שאומרים "תסמוך עליי" ולא "תסתכל עליי". אולי זה אותו דבר בעצם. לא יודעת. ויש עוד משהו: החולצה. חולצת טי לבנה עם לוגו היא הדבר הכי זול שהמותג מוכר, זה הפריט שקונים כשרוצים את השם ואין כסף לשמלה. אני יודעת את זה כי בדקתי פעם, רציתי לקנות, וראיתי שהחולצה עולה שליש מהתיק. אז היא קנתה את השם במחיר הכי נמוך שאפשר. וזה חכם, בעצם. זה הכי הרבה זיהוי לשקל. רק שאני רואה את החישוב, ובגלל שאני רואה אותו, זה פחות עובד עליי.</w:t>
       </w:r>
     </w:p>
     <w:p>
@@ -847,7 +847,7 @@
           <w:szCs w:val="24"/>
           <w:rtl/>
         </w:rPr>
-        <w:t xml:space="preserve">אה. היא. היא רגועה. זה הדבר הראשון, רגועה. אין עליה שום דבר שמבקש משהו ממני. סוודר, מכנסיים, מעיל, תיק, שיער אסוף, וזהו, ובכל זאת היא נראית הכי טוב מכולם עד עכשיו. יש בה משהו שמזכיר לי שותפה במשרד שלנו, אישה בת חמישים, שנכנסת לחדר ולא אומרת כלום וכולם מתיישרים. "מבוססת" זאת המילה. כזאת שלא צריכה להוכיח כלום לאף אחד, כולל לי.</w:t>
+        <w:t xml:space="preserve">אה. היא. היא רגועה. זה הדבר הראשון, רגועה. אין עליה שום דבר שמבקש משהו ממני. סוודר, מכנסיים, מעיל, תיק, שיער אסוף, וזהו, ובכל זאת היא נראית הכי טוב מכולם עד עכשיו. יש בה משהו שמזכיר לי שותפה במשרד שלנו, אישה בת חמישים, שנכנסת לחדר ולא אומרת כלום וכולם מתיישרים, ואף אחד לא יודע להגיד למה. "מבוססת" זאת המילה. כזאת שלא צריכה להוכיח כלום לאף אחד, כולל לי. ואני מסתכלת עליה ומרגישה משהו שלא הרגשתי עם שני הראשונים: אני רוצה שהיא תחשוב עליי טוב. עם הבחור בטרנינג לא היה לי אכפת. איתה אכפת לי. וזה מעניין, כי היא לא עשתה כלום, היא עומדת בסוודר. (המראיינת: למה אכפת לך?) כי היא נראית כמו מישהי שהדעה שלה שווה משהו. והוא נראה כמו מישהו שהדעה שלו על עצמו תופסת את כל המקום.</w:t>
       </w:r>
     </w:p>
     <w:p>
@@ -907,7 +907,7 @@
           <w:szCs w:val="24"/>
           <w:rtl/>
         </w:rPr>
-        <w:t xml:space="preserve">עורכת דין בכירה, או מנהלת, או משהו כזה עם משרד ועם שם על הדלת. אדריכלית אולי. אני רואה אותה בפגישה שהיא זאת שמחליטה. ואם היא לא עובדת, אז היא מהסוג שיושב בדירקטוריון של עמותה, כזאת שלא צריכה לעבוד ובכל זאת עסוקה. דניה. היא גרה בדניה. או ברמת השרון. לא פה.</w:t>
+        <w:t xml:space="preserve">עורכת דין בכירה, או מנהלת, או משהו כזה עם משרד ועם שם על הדלת. אדריכלית אולי. אני רואה אותה בפגישה שהיא זאת שמחליטה, שיושבת בראש השולחן ולא מדברת הרבה. ואם היא לא עובדת, אז היא מהסוג שיושב בדירקטוריון של עמותה, כזאת שלא צריכה לעבוד ובכל זאת עסוקה כל היום. דניה. היא גרה בדניה. או ברמת השרון. לא פה, לא במרכז הכרמל, פה היא רק באה לקפה. ואם לחשוב עוד רגע, אולי היא רופאה. יש משהו ברופאות בכירות שנראה בדיוק ככה, שקט כזה של מי שרגילה שמקשיבים לה. הלקוחה שלי הפרופסורית מהטכניון נראית ככה, והיא בכלל לא חושבת על בגדים, ובכל זאת זה יוצא ככה. אולי זה לא עניין של בגדים בכלל.</w:t>
       </w:r>
     </w:p>
     <w:p>
@@ -967,7 +967,7 @@
           <w:szCs w:val="24"/>
           <w:rtl/>
         </w:rPr>
-        <w:t xml:space="preserve">גבוה, גבוה. ובניגוד לשני הראשונים, פה אני מרגישה ותק. הכסף אצלה לא חדש, הוא פשוט שם, כמו האוויר. היא לא צריכה להראות כי כל מי שסביבה כבר יודע. ואני אגיד משהו שאולי יישמע לך מוזר: אני לא יודעת כמה הבגדים שלה עולים. יכול להיות שהסוודר הזה מזארה. אבל איך שהוא יושב עליה, איך שהצבעים מתאימים, זה אומר לי שלא. ואם כן מזארה, אז היא יודעת ללבוש זארה כמו שאני לא יודעת.</w:t>
+        <w:t xml:space="preserve">גבוה, גבוה. ובניגוד לשני הראשונים, פה אני מרגישה ותק. הכסף אצלה לא חדש, הוא פשוט שם, כמו האוויר. היא לא צריכה להראות כי כל מי שסביבה כבר יודע, ומי שלא יודע, לא מעניין אותה שיידע. ואני אגיד משהו שאולי יישמע לך מוזר: אני לא יודעת כמה הבגדים שלה עולים. יכול להיות שהסוודר הזה מזארה. באמת. אבל איך שהוא יושב עליה, איך שהצבעים מתאימים זה לזה, המעיל לתיק, התיק לנעליים, זה אומר לי שלא. ואם כן זארה, אז היא יודעת ללבוש זארה כמו שאני לא יודעת, וזה בעצמו סימן של מעמד, כי לדעת ללבוש פשוט זה דבר שלומדים מהבית. ואני, שגדלתי במוצקין עם אמא שקנתה בשוק, לא למדתי את זה. אני למדתי מאינסטגרם. וזה נראה, כנראה. אולי לא לך, אבל לה.</w:t>
       </w:r>
     </w:p>
     <w:p>
@@ -1027,7 +1027,7 @@
           <w:szCs w:val="24"/>
           <w:rtl/>
         </w:rPr>
-        <w:t xml:space="preserve">הבד. אני לא נגעתי בו, אבל אני רואה שהוא רך. והמעיל, שיושב מושלם על הכתפיים, ומעיל שיושב ככה זה או יקר או תפור. והתיק בלי שום לוגו, חום, חלק, שדווקא בגלל שאין עליו כלום נראה לי הכי יקר מכל התיקים פה. (המראיינת: למה דווקא?) כי מי שקונה תיק יקר בלי לוגו לא צריך שאחרים יידעו, ומי שלא צריך שיידעו, זה בדרך כלל מי שכולם כבר יודעים. ויש גם מה שאין. אין צבע, אין תכשיט, אין כלום שמושך את העין, והעין בכל זאת נמשכת. זה לקח לה שנים ללמוד, אני בטוחה.</w:t>
+        <w:t xml:space="preserve">הבד. אני לא נגעתי בו, אבל אני רואה שהוא רך, איך שהוא נופל על הכתף. והמעיל, שיושב מושלם על הכתפיים, ומעיל שיושב ככה זה או יקר או תפור, אין אופציה שלישית. והתיק בלי שום לוגו, חום, חלק, שדווקא בגלל שאין עליו כלום נראה לי הכי יקר מכל התיקים פה. (המראיינת: למה דווקא?) כי מי שקונה תיק יקר בלי לוגו לא צריך שאחרים יידעו, ומי שלא צריך שיידעו, זה בדרך כלל מי שכולם כבר יודעים. ויש גם מה שאין. אין צבע, אין תכשיט, אין כלום שמושך את העין, והעין בכל זאת נמשכת. זה לקח לה שנים ללמוד, אני בטוחה. או שלא למדה, ופשוט גדלה ככה. ויש פרט קטן, השיער. שיער אסוף פשוט, בלי שום דבר, ושיער כזה דורש שיער טוב, ושיער טוב זה מספרה טובה, וזה כסף שלא רואים. הכול אצלה הוא כסף שלא רואים. וזה, כרואת חשבון, מרשים אותי יותר מכסף שרואים, כי זה אומר שיש מספיק גם למה שלא רואים.</w:t>
       </w:r>
     </w:p>
     <w:p>
@@ -1106,7 +1106,7 @@
           <w:szCs w:val="24"/>
           <w:rtl/>
         </w:rPr>
-        <w:t xml:space="preserve">גבר מסודר. בוגר. הוא נראה אותו דבר בפגישת עבודה ובארוחת צהריים של שבת אצל ההורים. חולצה מכופתרת, צ'ינו, לופרס, שעון דק. קלאסי. כזה שהתלבש ככה גם לפני עשרים שנה ויתלבש ככה בעוד עשרים. ואני מסתכלת עליו ומרגישה אמון. בעבודה שלי, לקוח שנראה ככה משלם בזמן ולא מתווכח על החשבונית. זה נשמע שטחי, וזה נכון כמעט תמיד.</w:t>
+        <w:t xml:space="preserve">גבר מסודר. בוגר. הוא נראה אותו דבר בפגישת עבודה ובארוחת צהריים של שבת אצל ההורים. חולצה מכופתרת, צ'ינו, לופרס, שעון דק. קלאסי. כזה שהתלבש ככה גם לפני עשרים שנה ויתלבש ככה בעוד עשרים, ואשתו קונה לו את החולצות. ואני מסתכלת עליו ומרגישה אמון. בעבודה שלי, לקוח שנראה ככה משלם בזמן ולא מתווכח על החשבונית. זה נשמע שטחי, וזה נכון כמעט תמיד. יש לי שלושה לקוחות שנראים בדיוק ככה, ושלושתם מסודרים, ושלושתם משעממים, ושלושתם מעולם לא איחרו בתשלום. ויש בו משהו אבהי. לא במובן של זקן, במובן של מישהו שמחזיק דברים. אם הוא היה האבא של מישהי, הייתי מקנאה בה.</w:t>
       </w:r>
     </w:p>
     <w:p>
@@ -1166,7 +1166,7 @@
           <w:szCs w:val="24"/>
           <w:rtl/>
         </w:rPr>
-        <w:t xml:space="preserve">מנכ"ל של משהו בינוני, שותף במשרד עורכי דין, רופא בכיר. או יזם, אבל לא מהסוג של ההייטק עם הטי שירט, מהסוג של התעשייה, מפעל, לוגיסטיקה, משהו שעובד עשרים שנה. אולי פרופסור. משהו שיש בו סמכות שקטה. אני רואה אותו נכנס למשרד שלנו ומבקש קפה בנימוס.</w:t>
+        <w:t xml:space="preserve">מנכ"ל של משהו בינוני, שותף במשרד עורכי דין, רופא בכיר. או יזם, אבל לא מהסוג של ההייטק עם הטי שירט, מהסוג של התעשייה, מפעל, לוגיסטיקה, משהו שעובד עשרים שנה ולא מדברים עליו בחדשות. אולי פרופסור. משהו שיש בו סמכות שקטה. אני רואה אותו נכנס למשרד שלנו ומבקש קפה בנימוס, ויושב, ומחכה, ולא מסתכל בטלפון. ואם הוא יזם, אז הוא מהסוג שמכר את החברה לפני עשר שנים ועכשיו "עוזר" לחברות אחרות, ולא צריך כלום מאף אחד. זה הלוק של "לא צריך".</w:t>
       </w:r>
     </w:p>
     <w:p>
@@ -1226,7 +1226,7 @@
           <w:szCs w:val="24"/>
           <w:rtl/>
         </w:rPr>
-        <w:t xml:space="preserve">גבוה. כמה גבוה כלכלית, אין לי מושג, הוא לא מראה. יכול להיות שהוא מיליונר ויכול להיות שהוא מנהל בבנק עם משכורת טובה, ושניהם היו נראים אותו דבר. חברתית, זה המעמד הגבוה המבוסס, האנשים שמנהלים דברים בעיר בלי שתדעי שהם מנהלים. הוא והאישה בתמונה 3 הם אותו עולם. אני כמעט יכולה לדמיין אותם באותה ארוחת ערב.</w:t>
+        <w:t xml:space="preserve">גבוה. כמה גבוה כלכלית, אין לי מושג, הוא לא מראה. יכול להיות שהוא מיליונר ויכול להיות שהוא מנהל בבנק עם משכורת טובה, ושניהם היו נראים אותו דבר, וזה בדיוק העניין: הלוק הזה מוחק את ההבדל בין "מסודר מאוד" ל"עשיר מאוד". חברתית, זה המעמד הגבוה המבוסס, האנשים שמנהלים דברים בעיר בלי שתדעי שהם מנהלים. הוא והאישה בתמונה 3 הם אותו עולם. אני כמעט יכולה לדמיין אותם באותה ארוחת ערב, מדברים בשקט על משהו שלא הייתי מבינה. ואני שמה לב שאני מדרגת אותו לפי "מה הוא לא עושה", וזה מוזר, כי את שני הראשונים דירגתי לפי מה שהם כן עושים. אצלו ההיעדר הוא המידע.</w:t>
       </w:r>
     </w:p>
     <w:p>
@@ -1286,7 +1286,7 @@
           <w:szCs w:val="24"/>
           <w:rtl/>
         </w:rPr>
-        <w:t xml:space="preserve">מה שאין. אין לוגו, אין שעון שצועק, אין פריט אחד שאומר "יקר". הלופרס מעור, כנראה עור טוב, השעון עם הרצועה הדקה, שזה שעון של אנשים שלא צריכים להרשים, והחולצה שיושבת טוב. ויש משהו בעמידה. אני לא יודעת אם זה הבגדים או הוא, אולי הבגדים נותנים לו לעמוד ככה. השקט שלו הוא מה שעשה לי את הרושם, ושקט אצלי זה ביטחון, וביטחון זה מעמד. ככה זה עובד אצלי, כנראה.</w:t>
+        <w:t xml:space="preserve">מה שאין. אין לוגו, אין שעון שצועק, אין פריט אחד שאומר "יקר". הלופרס מעור, כנראה עור טוב, השעון עם הרצועה הדקה, שזה שעון של אנשים שלא צריכים להרשים, והחולצה שיושבת טוב, לא צמודה ולא רחבה. ויש משהו בעמידה. אני לא יודעת אם זה הבגדים או הוא, אולי הבגדים נותנים לו לעמוד ככה, אולי הוא עומד ככה בכל בגד. השקט שלו הוא מה שעשה לי את הרושם, ושקט אצלי זה ביטחון, וביטחון זה מעמד. ככה זה עובד אצלי, כנראה. (המראיינת: ואם היה לובש את זה עם לוגו קטן?) אז היה יורד אצלי. באמת. לוגו קטן על החולצה היה הופך אותו מ"לא צריך" ל"קצת צריך". זה אבסורד, כי לוגו קטן זה כלום, אבל זה היה סדק. עכשיו אין סדק.</w:t>
       </w:r>
     </w:p>
     <w:p>
@@ -1365,7 +1365,7 @@
           <w:szCs w:val="24"/>
           <w:rtl/>
         </w:rPr>
-        <w:t xml:space="preserve">אוקיי, רגע... ארבע, שלוש, אחת, שתיים. הגבר ראשון, כי הוא הכי מבוסס והכי בטוח, ואין בו שום סימן שאלה. האישה שנייה, ממש צמוד, אולי שווה, אבל אצלו יש לי תחושה של עוד יותר ותק. ואז פער. הבחור בטרנינג שלישי, כי יש כסף, זה בטוח, אבל הכסף חדש, והחברתי אצלי נמוך יותר. והבחורה אחרונה, כי אצלה אני הכי פחות בטוחה שזה בכלל הכסף שלה. ואני רואה מה עשיתי: שמתי את שני השקטים למעלה ואת שני הרועשים למטה. ואם היית שואלת מי הוציא הכי הרבה כסף על מה שהוא לובש, אולי הייתי הופכת את הסדר. אז מה בעצם דירגתי? לא כסף. דירגתי... טעם? לא. דירגתי את מי שלא צריך אותי. זה מה שדירגתי.</w:t>
+        <w:t xml:space="preserve">אוקיי, רגע... ארבע, שלוש, אחת, שתיים. הגבר ראשון, כי הוא הכי מבוסס והכי בטוח, ואין בו שום סימן שאלה. האישה שנייה, ממש צמוד, אולי שווה, אבל אצלו יש לי תחושה של עוד יותר ותק, אולי כי גברים בגיל הזה שנראים ככה הם בדרך כלל כבר עשרים שנה באותו מקום. ואז פער. הבחור בטרנינג שלישי, כי יש כסף, זה בטוח, אבל הכסף חדש, והחברתי אצלי נמוך יותר. והבחורה אחרונה, כי אצלה אני הכי פחות בטוחה שזה בכלל הכסף שלה. ואני רואה מה עשיתי: שמתי את שני השקטים למעלה ואת שני הרועשים למטה. ואם היית שואלת מי הוציא הכי הרבה כסף על מה שהוא לובש, אולי הייתי הופכת את הסדר, הבחור ראשון, הבחורה שנייה. אז מה בעצם דירגתי? לא כסף. דירגתי... טעם? לא. דירגתי את מי שלא צריך אותי. זה מה שדירגתי. מי שלא צריך שאסתכל עליו, דירגתי גבוה. מי שצריך, דירגתי נמוך. ועכשיו שאני אומרת את זה בקול, זה נשמע די אכזרי. כאילו אני מענישה אנשים על זה שהם רוצים שיראו אותם. ואני בעצמי רוצה שיראו אותי, רק בשקט.</w:t>
       </w:r>
     </w:p>
     <w:p>
@@ -1425,7 +1425,7 @@
           <w:szCs w:val="24"/>
           <w:rtl/>
         </w:rPr>
-        <w:t xml:space="preserve">מנסה להיראות עשיר, שניים הראשונים, בלי להתלבט, והבחורה אפילו יותר, כי אצלה כל פריט הוא מותג. הבחור בטרנינג מנסה, אבל יש לי הרגשה שהוא גם באמת עשיר, רק עשיר בקול רם. עשיר בלי להתאמץ, הגבר בחולצה הכחולה, לגמרי. ואחריו האישה. אבל, רגע. אצלה אני כן רואה מאמץ. מאמץ אחר. מאמץ להיראות שלא מתאמצים. כל פריט אצלה נבחר, הצבעים לא במקרה, השיער לא במקרה. זה סגנון, וזה אולי דורש יותר ידע מלקנות לוגו, כי לוגו קונים בחנות, ואת זה צריך לדעת. אז אולי הוא היחיד פה שבאמת לא מתאמץ. או שהוא מתאמץ הכי טוב מכולם. אני לא יודעת.</w:t>
+        <w:t xml:space="preserve">מנסה להיראות עשיר, שניים הראשונים, בלי להתלבט, והבחורה אפילו יותר, כי אצלה כל פריט הוא מותג, אין פריט אחד ניטרלי. הבחור בטרנינג מנסה, אבל יש לי הרגשה שהוא גם באמת עשיר, רק עשיר בקול רם. עשיר בלי להתאמץ, הגבר בחולצה הכחולה, לגמרי. ואחריו האישה. אבל, רגע. אצלה אני כן רואה מאמץ. מאמץ אחר. מאמץ להיראות שלא מתאמצים. כל פריט אצלה נבחר, הצבעים לא במקרה, השיער לא במקרה, התיק בלי לוגו הוא בחירה, לא ברירת מחדל. זה סגנון, וזה אולי דורש יותר ידע מלקנות לוגו, כי לוגו קונים בחנות, ואת זה צריך לדעת. אז אולי הוא היחיד פה שבאמת לא מתאמץ. או שהוא מתאמץ הכי טוב מכולם, כל כך טוב שאני לא רואה. אני לא יודעת. ויש אפשרות שלישית, שעולה לי עכשיו: שהוא לא מתאמץ כי אשתו מתאמצת בשבילו. שהיא קנתה את החולצה ואת הנעליים ואת השעון, ושהוא פשוט לובש מה ששמים לו. ואז "לא מתאמץ" זה בעצם "מישהי אחרת מתאמצת", וזה בכלל סיפור אחר.</w:t>
       </w:r>
     </w:p>
     <w:p>
@@ -1485,7 +1485,7 @@
           <w:szCs w:val="24"/>
           <w:rtl/>
         </w:rPr>
-        <w:t xml:space="preserve">לעבוד, הגבר. בלי לחשוב. מישהו שאפשר לסמוך עליו, שיש לו ניסיון, שלא עושה דרמה בפגישה. האישה גם, אבל אני מרגישה שהיא תהיה מנהלת מצוינת וחברה רחוקה. כזאת ששומרת מרחק. ולהיות חברה, מצחיק, הבחורה בתמונה 2. כן. היא נראית כיפית, קלה, כזאת שכיף לצאת איתה לשתות, גם אם בעבודה לא הייתי לוקחת אותה ברצינות, וזה לא הוגן, אני יודעת. הבחור בטרנינג, לא זה ולא זה. הוא נראה לי כמו מישהו שמתעייפים ממנו אחרי שעה. אולי אני טועה. בטח אני טועה. זה תמונה.</w:t>
+        <w:t xml:space="preserve">לעבוד, הגבר. בלי לחשוב. מישהו שאפשר לסמוך עליו, שיש לו ניסיון, שלא עושה דרמה בפגישה, שאם יש בעיה בדוח הוא יגיד "בסדר, נתקן" ולא יצעק. האישה גם, אבל אני מרגישה שהיא תהיה מנהלת מצוינת וחברה רחוקה. כזאת ששומרת מרחק, שלא תספר לי על הבית. ולהיות חברה, מצחיק, הבחורה בתמונה 2. כן. היא נראית כיפית, קלה, כזאת שכיף לצאת איתה לשתות ולצחוק, גם אם בעבודה לא הייתי לוקחת אותה ברצינות, וזה לא הוגן, אני יודעת, אולי היא רואת חשבון טובה ממני. הבחור בטרנינג, לא זה ולא זה. הוא נראה לי כמו מישהו שמתעייפים ממנו אחרי שעה, שכל שיחה היא עליו. אולי אני טועה. בטח אני טועה. זה תמונה. ואם אני חושבת על זה עוד רגע, מעניין שאת הבחורה אני מוכנה לאהוב ואת הבחור לא, למרות שהם לובשים אותו דבר בעצם. כנראה כי אישה שרוצה שיסתכלו עליה זה משהו שאני מבינה מבפנים, וגבר שרוצה שיסתכלו עליו זה משהו שמאיים עליי קצת. זה לא הוגן כלפיו. אבל זה מה שיש.</w:t>
       </w:r>
     </w:p>
     <w:p>
@@ -1583,7 +1583,7 @@
           <w:szCs w:val="24"/>
           <w:rtl/>
         </w:rPr>
-        <w:t xml:space="preserve">קצת, כן. ידעתי שהלוגואים יקרים, זה כל אחד יודע. לא ידעתי שהסוודר והחולצה של השניים השקטים עולים אותו דבר או יותר. באמת חשבתי שהסוודר יכול להיות מכל מקום. אז זה משנה לי משהו. זה אומר שההבדל שעשיתי בראש הוא לא כסף נגד פחות כסף, הוא... שפה. מי שלובש את השקט מדבר רק עם מי שמכיר את המילים. ומי שלובש לוגו מדבר עם כולם, גם איתי, גם עם מי שלא יודע כלום. ואם חושבים על זה ככה, אז השקט הוא בעצם יותר סגור, יותר מועדון. זה לא משנה לי את הדעה על האנשים בתמונות. זה משנה לי את ההבנה למה חשבתי מה שחשבתי. וזה קצת לא נעים, האמת.</w:t>
+        <w:t xml:space="preserve">קצת, כן. ידעתי שהלוגואים יקרים, זה כל אחד יודע. לא ידעתי שהסוודר והחולצה של השניים השקטים עולים אותו דבר או יותר. באמת חשבתי שהסוודר יכול להיות מכל מקום, אמרתי לך זארה. אז זה משנה לי משהו. זה אומר שההבדל שעשיתי בראש הוא לא כסף נגד פחות כסף, הוא... שפה. מי שלובש את השקט מדבר רק עם מי שמכיר את המילים. ומי שלובש לוגו מדבר עם כולם, גם איתי, גם עם מי שלא יודע כלום. ואם חושבים על זה ככה, אז השקט הוא בעצם יותר סגור, יותר מועדון, יותר "אם את לא יודעת, את לא שייכת". והלוגו הוא בעצם יותר פתוח, "הנה, תראו, זה מה שיש לי, כולכם מוזמנים לדעת". זה לא משנה לי את הדעה על האנשים בתמונות. זה משנה לי את ההבנה למה חשבתי מה שחשבתי. וזה קצת לא נעים, האמת. כי כל הראיון דירגתי את המועדון הסגור למעלה ואת האנשים הפתוחים למטה, והרגשתי שזה טעם טוב. ואולי זה רק שאני רוצה להיות במועדון.</w:t>
       </w:r>
     </w:p>
     <w:p>
@@ -1643,7 +1643,7 @@
           <w:szCs w:val="24"/>
           <w:rtl/>
         </w:rPr>
-        <w:t xml:space="preserve">"למה אתה צריך את זה." זה המשפט שעובר. כאילו הלוגו הגדול הוא בקשה, "תסתכלי עליי", ואני לא אוהבת שמבקשים ממני. ואז, שנייה אחרי, אני תופסת את עצמי. מי אני. אולי הבן אדם עבד קשה ומגיע לו ליהנות ממה שקנה, ולמה לי להתעצבן על חולצה. אבל התגובה הראשונה, לפני המחשבה, היא ריחוק. ויש הבדל שאני שמה לב אליו עכשיו: לוגו של מותג ספורט לא מפריע לי בכלל, הבת שלי לובשת, בעלי לובש. לוגו של מותג יוקרה כן. כנראה כי הראשון אומר "אני אוהב לרוץ" והשני אומר "יש לי כסף". והשני מפריע לי. למה? אולי כי זה מזכיר לי שגם לי אכפת. לא יודעת. תרשמי "לא יודעת".</w:t>
+        <w:t xml:space="preserve">"למה אתה צריך את זה." זה המשפט שעובר. כאילו הלוגו הגדול הוא בקשה, "תסתכלי עליי", ואני לא אוהבת שמבקשים ממני. ואז, שנייה אחרי, אני תופסת את עצמי. מי אני. אולי הבן אדם עבד קשה ומגיע לו ליהנות ממה שקנה, ולמה לי להתעצבן על חולצה שלא קשורה אליי. אבל התגובה הראשונה, לפני המחשבה, היא ריחוק. ויש הבדל שאני שמה לב אליו עכשיו: לוגו של מותג ספורט לא מפריע לי בכלל, הבת שלי לובשת, בעלי לובש, אני לובשת לחדר כושר. לוגו של מותג יוקרה כן. כנראה כי הראשון אומר "אני אוהב לרוץ" והשני אומר "יש לי כסף". והשני מפריע לי. למה? אולי כי זה מזכיר לי שגם לי אכפת. שגם אני, כשאני קונה חליפה, בוחרת כזאת שאנשים מסוימים יזהו. לא יודעת. תרשמי "לא יודעת". ועוד משהו: במשרד, כשנכנס מישהו עם לוגו גדול, אני אוטומטית מניחה שהוא ירצה להתמקח על המחיר. וזה בדרך כלל נכון. ומי שנכנס בחולצה כחולה, לא מתמקח. אז הלוגו, בעבודה שלי, אומר לי "הולך להיות ויכוח", וזה אולי מה שעובר לי בראש באמת.</w:t>
       </w:r>
     </w:p>
     <w:p>
@@ -1703,7 +1703,7 @@
           <w:szCs w:val="24"/>
           <w:rtl/>
         </w:rPr>
-        <w:t xml:space="preserve">שאני מופתעת מעצמי. באתי לפה בטוחה שאני לא שיפוטית, ועכשיו ישבתי עשרים דקות ודירגתי ארבעה אנשים שאני לא מכירה לפי בד, והייתי בטוחה בעצמי כל הדרך. ואני עושה את זה כנראה כל יום במשרד, עם כל לקוח שנכנס, רק בלי לשים לב. זה משהו לחשוב עליו. ועוד דבר, לעבודה שלך: תשאלי גם גברים. אני חושבת שעל הבחור בטרנינג גברים היו אומרים משהו אחר לגמרי. אולי "כל הכבוד לו". אני לא יודעת. אבל זה היה מעניין אותי לדעת.</w:t>
+        <w:t xml:space="preserve">שאני מופתעת מעצמי. באתי לפה בטוחה שאני לא שיפוטית, ועכשיו ישבתי חצי שעה ודירגתי ארבעה אנשים שאני לא מכירה לפי בד, והייתי בטוחה בעצמי כל הדרך, עם נימוקים, כאילו אני עושה ביקורת. ואני עושה את זה כנראה כל יום במשרד, עם כל לקוח שנכנס, רק בלי לשים לב. זה משהו לחשוב עליו. ועוד דבר, לעבודה שלך: תשאלי גם גברים. אני חושבת שעל הבחור בטרנינג גברים היו אומרים משהו אחר לגמרי. אולי "כל הכבוד לו". אולי "איזה שעון". אני לא יודעת. אבל זה היה מעניין אותי לדעת. ואם מותר לי עוד דבר אחד: תשאלי את האנשים בתמונות. באמת. תראי להם מה אמרנו עליהם. אני הייתי רוצה לדעת מה הבחור בטרנינג חושב על מה שאמרתי עליו. אני חושדת שהוא היה צוחק. ואולי היה צודק.</w:t>
       </w:r>
     </w:p>
     <w:p>
@@ -1759,7 +1759,7 @@
           <w:szCs w:val="24"/>
           <w:rtl/>
         </w:rPr>
-        <w:t xml:space="preserve">תאריך: 1.10.2026    משך: 26 דקות    מקום: ביתה של המרואיינת, קריית ביאליק    הקלטה: בטלפון, בהסכמה</w:t>
+        <w:t xml:space="preserve">תאריך: 1.10.2026    משך: 31 דקות    מקום: ביתה של המרואיינת, קריית ביאליק    הקלטה: בטלפון, בהסכמה</w:t>
       </w:r>
     </w:p>
     <w:p>
@@ -1838,7 +1838,7 @@
           <w:szCs w:val="24"/>
           <w:rtl/>
         </w:rPr>
-        <w:t xml:space="preserve">עשרים ושבע. קריית ביאליק, כל החיים. אני מנהלת חנות של רשת אופנה בקניון בקריות, שנה שלישית כמנהלת, לפני זה הייתי מוכרת באותה חנות שלוש שנים, ולפני זה חנות נעליים. בערבים אני לומדת סטיילינג אישי, קורס של שנה, כי אני רוצה לעבוד כסטייליסטית, זה החלום, ואני יודעת שזה נשמע כמו משהו שכולן אומרות. רווקה, עם שותפה. ורוב המשכורת הולכת על בגדים, אני לא אשקר לך, אמא שלי כועסת על זה כל שבוע.</w:t>
+        <w:t xml:space="preserve">עשרים ושבע. קריית ביאליק, כל החיים, אותו רחוב. אני מנהלת חנות של רשת אופנה בקניון בקריות, שנה שלישית כמנהלת, לפני זה הייתי מוכרת באותה חנות שלוש שנים, ולפני זה חנות נעליים, שנה וחצי, שם התחלתי להבין מה אנשים קונים באמת. בערבים אני לומדת סטיילינג אישי, קורס של שנה, בחיפה, פעמיים בשבוע, כי אני רוצה לעבוד כסטייליסטית, זה החלום, ואני יודעת שזה נשמע כמו משהו שכל בחורה בגיל שלי אומרת. רווקה, עם שותפה, בדירה של שני חדרים. ורוב המשכורת הולכת על בגדים, אני לא אשקר לך, אמא שלי כועסת על זה כל שבוע, והיא צודקת, ואני ממשיכה. בחנות אני רואה בערך מאה אנשים ביום, ואני יודעת תוך דקה מה הם יקנו ומה הם יגידו שהם רוצים, ואלה לא אותו דבר. אז אולי יש לי משהו להגיד לך.</w:t>
       </w:r>
     </w:p>
     <w:p>
@@ -1898,7 +1898,7 @@
           <w:szCs w:val="24"/>
           <w:rtl/>
         </w:rPr>
-        <w:t xml:space="preserve">חמש. חמש ועוד. זה לא תחביב, זה החיים שלי. אני יודעת מה האוסף של העונה, אני מזהה פריט ברחוב ממרחק, אני יודעת כמה הוא עולה ומאיזו שנה. ובעבודה אני מלבישה אנשים כל היום ורואה מה הם קונים ולמה הם קונים, וזה בעצם מה שאת חוקרת, אז יש לי הרבה מה להגיד, תעצרי אותי אם אני מדברת יותר מדי.</w:t>
+        <w:t xml:space="preserve">חמש. חמש ועוד. זה לא תחביב, זה החיים שלי. אני יודעת מה האוסף של העונה, אני מזהה פריט ברחוב ממרחק של עשרים מטר, אני יודעת כמה הוא עולה ומאיזו שנה ואם הוא מקורי או מטורקיה. ובעבודה אני מלבישה אנשים כל היום ורואה מה הם קונים ולמה הם קונים, וזה בעצם מה שאת חוקרת, אז יש לי הרבה מה להגיד, תעצרי אותי אם אני מדברת יותר מדי. ויש לי גם צד שני: אני לומדת את הצד ה"גבוה", בקורס, איך מלבישים מישהי שיש לה כסף אמיתי, ואני רואה שזה עולם אחר לגמרי מהחנות שלי. בחנות שלי אנשים קונים שם. בקורס מלמדים אותי שהשם זה הדבר האחרון. אז אני חיה בין שני העולמות האלה, וזה בדיוק ארבע התמונות שלך, אני מנחשת.</w:t>
       </w:r>
     </w:p>
     <w:p>
@@ -1996,7 +1996,7 @@
           <w:szCs w:val="24"/>
           <w:rtl/>
         </w:rPr>
-        <w:t xml:space="preserve">טוב, זה בחור שאני רואה כל יום בקניון. ממש כל יום. הקפוצ'ון הזה אני יודעת מאיזו קולקציה, הסניקרס גם, אלה הכבדים, שעולים כמעט ארבעת אלפים, והשעון. הוא בנה את עצמו מהלוק, זה הלוק של "הגעתי", ואין שום פריט פה שהוא לא בחר כי הוא מזוהה. בחור כזה בא אליי לחנות עם החברה, ושואל "מה הכי יקר", לא "מה הכי יפה". ואני מבינה אותו, האמת, כי הוא קונה הכרה, לא בגד.</w:t>
+        <w:t xml:space="preserve">טוב, זה בחור שאני רואה כל יום בקניון. ממש כל יום, יש לו שם כזה אצלנו בצוות, לא אגיד. הקפוצ'ון הזה אני יודעת מאיזו קולקציה, מלפני שנתיים, הסניקרס גם, אלה הכבדים, שעולים כמעט ארבעת אלפים, והשעון. הוא בנה את עצמו מהלוק, זה הלוק של "הגעתי", ואין שום פריט פה שהוא לא בחר כי הוא מזוהה. בחור כזה בא אליי לחנות עם החברה, ושואל "מה הכי יקר", לא "מה הכי יפה", ואז מצלם את עצמו בתא המדידה. ואני מבינה אותו, האמת, כי הוא קונה הכרה, לא בגד. ויש בו משהו שאני אוהבת, בכנות: הוא לא מעמיד פנים. הוא אומר בדיוק מה הוא רוצה. הבחורה בתמונה 3, שאת עוד תראי לי, היא מעמידה פנים הרבה יותר. הוא פשוט רועש. (המראיינת: מה הכי בולט לך?) שהוא חדש. הכול עליו חדש. אין פריט אחד משומש. וזה אומר שהוא עוד בשלב של הקנייה, לא בשלב של הלבישה.</w:t>
       </w:r>
     </w:p>
     <w:p>
@@ -2056,7 +2056,7 @@
           <w:szCs w:val="24"/>
           <w:rtl/>
         </w:rPr>
-        <w:t xml:space="preserve">עצמאי. משהו שמוכר. רכבים, טלפונים, אולי יש לו עסק של הסעות, שיפוצים, משהו שנכנס בו מזומן ושאין בו בוס. או שהוא עובד אצל אבא, ואבא מרוויח. או כדורגלן, זה גם מתאים. לא משרד. בחיים לא משרד.</w:t>
+        <w:t xml:space="preserve">עצמאי. משהו שמוכר. רכבים, טלפונים, אולי יש לו עסק של הסעות, שיפוצים, משהו שנכנס בו מזומן ושאין בו בוס. או שהוא עובד אצל אבא, ואבא מרוויח, ואבא לא שואל מה הוא לובש. או כדורגלן, זה גם מתאים, יש לי שניים מהקבוצה בחיפה שקונים אצלנו ונראים בדיוק ככה. לא משרד. בחיים לא משרד. ואם הוא כן במשרד, אז זה משרד של "יועץ", משהו שהוא המציא. ואני יודעת שזה נשמע מתנשא, ואני לא מתנשאת, אח שלי בדיוק כזה, מוכר רכבים, ואני אוהבת אותו, ואני קונה לו את הקפוצ'ונים האלה ליום הולדת כי זה מה שהוא רוצה.</w:t>
       </w:r>
     </w:p>
     <w:p>
@@ -2116,7 +2116,7 @@
           <w:szCs w:val="24"/>
           <w:rtl/>
         </w:rPr>
-        <w:t xml:space="preserve">כלכלית, אני יודעת בדיוק: הסט הזה, אם הכול מקורי, זה עשרים וחמש, שלושים אלף שקל על הגוף. אז לא עני. חברתית... זה כסף של הדור הזה. או של אבא. לא "משפחה ותיקה עם כסף". אנשים שהכסף בא אליהם עכשיו, ושמחים בו, ורוצים שיראו. ואני לא אומרת את זה בזלזול, כי אם היה לי, גם אני הייתי מראה. הייתי. לפני כמה שנים הייתי.</w:t>
+        <w:t xml:space="preserve">כלכלית, אני יודעת בדיוק: הסט הזה, אם הכול מקורי, זה עשרים וחמש, שלושים אלף שקל על הגוף. השעון לבד יכול להיות עשרים. אז לא עני. אבל "אם הכול מקורי" זה משפט חשוב, כי הקפוצ'ון הזה יש בטורקיה בשלוש מאות שקל ואי אפשר להבדיל מהתמונה. חברתית... זה כסף של הדור הזה. או של אבא. לא "משפחה ותיקה עם כסף". אנשים שהכסף בא אליהם עכשיו, ושמחים בו, ורוצים שיראו. ואני לא אומרת את זה בזלזול, כי אם היה לי, גם אני הייתי מראה. הייתי. לפני כמה שנים הייתי. יש לי תמונות. ובקריות, זה המעמד הגבוה. ממש. בקריות הוא בפסגה. בכרמל הוא באמצע. בתל אביב הוא... תלוי איפה בתל אביב. אז המעמד שלו תלוי איפה הוא עומד, וזה משהו שלמדתי מהקורס: אותו לוק הוא מעמד אחר בכל עיר.</w:t>
       </w:r>
     </w:p>
     <w:p>
@@ -2176,7 +2176,7 @@
           <w:szCs w:val="24"/>
           <w:rtl/>
         </w:rPr>
-        <w:t xml:space="preserve">הלוגו, ברור. אבל אצלי זה יותר ספציפי: הוא לא קנה את הפריט היפה של המותג, הוא קנה את הפריט הכי מזוהה. למותג הזה יש דברים מהממים, שקטים, עם גזרות מטורפות, ואף אחד לא יזהה אותם ברחוב. הוא בחר דווקא את זה שכולם מזהים. זה אומר שהמטרה היא שיזהו, לא שיהיה יפה. (המראיינת: ומה עם השילוב?) השילוב לא עובד. השעון זהב והסניקרס לבנים והפאוץ' חום. זה "הכי הרבה", לא "הכי נכון". מי שיודע לא היה שם את שלושתם ביחד.</w:t>
+        <w:t xml:space="preserve">הלוגו, ברור. אבל אצלי זה יותר ספציפי: הוא לא קנה את הפריט היפה של המותג, הוא קנה את הפריט הכי מזוהה. למותג הזה יש דברים מהממים, שקטים, עם גזרות מטורפות, מעילים שאני הייתי הורגת בשבילם, ואף אחד לא יזהה אותם ברחוב. הוא בחר דווקא את זה שכולם מזהים, שגם מי שבחיים לא נכנס לחנות יודע מה זה. זה אומר שהמטרה היא שיזהו, לא שיהיה יפה. (המראיינת: ומה עם השילוב?) השילוב לא עובד. השעון זהב והסניקרס לבנים והפאוץ' חום. זה "הכי הרבה", לא "הכי נכון". מי שיודע לא היה שם את שלושתם ביחד, היה בוחר אחד. ובקורס היו מורידים לו שני פריטים ואומרים "עכשיו אתה נראה עשיר". והוא היה מרגיש שלקחו לו משהו. ואני מבינה אותו, כי כשהמורה שלי הורידה לי את התיק עם הלוגו בפעם הראשונה הרגשתי ערומה.</w:t>
       </w:r>
     </w:p>
     <w:p>
@@ -2255,7 +2255,7 @@
           <w:szCs w:val="24"/>
           <w:rtl/>
         </w:rPr>
-        <w:t xml:space="preserve">היא מהממת. נגיד את זה. ואני רואה את השעות: שיער, ציפורניים, גבות, הכול עשוי. היא יודעת בדיוק מה הלוק שלה ועובדת עליו. זה לוק שראיתי אלף פעם באינסטגרם, כזה "קריות פוגש תל אביב". היא נראית נחמדה אבל סגורה, כזאת שלא תחייך לך ברחוב. אני מכירה אותה, לא אותה, אבל אותה. חצי מהלקוחות שלי.</w:t>
+        <w:t xml:space="preserve">היא מהממת. נגיד את זה קודם. ואני רואה את השעות: שיער, שתי שעות במספרה, ציפורניים, שעה וחצי, גבות, ריסים, הכול עשוי, הכול מתואם. היא יודעת בדיוק מה הלוק שלה ועובדת עליו קשה, זאת עבודה, אנשים לא מבינים שזאת עבודה. זה לוק שראיתי אלף פעם באינסטגרם, כזה "קריות פוגש תל אביב". היא נראית נחמדה אבל סגורה, כזאת שלא תחייך לך ברחוב ולא תגיד סליחה אם היא נתקלת בך. אני מכירה אותה, לא אותה, אבל אותה. חצי מהלקוחות שלי. ואני יודעת גם מה היא תקנה אצלי: את הדבר שנראה הכי יקר במחיר הכי נמוך. והיא תבדוק שלוש פעמים אם יש לוגו.</w:t>
       </w:r>
     </w:p>
     <w:p>
@@ -2315,7 +2315,7 @@
           <w:szCs w:val="24"/>
           <w:rtl/>
         </w:rPr>
-        <w:t xml:space="preserve">משפיענית או כזאת שרוצה. או יופי, לקים, ריסים. או עובדת בחנות מותג בקניון, בגלל הלוק, אצלנו היו לוקחים אותה. או סטודנטית שההורים נותנים. אני יודעת שזה סטריאוטיפ. אבל הלוק הוא הסטריאוטיפ, והיא בחרה אותו, אז היא בחרה גם מה יחשבו.</w:t>
+        <w:t xml:space="preserve">משפיענית או כזאת שרוצה, עם חמשת אלפים עוקבים ותחושה של חמישים. או יופי, לקים, ריסים, יש לה את הידיים לזה. או עובדת בחנות מותג בקניון, בגלל הלוק, אצלנו היו לוקחים אותה מיד, הלקוחות אוהבות מוכרת שנראית כמו מה שהן רוצות להיות. או סטודנטית שההורים נותנים. אני יודעת שזה סטריאוטיפ. אבל הלוק הוא הסטריאוטיפ, והיא בחרה אותו, אז היא בחרה גם מה יחשבו. זה לא שאני ממציאה לה סיפור. היא סיפרה אותו בעצמה, עם הבגדים.</w:t>
       </w:r>
     </w:p>
     <w:p>
@@ -2375,7 +2375,7 @@
           <w:szCs w:val="24"/>
           <w:rtl/>
         </w:rPr>
-        <w:t xml:space="preserve">כלכלית, פה אני זהירה. ממש. יש לי לקוחות שנראות בדיוק ככה, ואני יודעת שאחת קנתה את התיק בשתים עשרה תשלומים, ואחת קנתה חיקוי מטורקיה שאי אפשר להבדיל, ואחת קיבלה מהארוס. הלוק הזה אפשר להשיג בלי כסף אמיתי, וזה ההבדל בינה לבין מה שאת כנראה תראי לי אחר כך. חברתית, בינוני. זה הלוק של הבינוני שמסתכל למעלה. ואני הייתי שם. בת עשרים ושתיים, עם התיק הזה בתשלומים. באמת.</w:t>
+        <w:t xml:space="preserve">כלכלית, פה אני זהירה. ממש. יש לי לקוחות שנראות בדיוק ככה, ואני יודעת שאחת קנתה את התיק בשתים עשרה תשלומים, ואחת קנתה חיקוי מטורקיה שאי אפשר להבדיל, ואחת קיבלה מהארוס, ואחת באמת עשירה. אותו לוק, ארבעה סיפורים. הלוק הזה אפשר להשיג בלי כסף אמיתי, וזה ההבדל בינה לבין מה שאת כנראה תראי לי אחר כך. חברתית, בינוני. זה הלוק של הבינוני שמסתכל למעלה. ואני הייתי שם. בת עשרים ושתיים, עם התיק הזה בתשלומים, שלוש שנים. באמת. ואני זוכרת כמה הוא היה חשוב לי, וכמה אנשים הסתכלו, ואיך זה הרגיש, וזה הרגיש מעולה. אז אני לא יכולה לדרג אותה נמוך בלי לדרג את עצמי של אז.</w:t>
       </w:r>
     </w:p>
     <w:p>
@@ -2435,7 +2435,7 @@
           <w:szCs w:val="24"/>
           <w:rtl/>
         </w:rPr>
-        <w:t xml:space="preserve">התיק. כי זה התיק שכולן רוצות, וכולן מזהות, וזה הפריט הראשון שקונים כשרוצים להיראות. החולצה עם הלוגו, שהיא "פריט כניסה", הכי זול שיש למותג, לא השמלה, לא המעיל, החולצה. המשקפיים, גם פריט כניסה. זאת אומרת, הכול פה הוא הפריטים הכי זולים של המותגים הכי יקרים. וזה מה שאומר לי "בינוני": לא שאין כסף, אלא שהכסף הולך על זיהוי לכל שקל. אני יודעת כי זה בדיוק מה שאני הייתי עושה, ועשיתי.</w:t>
+        <w:t xml:space="preserve">התיק. כי זה התיק שכולן רוצות, וכולן מזהות, וזה הפריט הראשון שקונים כשרוצים להיראות. החולצה עם הלוגו, שהיא "פריט כניסה", הכי זול שיש למותג, לא השמלה, לא המעיל, החולצה, אלף ומשהו שקל, שזה הרבה לחולצה וכלום למותג. המשקפיים, גם פריט כניסה. זאת אומרת, הכול פה הוא הפריטים הכי זולים של המותגים הכי יקרים. וזה מה שאומר לי "בינוני": לא שאין כסף, אלא שהכסף הולך על זיהוי לכל שקל. אני יודעת כי זה בדיוק מה שאני הייתי עושה, ועשיתי, ויש לי עדיין את החולצה בארון, לא לובשת, לא זורקת. (המראיינת: ואם היה רק התיק?) אז הייתי אומרת "אישה שקנתה לעצמה תיק". תיק אחד זה הישג. ארבעה פריטים זה תוכנית.</w:t>
       </w:r>
     </w:p>
     <w:p>
@@ -2514,7 +2514,7 @@
           <w:szCs w:val="24"/>
           <w:rtl/>
         </w:rPr>
-        <w:t xml:space="preserve">ואו. אוקיי. זה הלוק שאני חולמת עליו. אני יודעת בדיוק מה זה: יוקרה שקטה, הסוודר הזה הוא לורו פיאנה או משהו ברמה הזאת, התיק הוא בוטגה או דה רואו, ואם אני צודקת, אז כל מה שעליה עולה יותר ממה שעל הבחור בתמונה אחת. אולי פי שניים. והיא נראית... איך להגיד... כאילו היא לא צריכה אישור מאף אחד. רגועה. אני מסתכלת עליה ורוצה להיות היא בגיל ארבעים. (המראיינת: מה בה?) שהיא לא מנסה. לא, זה לא נכון, היא מנסה. היא מנסה אחרת.</w:t>
+        <w:t xml:space="preserve">ואו. אוקיי. זה הלוק שאני חולמת עליו. אני יודעת בדיוק מה זה: יוקרה שקטה, הסוודר הזה הוא לורו פיאנה או משהו ברמה הזאת, התיק הוא בוטגה או דה רואו, ואם אני צודקת, אז כל מה שעליה עולה יותר ממה שעל הבחור בתמונה אחת. אולי פי שניים. אולי יותר. והיא נראית... איך להגיד... כאילו היא לא צריכה אישור מאף אחד. רגועה. אני מסתכלת עליה ורוצה להיות היא בגיל ארבעים. (המראיינת: מה בה?) שהיא לא מנסה. לא, זה לא נכון, היא מנסה. היא מנסה אחרת. היא מנסה להיראות כמו מישהי שלא מנסה, וזה מה שלומדים אצלי בקורס שנה שלמה, איך לעשות את זה, ועדיין לא הצלחתי, כי זה לא רק הבגדים, זה איך שעומדים בהם. היא עומדת כאילו הסוודר הזה עלה לה חמישים שקל. זאת האמנות.</w:t>
       </w:r>
     </w:p>
     <w:p>
@@ -2574,7 +2574,7 @@
           <w:szCs w:val="24"/>
           <w:rtl/>
         </w:rPr>
-        <w:t xml:space="preserve">משהו בכיר מאוד. מנכ"לית, שותפה בקרן, עורכת דין שהשם שלה על הדלת. או אשתו של מישהו בכיר, אבל כזאת שיש לה עניינים משלה, גלריה, עמותה. משהו שבו צריך להיראות יקר בלי שיראו שמנסים, כי בעולם שלה להיראות שמנסים זה הדבר הכי גרוע.</w:t>
+        <w:t xml:space="preserve">משהו בכיר מאוד. מנכ"לית, שותפה בקרן, עורכת דין שהשם שלה על הדלת. או אשתו של מישהו בכיר, אבל כזאת שיש לה עניינים משלה, גלריה, עמותה, משהו שהיא לא צריכה את הכסף ממנו. משהו שבו צריך להיראות יקר בלי שיראו שמנסים, כי בעולם שלה להיראות שמנסים זה הדבר הכי גרוע, גרוע יותר מלהיראות עני. ואולי גם מישהי מתחום האופנה עצמו, עורכת של מגזין, קניינית. אלה הנשים שנראות ככה באמת, כי הן מכירות את המחירים ויודעות לבחור.</w:t>
       </w:r>
     </w:p>
     <w:p>
@@ -2634,7 +2634,7 @@
           <w:szCs w:val="24"/>
           <w:rtl/>
         </w:rPr>
-        <w:t xml:space="preserve">הכי גבוה מכולם. כלכלית, כי הפריטים האלה הם הכי יקרים שיש בשוק, ואני יודעת מחירים. חברתית, כי זה לוק שצריך לדעת אותו, ולדעת אותו זה עניין של איפה גדלת. מי שלא גדלה ליד אנשים שמתלבשים ככה לא תעשה את זה נכון גם עם כסף. וזה הדבר שהכי מתסכל אותי, כסטייליסטית בדרך: אפשר לקנות את הבגדים. אי אפשר לקנות את הידע. את הידע אני לומדת שנים, ועדיין.</w:t>
+        <w:t xml:space="preserve">הכי גבוה מכולם. כלכלית, כי הפריטים האלה הם הכי יקרים שיש בשוק, ואני יודעת מחירים, סוודר כזה זה שמונה עד שתים עשרה אלף. חברתית, כי זה לוק שצריך לדעת אותו, ולדעת אותו זה עניין של איפה גדלת. מי שלא גדלה ליד אנשים שמתלבשים ככה לא תעשה את זה נכון גם עם כסף, היא תקנה את הסוודר הנכון ותשים עליו שרשרת לא נכונה. וזה הדבר שהכי מתסכל אותי, כסטייליסטית בדרך: אפשר לקנות את הבגדים. אי אפשר לקנות את הידע. את הידע אני לומדת שנים, ועדיין, המורה שלי תופסת אותי על דברים. על הציפורניים, למשל. ציפורניים כמו שלי, היא אומרת, לא הולכות עם הלוק הזה. ואני לא מוכנה לוותר על הציפורניים. אז כנראה שאני עדיין בינונית.</w:t>
       </w:r>
     </w:p>
     <w:p>
@@ -2694,7 +2694,7 @@
           <w:szCs w:val="24"/>
           <w:rtl/>
         </w:rPr>
-        <w:t xml:space="preserve">הבד. קשמיר רואים ממרחק, יש לו נפילה אחרת, הוא לא עומד, הוא נשפך. המכנסיים, שיושבים מושלם, ומכנסיים שיושבים ככה זה או אלפי שקלים או חייט. התיק בלי לוגו, שזה בדיוק הקוד, "מי שיודע יודע". הצבעים, בז' קאמל שחור, זאת הפלטה של היוקרה השקטה, אין פה צבע אחד במקרה. והשיער האסוף, שנראה פשוט, והוא הכי קשה. הכול פה בנוי על פרטים שרק מי שמכירה רואה, וזה הרעיון כולו. זה לוק שמדבר למועדון.</w:t>
+        <w:t xml:space="preserve">הבד. קשמיר רואים ממרחק, יש לו נפילה אחרת, הוא לא עומד, הוא נשפך. המכנסיים, שיושבים מושלם, ומכנסיים שיושבים ככה זה או אלפי שקלים או חייט, ואצלה כנראה גם וגם. התיק בלי לוגו, שזה בדיוק הקוד, "מי שיודע יודע", ואני יודעת, ואני יודעת גם כמה הוא עולה, ואני לא אגיד כי זה יישמע כמו שקר. הצבעים, בז' קאמל שחור, זאת הפלטה של היוקרה השקטה, אין פה צבע אחד במקרה, ואין פה צבע אחד שאפשר לטעות בו. והשיער האסוף, שנראה פשוט, והוא הכי קשה, כי צריך שיער בריא וחלק, וזה מספרה יקרה פעם בחודש. הכול פה בנוי על פרטים שרק מי שמכירה רואה, וזה הרעיון כולו. זה לוק שמדבר למועדון. ומי שלא במועדון רואה סוודר בז'. ואני, שאני בחצי הדרך למועדון, רואה את הסוודר ואת המחיר ואת כמה שנים יש לי עוד.</w:t>
       </w:r>
     </w:p>
     <w:p>
@@ -2773,7 +2773,7 @@
           <w:szCs w:val="24"/>
           <w:rtl/>
         </w:rPr>
-        <w:t xml:space="preserve">גבר שנראה טוב בלי להיראות שמנסה, וזה אצל גברים נדיר. באמת נדיר, אני רואה מאות גברים בשבוע. הוא נראה כמו מישהו שיש לו ארון קטן של דברים מצוינים, ולובש אותם שוב ושוב, ולא חושב על זה. חולצה טובה, מכנסיים טובים, נעליים טובות. אני מדמיינת אותו במסעדה טובה, לא בבר. אדיב. קצת שמור. בוגר. כזה שלא יסתכל עליי פעמיים, וגם זה אומר משהו.</w:t>
+        <w:t xml:space="preserve">גבר שנראה טוב בלי להיראות שמנסה, וזה אצל גברים נדיר. באמת נדיר, אני רואה מאות גברים בשבוע, ורובם או שלא מנסים ונראים ככה, או שמנסים ורואים. הוא נראה כמו מישהו שיש לו ארון קטן של דברים מצוינים, ולובש אותם שוב ושוב, ולא חושב על זה בבוקר יותר מעשר שניות. חולצה טובה, מכנסיים טובים, נעליים טובות, שעון שקיבל מאבא שלו. אני מדמיינת אותו במסעדה טובה, לא בבר. אדיב. קצת שמור. בוגר. כזה שלא יסתכל עליי פעמיים, וגם זה אומר משהו, כי הבחור בתמונה אחת היה מסתכל שלוש.</w:t>
       </w:r>
     </w:p>
     <w:p>
@@ -2833,7 +2833,7 @@
           <w:szCs w:val="24"/>
           <w:rtl/>
         </w:rPr>
-        <w:t xml:space="preserve">בכיר בלא-הייטק. בנקאות, משפטים, רפואה, או עסק משפחתי גדול. אדריכל אולי. הייטקיסטים לא נראים ככה, הם בטי שירט וסניקרס, גם המנכ"לים. זה לוק של מישהו שפוגש אנשים שצריכים לכבד אותו, ושהוא רגיל שמכבדים.</w:t>
+        <w:t xml:space="preserve">בכיר בלא-הייטק. בנקאות, משפטים, רפואה, או עסק משפחתי גדול, שלושה דורות. אדריכל אולי. הייטקיסטים לא נראים ככה, הם בטי שירט וסניקרס, גם המנכ"לים, אולי בעיקר המנכ"לים. זה לוק של מישהו שפוגש אנשים שצריכים לכבד אותו, ושהוא רגיל שמכבדים, ושאם לא יכבדו הוא לא יבין מה קרה. ואולי הוא גם מישהו שאשתו קונה לו את הבגדים, זה הלוק של גבר שמישהי מלבישה אותו טוב. גברים שקונים לעצמם נראים קצת אחרת, יש להם פריט אחד שהם בחרו והוא לא מתאים.</w:t>
       </w:r>
     </w:p>
     <w:p>
@@ -2893,7 +2893,7 @@
           <w:szCs w:val="24"/>
           <w:rtl/>
         </w:rPr>
-        <w:t xml:space="preserve">גבוה. גם וגם. אותו עולם כמו האישה בתמונה 3, ואם היית אומרת לי שהם זוג, הייתי מאמינה מיד. והוא נראה לי כמו מישהו שגדל עם כסף, לא כמו מישהו שעשה אותו. (המראיינת: ממה?) מזה שאין בו כלום שמנסה. אנשים שעשו כסף, גם כשהם לומדים להתלבש שקט, יש להם פריט אחד שמסגיר, שעון, נעליים, משהו. לו אין.</w:t>
+        <w:t xml:space="preserve">גבוה. גם וגם. אותו עולם כמו האישה בתמונה 3, ואם היית אומרת לי שהם זוג, הייתי מאמינה מיד, והייתי אומרת שהיא הלבישה אותו. והוא נראה לי כמו מישהו שגדל עם כסף, לא כמו מישהו שעשה אותו. (המראיינת: ממה?) מזה שאין בו כלום שמנסה. אנשים שעשו כסף, גם כשהם לומדים להתלבש שקט, יש להם פריט אחד שמסגיר, שעון, נעליים, חגורה, משהו שהם לא הצליחו לוותר עליו. לו אין. אפילו השעון שלו הוא שעון של "זה היה של אבא". ובחנות, גברים כאלה לא נכנסים אליי בכלל. הם קונים במקום אחר, או שלא קונים, כי יש להם כבר. אז אני רואה אותו רק מבחוץ. וזה אולי למה אני לא יודעת להגיד עליו הרבה.</w:t>
       </w:r>
     </w:p>
     <w:p>
@@ -2953,7 +2953,7 @@
           <w:szCs w:val="24"/>
           <w:rtl/>
         </w:rPr>
-        <w:t xml:space="preserve">הלופרס. לופרס טובים, מעור טוב, זה הדבר שהכי מסגיר מעמד אצל גברים, יותר משעון, ואני אומרת את זה מניסיון של חנות נעליים. והשעון הדק, שהוא ההפך מהשעון של הבחור בתמונה אחת, ואולי עולה יותר. החולצה מבד מט, לא מבריק. ושום לוגו, בשום מקום. אצל גברים זה אפילו חזק יותר מאצל נשים, כי גבר עם כסף חדש כמעט תמיד הולך על לוגו, זה מה שאני רואה בחנות, ואלה שלא, זה בדרך כלל סימן.</w:t>
+        <w:t xml:space="preserve">הלופרס. לופרס טובים, מעור טוב, זה הדבר שהכי מסגיר מעמד אצל גברים, יותר משעון, ואני אומרת את זה מניסיון של חנות נעליים: גבר יחסוך על הכול חוץ מנעליים, אם הוא יודע. והשעון הדק, שהוא ההפך מהשעון של הבחור בתמונה אחת, ואולי עולה יותר, ואף אחד לא יידע. החולצה מבד מט, לא מבריק, שזה הבדל שרואים רק אם מחפשים. ושום לוגו, בשום מקום. אצל גברים זה אפילו חזק יותר מאצל נשים, כי גבר עם כסף חדש כמעט תמיד הולך על לוגו, זה מה שאני רואה בחנות כל יום, ואלה שלא, זה בדרך כלל סימן שהכסף לא חדש. או שהם בכלל לא חושבים על זה. וזה, לא לחשוב על זה, זה הדבר הכי יקר שיש.</w:t>
       </w:r>
     </w:p>
     <w:p>
@@ -3032,7 +3032,7 @@
           <w:szCs w:val="24"/>
           <w:rtl/>
         </w:rPr>
-        <w:t xml:space="preserve">שלוש, ארבע, אחת, שתיים. בלי להתלבט. האישה ראשונה, כי הלוק שלה הוא היקר ביותר והמתוחכם ביותר, ואני יודעת כמה הוא עולה. הגבר שני, צמוד. הבחור בטרנינג שלישי, יש לו כסף אמיתי, אני יודעת מה הוא לובש, אבל אין לו את הידע. הבחורה אחרונה, כי אצלה גם בכסף אני לא בטוחה. ורגע, אני רוצה להגיד משהו: הסדר הזה הוא של מעמד. לא של מי אני אוהבת. את הבחורה בתמונה 2 אני הכי מבינה מכולם, כי הייתי היא. בדיוק היא. עם אותו תיק. אז אני מדרגת אותה אחרונה ומרגישה קצת בוגדת.</w:t>
+        <w:t xml:space="preserve">שלוש, ארבע, אחת, שתיים. בלי להתלבט. האישה ראשונה, כי הלוק שלה הוא היקר ביותר והמתוחכם ביותר, ואני יודעת כמה הוא עולה, בערך ארבעים אלף אם הכול מה שאני חושבת. הגבר שני, צמוד, אולי שווה. הבחור בטרנינג שלישי, יש לו כסף אמיתי, אני יודעת מה הוא לובש, אבל אין לו את הידע, ובלי הידע הכסף נראה זול. הבחורה אחרונה, כי אצלה גם בכסף אני לא בטוחה. ורגע, אני רוצה להגיד משהו: הסדר הזה הוא של מעמד. לא של מי אני אוהבת. את הבחורה בתמונה 2 אני הכי מבינה מכולם, כי הייתי היא. בדיוק היא. עם אותו תיק. אז אני מדרגת אותה אחרונה ומרגישה קצת בוגדת. ואני גם יודעת שבעוד שלוש שנים, כשאסיים את הקורס ואעבוד עם לקוחות עשירות, אני אדרג אותה עוד יותר נמוך, ואתבייש בזה עוד יותר. ככה זה עובד. ככל שעולים, מסתכלים למטה על מי שהיית.</w:t>
       </w:r>
     </w:p>
     <w:p>
@@ -3092,7 +3092,7 @@
           <w:szCs w:val="24"/>
           <w:rtl/>
         </w:rPr>
-        <w:t xml:space="preserve">מנסה להיראות עשיר: הבחור והבחורה, שניהם, וזה המטרה המוצהרת של הלוק, הם לא מסתירים. ואני לא רואה בזה רע, זה לוק של "אני רוצה שתדעו", והם משיגים את זה, זה עובד. נראה עשיר בלי להתאמץ: הגבר, הכי. האישה גם, אבל פה אני רוצה לדייק: היא מתאמצת המון. רק שהמאמץ שלה הוא להיראות לא מתאמצת, וזה דורש הרבה יותר ידע וכסף מלקנות לוגו. יוקרה שקטה היא לא פחות מאמץ. היא מאמץ שמוסתר טוב. ואני יודעת כי אני מנסה ללמוד אותו, וזה קשה בטירוף.</w:t>
+        <w:t xml:space="preserve">מנסה להיראות עשיר: הבחור והבחורה, שניהם, וזה המטרה המוצהרת של הלוק, הם לא מסתירים, ואם היית שואלת אותם הם היו אומרים "כן, בטח, בשביל זה קניתי". ואני לא רואה בזה רע, זה לוק של "אני רוצה שתדעו", והם משיגים את זה, זה עובד, אנשים יודעים. נראה עשיר בלי להתאמץ: הגבר, הכי. האישה גם, אבל פה אני רוצה לדייק: היא מתאמצת המון. רק שהמאמץ שלה הוא להיראות לא מתאמצת, וזה דורש הרבה יותר ידע וכסף מלקנות לוגו. יוקרה שקטה היא לא פחות מאמץ. היא מאמץ שמוסתר טוב. ואני יודעת כי אני מנסה ללמוד אותו, וזה קשה בטירוף, ובכל שבוע המורה שלי מראה לי עוד דבר שעשיתי לא נכון. והגבר, אם הוא באמת לא מתאמץ, אז הוא היחיד פה שאי אפשר ללמד. כי אי אפשר ללמד לא לנסות. אפשר רק להעמיד פנים, וזה מה שהאישה עושה, ומה שאני לומדת לעשות.</w:t>
       </w:r>
     </w:p>
     <w:p>
@@ -3152,7 +3152,7 @@
           <w:szCs w:val="24"/>
           <w:rtl/>
         </w:rPr>
-        <w:t xml:space="preserve">לעבוד, האישה. הייתי רוצה ללמוד ממנה, היא בדיוק מה שאני רוצה להיות, והיא בטח בוסית קשה, אבל כזאת שמלמדת. חברה... האמת? הבחורה בתמונה 2. היא הכי כיפית והכי קלה, והיא מהעולם שלי, היינו הולכות לקניון ביחד. הגבר, לא לעבוד ולא חברה, הוא נראה לי משעמם, כזה שמדבר על ריבית. והבחור בטרנינג, לחברות הוא יכול להיות מצחיק, יש לו אנרגיה, לעבודה לא, הוא ימכור לי משהו תוך חמש דקות.</w:t>
+        <w:t xml:space="preserve">לעבוד, האישה. הייתי רוצה ללמוד ממנה, היא בדיוק מה שאני רוצה להיות, והיא בטח בוסית קשה, כזאת שאומרת "לא" בלי להסביר, אבל כזאת שמלמדת רק מזה שרואים אותה. חברה... האמת? הבחורה בתמונה 2. היא הכי כיפית והכי קלה, והיא מהעולם שלי, היינו הולכות לקניון ביחד ומצלמות אחת את השנייה ונהנות. הגבר, לא לעבוד ולא חברה, הוא נראה לי משעמם, כזה שמדבר על ריבית ועל מה הבן שלו לומד. והבחור בטרנינג, לחברות הוא יכול להיות מצחיק, יש לו אנרגיה, הוא היה מזמין את כולם, לעבודה לא, הוא ימכור לי משהו תוך חמש דקות ואני אקנה. ואני שמה לב שאני רוצה לעבוד עם מי שאני רוצה להיות, ולהיות חברה של מי שהייתי. וזה אולי אומר שאני באמצע, בדיוק בין התמונה 2 לתמונה 3, ולא בטוחה לאן.</w:t>
       </w:r>
     </w:p>
     <w:p>
@@ -3250,7 +3250,7 @@
           <w:szCs w:val="24"/>
           <w:rtl/>
         </w:rPr>
-        <w:t xml:space="preserve">לא מפתיע אותי בכלל, כי ידעתי מהרגע הראשון. זיהיתי את כל הפריטים, גם של השקטים, ואני יודעת שהשקטים יקרים יותר. מה שכן מעניין אותי זה שאת שואלת. כי זה אומר שרוב האנשים לא יודעים. ואם רוב האנשים לא יודעים, אז הלוק של האישה בבז' לא עובד על רוב האנשים. הוא עובד רק על מי שמכיר. זה לוק למועדון סגור. והלוק של הבחור בטרנינג עובד על כולם, על אמא שלי, על השכן. אז השאלה היא עם מי את רוצה לדבר. זה לא משנה לי את הדעה. זה מחזק אותה. ואולי קצת עוצר אותי, כי אני בדרך למועדון הזה, ואני לא בטוחה שאני רוצה לדבר רק איתם.</w:t>
+        <w:t xml:space="preserve">לא מפתיע אותי בכלל, כי ידעתי מהרגע הראשון, אמרתי לך את המותגים לפני שאת אמרת. זיהיתי את כל הפריטים, גם של השקטים, ואני יודעת שהשקטים יקרים יותר, הרבה יותר. מה שכן מעניין אותי זה שאת שואלת. כי זה אומר שרוב האנשים לא יודעים. ואם רוב האנשים לא יודעים, אז הלוק של האישה בבז' לא עובד על רוב האנשים. הוא עובד רק על מי שמכיר. זה לוק למועדון סגור, ואני עומדת בדלת שלו עם הקורס שלי ומחכה שיפתחו. והלוק של הבחור בטרנינג עובד על כולם, על אמא שלי, על השכן, על הילדים בקניון. אז השאלה היא עם מי את רוצה לדבר. זה לא משנה לי את הדעה. זה מחזק אותה. ואולי קצת עוצר אותי, כי אני בדרך למועדון הזה, ואני לא בטוחה שאני רוצה לדבר רק איתם. אמא שלי לא תדע להעריך את הסוודר. היא תגיד "למה לא קנית משהו יפה". ואני רוצה שאמא שלי תדע שהצלחתי. והבחור בטרנינג, אמא שלו יודעת.</w:t>
       </w:r>
     </w:p>
     <w:p>
@@ -3310,7 +3310,7 @@
           <w:szCs w:val="24"/>
           <w:rtl/>
         </w:rPr>
-        <w:t xml:space="preserve">מה שעובר לי בראש, אחת שתיים: "אני יודעת מאיזו קולקציה זה ומה שילמת". ואז "למה דווקא את זה". כי כמעט תמיד, לוגו גדול הוא פריט הכניסה, הזול, ומי שקונה אותו מקבל את השם ולא את הבגד. בחנות אני רואה את זה כל יום, "יש לך משהו עם לוגו?", לא "משהו יפה". זה לא מרגיז אותי. אני מבינה את זה. אבל אני כבר לא רוצה את זה לעצמי. פעם רציתי, מאוד. היום אני חוסכת למעיל בלי לוגו שעולה כמו חודשיים משכורת. וזה כנראה אומר שאני עולה מעמד. או שאני רוצה. או שרק שיניתי מועדון.</w:t>
+        <w:t xml:space="preserve">מה שעובר לי בראש, אחת שתיים: "אני יודעת מאיזו קולקציה זה ומה שילמת". ואז "למה דווקא את זה". כי כמעט תמיד, לוגו גדול הוא פריט הכניסה, הזול, ומי שקונה אותו מקבל את השם ולא את הבגד. בחנות אני רואה את זה כל יום, "יש לך משהו עם לוגו?", לא "משהו יפה", לא "משהו שמתאים לי", "עם לוגו". זה לא מרגיז אותי. אני מבינה את זה, הם לא קונים בגד, הם קונים משהו להגיד. אבל אני כבר לא רוצה את זה לעצמי. פעם רציתי, מאוד. היום אני חוסכת למעיל בלי לוגו שעולה כמו חודשיים משכורת, ואף אחד בקריות לא יידע מה זה, ואני אדע. וזה כנראה אומר שאני עולה מעמד. או שאני רוצה. או שרק שיניתי מועדון, ממועדון שכולם רואים למועדון שאף אחד לא רואה, וזה אותו צורך, רק יותר יקר. (המראיינת: ומה את מרגישה כלפי מי שלובש?) קרבה. באמת. זאת אני לפני חמש שנים. ואני לא יכולה לכעוס על מי שהייתי.</w:t>
       </w:r>
     </w:p>
     <w:p>
@@ -3370,7 +3370,7 @@
           <w:szCs w:val="24"/>
           <w:rtl/>
         </w:rPr>
-        <w:t xml:space="preserve">כן. שהחלוקה הזאת, לוגו מול שקט, היא לא רק כסף, היא גיל. בעשרים ושתיים רציתי שיראו. בעשרים ושבע אני רוצה שמי שמבין יראה. ובארבעים, אני מנחשת, לא ארצה שאף אחד יראה. אז אולי זה לא שני סוגי אנשים, זה שלושה שלבים של אותו אדם. ולמחקר שלך: תשאלי גברים. ממה שאני רואה בחנות, גברים הרבה יותר מכורים ללוגו מנשים, והם מתביישים להודות, אז הם יגידו לך משהו אחר ממה שהם קונים.</w:t>
+        <w:t xml:space="preserve">כן. שהחלוקה הזאת, לוגו מול שקט, היא לא רק כסף, היא גיל. בעשרים ושתיים רציתי שיראו. בעשרים ושבע אני רוצה שמי שמבין יראה. ובארבעים, אני מנחשת, לא ארצה שאף אחד יראה. אז אולי זה לא שני סוגי אנשים, זה שלושה שלבים של אותו אדם, ושתי התמונות האלה הן אותה אישה בהפרש של חמש עשרה שנה. ולמחקר שלך: תשאלי גברים. ממה שאני רואה בחנות, גברים הרבה יותר מכורים ללוגו מנשים, והם מתביישים להודות, אז הם יגידו לך משהו אחר ממה שהם קונים. תסתכלי מה הם קונים, לא מה הם אומרים. ועוד דבר, אם מותר: תבואי לחנות. יום אחד. תראי מי קונה מה. זה מחקר יותר טוב מכל תמונה.</w:t>
       </w:r>
     </w:p>
     <w:p>
@@ -3426,7 +3426,7 @@
           <w:szCs w:val="24"/>
           <w:rtl/>
         </w:rPr>
-        <w:t xml:space="preserve">תאריך: 4.10.2026    משך: 21 דקות    מקום: חדר המורים בבית ספר תיכון, קריית טבעון    הקלטה: בטלפון, בהסכמה</w:t>
+        <w:t xml:space="preserve">תאריך: 4.10.2026    משך: 25 דקות    מקום: חדר המורים בבית ספר תיכון, קריית טבעון    הקלטה: בטלפון, בהסכמה</w:t>
       </w:r>
     </w:p>
     <w:p>
@@ -3505,7 +3505,7 @@
           <w:szCs w:val="24"/>
           <w:rtl/>
         </w:rPr>
-        <w:t xml:space="preserve">בת חמישים ושתיים. מורה לספרות ומחנכת, פה בטבעון, עשרים ושש שנים. גדלתי בחיפה, בנווה שאנן, בבניין רכבת, שלושה ילדים, שניים כבר אחרי צבא, אחת בכיתה י"א. אני אוהבת לקרוא, לטייל בכרמל, ואין לי סבלנות לקניות, בכלל. אני אומרת את זה עכשיו כדי שתדעי עם מי את יושבת, כי אני חושדת שאני לא המרואיינת האידיאלית שלך.</w:t>
+        <w:t xml:space="preserve">בת חמישים ושתיים. מורה לספרות ומחנכת, פה בטבעון, עשרים ושש שנים, מהן עשרים כמחנכת. גדלתי בחיפה, בנווה שאנן, בבניין רכבת, ההורים עובדים, אבא במפעל ואמא בקופת חולים. שלושה ילדים, שניים כבר אחרי צבא, אחת בכיתה י"א, אצלי בבית הספר, לא בכיתה שלי. אני אוהבת לקרוא, לטייל בכרמל, ואין לי סבלנות לקניות, בכלל, אני נכנסת לחנות וצריכה לצאת אחרי חמש דקות. אני אומרת את זה עכשיו כדי שתדעי עם מי את יושבת, כי אני חושדת שאני לא המרואיינת האידיאלית שלך. ומצד שני, אני מורה עשרים ושש שנים, ומורה רואה כל יום שלושים ילדים שמנסים להגיד משהו עם הבגדים שלהם, אז אולי אני כן יודעת לקרוא את זה, רק מכיוון אחר.</w:t>
       </w:r>
     </w:p>
     <w:p>
@@ -3565,7 +3565,7 @@
           <w:szCs w:val="24"/>
           <w:rtl/>
         </w:rPr>
-        <w:t xml:space="preserve">שתיים. אולי אחת וחצי. אני מתלבשת נקי ומסודר, בשביל הכיתה, שלא יגידו, אבל אני לא עוקבת אחרי כלום, לא מכירה מותגים, והפעם האחרונה שקניתי משהו לא כי הישן נקרע... לא זוכרת. הבנות שלי צוחקות עליי, "אמא, הסנדלים". אבל יש דבר אחד: אני שמה לב מאוד איך התלמידים שלי מתלבשים. כי זה אומר לי הרבה על מה שקורה להם בבית. אז אולי אני כן קוראת בגדים, רק לא כמו שאת מתכוונת.</w:t>
+        <w:t xml:space="preserve">שתיים. אולי אחת וחצי. אני מתלבשת נקי ומסודר, בשביל הכיתה, שלא יגידו, יש לי חמש חולצות וארבעה מכנסיים ואני מסובבת. אבל אני לא עוקבת אחרי כלום, לא מכירה מותגים, והפעם האחרונה שקניתי משהו לא כי הישן נקרע... לא זוכרת. הבנות שלי צוחקות עליי, "אמא, הסנדלים", והסנדלים האלה בני שש שנים ונוחים. אבל יש דבר אחד: אני שמה לב מאוד איך התלמידים שלי מתלבשים. כי זה אומר לי הרבה על מה שקורה להם בבית, אם הם ישנים, אם יש כסף, אם הם מנסים להיות מישהו אחר השבוע. אז אולי אני כן קוראת בגדים, רק לא כמו שאת מתכוונת. אני קוראת אותם כמו שקוראים סיפור, לא כמו שקוראים קטלוג.</w:t>
       </w:r>
     </w:p>
     <w:p>
@@ -3663,7 +3663,7 @@
           <w:szCs w:val="24"/>
           <w:rtl/>
         </w:rPr>
-        <w:t xml:space="preserve">"ילד". זה מה שעלה. לא בגלל הגיל, הוא לא ילד, אלא כי הוא נראה כמו תלמיד שלי שגדל. יש לי כאלה בכיתה, עם הנעליים הגדולות, הקפוצ'ון עם הכיתוב, ואני רואה אותו ואומרת "אה, זה עומר בעוד עשר שנים". הוא נראה לי קצת מתנשא, "תראו אותי", ובאותו זמן, מתחת לזה, לא בטוח. כאילו הבגדים הם שריון. ואני יודעת שאני אומרת את זה כי אני מורה, ומורה רואה בכל אחד ילד מפוחד. אבל זה מה שרואים. (המראיינת: איפה היית פוגשת אותו?) ליד רכב. עומד ליד רכב יקר ומצלם.</w:t>
+        <w:t xml:space="preserve">"ילד". זה מה שעלה. לא בגלל הגיל, הוא לא ילד, הוא בטח בן שלושים, אלא כי הוא נראה כמו תלמיד שלי שגדל. יש לי כאלה בכיתה, עם הנעליים הגדולות, הקפוצ'ון עם הכיתוב, ואני רואה אותו ואומרת "אה, זה עומר בעוד עשר שנים". הוא נראה לי קצת מתנשא, "תראו אותי", ובאותו זמן, מתחת לזה, לא בטוח. כאילו הבגדים הם שריון. ואני יודעת שאני אומרת את זה כי אני מורה, ומורה רואה בכל אחד ילד מפוחד, זאת מחלה מקצועית. אבל זה מה שרואים. (המראיינת: איפה היית פוגשת אותו?) ליד רכב. עומד ליד רכב יקר ומצלם. או בחתונה, ליד הבר, מדבר עם שלושה חברים שנראים בדיוק אותו דבר. ואני חושבת שאם הייתי מדברת איתו, הוא היה בסדר גמור. הבגדים מדברים לפניו, וזה חבל, כי אולי יש לו מה להגיד.</w:t>
       </w:r>
     </w:p>
     <w:p>
@@ -3723,7 +3723,7 @@
           <w:szCs w:val="24"/>
           <w:rtl/>
         </w:rPr>
-        <w:t xml:space="preserve">אין לי מושג, באמת שלא. משהו עם כסף שבא מהר. אולי עובד עם אבא, אולי מוכר משהו. הילדים שלי היו אומרים כדורגלן, מיד. אני לא רואה אותו במקצוע שלומדים, ואני לא יודעת אם זה בגלל הבגדים או בגלל שהוא נראה לי צעיר מדי בשביל כל דבר.</w:t>
+        <w:t xml:space="preserve">אין לי מושג, באמת שלא. משהו עם כסף שבא מהר. אולי עובד עם אבא, אולי מוכר משהו, אולי יש לו משהו באינטרנט שאני לא מבינה. הילדים שלי היו אומרים כדורגלן, מיד, בלי לחשוב. אני לא רואה אותו במקצוע שלומדים, ואני לא יודעת אם זה בגלל הבגדים או בגלל שהוא נראה לי צעיר מדי בשביל כל דבר. יש לי בוגר, סיים לפני שמונה שנים, שנראה בדיוק ככה ויש לו רשת של חנויות טלפונים, והוא מגיע לכנס בוגרים עם רכב שעולה יותר מהדירה שלי, ומחבק אותי, והוא מקסים. אז אולי הוא זה. ואולי לא. אני מנחשת לפי בוגר אחד.</w:t>
       </w:r>
     </w:p>
     <w:p>
@@ -3783,7 +3783,7 @@
           <w:szCs w:val="24"/>
           <w:rtl/>
         </w:rPr>
-        <w:t xml:space="preserve">כסף יש לו, כנראה, כי אפילו אני רואה שהנעליים לא מהשוק. אבל אם זה שלו, אין לי מושג. חברתית... אני לא יודעת אם זאת בכלל הקטגוריה. הוא נראה לי כמו מישהו שבא ממקום שלא היה בו, והגיע למקום שיש בו, והבגדים הם הדרך להגיד את זה. אני גדלתי בנווה שאנן, ההורים שלי היו פועלים, ואני זוכרת את השכנים שקנו את הדבר הראשון היקר שלהם ושמו אותו בסלון שכולם יראו. זה אותו דבר. רק שהסלון הוא הגוף.</w:t>
+        <w:t xml:space="preserve">כסף יש לו, כנראה, כי אפילו אני רואה שהנעליים לא מהשוק. אבל אם זה שלו, אין לי מושג. חברתית... אני לא יודעת אם זאת בכלל הקטגוריה. הוא נראה לי כמו מישהו שבא ממקום שלא היה בו, והגיע למקום שיש בו, והבגדים הם הדרך להגיד את זה. אני גדלתי בנווה שאנן, ההורים שלי היו פועלים, ואני זוכרת את השכנים שקנו את הדבר הראשון היקר שלהם, מכונית, וידאו, ושמו אותו במקום שכולם יראו. זה אותו דבר. רק שהסלון הוא הגוף. ואני לא אומרת את זה מלמעלה, כי אבא שלי קנה סובארו ושטף אותה כל יום שישי ברחוב, כדי שיראו. אז המעמד שלו הוא המעמד של אבא שלי, בעצם. מי שעלה. ואני גאה באבא שלי. אז אני צריכה להיות זהירה במה שאני אומרת על הבחור הזה.</w:t>
       </w:r>
     </w:p>
     <w:p>
@@ -3843,7 +3843,7 @@
           <w:szCs w:val="24"/>
           <w:rtl/>
         </w:rPr>
-        <w:t xml:space="preserve">שהכול גדול. הכיתוב גדול, הנעליים גדולות, השעון גדול. וכשתלמיד מגיע אליי עם משהו גדול, זה בדרך כלל אומר שהוא רוצה שיראו אותו, כי משהו אחר בו לא רואים. אני לא אומרת שזה המצב פה, אני לא מכירה את הבחור. אבל זה מה שהבגדים עשו לי. ועוד דבר קטן: הוא בטרנינג. בגד ספורט. וברור שהוא לא הולך לעשות ספורט. אז הבגד לא משרת את מה שהוא נועד לו, הוא משרת משהו אחר, וזה הדבר שהכי אומר לי "תצוגה".</w:t>
+        <w:t xml:space="preserve">שהכול גדול. הכיתוב גדול, הנעליים גדולות, השעון גדול. וכשתלמיד מגיע אליי עם משהו גדול, זה בדרך כלל אומר שהוא רוצה שיראו אותו, כי משהו אחר בו לא רואים. אני לא אומרת שזה המצב פה, אני לא מכירה את הבחור. אבל זה מה שהבגדים עשו לי. ועוד דבר קטן: הוא בטרנינג. בגד ספורט. וברור שהוא לא הולך לעשות ספורט, לא עם השעון הזה. אז הבגד לא משרת את מה שהוא נועד לו, הוא משרת משהו אחר, וזה הדבר שהכי אומר לי "תצוגה". בגד שלא עושה את העבודה שלו עושה עבודה אחרת. (המראיינת: ואיזה פרט הכי?) הכיתוב. כי הכיתוב הוא מילים, ואני מורה לספרות, ואני קוראת מילים. ומילים על חולצה הן כמו שלט על דלת. הוא כתב על עצמו מה הוא רוצה שיקראו.</w:t>
       </w:r>
     </w:p>
     <w:p>
@@ -3922,7 +3922,7 @@
           <w:szCs w:val="24"/>
           <w:rtl/>
         </w:rPr>
-        <w:t xml:space="preserve">בחורה יפה. מאוד מטופחת. מושקעת. היא מזכירה לי את הבנות שלי בכיתה י"ב בטקס הסיום, כולן בדיוק ככה, אותן ציפורניים, אותו שיער. יש בה משהו שמנסה להיראות מבוגר ועשיר יותר ממה שהוא. והיא נראית לי נחמדה, באמת, רק שאני לא יודעת על מה הייתי מדברת איתה אחרי "שלום". וזה אולי עליי, לא עליה.</w:t>
+        <w:t xml:space="preserve">בחורה יפה. מאוד מטופחת. מושקעת. היא מזכירה לי את הבנות שלי בכיתה י"ב בטקס הסיום, כולן בדיוק ככה, אותן ציפורניים, אותו שיער, אותו תיק, כאילו הלכו ביחד לקנות. יש בה משהו שמנסה להיראות מבוגר ועשיר יותר ממה שהוא. והיא נראית לי נחמדה, באמת, רק שאני לא יודעת על מה הייתי מדברת איתה אחרי "שלום". וזה אולי עליי, לא עליה. אולי היא קוראת ספרים. אולי היא קוראת יותר ממני. אני לא יודעת, ואני כבר החלטתי שלא, וזה בדיוק מה שאת חוקרת, לא? שהחלטתי תוך שנייה. ואני מתביישת קצת, כי אני מחנכת ואני אומרת לתלמידים לא לשפוט.</w:t>
       </w:r>
     </w:p>
     <w:p>
@@ -3982,7 +3982,7 @@
           <w:szCs w:val="24"/>
           <w:rtl/>
         </w:rPr>
-        <w:t xml:space="preserve">יופי. או רשתות. או עדיין לא עובדת, סטודנטית. אני לא רואה אותה בכיתה, לא כי היא לא חכמה, אין לי מושג כמה היא חכמה, אלא כי הלבוש הזה לא מתאים לעמוד מול שלושים ילדים. הייתי מתפרקת עם הציפורניים האלה אחרי שיעור אחד.</w:t>
+        <w:t xml:space="preserve">יופי. או רשתות. או עדיין לא עובדת, סטודנטית, חיילת משוחררת שעוד לא החליטה. אני לא רואה אותה בכיתה, לא כי היא לא חכמה, אין לי מושג כמה היא חכמה, אלא כי הלבוש הזה לא מתאים לעמוד מול שלושים ילדים. הייתי מתפרקת עם הציפורניים האלה אחרי שיעור אחד, איך כותבים על לוח עם זה. ויש לי מורה צעירה בצוות, מורה לאנגלית, שנראית קצת ככה בימי שישי, ובימי חול היא לובשת אחרת, ואז הבנתי שזה לא "מי היא", זה "מה היא לובשת בשביל מי". אז אולי גם הבחורה הזאת, ביום שני, נראית לגמרי אחרת. אני רואה אותה ביום שישי.</w:t>
       </w:r>
     </w:p>
     <w:p>
@@ -4042,7 +4042,7 @@
           <w:szCs w:val="24"/>
           <w:rtl/>
         </w:rPr>
-        <w:t xml:space="preserve">כלכלית, אני לא יודעת. אני רואה שמות על הבגדים ואני יודעת שהשמות האלה יקרים, אפילו אני, אבל אני לא יודעת להבדיל בין אמיתי לחיקוי, ואני יודעת שיש הרבה חיקויים, כי התלמידים שלי באים עם כאלה. חברתית, בינוני. והכסף, אם יש, אולי של ההורים. היא נראית לי כמו מישהי שעוד לא במקום שלה, שהיא בדרך לאיפשהו ומתלבשת כמו היעד.</w:t>
+        <w:t xml:space="preserve">כלכלית, אני לא יודעת. אני רואה שמות על הבגדים ואני יודעת שהשמות האלה יקרים, אפילו אני, אבל אני לא יודעת להבדיל בין אמיתי לחיקוי, ואני יודעת שיש הרבה חיקויים, כי התלמידים שלי באים עם כאלה ומתווכחים ביניהם מי מזויף. חברתית, בינוני. והכסף, אם יש, אולי של ההורים. היא נראית לי כמו מישהי שעוד לא במקום שלה, שהיא בדרך לאיפשהו ומתלבשת כמו היעד. וזה, אגב, לא רע. גם אני בגיל עשרים ושתיים התלבשתי כמו מורה לפני שהייתי מורה. התלבשתי כמו מה שרציתי להיות. אז אולי היא פשוט רוצה להיות עשירה, וזה היעד שלה, ומה רע בזה.</w:t>
       </w:r>
     </w:p>
     <w:p>
@@ -4102,7 +4102,7 @@
           <w:szCs w:val="24"/>
           <w:rtl/>
         </w:rPr>
-        <w:t xml:space="preserve">השמות. על החולצה כתוב מותג. על התיק יש סמלים. על המשקפיים. אני יודעת שאלה מותגים יקרים בלי להתעניין, כי כולם יודעים, זה הכוח שלהם. ומי ששמה על עצמה כל כך הרבה שמות רוצה שיקראו אותה כמו שלט. בעיניי זה קצת עצוב. אבל אני בת חמישים ושתיים עם סנדלים, אז מה אני מבינה. (המראיינת: למה עצוב?) כי זה אומר שהיא לא בטוחה שיראו אותה בלי השלט.</w:t>
+        <w:t xml:space="preserve">השמות. על החולצה כתוב מותג. על התיק יש סמלים. על המשקפיים. אני יודעת שאלה מותגים יקרים בלי להתעניין, כי כולם יודעים, זה הכוח שלהם, הם הצליחו להגיע גם אליי. ומי ששמה על עצמה כל כך הרבה שמות רוצה שיקראו אותה כמו שלט. בעיניי זה קצת עצוב. אבל אני בת חמישים ושתיים עם סנדלים, אז מה אני מבינה. (המראיינת: למה עצוב?) כי זה אומר שהיא לא בטוחה שיראו אותה בלי השלט. ואני רואה את זה אצל תלמידות, בנות חמש עשרה, שבלי הדבר הנכון על הגוף מרגישות שהן שקופות. ואני אומרת להן שהן לא שקופות. והן לא מאמינות לי, כי אני עם הסנדלים. אז אולי אני לא האדם הנכון להגיד את זה.</w:t>
       </w:r>
     </w:p>
     <w:p>
@@ -4181,7 +4181,7 @@
           <w:szCs w:val="24"/>
           <w:rtl/>
         </w:rPr>
-        <w:t xml:space="preserve">הנה, זאת אני מבינה. היא נראית נעימה. רגועה. מסודרת בלי להתאמץ. ואני לא רואה בה שום דבר מיוחד בבגדים, היא הכי נורמלית מכל הארבעה עד עכשיו. סוודר, מכנסיים, מעיל. היא נראית כמו קולגה שלי, כמו המנהלת שלנו, כמו מישהי שאני פוגשת בהשתלמות ומתיישבת לידה. אם הייתי רואה אותה ברחוב לא הייתי מסתכלת פעמיים. וזה, אצלי, מחמאה.</w:t>
+        <w:t xml:space="preserve">הנה, זאת אני מבינה. היא נראית נעימה. רגועה. מסודרת בלי להתאמץ. ואני לא רואה בה שום דבר מיוחד בבגדים, היא הכי נורמלית מכל הארבעה עד עכשיו. סוודר, מכנסיים, מעיל. היא נראית כמו קולגה שלי, כמו המנהלת שלנו, כמו מישהי שאני פוגשת בהשתלמות ומתיישבת לידה כי היא נראית כמו מישהי שלא תדבר כל ההרצאה. אם הייתי רואה אותה ברחוב לא הייתי מסתכלת פעמיים. וזה, אצלי, מחמאה. הדבר הכי טוב שאפשר להגיד על מישהו, לדעתי, זה שהוא לא מפריע לך לראות אותו. היא לא מפריעה. היא פשוט שם. ואני סומכת על אנשים כאלה יותר, אני יודעת שזה לא הוגן.</w:t>
       </w:r>
     </w:p>
     <w:p>
@@ -4241,7 +4241,7 @@
           <w:szCs w:val="24"/>
           <w:rtl/>
         </w:rPr>
-        <w:t xml:space="preserve">מורה. מנהלת בית ספר. עובדת סוציאלית בכירה. אולי רופאה. מישהי עם מקצוע, שמתלבשת לעבודה, ושאנשים מכבדים אותה בעבודה. אולי מרצה. היא נראית כמו מישהי שעובדת עם אנשים.</w:t>
+        <w:t xml:space="preserve">מורה. מנהלת בית ספר. עובדת סוציאלית בכירה. אולי רופאה, רופאת משפחה. מישהי עם מקצוע, שמתלבשת לעבודה, ושאנשים מכבדים אותה בעבודה בגלל מה שהיא עושה. אולי מרצה. היא נראית כמו מישהי שעובדת עם אנשים, לא עם מספרים ולא עם מכונות. ואם היא מנהלת בית ספר, אז היא מנהלת טובה, כזאת שהמורים לא מפחדים ממנה אבל גם לא מזלזלים. אני מכירה שתיים כאלה. שתיהן נראות ככה. סוודר, מכנסיים, שיער אסוף, וכולם מקשיבים.</w:t>
       </w:r>
     </w:p>
     <w:p>
@@ -4301,7 +4301,7 @@
           <w:szCs w:val="24"/>
           <w:rtl/>
         </w:rPr>
-        <w:t xml:space="preserve">בינוני-גבוה. משכילה, מסודרת, לא עשירה במיוחד ולא ענייה. אני לא רואה עליה שום דבר שאומר "כסף גדול". היא נראית כמוני, רק יותר מסודרת ועם מעיל יותר יפה. מעמד של אנשי מקצוע, לא של עשירים. ואם תגידי לי אחר כך שהיא מיליונרית, אני אתפלא. באמת אתפלא.</w:t>
+        <w:t xml:space="preserve">בינוני-גבוה. משכילה, מסודרת, לא עשירה במיוחד ולא ענייה. אני לא רואה עליה שום דבר שאומר "כסף גדול". היא נראית כמוני, רק יותר מסודרת ועם מעיל יותר יפה. מעמד של אנשי מקצוע, לא של עשירים. ואם תגידי לי אחר כך שהיא מיליונרית, אני אתפלא. באמת אתפלא. כי מיליונריות, בעיניי, נראות אחרת, הן נראות כמו משהו שאני רואה בטלוויזיה, עם תכשיטים ושיער עשוי. היא נראית כמו מישהי שקמה בשש ומכינה סנדוויצ'ים. ואולי זה בדיוק מה שאני לא מבינה. שיש עשירות שקמות בשש. אני לא מכירה כאלה. אני מכירה מורות.</w:t>
       </w:r>
     </w:p>
     <w:p>
@@ -4361,7 +4361,7 @@
           <w:szCs w:val="24"/>
           <w:rtl/>
         </w:rPr>
-        <w:t xml:space="preserve">הפשטות. אין שום דבר שצועק, אין שמות, אין זהב, אין צבעים. הבגדים נראים נוחים, ואני חושבת על אדם נוח. ואני מודה, אני לא יודעת להבדיל בין סוודר יקר לסוודר זול, בשבילי סוודר בז' הוא סוודר בז'. אז מה שגרם לי להגיד "בינונית" זה שלא ראיתי שום סימן של עושר. אולי יש סימנים שאני לא יודעת לקרוא. כמו שאני לא יודעת לקרוא סינית. זה לא אומר שאין שם כתוב משהו.</w:t>
+        <w:t xml:space="preserve">הפשטות. אין שום דבר שצועק, אין שמות, אין זהב, אין צבעים. הבגדים נראים נוחים, ואני חושבת על אדם נוח. ואני מודה, אני לא יודעת להבדיל בין סוודר יקר לסוודר זול, בשבילי סוודר בז' הוא סוודר בז', כולם מאותו מקום בקניון. אז מה שגרם לי להגיד "בינונית" זה שלא ראיתי שום סימן של עושר. אולי יש סימנים שאני לא יודעת לקרוא. כמו שאני לא יודעת לקרוא סינית. זה לא אומר שאין שם כתוב משהו. (המראיינת: מה היית צריכה לראות?) לא יודעת. תכשיט? שעון? משהו שמבריק? זה מה שאני יודעת לזהות. ואם העושר שלה הוא בבד, אז אני פשוט לא רואה בדים. אני רואה צורות וצבעים. ואצלה שניהם שקטים, אז קראתי "שקט" כ"רגיל". ואולי "שקט" זה בעצם "לא צריך לדבר איתך".</w:t>
       </w:r>
     </w:p>
     <w:p>
@@ -4440,7 +4440,7 @@
           <w:szCs w:val="24"/>
           <w:rtl/>
         </w:rPr>
-        <w:t xml:space="preserve">גבר נעים, מסודר, בוגר. אבא של תלמיד שבא לאסיפת הורים ויושב בשקט ושואל שאלה טובה אחת. חולצה פשוטה, מכנסיים פשוטים, נעליים. הוא נראה לי כמו מישהו שאפשר לדבר איתו ושהוא מקשיב. מהארבעה הוא הכי "רגיל", ואני מתכוונת לזה בצורה הכי טובה. רגיל זה דבר טוב בעיניי.</w:t>
+        <w:t xml:space="preserve">גבר נעים, מסודר, בוגר. אבא של תלמיד שבא לאסיפת הורים ויושב בשקט ושואל שאלה טובה אחת ואז מודה לי. חולצה פשוטה, מכנסיים פשוטים, נעליים. הוא נראה לי כמו מישהו שאפשר לדבר איתו ושהוא מקשיב. מהארבעה הוא הכי "רגיל", ואני מתכוונת לזה בצורה הכי טובה. רגיל זה דבר טוב בעיניי, אולי כי אני רואה כל יום כל כך הרבה ילדים שמתאמצים להיות לא רגילים. והוא נראה כמו מישהו שהפסיק להתאמץ לפני עשרים שנה, והרוויח מזה שקט. וזה מה שאני מאחלת לתלמידים שלי. לא שיהיה להם שעון, שיהיה להם את השקט הזה.</w:t>
       </w:r>
     </w:p>
     <w:p>
@@ -4500,7 +4500,7 @@
           <w:szCs w:val="24"/>
           <w:rtl/>
         </w:rPr>
-        <w:t xml:space="preserve">מהנדס. רופא. מנהל במפעל, יש פה הרבה כאלה, מהמפעלים בעמק. איש עסקים, אבל מהשקטים. עורך דין אולי. מישהו שלמד, ועובד הרבה שנים באותו מקום, וחוזר הביתה בשש.</w:t>
+        <w:t xml:space="preserve">מהנדס. רופא. מנהל במפעל, יש פה הרבה כאלה, מהמפעלים בעמק, מגיעים לאסיפות הורים בדיוק ככה. איש עסקים, אבל מהשקטים. עורך דין אולי, אבל לא מהסוג שבטלוויזיה. מישהו שלמד, ועובד הרבה שנים באותו מקום, וחוזר הביתה בשש, ויש לו תחביב, ריצה, אופניים, משהו. ואני רואה אותו גם בעמדת כיבוד בטקס של בית הספר, עוזר, בלי שביקשו. יש כאלה. בדרך כלל זה האבות שנראים ככה.</w:t>
       </w:r>
     </w:p>
     <w:p>
@@ -4560,7 +4560,7 @@
           <w:szCs w:val="24"/>
           <w:rtl/>
         </w:rPr>
-        <w:t xml:space="preserve">בינוני-גבוה. כמו האישה הקודמת. מסודר, בטוח, לא נראה לי עשיר במיוחד. מעמד של אנשים עם מקצוע טוב שחיים בנוחות. לא בפסגה, רחוק מהתחתית. הוא נראה כמו רוב האבות בטבעון, האמת. כמו בעלי, בערך, רק עם חולצה מגוהצת יותר.</w:t>
+        <w:t xml:space="preserve">בינוני-גבוה. כמו האישה הקודמת. מסודר, בטוח, לא נראה לי עשיר במיוחד. מעמד של אנשים עם מקצוע טוב שחיים בנוחות. לא בפסגה, רחוק מהתחתית. הוא נראה כמו רוב האבות בטבעון, האמת. כמו בעלי, בערך, רק עם חולצה מגוהצת יותר, ובעלי לא מגהץ, אני לא מגהצת, אז אולי זה ההבדל. ושוב, אם תגידי לי שהוא מיליונר, אתפלא. פחות מאשר אצלה, כי אצל גברים אני יודעת פחות מה לחפש. אבל אתפלא.</w:t>
       </w:r>
     </w:p>
     <w:p>
@@ -4620,7 +4620,7 @@
           <w:szCs w:val="24"/>
           <w:rtl/>
         </w:rPr>
-        <w:t xml:space="preserve">שאין שום דבר. שום סימן. אין לוגו, אין שעון בולט, הבגדים הם בגדים ולא הצהרה. ובשבילי זה אדם שלא עסוק במה חושבים עליו, ואנשים כאלה הם בדרך כלל אנשים עובדים ומסודרים. ושוב, אולי הנעליים שלו עולות אלפים, ואני לא רואה, ואני חושבת שרוב האנשים לא רואים, ואולי זה בדיוק העניין ואני לא מבינה אותו.</w:t>
+        <w:t xml:space="preserve">שאין שום דבר. שום סימן. אין לוגו, אין שעון בולט, הבגדים הם בגדים ולא הצהרה. ובשבילי זה אדם שלא עסוק במה חושבים עליו, ואנשים כאלה הם בדרך כלל אנשים עובדים ומסודרים. ושוב, אולי הנעליים שלו עולות אלפים, ואני לא רואה, ואני חושבת שרוב האנשים לא רואים, ואולי זה בדיוק העניין ואני לא מבינה אותו. יש משהו שאני כן רואה: הוא לבוש מתאים לגיל שלו. הבחור בתמונה אחת לבוש כמו בן עשרים כשהוא בן שלושים. הוא לבוש כמו בן ארבעים וחמש כשהוא בן ארבעים וחמש. וזה, אצלי, סימן של אדם שמסתדר עם עצמו. אולי זה מה שקראתי כ"מעמד". לא כסף. שלום עם הגיל.</w:t>
       </w:r>
     </w:p>
     <w:p>
@@ -4699,7 +4699,7 @@
           <w:szCs w:val="24"/>
           <w:rtl/>
         </w:rPr>
-        <w:t xml:space="preserve">זה קשה לי, כי אני לא רואה פערים גדולים. אני אסדר... ארבע, שלוש, אחת, שתיים. אבל רגע, הסתייגות: את שני הראשונים שמתי גבוה כי הם נראים לי מסודרים ומכובדים, לא כי הם נראים לי עשירים. את הבחור בטרנינג שלישי כי יש לו כנראה כסף אבל לא... לא מעמד, אם אפשר להפריד ביניהם, ואני חושבת שאפשר. והבחורה אחרונה כי היא נראית לי הכי צעירה והכי לא מגובשת. ואם תשאלי רק על כסף, רק כסף, אז אולי הסדר הפוך: הבחור בטרנינג ראשון, כי הוא היחיד שאני רואה עליו כסף, והשניים השקטים אחרונים. אז מה דירגתי? נראה לי שדירגתי מי הייתי רוצה שילמד את הילדים שלי.</w:t>
+        <w:t xml:space="preserve">זה קשה לי, כי אני לא רואה פערים גדולים. אני אסדר... ארבע, שלוש, אחת, שתיים. אבל רגע, הסתייגות: את שני הראשונים שמתי גבוה כי הם נראים לי מסודרים ומכובדים, לא כי הם נראים לי עשירים. את הבחור בטרנינג שלישי כי יש לו כנראה כסף אבל לא... לא מעמד, אם אפשר להפריד ביניהם, ואני חושבת שאפשר, אני רואה את זה כל יום בבית ספר, יש ילדים עם כסף ובלי מעמד ויש הפוך. והבחורה אחרונה כי היא נראית לי הכי צעירה והכי לא מגובשת. ואם תשאלי רק על כסף, רק כסף, אז אולי הסדר הפוך: הבחור בטרנינג ראשון, כי הוא היחיד שאני רואה עליו כסף, והשניים השקטים אחרונים. אז מה דירגתי? נראה לי שדירגתי מי הייתי רוצה שילמד את הילדים שלי. או מי הייתי רוצה לשבת לידו בחדר מורים. זה לא מעמד. זה... נוחות. דירגתי לפי מי נוח לי. ואני לא בטוחה שזה מה שביקשת. אבל זה מה שיצא.</w:t>
       </w:r>
     </w:p>
     <w:p>
@@ -4759,7 +4759,7 @@
           <w:szCs w:val="24"/>
           <w:rtl/>
         </w:rPr>
-        <w:t xml:space="preserve">מי שמנסה להיראות עשיר, שניים הראשונים, בלי ספק, הם לובשים את הכסף. מי שנראה עשיר בלי להתאמץ... האמת? אף אחד. השניים השקטים לא נראים לי עשירים בכלל. הם נראים לי מסודרים. ואולי זה ההבדל ביני לבין הבנות שלי, שהיו רואות פה משהו אחר. בשבילי "עשיר" זה משהו שרואים, ואם לא רואים, זה לא שם. אז יש פה שניים שמנסים ומצליחים להיראות עשירים, ושניים שלא מנסים ולא נראים. ואני, אם תשאלי, מעדיפה את אלה שלא נראים. אבל זה לא מה ששאלת.</w:t>
+        <w:t xml:space="preserve">מי שמנסה להיראות עשיר, שניים הראשונים, בלי ספק, הם לובשים את הכסף, הם כתבו אותו על עצמם. מי שנראה עשיר בלי להתאמץ... האמת? אף אחד. השניים השקטים לא נראים לי עשירים בכלל. הם נראים לי מסודרים. ואולי זה ההבדל ביני לבין הבנות שלי, שהיו רואות פה משהו אחר, הבת הגדולה שלי הייתה מזהה את הסוודר, אני בטוחה. בשבילי "עשיר" זה משהו שרואים, ואם לא רואים, זה לא שם. אז יש פה שניים שמנסים ומצליחים להיראות עשירים, ושניים שלא מנסים ולא נראים. ואני, אם תשאלי, מעדיפה את אלה שלא נראים. אבל זה לא מה ששאלת. (המראיינת: ומה אם השקטים באמת עשירים?) אז הם הצליחו להסתיר את זה ממני. וזה או צניעות או התנשאות, ואני לא יודעת איזה. צניעות זה אם הם לא רוצים שאף אחד יידע. התנשאות זה אם הם רוצים שרק מסוימים יידעו. ומהתמונה אי אפשר לדעת.</w:t>
       </w:r>
     </w:p>
     <w:p>
@@ -4819,7 +4819,7 @@
           <w:szCs w:val="24"/>
           <w:rtl/>
         </w:rPr>
-        <w:t xml:space="preserve">הגבר. לעבוד וגם להיות חברה. הוא נראה כמו מישהו שאפשר לסמוך עליו, שלא ייקח את עצמו ברצינות יתר, שיצחק על עצמו. האישה גם, היא נראית כמו חברה טובה, כזאת שיושבים איתה על קפה ומדברים על ספר. השניים הראשונים, פחות. לא כי הם אנשים רעים, אני לא יודעת עליהם כלום, אלא כי אני מרגישה שלא היה לנו על מה לדבר. ויכול להיות שאני טועה לגמרי. בטח שאני טועה. זה תמונה של בן אדם בבגדים, לא בן אדם.</w:t>
+        <w:t xml:space="preserve">הגבר. לעבוד וגם להיות חברה. הוא נראה כמו מישהו שאפשר לסמוך עליו, שלא ייקח את עצמו ברצינות יתר, שיצחק על עצמו, שיבוא לעזור להזיז שולחנות. האישה גם, היא נראית כמו חברה טובה, כזאת שיושבים איתה על קפה ומדברים על ספר, ושלא תסתכל על הסנדלים שלי. השניים הראשונים, פחות. לא כי הם אנשים רעים, אני לא יודעת עליהם כלום, אלא כי אני מרגישה שלא היה לנו על מה לדבר, שהם היו מסתכלים על הסנדלים. ויכול להיות שאני טועה לגמרי. בטח שאני טועה. זה תמונה של בן אדם בבגדים, לא בן אדם. ואני מלמדת ספרות, אני אמורה לדעת שהדמות היא לא הבגדים שלה. ובכל זאת. יושבת פה ועושה בדיוק את מה שאני אומרת לתלמידים לא לעשות.</w:t>
       </w:r>
     </w:p>
     <w:p>
@@ -4917,7 +4917,7 @@
           <w:szCs w:val="24"/>
           <w:rtl/>
         </w:rPr>
-        <w:t xml:space="preserve">כן. זה מפתיע אותי, די הרבה. חשבתי שהסוודר הוא סוודר רגיל והחולצה היא חולצה רגילה. אם הם עולים אלפים, אז לא ראיתי את זה בכלל, ומה שאמרתי, "בינוני", היה פשוט טעות. ובעיקר זה משנה לי משהו על עצמי: הבנתי שאני רואה רק את העושר שצועק, ויש עושר שמדבר בשפה שאני לא יודעת. ואז אני חושבת על האנשים האלה: הם מתלבשים כך שאנשים כמוני לא יראו, ורק אנשים כמוהם יראו. זה... זה קצת מטריד אותי, האמת, יותר מהלוגו. הלוגו לפחות מדבר איתי. זה מדבר מעל הראש שלי. (המראיינת: מטריד איך?) כאילו יש מועדון, ולא ידעתי שהוא קיים, ועכשיו אני יודעת שלא אני בו.</w:t>
+        <w:t xml:space="preserve">כן. זה מפתיע אותי, די הרבה. חשבתי שהסוודר הוא סוודר רגיל והחולצה היא חולצה רגילה. אם הם עולים אלפים, אז לא ראיתי את זה בכלל, ומה שאמרתי, "בינוני", היה פשוט טעות. טעות של קריאה. ובעיקר זה משנה לי משהו על עצמי: הבנתי שאני רואה רק את העושר שצועק, ויש עושר שמדבר בשפה שאני לא יודעת. ואז אני חושבת על האנשים האלה: הם מתלבשים כך שאנשים כמוני לא יראו, ורק אנשים כמוהם יראו. זה... זה קצת מטריד אותי, האמת, יותר מהלוגו. הלוגו לפחות מדבר איתי. זה מדבר מעל הראש שלי. (המראיינת: מטריד איך?) כאילו יש מועדון, ולא ידעתי שהוא קיים, ועכשיו אני יודעת שלא אני בו. ושכל הזמן שהסתכלתי עליהם ואמרתי "נחמדים, מסודרים, כמוני", הם היו... לא כמוני. בכלל לא. והם ידעו, ואני לא. וזה מרגיש קצת כמו להיות בבדיחה שלא הבנת.</w:t>
       </w:r>
     </w:p>
     <w:p>
@@ -4977,7 +4977,7 @@
           <w:szCs w:val="24"/>
           <w:rtl/>
         </w:rPr>
-        <w:t xml:space="preserve">"למה". זה מה שעובר. ואז אני חושבת על התלמידים. אצלנו הלוגו זה עניין רציני, ילדים נמדדים לפי זה, ויש הורים שקונים לילד דברים שהם לא יכולים להרשות לעצמם כדי שהילד לא ייפגע, ואני יודעת, כי הם אומרים לי את זה באסיפות. אז כשאני רואה לוגו גדול אני לא חושבת "עשיר". אני חושבת "מישהו אמר לו שככה מכבדים אותו". וזה עושה לי עצב. ואני גם יודעת שאני מבוגרת, ושאולי זה לא העניין שלי לשפוט, ושאולי הבחור בטרנינג מאושר יותר ממני. אבל שאלת מה עובר, וזה מה שעובר.</w:t>
+        <w:t xml:space="preserve">"למה". זה מה שעובר. ואז אני חושבת על התלמידים. אצלנו הלוגו זה עניין רציני, ילדים נמדדים לפי זה, ויש הורים שקונים לילד דברים שהם לא יכולים להרשות לעצמם כדי שהילד לא ייפגע, ואני יודעת, כי הם אומרים לי את זה באסיפות, אמא אחת בכתה לי על נעליים של אלף שקל. אז כשאני רואה לוגו גדול אני לא חושבת "עשיר". אני חושבת "מישהו אמר לו שככה מכבדים אותו". וזה עושה לי עצב. ואני גם יודעת שאני מבוגרת, ושאולי זה לא העניין שלי לשפוט, ושאולי הבחור בטרנינג מאושר יותר ממני, ואולי אמא שלו גאה בו כשהוא נכנס הביתה ככה. אבל שאלת מה עובר, וזה מה שעובר. ועכשיו, אחרי מה שגיליתי על השקטים, עובר לי עוד משהו: שלפחות הוא לא מסתיר. שלפחות הוא אומר מה הוא רוצה. השקטים מסתירים ממני. הוא לא. ואולי זה שווה משהו.</w:t>
       </w:r>
     </w:p>
     <w:p>
@@ -5037,7 +5037,7 @@
           <w:szCs w:val="24"/>
           <w:rtl/>
         </w:rPr>
-        <w:t xml:space="preserve">רק מה שאמרתי, שהראיון הזה לימד אותי שאני קוראת חצי שפה. ושאולי כדאי שאלמד את החצי השני, לא בשביל לקנות, בשביל להבין את מי שלובש. בעיקר את התלמידים. ועוד משהו למחקר: גיל. אני בטוחה שבחורה בת עשרים וחמש הייתה עונה לך הפוך ממני על השניים השקטים, שהייתה רואה בהם עושר מיד. ואני לא יודעת מי מאיתנו צודקת. אולי שתינו. אולי זאת בדיוק הנקודה.</w:t>
+        <w:t xml:space="preserve">רק מה שאמרתי, שהראיון הזה לימד אותי שאני קוראת חצי שפה. ושאולי כדאי שאלמד את החצי השני, לא בשביל לקנות, בשביל להבין את מי שלובש. בעיקר את התלמידים. ואת ההורים שלהם, שבאים לאסיפות, ושאני כנראה גם דירגתי בלי לדעת. ועוד משהו למחקר: גיל. אני בטוחה שבחורה בת עשרים וחמש הייתה עונה לך הפוך ממני על השניים השקטים, שהייתה רואה בהם עושר מיד. ואני לא יודעת מי מאיתנו צודקת. אולי שתינו. אולי זאת בדיוק הנקודה, שהבגדים אומרים דבר אחר לכל מי שמסתכל, ושאין שום דבר "שם" חוץ ממה שאנחנו שמים. זה, אגב, מה שאני מלמדת על שירה. לא חשבתי שזה נכון גם על סוודרים.</w:t>
       </w:r>
     </w:p>
     <w:p>
@@ -5093,7 +5093,7 @@
           <w:szCs w:val="24"/>
           <w:rtl/>
         </w:rPr>
-        <w:t xml:space="preserve">תאריך: 6.10.2026    משך: 22 דקות    מקום: בית קפה בשכונת הדר, חיפה, בהפסקה בין משמרות    הקלטה: בטלפון, בהסכמה</w:t>
+        <w:t xml:space="preserve">תאריך: 6.10.2026    משך: 27 דקות    מקום: בית קפה בשכונת הדר, חיפה, בהפסקה בין משמרות    הקלטה: בטלפון, בהסכמה</w:t>
       </w:r>
     </w:p>
     <w:p>
@@ -5172,7 +5172,7 @@
           <w:szCs w:val="24"/>
           <w:rtl/>
         </w:rPr>
-        <w:t xml:space="preserve">בת שלושים. אחות במחלקה פנימית בבית חולים בחיפה, שש שנים. גרה בהדר עם אחותי, שלומדת בטכניון. במקור מכפר ליד שפרעם, באתי לחיפה ללימודים ונשארתי, ההורים עדיין שואלים מתי אני חוזרת. רווקה. עובדת במשמרות, אז רוב החיים שלי אני בחלוק, וכשאני לא בחלוק אני מנסה להיראות כמו בן אדם, ולפעמים מצליחה.</w:t>
+        <w:t xml:space="preserve">בת שלושים. אחות במחלקה פנימית בבית חולים בחיפה, שש שנים, לפני זה שנה במחלקה כירורגית, ולפני זה הלימודים, פה בחיפה. גרה בהדר עם אחותי, שלומדת בטכניון, הנדסת חשמל, ואנחנו משלמות שכר דירה שהוא חצי מהמשכורת שלי. במקור מכפר ליד שפרעם, באתי לחיפה ללימודים ונשארתי, ההורים עדיין שואלים מתי אני חוזרת, כל שבת. רווקה. עובדת במשמרות, אז רוב החיים שלי אני בחלוק, וכשאני לא בחלוק אני מנסה להיראות כמו בן אדם, ולפעמים מצליחה, בדרך כלל בימי שישי. ואני אגיד לך מראש משהו: אני חיה בין שני עולמות, הכפר ובית החולים, ובכל אחד מהם הבגדים אומרים משהו אחר, אז יכול להיות שאני אענה לך פעמיים על כל שאלה.</w:t>
       </w:r>
     </w:p>
     <w:p>
@@ -5232,7 +5232,7 @@
           <w:szCs w:val="24"/>
           <w:rtl/>
         </w:rPr>
-        <w:t xml:space="preserve">שלוש. אני אוהבת בגדים, אני קונה, אני מסתכלת, אבל אני לא "בקטע". אין לי זמן ואין לי כסף, ובמחלקה אף אחד לא רואה מה יש מתחת לחלוק. אבל אני כן שמה לב למה אנשים לובשים, זה חלק מהעבודה. מטופל נכנס, ואני רואה אותו לפני שאני יודעת עליו כלום, ומהבגדים אני כבר יודעת דברים. מי יבוא לבקר אותו. אם יש לו למי להתקשר. אז אולי זה יותר משלוש, רק בכיוון אחר.</w:t>
+        <w:t xml:space="preserve">שלוש. אני אוהבת בגדים, אני קונה, אני מסתכלת, אבל אני לא "בקטע". אין לי זמן ואין לי כסף, ובמחלקה אף אחד לא רואה מה יש מתחת לחלוק, אפשר לבוא בפיג'מה. אבל אני כן שמה לב למה אנשים לובשים, זה חלק מהעבודה. מטופל נכנס, ואני רואה אותו לפני שאני יודעת עליו כלום, ומהבגדים אני כבר יודעת דברים. מי יבוא לבקר אותו. אם יש לו למי להתקשר. אם יש לו ביטוח משלים. אם הוא יבין מה אני אומרת לו על התרופות. אז אולי זה יותר משלוש, רק בכיוון אחר. בכפר, אגב, זה חמש. בכפר כולם מסתכלים על כולם, וכל חתונה היא תצוגה, ואני יודעת בדיוק מי קנה מה ואיפה. אז שלוש בחיפה, חמש בבית.</w:t>
       </w:r>
     </w:p>
     <w:p>
@@ -5330,7 +5330,7 @@
           <w:szCs w:val="24"/>
           <w:rtl/>
         </w:rPr>
-        <w:t xml:space="preserve">אה, אותו אני מכירה. לא אותו, אבל כאלה יש בכל מקום, בכפר שלי יש עשרה כאלה. בחור צעיר, מתלהב, רוצה להיראות מצליח, וזה חביב בעיניי, באמת, כי אני מבינה מאיפה זה בא. במקום שהוא בא ממנו, ואני מנחשת שזה מקום כמו שלי, להיראות ככה אומר שהצלחת. אני לא מרגישה ממנו התנשאות. אני מרגישה רצון שיכבדו אותו. וזה דבר אחר לגמרי מהתנשאות, גם אם מבחוץ זה נראה אותו דבר.</w:t>
+        <w:t xml:space="preserve">אה, אותו אני מכירה. לא אותו, אבל כאלה יש בכל מקום, בכפר שלי יש עשרה כאלה, בן דוד שלי הוא כזה. בחור צעיר, מתלהב, רוצה להיראות מצליח, וזה חביב בעיניי, באמת, כי אני מבינה מאיפה זה בא. במקום שהוא בא ממנו, ואני מנחשת שזה מקום כמו שלי, להיראות ככה אומר שהצלחת, ושהמשפחה הצליחה, ושאפשר להפסיק לדאוג. אני לא מרגישה ממנו התנשאות. אני מרגישה ממנו רצון שיכבדו אותו. וזה דבר אחר לגמרי מהתנשאות, גם אם מבחוץ זה נראה אותו דבר. (המראיינת: איך את רואה את ההבדל?) בעיניים. מי שמתנשא לא מסתכל עלייך. הוא מסתכל ישר למצלמה, ומחכה שתסתכלי. זה בקשה, לא דחייה.</w:t>
       </w:r>
     </w:p>
     <w:p>
@@ -5390,7 +5390,7 @@
           <w:szCs w:val="24"/>
           <w:rtl/>
         </w:rPr>
-        <w:t xml:space="preserve">עצמאי. עסק משלו או של המשפחה. בניין, רכב, סחורה, משהו. אצלנו הבחורים שמצליחים מתלבשים בדיוק ככה, כי זה הסימן שהצלחת, כמו רכב חדש. יכול להיות גם ספורטאי. לא עובד בשכר אצל מישהו, זה בטוח. מי שעובד אצל מישהו לא לובש ככה, כי הבוס יסתכל.</w:t>
+        <w:t xml:space="preserve">עצמאי. עסק משלו או של המשפחה. בניין, רכב, סחורה, משהו. אצלנו הבחורים שמצליחים מתלבשים בדיוק ככה, כי זה הסימן שהצלחת, כמו רכב חדש, כמו קומה נוספת על הבית. יכול להיות גם ספורטאי. לא עובד בשכר אצל מישהו, זה בטוח. מי שעובד אצל מישהו לא לובש ככה, כי הבוס יסתכל וישאל מאיפה. ובן דוד שלי, שנראה ככה, יש לו מוסך, ומרוויח יותר ממני פי שלושה, ואף פעם לא למד, ואמא שלו הכי גאה בו מכל המשפחה. אז "מה הוא עושה בחיים" זה אולי: הוא מפרנס. וזה הרבה.</w:t>
       </w:r>
     </w:p>
     <w:p>
@@ -5450,7 +5450,7 @@
           <w:szCs w:val="24"/>
           <w:rtl/>
         </w:rPr>
-        <w:t xml:space="preserve">כלכלית, יש לו, או שהוא מראה שיש לו, ואצלנו זה לפעמים אותו דבר. יש בחורים בכפר עם שעון זהב וחובות. חברתית... איך להגיד את זה בלי שזה יישמע רע. הוא ממקום שבו העושר חדש, ושהיה בו מחסור, ועכשיו רוצים שזה ייראה. ואני לא אשפוט אותו, כי אני מבינה את הצורך הזה מבפנים. אבא שלי קנה את המרצדס הראשונה שלו ונסע איתה שלוש פעמים ברחוב הראשי לפני שחנה. אותו דבר.</w:t>
+        <w:t xml:space="preserve">כלכלית, יש לו, או שהוא מראה שיש לו, ואצלנו זה לפעמים אותו דבר. יש בחורים בכפר עם שעון זהב וחובות, וכולם יודעים, ובכל זאת השעון חשוב, כי החובות לא רואים והשעון כן. חברתית... איך להגיד את זה בלי שזה יישמע רע. הוא ממקום שבו העושר חדש, ושהיה בו מחסור, ועכשיו רוצים שזה ייראה. ואני לא אשפוט אותו, כי אני מבינה את הצורך הזה מבפנים. אבא שלי קנה את המרצדס הראשונה שלו, משומשת, ונסע איתה שלוש פעמים ברחוב הראשי לפני שחנה. אותו דבר. ובחיפה, בבית החולים, המעמד של הבחור הזה יורד. ממש. אותו אדם, אותם בגדים, בכפר הוא בפסגה ובמחלקה הוא "אחד כזה". ואני, שעברתי בין שני המקומות, רואה את הנפילה שלו בין שני העולמות ולא יודעת איזה מהם צודק.</w:t>
       </w:r>
     </w:p>
     <w:p>
@@ -5510,7 +5510,7 @@
           <w:szCs w:val="24"/>
           <w:rtl/>
         </w:rPr>
-        <w:t xml:space="preserve">הלוגו הגדול, השעון הזהב, ובעיקר שהכול ביחד. אבל יש גם משהו שאולי לא שמים לב אליו: הבגדים חדשים לגמרי. כאילו קנה אתמול. אצל מי שיש לו כסף הרבה זמן הבגדים נראים "חיים", קצת מקומטים, קצת משומשים. פה הכול מבריק, עם הקפלים מהקופסה. וזה אומר לי שהוא בתחילת הדרך של להיות עשיר, ובתחילת הדרך מראים. אחר כך, אולי, מפסיקים.</w:t>
+        <w:t xml:space="preserve">הלוגו הגדול, השעון הזהב, ובעיקר שהכול ביחד. אבל יש גם משהו שאולי לא שמים לב אליו: הבגדים חדשים לגמרי. כאילו קנה אתמול. אצל מי שיש לו כסף הרבה זמן הבגדים נראים "חיים", קצת מקומטים, קצת משומשים, לא אכפת לו. פה הכול מבריק, עם הקפלים מהקופסה, הנעליים בלי אבק. וזה אומר לי שהוא בתחילת הדרך של להיות עשיר, ובתחילת הדרך מראים. אחר כך, אולי, מפסיקים. או לא. אבא שלי לא הפסיק. (המראיינת: עוד משהו?) הפאוץ'. בכפר, פאוץ' כזה זה הפריט שהכי מדברים עליו, כי הוא קטן ויקר ועובר מיד ליד בחתונה, "תראה מה הוא קנה". זה הפריט שנועד לשיחה. הוא קנה נושא לשיחה.</w:t>
       </w:r>
     </w:p>
     <w:p>
@@ -5589,7 +5589,7 @@
           <w:szCs w:val="24"/>
           <w:rtl/>
         </w:rPr>
-        <w:t xml:space="preserve">יפה מאוד. מטופחת. מושקעת בכל פרט, הציפורניים, הריסים, השיער. היא נראית לי כמו מישהי שהלוק הוא חלק מהעבודה שלה, או חלק מהזהות. היא לא שטחית בעיניי, היא נראית כמו מישהי שגדלה בעולם שבו ככה נראות ונקודה. יש לי בנות דודות ככה. שתיים. אני אוהבת אותן, ואני לא מבינה איך הן מחזיקות ציפורניים כאלה.</w:t>
+        <w:t xml:space="preserve">יפה מאוד. מטופחת. מושקעת בכל פרט, הציפורניים, הריסים, השיער, הגבות. היא נראית לי כמו מישהי שהלוק הוא חלק מהעבודה שלה, או חלק מהזהות. היא לא שטחית בעיניי, היא נראית כמו מישהי שגדלה בעולם שבו ככה נראות ונקודה, ולא נראות ככה זה מוזר. יש לי בנות דודות ככה. שתיים. אני אוהבת אותן, ואני לא מבינה איך הן מחזיקות ציפורניים כאלה, ואני לא מבינה איך הן קמות שעה לפני כולם בשביל השיער, וגם הן לא מבינות איך אני יוצאת מהבית בלי איפור. אז אנחנו לא מבינות אחת את השנייה, ואוהבות. וזאת היא, בתמונה. בת דודה.</w:t>
       </w:r>
     </w:p>
     <w:p>
@@ -5649,7 +5649,7 @@
           <w:szCs w:val="24"/>
           <w:rtl/>
         </w:rPr>
-        <w:t xml:space="preserve">יופי. קוסמטיקה, איפור, ציפורניים, לקים. או מוכרת בחנות יוקרתית. או מאורסת ומתכוננת לחתונה, זה גם לוק כזה אצלנו, כלה לעתיד, כל פריט מתנה מהחתן. בבית חולים לא, לא כי היא לא יכולה, אלא כי הלוק הזה לא שורד משמרת לילה אחת.</w:t>
+        <w:t xml:space="preserve">יופי. קוסמטיקה, איפור, ציפורניים, לקים. או מוכרת בחנות יוקרתית. או מאורסת ומתכוננת לחתונה, זה גם לוק כזה אצלנו, כלה לעתיד, כל פריט מתנה מהחתן, והתיק הזה הוא בדיוק מתנת אירוסין, כולן מקבלות אותו, זה כמעט חוק. בבית חולים לא, לא כי היא לא יכולה, אלא כי הלוק הזה לא שורד משמרת לילה אחת. או שאולי היא כן אחות, ביום שישי. יש לי קולגה שבמשמרת היא בלי כלום ובשישי היא בדיוק ככה, ואף אחד במחלקה לא יזהה אותה ברחוב. אז הלוק לא אומר לי מה היא עושה. הוא אומר לי איך היא רוצה שיראו אותה ביום שלא עובדים.</w:t>
       </w:r>
     </w:p>
     <w:p>
@@ -5709,7 +5709,7 @@
           <w:szCs w:val="24"/>
           <w:rtl/>
         </w:rPr>
-        <w:t xml:space="preserve">כלכלית, אני לא יודעת אם הכסף שלה, ואני מניחה שלא, בגלל הגיל. חברתית, בינוני. משפחה שמשקיעה בבת. אצלנו, בת שנראית ככה היא בת שהמשפחה רוצה שתיראה טוב, והתיק הוא לפעמים מאבא ולפעמים מהארוס. זה לא אומר שהמשפחה עשירה. זה אומר שהמשפחה רוצה שידעו שהיא מסודרת. ההבדל דק, ואצלנו הוא חשוב.</w:t>
+        <w:t xml:space="preserve">כלכלית, אני לא יודעת אם הכסף שלה, ואני מניחה שלא, בגלל הגיל, ובגלל הניסיון שלי. חברתית, בינוני. משפחה שמשקיעה בבת. אצלנו, בת שנראית ככה היא בת שהמשפחה רוצה שתיראה טוב, והתיק הוא לפעמים מאבא ולפעמים מהארוס. זה לא אומר שהמשפחה עשירה. זה אומר שהמשפחה רוצה שידעו שהיא מסודרת. ההבדל דק, ואצלנו הוא חשוב, כי בת שנראית מסודרת מביאה כבוד למשפחה, ומביאה שידוך טוב, ואלה דברים ששווים יותר מהתיק. אז התיק הוא השקעה. לא שלה. של המשפחה. ואני לא בטוחה שהיא יודעת את זה, ואם היא יודעת, אולי זה בסדר מבחינתה.</w:t>
       </w:r>
     </w:p>
     <w:p>
@@ -5769,7 +5769,7 @@
           <w:szCs w:val="24"/>
           <w:rtl/>
         </w:rPr>
-        <w:t xml:space="preserve">התיק. קודם כול. זה התיק שכולן רוצות, ורואים אותו בכל חתונה, שלוש ארבע כאלה בשולחן. והחולצה עם השם. והמשקפיים. והציפורניים, שזה לא בגד, אבל זה אומר הכי הרבה: עם ציפורניים כאלה אי אפשר לעבוד בידיים, אי אפשר לחבר עירוי, אי אפשר לבשל. אז היא לא עובדת בידיים. וזה מה שנתן לי את הרושם: לוק שנועד להיראות, לא לעבוד. והיא בחרה את זה, וזה בסדר.</w:t>
+        <w:t xml:space="preserve">התיק. קודם כול. זה התיק שכולן רוצות, ורואים אותו בכל חתונה, שלוש ארבע כאלה בשולחן, וכולן יודעות מי קנה ומי קיבלה. והחולצה עם השם. והמשקפיים. והציפורניים, שזה לא בגד, אבל זה אומר הכי הרבה: עם ציפורניים כאלה אי אפשר לעבוד בידיים, אי אפשר לחבר עירוי, אי אפשר לבשל, אי אפשר להחליף חיתול. אז היא לא עובדת בידיים. וזה מה שנתן לי את הרושם: לוק שנועד להיראות, לא לעבוד. והיא בחרה את זה, וזה בסדר. אני בחרתי ידיים בלי ציפורניים, והיא בחרה ציפורניים בלי עבודת ידיים, ושתינו שילמנו על זה משהו. היא שילמה בזה שאנשים כמוני חושבים שהיא לא עובדת. אני שילמתי בזה שאנשים כמוה חושבים שאני לא מטופחת.</w:t>
       </w:r>
     </w:p>
     <w:p>
@@ -5848,7 +5848,7 @@
           <w:szCs w:val="24"/>
           <w:rtl/>
         </w:rPr>
-        <w:t xml:space="preserve">יפה אחרת. שקטה. היא נראית חכמה ובטוחה, כזאת שלא צריכה את המבט של אף אחד. ואני אגיד לך בדיוק מה עלה לי: רופאה בכירה במחלקה. יש לנו שתיים כאלה, שמגיעות בבוקר בדיוק ככה, סוודר פשוט, מכנסיים שחורים, שיער אסוף, ולא צריכות להגיד כלום כדי שכולם יידעו מי מנהל. אני רואה אותן ואני יודעת שהיום יהיה מסודר.</w:t>
+        <w:t xml:space="preserve">יפה אחרת. שקטה. היא נראית חכמה ובטוחה, כזאת שלא צריכה את המבט של אף אחד, ואם מסתכלים עליה זה בסדר ואם לא זה בסדר. ואני אגיד לך בדיוק מה עלה לי: רופאה בכירה במחלקה. יש לנו שתיים כאלה, שמגיעות בבוקר בדיוק ככה, סוודר פשוט, מכנסיים שחורים, שיער אסוף, ולא צריכות להגיד כלום כדי שכולם יידעו מי מנהל. אני רואה אותן ואני יודעת שהיום יהיה מסודר. ויש משהו שרק עכשיו אני שמה לב אליו: היא הראשונה מהשלוש שאני מסתכלת לה בפנים ולא על הבגדים. עם השניים הראשונים הסתכלתי על החולצה. איתה אני מסתכלת בעיניים. וזה כנראה בדיוק מה שהבגדים שלה עושים, הם מזיזים את המבט אליה.</w:t>
       </w:r>
     </w:p>
     <w:p>
@@ -5908,7 +5908,7 @@
           <w:szCs w:val="24"/>
           <w:rtl/>
         </w:rPr>
-        <w:t xml:space="preserve">רופאה בכירה, אמרתי. או מנהלת, או עורכת דין, או מרצה. משהו שבו היא הסמכות ולא צריכה להוכיח. אני מדמיינת אותה נכנסת לחדר וכולם משתתקים, בלי שהיא מרימה את הקול. ככה הרופאות הבכירות שלנו. הצעירות מרימות קול. הבכירות לא צריכות.</w:t>
+        <w:t xml:space="preserve">רופאה בכירה, אמרתי. או מנהלת, או עורכת דין, או מרצה. משהו שבו היא הסמכות ולא צריכה להוכיח. אני מדמיינת אותה נכנסת לחדר וכולם משתתקים, בלי שהיא מרימה את הקול. ככה הרופאות הבכירות שלנו. הצעירות מרימות קול. הבכירות לא צריכות. הן אומרות "תעשי ככה" בשקט, ועושים. ואני חושבת שהבגדים שלה הם חלק מזה, שהם אומרים "אני לא צריכה להתאמץ בשבילכם", ושזה עובד על אנשים כמו שזה עובד עליי עכשיו. הייתי עושה מה שהיא אומרת. בלי לשאול.</w:t>
       </w:r>
     </w:p>
     <w:p>
@@ -5968,7 +5968,7 @@
           <w:szCs w:val="24"/>
           <w:rtl/>
         </w:rPr>
-        <w:t xml:space="preserve">גבוה. כלכלית, אני מנחשת גבוה, אבל זה ניחוש, כי אני לא רואה כסף, אני רואה טעם. חברתית, גבוה בטוח: לוק של מישהי שהמעמד שלה בא ממה שהיא עושה, לא ממה שהיא לובשת. ואצלנו, בחברה שלי, יש מעט נשים שנראות ככה. ואלה שכן, זה בדרך כלל נשים שלמדו הרבה שנים ויצאו מהכפר. אז אולי זה גם למה אני מסתכלת עליה ככה. היא מה שאחותי תהיה.</w:t>
+        <w:t xml:space="preserve">גבוה. כלכלית, אני מנחשת גבוה, אבל זה ניחוש, כי אני לא רואה כסף, אני רואה טעם. חברתית, גבוה בטוח: לוק של מישהי שהמעמד שלה בא ממה שהיא עושה, לא ממה שהיא לובשת. ואצלנו, בחברה שלי, יש מעט נשים שנראות ככה. ואלה שכן, זה בדרך כלל נשים שלמדו הרבה שנים ויצאו מהכפר, רופאות, עורכות דין, שחוזרות לחתונות ככה, ושכולן מסתכלות עליהן ולא יודעות מה לחשוב, כי הן לא עם תיק ולא עם זהב ובכל זאת כולם יודעים שהן "הגיעו". אז אולי זה גם למה אני מסתכלת עליה ככה. היא מה שאחותי תהיה, בעוד עשר שנים, עם התואר מהטכניון. ואולי מה שאני רוצה להיות, ולא יודעת איך, כי אני עם משמרות ושכר דירה.</w:t>
       </w:r>
     </w:p>
     <w:p>
@@ -6028,7 +6028,7 @@
           <w:szCs w:val="24"/>
           <w:rtl/>
         </w:rPr>
-        <w:t xml:space="preserve">השקט. אין שום דבר בולט, ובכל זאת היא נראית יקרה. הסוודר נראה רך, המעיל נראה כבד וטוב, התיק נראה... לא יודעת, "נכון". והשיער האסוף הפשוט. ואני מודה שאני לא יודעת כמה זה עולה, אולי הסוודר מהקניון. אבל הרושם הוא של מישהי שיכולה להרשות לעצמה לא להראות. וזה, אני חושבת, הדבר הכי יקר שיש, כי אצלנו אף אחד לא יכול להרשות לעצמו את זה. אצלנו מי שלא מראה, חושבים שאין לו.</w:t>
+        <w:t xml:space="preserve">השקט. אין שום דבר בולט, ובכל זאת היא נראית יקרה. הסוודר נראה רך, המעיל נראה כבד וטוב, התיק נראה... לא יודעת, "נכון". והשיער האסוף הפשוט. ואני מודה שאני לא יודעת כמה זה עולה, אולי הסוודר מהקניון. אבל הרושם הוא של מישהי שיכולה להרשות לעצמה לא להראות. וזה, אני חושבת, הדבר הכי יקר שיש, כי אצלנו אף אחד לא יכול להרשות לעצמו את זה. אצלנו מי שלא מראה, חושבים שאין לו. וכדי לא להראות ולא לדאוג מה חושבים, צריך להיות במקום שבו מה שחושבים לא משנה. וזה המקום הכי יקר בעולם. יותר מהתיק של הבחורה. יותר מהשעון של הבחור. זה מקום שאי אפשר לקנות, רק להגיע אליו. ואני לא יודעת אם היא הגיעה או נולדה שם.</w:t>
       </w:r>
     </w:p>
     <w:p>
@@ -6107,7 +6107,7 @@
           <w:szCs w:val="24"/>
           <w:rtl/>
         </w:rPr>
-        <w:t xml:space="preserve">גבר רגוע. מסודר. נעים. גם הוא נראה כמו רופא בכיר, או מנהל של משהו. הוא לא מנסה להרשים ולכן מרשים. אם הייתי רואה אותו במחלקה הייתי מניחה שבא לבקר את אבא שלו, ושידבר איתנו בכבוד, ויגיד תודה כשיוצא. יש כאלה. לא הרבה.</w:t>
+        <w:t xml:space="preserve">גבר רגוע. מסודר. נעים. גם הוא נראה כמו רופא בכיר, או מנהל של משהו. הוא לא מנסה להרשים ולכן מרשים. אם הייתי רואה אותו במחלקה הייתי מניחה שבא לבקר את אבא שלו, ושידבר איתנו בכבוד, ויגיד תודה כשיוצא, וישאל אם צריך להביא משהו. יש כאלה. לא הרבה. ורוב הזמן הם נראים בדיוק ככה, בחולצה כזאת. אלה שצועקים עלינו במחלקה נראים אחרת, הם בדרך כלל עם שעון. אני יודעת שזה לא מדעי. אבל אחרי שש שנים יש לי סטטיסטיקה.</w:t>
       </w:r>
     </w:p>
     <w:p>
@@ -6167,7 +6167,7 @@
           <w:szCs w:val="24"/>
           <w:rtl/>
         </w:rPr>
-        <w:t xml:space="preserve">רופא, מנהל, מהנדס בכיר, עורך דין. מישהו שאנשים באים אליו ולא הוא אליהם. או איש עסקים ותיק, מהסוג שכבר לא צריך להראות. ואני רואה אותו אבא של משפחה, מגיע הביתה בשש, אוכל עם הילדים, שואל מה היה בבית הספר.</w:t>
+        <w:t xml:space="preserve">רופא, מנהל, מהנדס בכיר, עורך דין. מישהו שאנשים באים אליו ולא הוא אליהם. או איש עסקים ותיק, מהסוג שכבר לא צריך להראות. ואני רואה אותו אבא של משפחה, מגיע הביתה בשש, אוכל עם הילדים, שואל מה היה בבית הספר, ולא מסתכל בטלפון בארוחה. ואני מדמיינת לו גם אישה שנראית כמו תמונה 3. ובת שנראית כמו תמונה 2. וזה מצחיק, כי זה אומר שאני בונה לו משפחה שלמה מחולצה. אבל זה מה שעושים. בונים סיפור.</w:t>
       </w:r>
     </w:p>
     <w:p>
@@ -6227,7 +6227,7 @@
           <w:szCs w:val="24"/>
           <w:rtl/>
         </w:rPr>
-        <w:t xml:space="preserve">גבוה, כמו האישה בתמונה 3, אותו עולם. ואני רוצה להגיד משהו על החברה שלי: גבר ערבי עשיר כמעט אף פעם לא נראה ככה. הוא ייראה כמו הבחור בתמונה 1. הלוק הזה, של "אני לא צריך להוכיח", הוא לוק של מי שכבר הוכיחו בשבילו, אבא שלו, סבא שלו. ובחברה שעדיין מוכיחה, זה נדיר מאוד. אז אני מנחשת שהוא ממקום שבו העושר ותיק, שלושה דורות לפחות.</w:t>
+        <w:t xml:space="preserve">גבוה, כמו האישה בתמונה 3, אותו עולם, אותה שכונה, אותה ארוחת ערב. ואני רוצה להגיד משהו על החברה שלי: גבר ערבי עשיר כמעט אף פעם לא נראה ככה. הוא ייראה כמו הבחור בתמונה 1. הלוק הזה, של "אני לא צריך להוכיח", הוא לוק של מי שכבר הוכיחו בשבילו, אבא שלו, סבא שלו. ובחברה שעדיין מוכיחה, שעדיין נלחמת על המקום שלה, זה נדיר מאוד. אז אני מנחשת שהוא ממקום שבו העושר ותיק, שלושה דורות לפחות. ואולי בעוד שלושה דורות גם בן דוד שלי, הנכד שלו, ייראה ככה. ואולי אז אנחנו נהיה שם. אני אוהבת לחשוב את זה.</w:t>
       </w:r>
     </w:p>
     <w:p>
@@ -6287,7 +6287,7 @@
           <w:szCs w:val="24"/>
           <w:rtl/>
         </w:rPr>
-        <w:t xml:space="preserve">הנעליים, שנראות מעור טוב ולא חדשות, קצת חיות. השעון הדק. החולצה שיושבת. ובעיקר שאין לוגו, בשום מקום, חיפשתי. אצל גברים זה מסגיר הכי הרבה, לדעתי: גבר שיש לו כסף ולא שם לוגו הוא גבר שהכסף אצלו הוא לא חדשות. ובמחלקה למדתי משהו: האנשים האלה הם בדרך כלל הכי מנומסים. לא יודעת למה. אולי כי אין להם ממה לפחד.</w:t>
+        <w:t xml:space="preserve">הנעליים, שנראות מעור טוב ולא חדשות, קצת חיות, קצת מקומטות בקדמת הרגל. השעון הדק, שנראה ישן, אולי ירושה. החולצה שיושבת. ובעיקר שאין לוגו, בשום מקום, חיפשתי, הסתכלתי על החגורה, על הנעליים, כלום. אצל גברים זה מסגיר הכי הרבה, לדעתי: גבר שיש לו כסף ולא שם לוגו הוא גבר שהכסף אצלו הוא לא חדשות. ובמחלקה למדתי משהו: האנשים האלה הם בדרך כלל הכי מנומסים. לא יודעת למה. אולי כי אין להם ממה לפחד. מי שמפחד שלא יכבדו אותו, צועק. מי שבטוח שיכבדו, מבקש בשקט. והבגדים אומרים את זה לפני שהוא פותח את הפה.</w:t>
       </w:r>
     </w:p>
     <w:p>
@@ -6366,7 +6366,7 @@
           <w:szCs w:val="24"/>
           <w:rtl/>
         </w:rPr>
-        <w:t xml:space="preserve">שלוש, ארבע, אחת, שתיים. האישה ראשונה, כי היא נראית לי הכי בטוחה והכי "מגיעה ממקום", וקצת מעל הגבר כי אצלי נשים כאלה נדירות יותר ולכן מרשימות יותר. הגבר שני. הבחור בטרנינג שלישי, הוא בדרך למעלה ועוד לא שם. הבחורה אחרונה, כי הלוק שלה הכי תלוי במישהו אחר. ו... תוך כדי שאני מסדרת אני שמה לב למשהו: אני מדרגת את השניים ש"מראים" למטה ואת השניים ש"לא מראים" למעלה. ובכפר שלי הדירוג היה הפוך לגמרי. אצלנו מי שלא מראה, זה מי שאין לו. אז מי מסדרת פה עכשיו, רים מחיפה או רים מהכפר? רים מחיפה. אחרי שש שנים בבית חולים. ואני לא בטוחה שזה טוב.</w:t>
+        <w:t xml:space="preserve">שלוש, ארבע, אחת, שתיים. האישה ראשונה, כי היא נראית לי הכי בטוחה והכי "מגיעה ממקום", וקצת מעל הגבר כי אצלי נשים כאלה נדירות יותר ולכן מרשימות יותר. הגבר שני. הבחור בטרנינג שלישי, הוא בדרך למעלה ועוד לא שם. הבחורה אחרונה, כי הלוק שלה הכי תלוי במישהו אחר. ו... תוך כדי שאני מסדרת אני שמה לב למשהו: אני מדרגת את השניים ש"מראים" למטה ואת השניים ש"לא מראים" למעלה. ובכפר שלי הדירוג היה הפוך לגמרי. אצלנו מי שלא מראה, זה מי שאין לו. אז מי מסדרת פה עכשיו, רים מחיפה או רים מהכפר? רים מחיפה. אחרי שש שנים בבית חולים. ואני לא בטוחה שזה טוב. כי רים מהכפר הייתה רואה בבחור בטרנינג מישהו שעובד קשה ומצליח, ורים מחיפה רואה בו "אחד כזה". ואותו אדם לא השתנה. אני השתניתי. וזה אולי לא תמיד לטובה, להתחיל לראות אנשים כמו שהמחלקה רואה אותם.</w:t>
       </w:r>
     </w:p>
     <w:p>
@@ -6426,7 +6426,7 @@
           <w:szCs w:val="24"/>
           <w:rtl/>
         </w:rPr>
-        <w:t xml:space="preserve">מנסה להיראות עשיר: הבחור והבחורה, ברור, ואני לא אומרת את זה כביקורת, זה הלוק, וזה עובד, הוא משיג את המטרה שלו. עשיר בלי להתאמץ: הגבר. האישה גם, אבל אצלה יש ידע, היא בחרה כל פריט, זה עשיר שלא מתאמץ להיראות עשיר אבל כן מתאמץ להיראות נכון. ויש הבדל, אני חושבת, בין "לא מתאמץ" ל"לא מראה". הגבר לא מראה. האישה מראה, רק למי שיודע. הבחור מראה לכולם. והבחורה מראה למי שמסתכל. ארבעה אנשים, ארבע דרכים להגיד "תסתכלו", וגם "אל תסתכלו" זה דרך.</w:t>
+        <w:t xml:space="preserve">מנסה להיראות עשיר: הבחור והבחורה, ברור, ואני לא אומרת את זה כביקורת, זה הלוק, וזה עובד, הוא משיג את המטרה שלו, בכפר כולם היו אומרים "וואו". עשיר בלי להתאמץ: הגבר. האישה גם, אבל אצלה יש ידע, היא בחרה כל פריט, זה עשיר שלא מתאמץ להיראות עשיר אבל כן מתאמץ להיראות נכון. ויש הבדל, אני חושבת, בין "לא מתאמץ" ל"לא מראה". הגבר לא מראה. האישה מראה, רק למי שיודע. הבחור מראה לכולם. והבחורה מראה למי שמסתכל. ארבעה אנשים, ארבע דרכים להגיד "תסתכלו", וגם "אל תסתכלו" זה דרך. (המראיינת: ואיזו דרך את מעדיפה?) בחיפה, של הגבר. בכפר, של הבחור. ואני רוצה שתהיה לי דרך אחת. ואין לי. אני לובשת משהו אחר לחתונה בכפר ומשהו אחר לשישי בחיפה, ובשניהם אני מרגישה שאני מתחפשת קצת.</w:t>
       </w:r>
     </w:p>
     <w:p>
@@ -6486,7 +6486,7 @@
           <w:szCs w:val="24"/>
           <w:rtl/>
         </w:rPr>
-        <w:t xml:space="preserve">לעבוד, האישה. היא נראית כמו מנהלת שהייתי רוצה שתהיה האחות הראשית שלי, כזאת שלא צועקת ויודעת. להיות חברה, האמת, הבחורה בתמונה 2, כי היא מזכירה לי את בנות הדודות שלי, ואיתה יהיה צחוק, ונצא, ונדבר על שטויות, וזה מה שאני צריכה אחרי משמרת. הגבר, לעבוד כן, חברות לא, הוא נראה מהסוג שלא מתחברים אליו, מנומס וסגור. והבחור בטרנינג, חברה שלו הייתי יכולה להיות, הוא נראה חברותי, פתוח, אבל לעבוד איתו לא. הוא מקבל החלטות מהר מדי, רואים.</w:t>
+        <w:t xml:space="preserve">לעבוד, האישה. היא נראית כמו מנהלת שהייתי רוצה שתהיה האחות הראשית שלי, כזאת שלא צועקת ויודעת, ושאם טעיתי היא תגיד לי בשקט ולא מול כולם. להיות חברה, האמת, הבחורה בתמונה 2, כי היא מזכירה לי את בנות הדודות שלי, ואיתה יהיה צחוק, ונצא, ונדבר על שטויות, והיא תגיד לי שאני צריכה לעשות ציפורניים, ואני אצחק, וזה מה שאני צריכה אחרי משמרת, לא שיחה על ספרים. הגבר, לעבוד כן, חברות לא, הוא נראה מהסוג שלא מתחברים אליו, מנומס וסגור, כמו הרופאים שאומרים "תודה" ולא זוכרים את השם שלך. והבחור בטרנינג, חברה שלו הייתי יכולה להיות, הוא נראה חברותי, פתוח, מזמין את כולם, אבל לעבוד איתו לא. הוא מקבל החלטות מהר מדי, רואים, ובמחלקה זה מסוכן.</w:t>
       </w:r>
     </w:p>
     <w:p>
@@ -6584,7 +6584,7 @@
           <w:szCs w:val="24"/>
           <w:rtl/>
         </w:rPr>
-        <w:t xml:space="preserve">קצת מפתיע, בעיקר על הגבר. לא חשבתי שהחולצה והנעליים שלו עולות אלפים, חשבתי "חולצה". על האישה פחות הופתעתי, הרגשתי שיש שם משהו יקר, רק לא ידעתי להגיד מה. זה משנה לי משהו, כן. אני מבינה שיש שתי שפות של עושר. ואני, מהכפר, רגילה לראשונה, של הלוגו, ולומדת את השנייה דרך בית החולים, שבו הבכירים מדברים בשנייה. ועוד משהו שעולה לי עכשיו: השפה השנייה היא גם גדר. מי שלא מכיר את המותגים האלה לא נכנס, ולא יודע בכלל שיש דלת. הלוגו, לפחות, מדבר עם כולם, גם עם אמא שלי. אז אולי הלוגו הוא יותר הוגן. לא יודעת. זה מבלבל אותי.</w:t>
+        <w:t xml:space="preserve">קצת מפתיע, בעיקר על הגבר. לא חשבתי שהחולצה והנעליים שלו עולות אלפים, חשבתי "חולצה", חשבתי שאפשר לקנות כזאת בכל מקום. על האישה פחות הופתעתי, הרגשתי שיש שם משהו יקר, רק לא ידעתי להגיד מה. זה משנה לי משהו, כן. אני מבינה שיש שתי שפות של עושר. ואני, מהכפר, רגילה לראשונה, של הלוגו, ולומדת את השנייה דרך בית החולים, שבו הבכירים מדברים בשנייה. ועוד משהו שעולה לי עכשיו: השפה השנייה היא גם גדר. מי שלא מכיר את המותגים האלה לא נכנס, ולא יודע בכלל שיש דלת. אמא שלי הייתה מסתכלת על האישה בבז' ואומרת "מסכנה, אין לה כסף לתכשיט". והאישה בבז' הייתה מסתכלת על אמא שלי עם הזהב שלה ואומרת... לא יודעת מה. משהו. והלוגו, לפחות, מדבר עם כולם, גם עם אמא שלי, גם עם הרופאה. אז אולי הלוגו הוא יותר הוגן. לא יודעת. זה מבלבל אותי. כי כל הראיון דירגתי את הגדר למעלה.</w:t>
       </w:r>
     </w:p>
     <w:p>
@@ -6644,7 +6644,7 @@
           <w:szCs w:val="24"/>
           <w:rtl/>
         </w:rPr>
-        <w:t xml:space="preserve">תלוי איפה אני. באמת. בבית החולים, לוגו גדול אומר לי "כסף חדש", ואני קצת מרימה גבה, כמו שלימדו אותי פה. בכפר, בחתונה, לוגו גדול אומר "הצלחה", ואני אומרת "יפה לך", בלי ציניות. אותו לוגו, שתי תגובות, ושתיהן שלי. ואני חושבת שהאמת באמצע: מי שלובש לוגו גדול רוצה להיות שייך למשהו. לפעמים זה מה שיש לו. לפעמים זה מה שהוא חולם עליו. ואני לא יודעת להבדיל מבחוץ, ואולי גם לא צריכה.</w:t>
+        <w:t xml:space="preserve">תלוי איפה אני. באמת. בבית החולים, לוגו גדול אומר לי "כסף חדש", ואני קצת מרימה גבה, כמו שלימדו אותי פה בלי שאף אחד אמר מילה, רק מהמבטים של הרופאים. בכפר, בחתונה, לוגו גדול אומר "הצלחה", ואני אומרת "יפה לך", בלי ציניות, ומתכוונת. אותו לוגו, שתי תגובות, ושתיהן שלי. ואני חושבת שהאמת באמצע: מי שלובש לוגו גדול רוצה להיות שייך למשהו. לפעמים זה מה שיש לו. לפעמים זה מה שהוא חולם עליו. ואני לא יודעת להבדיל מבחוץ, ואולי גם לא צריכה. ויש עוד משהו, מהמחלקה: המטופלים עם הלוגו הגדול הם לפעמים אלה שהכי מפחדים. באמת. הם נכנסים עם השעון ועם הקפוצ'ון ובלילה, כשאין אף אחד, הם הכי מפוחדים, והם שואלים אותי אם זה בסדר, אם יהיה בסדר. והאלה עם החולצה הכחולה שואלים את הרופא, לא אותי. אז הלוגו, בלילה, זה מישהו שצריך שיגידו לו שהכול בסדר. זה מה שעובר לי. בלילה.</w:t>
       </w:r>
     </w:p>
     <w:p>
@@ -6704,7 +6704,7 @@
           <w:szCs w:val="24"/>
           <w:rtl/>
         </w:rPr>
-        <w:t xml:space="preserve">כן. שהדירוג שלי היה של חיפה ולא של הכפר, ושאני לא בטוחה איזה מהם הוא "אני". אם היית מראיינת אותי בגיל עשרים ושתיים, לפני העיר, הייתי שמה את הבחור בטרנינג ראשון, בלי להתלבט. אז אולי המחקר שלך צריך לשאול לא רק מה אנשים רואים, אלא מאיפה הם מסתכלים. ועוד משהו, מהעבודה: כשמטופל נכנס עם לוגו גדול, אני לא חושבת על מעמד. אני חושבת אם יש לו ביטוח משלים. זה מה שבית החולים עשה לי. את זה תכתבי, זה חשוב.</w:t>
+        <w:t xml:space="preserve">כן. שהדירוג שלי היה של חיפה ולא של הכפר, ושאני לא בטוחה איזה מהם הוא "אני". אם היית מראיינת אותי בגיל עשרים ושתיים, לפני העיר, הייתי שמה את הבחור בטרנינג ראשון, בלי להתלבט, ואת הגבר בחולצה אחרון, כי "מה זה, אין לו כלום". אז אולי המחקר שלך צריך לשאול לא רק מה אנשים רואים, אלא מאיפה הם מסתכלים, ואיפה הם היו לפני. ועוד משהו, מהעבודה: כשמטופל נכנס עם לוגו גדול, אני לא חושבת על מעמד. אני חושבת אם יש לו ביטוח משלים. זה מה שבית החולים עשה לי. את זה תכתבי, זה חשוב. ואם תרצי, תבואי למחלקה פעם, בלילה, ותראי מי לובש מה כשאף אחד לא מסתכל. שם זה המחקר האמיתי. בפיג'מות של בית החולים כולם נראים אותו דבר, ואז פתאום רואים מי הם.</w:t>
       </w:r>
     </w:p>
     <w:p>
@@ -6760,7 +6760,7 @@
           <w:szCs w:val="24"/>
           <w:rtl/>
         </w:rPr>
-        <w:t xml:space="preserve">תאריך: 8.10.2026    משך: 21 דקות    מקום: שיחת וידאו, מביתה של המרואיינת בנשר    הקלטה: בטלפון, בהסכמה</w:t>
+        <w:t xml:space="preserve">תאריך: 8.10.2026    משך: 24 דקות    מקום: שיחת וידאו, מביתה של המרואיינת בנשר    הקלטה: בטלפון, בהסכמה</w:t>
       </w:r>
     </w:p>
     <w:p>
@@ -6839,7 +6839,7 @@
           <w:szCs w:val="24"/>
           <w:rtl/>
         </w:rPr>
-        <w:t xml:space="preserve">ארבעים וחמש. מהנדסת תוכנה, מנהלת צוות של שישה במת"ם, חברה בינונית, לא אגיד איזו. נשר, נשואה, שני ילדים בני נוער. עליתי מרוסיה בגיל אחת עשרה, גדלתי בקריית ים, בבניין שכולם בו היו עולים, למדתי בטכניון. היום אני מהבית, אז את רואה אותי בטריקו אפור, וזה בדיוק מה שאני לובשת גם במשרד, אז אל תחשבי שזה בגלל הזום.</w:t>
+        <w:t xml:space="preserve">ארבעים וחמש. מהנדסת תוכנה, מנהלת צוות של שישה במת"ם, חברה בינונית, לא אגיד איזו, עשרים שנה בתחום. נשר, נשואה, בעלי גם מהנדס, שני ילדים בני נוער, בת שש עשרה ובן ארבע עשרה. עליתי מרוסיה בגיל אחת עשרה, מסנט פטרבורג, גדלתי בקריית ים, בבניין שכולם בו היו עולים ואף אחד לא היה כסף, למדתי בטכניון, ההורים שלי מהנדסים שעבדו שנים בניקיון ובשמירה עד שחזרו למקצוע. היום אני מהבית, אז את רואה אותי בטריקו אפור, וזה בדיוק מה שאני לובשת גם במשרד, אז אל תחשבי שזה בגלל הזום. ואני אומרת לך מראש: אני אדם ישיר, ככה גדלתי, ואם משהו יישמע לך קשה, זה לא נגד אף אחד, זה פשוט איך שאני מדברת.</w:t>
       </w:r>
     </w:p>
     <w:p>
@@ -6899,7 +6899,7 @@
           <w:szCs w:val="24"/>
           <w:rtl/>
         </w:rPr>
-        <w:t xml:space="preserve">שתיים. אני לא מתעניינת, ואני אומרת את זה בלי גאווה ובלי בושה, זה פשוט לא שם. קונה אונליין, אותם דברים, אותו מותג, אותו צבע, כבר עשר שנים. מה שאני כן יודעת זה שמות, כי אי אפשר לחיות בעולם בלי לדעת, והבת שלי בת שש עשרה מדברת על זה כל ארוחת ערב. בהייטק אף אחד לא מסתכל. ומי שכן מסתכל, זה בדרך כלל אומר עליו משהו לא טוב.</w:t>
+        <w:t xml:space="preserve">שתיים. אני לא מתעניינת, ואני אומרת את זה בלי גאווה ובלי בושה, זה פשוט לא שם, כמו שאני לא מתעניינת בכדורגל. קונה אונליין, אותם דברים, אותו מותג, אותו צבע, כבר עשר שנים, יש לי שבעה טריקו אפורים. מה שאני כן יודעת זה שמות, כי אי אפשר לחיות בעולם בלי לדעת, והבת שלי בת שש עשרה מדברת על זה כל ארוחת ערב, ואני לומדת ממנה בעל כורחי. בהייטק אף אחד לא מסתכל. ומי שכן מסתכל, זה בדרך כלל אומר עליו משהו לא טוב, שהוא עסוק בדבר הלא נכון. אצלנו בצוות יש מישהו שבא בחולצות מכופתרות, וכולם קצת חושדים בו. באמת. אז התרבות שלי היא הפוכה משל רוב האנשים, כנראה, ואת צריכה לקחת את זה בחשבון במה שאני אגיד.</w:t>
       </w:r>
     </w:p>
     <w:p>
@@ -6997,7 +6997,7 @@
           <w:szCs w:val="24"/>
           <w:rtl/>
         </w:rPr>
-        <w:t xml:space="preserve">אני אהיה ישירה, ביקשת מה עולה. הוא נראה לי כמו מישהו שלא הייתי רוצה לשבת לידו באוטובוס. לא כי הוא מפחיד. כי הוא רועש. הכול עליו רועש, גם כשהוא שותק. אני רואה בן אדם צעיר שמאוד רוצה שיחשבו שהוא הצליח, ושבעצמו לא לגמרי בטוח. אצלנו בצוות אומרים: מי שצריך להגיד שהוא מתכנת טוב, כנראה לא. אותו דבר פה. ואולי אני טועה והוא בן אדם נהדר. אבל זה מה שהבגדים אמרו לי לפני שהוא פתח את הפה.</w:t>
+        <w:t xml:space="preserve">אני אהיה ישירה, ביקשת מה עולה. הוא נראה לי כמו מישהו שלא הייתי רוצה לשבת לידו באוטובוס. לא כי הוא מפחיד. כי הוא רועש. הכול עליו רועש, גם כשהוא שותק, גם בתמונה, אני כמעט שומעת מוזיקה מהטלפון שלו. אני רואה בן אדם צעיר שמאוד רוצה שיחשבו שהוא הצליח, ושבעצמו לא לגמרי בטוח. אצלנו בצוות אומרים: מי שצריך להגיד שהוא מתכנת טוב, כנראה לא. אותו דבר פה. ואולי אני טועה והוא בן אדם נהדר, שעוזר לאמא שלו ומגדל כלב. אבל זה מה שהבגדים אמרו לי לפני שהוא פתח את הפה. והם אמרו את זה בקול רם. (המראיינת: מה בדיוק אמרו?) "יש לי". זה מה שאמרו. רק "יש לי". לא "אני", לא "אני יודע", לא "אני אוהב". "יש לי". וזה משפט דל.</w:t>
       </w:r>
     </w:p>
     <w:p>
@@ -7057,7 +7057,7 @@
           <w:szCs w:val="24"/>
           <w:rtl/>
         </w:rPr>
-        <w:t xml:space="preserve">משהו בלי תואר. אני לא אומרת את זה בזלזול, אני אומרת מה אני רואה. מכירות, רכב, אולי קריפטו, אולי משהו על הגבול, לא יודעת. או שמשפחה עם כסף והוא לא עובד בכלל. מהנדס, בטוח שלא. מהנדסים לא נראים ככה גם כשיש להם פי שלושה ממנו, הם נראים כמוני, עם טריקו.</w:t>
+        <w:t xml:space="preserve">משהו בלי תואר. אני לא אומרת את זה בזלזול, אני אומרת מה אני רואה. מכירות, רכב, אולי קריפטו, אולי משהו על הגבול, לא יודעת. או שמשפחה עם כסף והוא לא עובד בכלל, ורק "מנהל נכסים". מהנדס, בטוח שלא. מהנדסים לא נראים ככה גם כשיש להם פי שלושה ממנו, הם נראים כמוני, עם טריקו, או כמו המנכ"ל הקודם שלנו, שאני אספר עליו אחר כך. ואולי הוא בכלל עובד בחנות של המותג הזה, ומקבל הנחת עובדים, ולובש הכול. גם זה אפשרי. ואז הוא לא עשיר בכלל, הוא פרסומת מהלכת. וזה אולי הכי עצוב מכל האפשרויות.</w:t>
       </w:r>
     </w:p>
     <w:p>
@@ -7117,7 +7117,7 @@
           <w:szCs w:val="24"/>
           <w:rtl/>
         </w:rPr>
-        <w:t xml:space="preserve">כסף פנוי יש לו, אחרת לא היה שם אותו על הגוף. חברתית, אני ממקמת נמוך, ואני יודעת שזה לא פוליטיקלי קורקט ושאת תרשמי את זה. בעיניי מעמד זה השכלה, לא ארנק. והלבוש הזה אומר לי "כסף בלי השכלה". ואולי הוא דוקטור לפיזיקה, ואז אני אתבייש. אבל שאלת מה עולה, וזה עולה, ואני לא אצנזר. (המראיינת: למה דווקא השכלה?) כי ככה גדלתי. בבית שלי ספרים היו הדבר שמראים לאורחים, לא רהיטים.</w:t>
+        <w:t xml:space="preserve">כסף פנוי יש לו, אחרת לא היה שם אותו על הגוף, או שיש לו אשראי, שזה לא אותו דבר, ואני יודעת, כי ראיתי את ההורים שלי לוקחים הלוואות בשביל דברים שרואים. חברתית, אני ממקמת נמוך, ואני יודעת שזה לא פוליטיקלי קורקט ושאת תרשמי את זה. בעיניי מעמד זה השכלה, לא ארנק. והלבוש הזה אומר לי "כסף בלי השכלה". ואולי הוא דוקטור לפיזיקה, ואז אני אתבייש, ואגיד סליחה. אבל שאלת מה עולה, וזה עולה, ואני לא אצנזר. (המראיינת: למה דווקא השכלה?) כי ככה גדלתי. בבית שלי ספרים היו הדבר שמראים לאורחים, לא רהיטים. ההורים שלי ניקו משרדים ובערב קראו דוסטויבסקי, ואמרו לי: את הכסף יכולים לקחת לך, את הראש לא. אז מישהו שמראה את הכסף, בעיניי, מראה את הדבר שיכולים לקחת לו. וזה אומר לי שאין לו את הדבר השני. ואולי יש לו ואני סתם עיוורת. אבל זה הקוד שלי, ואני כבר מבוגרת מדי להחליף אותו.</w:t>
       </w:r>
     </w:p>
     <w:p>
@@ -7177,7 +7177,7 @@
           <w:szCs w:val="24"/>
           <w:rtl/>
         </w:rPr>
-        <w:t xml:space="preserve">הלוגו הענק. השעון. הפאוץ'. כל אחד לבד הייתי סולחת, כולם ביחד זה תחפושת. ובעיקר, הכול נועד לזיהוי. הוא לבש דברים שהמטרה שלהם היא שיזהו אותם, לא שיהיה לו נוח, לא שיהיה יפה. ואני מכירה את זה מהבית: בשנות התשעים, בקריית ים, מי שהסתדר קנה את הדבר הכי מזוהה, טלוויזיה סוני, והעמיד אותה בסלון עם הדלת פתוחה. ואני זוכרת איך זה נראה מבחוץ, כילדה. זה אותו דבר. רק שהסלון הוא הגוף והסוני היא קפוצ'ון.</w:t>
+        <w:t xml:space="preserve">הלוגו הענק. השעון. הפאוץ'. כל אחד לבד הייתי סולחת, כולם ביחד זה תחפושת. ובעיקר, הכול נועד לזיהוי. הוא לבש דברים שהמטרה שלהם היא שיזהו אותם, לא שיהיה לו נוח, לא שיהיה יפה. ואני מכירה את זה מהבית: בשנות התשעים, בקריית ים, מי שהסתדר קנה את הדבר הכי מזוהה, טלוויזיה סוני, והעמיד אותה בסלון עם הדלת פתוחה, כדי שהשכנים יראו כשעוברים. ואני זוכרת איך זה נראה מבחוץ, כילדה, ואיך ההורים שלי, שלא היה להם סוני, הסתכלו על זה. זה אותו דבר. רק שהסלון הוא הגוף והסוני היא קפוצ'ון. ועוד משהו: הוא לבוש כאילו הוא בצילום. לא כאילו הוא בחיים. בחיים יש כתם, יש קמט, יש משהו שלא מתאים. אצלו הכול מתאים. וזה אומר לי שהוא התלבש בשביל התמונה, ושהתמונה חשובה לו מהיום שבו היא צולמה.</w:t>
       </w:r>
     </w:p>
     <w:p>
@@ -7256,7 +7256,7 @@
           <w:szCs w:val="24"/>
           <w:rtl/>
         </w:rPr>
-        <w:t xml:space="preserve">בחורה שהשקיעה המון זמן בלהיראות ככה. ואני מכבדת את הזמן, באמת, זה עבודה. את התוצאה פחות. היא נראית לי כמו תמונה מאינסטגרם, ואין בה שום דבר שהוא שלה, כל פריט ראיתי על מישהי אחרת. הבת שלי הייתה אומרת "מהממת". אני אומרת "כמו כולן". ושתינו צודקות, כנראה, ואולי זה בדיוק ההבדל בין שש עשרה לארבעים וחמש.</w:t>
+        <w:t xml:space="preserve">בחורה שהשקיעה המון זמן בלהיראות ככה. ואני מכבדת את הזמן, באמת, זה עבודה, שעות, ואני יודעת מהבת שלי כמה שעות. את התוצאה פחות. היא נראית לי כמו תמונה מאינסטגרם, ואין בה שום דבר שהוא שלה, כל פריט ראיתי על מישהי אחרת, בטלפון של הבת שלי. הבת שלי הייתה אומרת "מהממת". אני אומרת "כמו כולן". ושתינו צודקות, כנראה, ואולי זה בדיוק ההבדל בין שש עשרה לארבעים וחמש: בשש עשרה "כמו כולן" זה מחמאה, בארבעים וחמש זה ביקורת. ואולי בעוד עשר שנים הבת שלי תגיד על בחורה כזאת מה שאני אומרת עכשיו, ואני אזכיר לה. או שלא. אולי היא תישאר עם "מהממת", ואני אקנא.</w:t>
       </w:r>
     </w:p>
     <w:p>
@@ -7316,7 +7316,7 @@
           <w:szCs w:val="24"/>
           <w:rtl/>
         </w:rPr>
-        <w:t xml:space="preserve">רשתות. יופי. משהו בתחום. או שלא עובדת. קשה לי לדמיין אותה במקצוע שלומדים אותו שנים, וזאת דעה קדומה, אני יודעת, ואני אומרת אותה בכל זאת כי ביקשת כנות. מזכירה במשרד מפואר. קבלה במלון. משהו שהלוק הוא חלק מהתפקיד.</w:t>
+        <w:t xml:space="preserve">רשתות. יופי. משהו בתחום. או שלא עובדת. קשה לי לדמיין אותה במקצוע שלומדים אותו שנים, וזאת דעה קדומה, אני יודעת, ואני אומרת אותה בכל זאת כי ביקשת כנות. מזכירה במשרד מפואר. קבלה במלון. משהו שהלוק הוא חלק מהתפקיד. ויש לי מתכנתת בצוות, מצוינת, שבימי שישי נראית בדיוק ככה, ראיתי בסטורי. אז אני יודעת שזה לא בהכרח. אבל המתכנתת שלי לא נראית ככה ביום ראשון. אז השאלה היא אם זאת תמונה של יום שישי או של יום ראשון. ואם זה יום ראשון, אז כנראה לא מתכנתת.</w:t>
       </w:r>
     </w:p>
     <w:p>
@@ -7376,7 +7376,7 @@
           <w:szCs w:val="24"/>
           <w:rtl/>
         </w:rPr>
-        <w:t xml:space="preserve">כלכלית, אני לא מאמינה שזה הכסף שלה. חברתית, בינוני, ולא בטוחה אפילו. בשבילי זה לוק של מישהי שמודדת את עצמה לפי מה שרואים, וזה בדרך כלל מי שלא קיבלה מספיק על דברים אחרים. וסליחה, זה נשמע קשה. אני לא מכירה אותה. אבל זה מה שהבגדים מספרים, והיא זאת שבחרה שהם יספרו.</w:t>
+        <w:t xml:space="preserve">כלכלית, אני לא מאמינה שזה הכסף שלה. חברתית, בינוני, ולא בטוחה אפילו. בשבילי זה לוק של מישהי שמודדת את עצמה לפי מה שרואים, וזה בדרך כלל מי שלא קיבלה מספיק על דברים אחרים, על הראש, על מה שהיא עושה. וסליחה, זה נשמע קשה. אני לא מכירה אותה. אבל זה מה שהבגדים מספרים, והיא זאת שבחרה שהם יספרו. ואני רוצה להוסיף, כדי להיות הוגנת: גם הבגדים שלי מספרים משהו, הטריקו האפור מספר "לא אכפת לי", וזה גם הצהרה, ואולי גם זה מראה שלא קיבלתי מספיק על משהו אחר. אני לא פטורה. רק שהקוד שלי שונה. הבגדים שלי אומרים "תסתכלו על הקוד שכתבתי", והבגדים שלה אומרים "תסתכלו עליי". ואולי שנינו רוצים אותו דבר.</w:t>
       </w:r>
     </w:p>
     <w:p>
@@ -7436,7 +7436,7 @@
           <w:szCs w:val="24"/>
           <w:rtl/>
         </w:rPr>
-        <w:t xml:space="preserve">כל השמות. החולצה עם הכיתוב, התיק עם הסמלים, המשקפיים. אני לא מתעניינת באופנה ועדיין מזהה את כל המותגים, וזה הפואנטה: היא לבשה את מה שכולם מזהים כדי שכולם יזהו. בגד עם לוגו גדול אומר לי "תראי מה יש לי". בגד בלי אומר לי "תראי מי אני", או לפחות לא מפריע לי לראות. ואני אחרי עשר דקות עם התמונה שלה לא יודעת מי היא. אני יודעת מה יש לה.</w:t>
+        <w:t xml:space="preserve">כל השמות. החולצה עם הכיתוב, התיק עם הסמלים, המשקפיים. אני לא מתעניינת באופנה ועדיין מזהה את כל המותגים, וזה הפואנטה: היא לבשה את מה שכולם מזהים כדי שכולם יזהו. בגד עם לוגו גדול אומר לי "תראי מה יש לי". בגד בלי אומר לי "תראי מי אני", או לפחות לא מפריע לי לראות. ואני אחרי עשר דקות עם התמונה שלה לא יודעת מי היא. אני יודעת מה יש לה. ואני יודעת שזה עולה הרבה, ושהיא יודעת שאני יודעת, ושזה בדיוק מה שהיא רוצה שאני אדע. אז השיחה בינינו, דרך הבגדים, היא שיחה על כסף. והיא זאת שפתחה אותה. ואני, שלא מתעניינת, נמשכתי פנימה בכל זאת. אז זה עובד. זה מה שמרגיז.</w:t>
       </w:r>
     </w:p>
     <w:p>
@@ -7515,7 +7515,7 @@
           <w:szCs w:val="24"/>
           <w:rtl/>
         </w:rPr>
-        <w:t xml:space="preserve">אה, זאת אני מכירה. היא נראית כמו אנשים שאני עובדת איתם ומכבדת. רגועה, רצינית, מסודרת, אפס רעש. נראית כמו מנהלת בכירה, כמו מישהי שהייתי רוצה שתהיה המנהלת שלי. ונראית חכמה. ואני אומרת "חכמה" על בסיס סוודר, ואני שומעת כמה זה מגוחך, ואני לא יכולה שלא. ככה זה עובד, הראש עושה את זה לבד.</w:t>
+        <w:t xml:space="preserve">אה, זאת אני מכירה. היא נראית כמו אנשים שאני עובדת איתם ומכבדת. רגועה, רצינית, מסודרת, אפס רעש. נראית כמו מנהלת בכירה, כמו מישהי שהייתי רוצה שתהיה המנהלת שלי, כזאת שאומרת מה צריך בשני משפטים ויוצאת. ונראית חכמה. ואני אומרת "חכמה" על בסיס סוודר, ואני שומעת כמה זה מגוחך, ואני לא יכולה שלא. ככה זה עובד, הראש עושה את זה לבד, ואני מהנדסת, אני יודעת שהראש הוא מערכת עם באגים, וזה באג, ובכל זאת. (המראיינת: מה בה "חכמה"?) שהיא לא מבקשת שאסתכל. מי שלא מבקש שיסתכלו עליו, כנראה עסוק במשהו אחר, וה"משהו אחר" הוא בדרך כלל מחשבה. זה ההיגיון שלי. ואני מודה שהוא רופף.</w:t>
       </w:r>
     </w:p>
     <w:p>
@@ -7575,7 +7575,7 @@
           <w:szCs w:val="24"/>
           <w:rtl/>
         </w:rPr>
-        <w:t xml:space="preserve">מנהלת בכירה בחברה גדולה. שותפה במשרד. פרופסור. מנכ"לית אולי. רופאה. מישהי שיושבת בישיבות עם אנשים חשובים ולא צריכה להרשים אותם, כי הם באו אליה. משהו עם הרבה שנות לימוד והרבה אחריות.</w:t>
+        <w:t xml:space="preserve">מנהלת בכירה בחברה גדולה. שותפה במשרד. פרופסור. מנכ"לית אולי. רופאה. מישהי שיושבת בישיבות עם אנשים חשובים ולא צריכה להרשים אותם, כי הם באו אליה. משהו עם הרבה שנות לימוד והרבה אחריות. ואולי גם מישהי מהתחום שלי, סמנכ"לית פיתוח, יש כאלה שנראות ככה, אחת או שתיים שאני מכירה, והן בדיוק ככה: סוודר, מכנסיים שחורים, שיער אסוף, ואף אחד לא מתווכח איתן בישיבה.</w:t>
       </w:r>
     </w:p>
     <w:p>
@@ -7635,7 +7635,7 @@
           <w:szCs w:val="24"/>
           <w:rtl/>
         </w:rPr>
-        <w:t xml:space="preserve">גבוה, גם וגם. חברתית, גבוה, כי היא נראית משכילה ומסודרת, שזה הקריטריון שלי, כבר אמרתי. כלכלית, אני מניחה גבוה, אבל, ואני רוצה להיות מדויקת פה, אני לא רואה את זה בבגדים. הסוודר יכול להיות מכל חנות ולא הייתי יודעת. מה שנראה לי יקר זה היא. האדם. לא הבד.</w:t>
+        <w:t xml:space="preserve">גבוה, גם וגם. חברתית, גבוה, כי היא נראית משכילה ומסודרת, שזה הקריטריון שלי, כבר אמרתי. כלכלית, אני מניחה גבוה, אבל, ואני רוצה להיות מדויקת פה, אני לא רואה את זה בבגדים. הסוודר יכול להיות מכל חנות ולא הייתי יודעת, הוא נראה לי כמו הסוודרים של הבת שלי. מה שנראה לי יקר זה היא. האדם. לא הבד. ואם תגידי לי אחר כך שהסוודר הזה עולה כמו המחשב שלי, אני אגיד "למה". באמת, "למה". כי הפונקציה של סוודר היא לחמם, והוא יכול לחמם גם במאה שקל. אז אם היא שילמה אלפים, היא שילמה על משהו אחר, ואני לא יודעת על מה.</w:t>
       </w:r>
     </w:p>
     <w:p>
@@ -7695,7 +7695,7 @@
           <w:szCs w:val="24"/>
           <w:rtl/>
         </w:rPr>
-        <w:t xml:space="preserve">שאין כלום. אין שם, אין סמל, אין צבע, אין ניסיון. בגדים שנועדו להיות בגדים. ובהייטק, האנשים הכי בכירים שאני מכירה נראים בדיוק ככה, או עוד יותר פשוט, המנכ"ל הקודם שלנו הגיע בכפכפים. אז בשבילי פשטות היא סימן של מעמד, כי האנשים שאני יודעת שהם גבוה נראים פשוט. ואני יודעת שזה מעגלי. אבל זה מה שקורה בראש, ואת ביקשת את הראש.</w:t>
+        <w:t xml:space="preserve">שאין כלום. אין שם, אין סמל, אין צבע, אין ניסיון. בגדים שנועדו להיות בגדים, שעושים את העבודה שלהם, מחממים ומכסים, ושותקים. ובהייטק, האנשים הכי בכירים שאני מכירה נראים בדיוק ככה, או עוד יותר פשוט, המנכ"ל הקודם שלנו הגיע בכפכפים, ובפעם הראשונה שראיתי אותו חשבתי שהוא טכנאי. אז בשבילי פשטות היא סימן של מעמד, כי האנשים שאני יודעת שהם גבוה נראים פשוט. ואני יודעת שזה מעגלי: אני חושבת שפשוט זה גבוה כי הגבוהים שאני מכירה פשוטים, והם פשוטים כי בתרבות שלנו זה הקוד של גבוה. אבל זה מה שקורה בראש, ואת ביקשת את הראש, לא את הלוגיקה.</w:t>
       </w:r>
     </w:p>
     <w:p>
@@ -7774,7 +7774,7 @@
           <w:szCs w:val="24"/>
           <w:rtl/>
         </w:rPr>
-        <w:t xml:space="preserve">אדם שנראה כמו המנכ"ל הקודם, זה שבכפכפים, רק בחולצה. אדם נעים, שקט, שאף אחד לא היה מנחש שהוא מיליונר, והוא היה. חולצה, מכנסיים, נעליים, זהו. נורמלי. אמין. בוגר. אם הייתי צריכה לקנות מכונית משומשת מאחד הארבעה, ממנו. ואני יודעת שזה מבחן מוזר, אבל זה המבחן שלי.</w:t>
+        <w:t xml:space="preserve">אדם שנראה כמו המנכ"ל הקודם, זה שבכפכפים, רק בחולצה. אדם נעים, שקט, שאף אחד לא היה מנחש שהוא מיליונר, והוא היה, מכר שתי חברות. חולצה, מכנסיים, נעליים, זהו. נורמלי. אמין. בוגר. אם הייתי צריכה לקנות מכונית משומשת מאחד הארבעה, ממנו. ואני יודעת שזה מבחן מוזר, אבל זה המבחן שלי: ממי הייתי קונה מכונית. ממנו, כי הוא נראה כמו מישהו שאם יש בעיה במכונית, הוא יגיד. הבחור בטרנינג לא היה אומר. האישה בבז' הייתה אומרת, אבל הייתה מבקשת יותר כסף. והבחורה לא הייתה מוכרת מכונית, היא הייתה מצלמת אותה.</w:t>
       </w:r>
     </w:p>
     <w:p>
@@ -7834,7 +7834,7 @@
           <w:szCs w:val="24"/>
           <w:rtl/>
         </w:rPr>
-        <w:t xml:space="preserve">מנהל בכיר. יזם ותיק. רופא. עורך דין. או מהנדס מאוד בכיר, מהסוג שכבר לא מתכנת. משהו שבו הוא לא צריך להוכיח, והבגדים מראים את זה. דיקן. בעלים של חברה שהקים לפני עשרים שנה ועכשיו רק מגיע לישיבות.</w:t>
+        <w:t xml:space="preserve">מנהל בכיר. יזם ותיק. רופא. עורך דין. או מהנדס מאוד בכיר, מהסוג שכבר לא מתכנת, רק יושב בישיבות ואומר "לא". משהו שבו הוא לא צריך להוכיח, והבגדים מראים את זה. דיקן. בעלים של חברה שהקים לפני עשרים שנה ועכשיו רק מגיע לישיבות הדירקטוריון. ואני יכולה לדמיין אותו גם בטכניון, פרופסור למכונות, כזה שהסטודנטים מפחדים ממנו ואז מגלים שהוא הכי נחמד.</w:t>
       </w:r>
     </w:p>
     <w:p>
@@ -7894,7 +7894,7 @@
           <w:szCs w:val="24"/>
           <w:rtl/>
         </w:rPr>
-        <w:t xml:space="preserve">גבוה. ובעיקר חברתית: השכלה, ניסיון, מעמד שבא ממה שהוא עשה. כלכלית, אני מניחה שגם, אבל שוב, לא רואה בבגדים, אני מניחה. מי שמתלבש ככה בגיל הזה הוא בדרך כלל מסודר. וזה בדרך כלל, לא תמיד. יש לי שכן שנראה בדיוק ככה וחייב כסף לכל הבניין. אז בבקשה, תרשמי "בדרך כלל".</w:t>
+        <w:t xml:space="preserve">גבוה. ובעיקר חברתית: השכלה, ניסיון, מעמד שבא ממה שהוא עשה. כלכלית, אני מניחה שגם, אבל שוב, לא רואה בבגדים, אני מניחה. מי שמתלבש ככה בגיל הזה הוא בדרך כלל מסודר. וזה בדרך כלל, לא תמיד. יש לי שכן שנראה בדיוק ככה וחייב כסף לכל הבניין, ומתלבש ככה בדיוק כדי שלא יחשדו. אז בבקשה, תרשמי "בדרך כלל". ותרשמי גם שאני יודעת שאני מניחה. זה ההבדל בין מה שאני רואה למה שאני מניחה, ואת שאלת מה אני רואה, ואני רואה חולצה כחולה, והכול מעבר לזה זה אני.</w:t>
       </w:r>
     </w:p>
     <w:p>
@@ -7954,7 +7954,7 @@
           <w:szCs w:val="24"/>
           <w:rtl/>
         </w:rPr>
-        <w:t xml:space="preserve">שום דבר. וזה הסימן. חולצה בלי כיתוב, שעון בלי כלום, חגורה רגילה. אין פריט אחד שנועד להרשים אותי, ולכן אני מתרשמת. ועכשיו, כשאת אומרת לי שאולי הנעליים האלה עולות יותר מהקפוצ'ון של הראשון, ואני לא הייתי יודעת לעולם, זה מעניין: הוא משלם הרבה כסף בדיוק כדי שאנשים כמוני לא ידעו. זה פונקציה מוזרה. אני מהנדסת, אני שואלת מה הפונקציה. והפונקציה היא כנראה לא לדבר איתי.</w:t>
+        <w:t xml:space="preserve">שום דבר. וזה הסימן. חולצה בלי כיתוב, שעון בלי כלום, חגורה רגילה. אין פריט אחד שנועד להרשים אותי, ולכן אני מתרשמת. ועכשיו, כשאת אומרת לי שאולי הנעליים האלה עולות יותר מהקפוצ'ון של הראשון, ואני לא הייתי יודעת לעולם, זה מעניין: הוא משלם הרבה כסף בדיוק כדי שאנשים כמוני לא ידעו. זה פונקציה מוזרה. אני מהנדסת, אני שואלת מה הפונקציה. והפונקציה היא כנראה לא לדבר איתי. או לדבר עם מישהו אחר, שאני לא מכירה, בשפה שאני לא מכירה. ואם ככה, אז הוא בעצם לא "לא מראה". הוא מראה למישהו אחר. ואני רק לא הקהל. וזה משנה את כל מה שאמרתי עליו, אני מבינה עכשיו.</w:t>
       </w:r>
     </w:p>
     <w:p>
@@ -8033,7 +8033,7 @@
           <w:szCs w:val="24"/>
           <w:rtl/>
         </w:rPr>
-        <w:t xml:space="preserve">ארבע, שלוש, אחת, שתיים. הגבר ראשון, הכי מבוסס, הכי "גמור", אין לו מה להוכיח. האישה שנייה, צמוד. ואז פער גדול. הבחור בטרנינג שלישי רק כי אני חושבת שיש לו יותר כסף מהבחורה, לא כי הוא גבוה יותר. והבחורה אחרונה. ואני שמה לב, תוך כדי, שדירגתי לפי מה שאני קוראת לו "מעמד", שזה בעצם השכלה ורצינות, ולא כסף. אם היית שואלת רק כסף, הבחור בטרנינג היה ראשון, הוא היחיד שאני בטוחה שהוציא. אז בעצם דירגתי את מי שדומה לי. (המראיינת: דומה?) כן. השניים הראשונים נראים כמו אנשים מהעבודה שלי. אני דירגתי את הצוות שלי למעלה. זה מה שעשיתי.</w:t>
+        <w:t xml:space="preserve">ארבע, שלוש, אחת, שתיים. הגבר ראשון, הכי מבוסס, הכי "גמור", אין לו מה להוכיח. האישה שנייה, צמוד. ואז פער גדול. הבחור בטרנינג שלישי רק כי אני חושבת שיש לו יותר כסף מהבחורה, לא כי הוא גבוה יותר. והבחורה אחרונה. ואני שמה לב, תוך כדי, שדירגתי לפי מה שאני קוראת לו "מעמד", שזה בעצם השכלה ורצינות, ולא כסף. אם היית שואלת רק כסף, הבחור בטרנינג היה ראשון, הוא היחיד שאני בטוחה שהוציא. אז בעצם דירגתי את מי שדומה לי. (המראיינת: דומה?) כן. השניים הראשונים נראים כמו אנשים מהעבודה שלי. אני דירגתי את הצוות שלי למעלה. זה מה שעשיתי. ואם הבחור בטרנינג היה עושה את הדירוג, הוא היה שם את עצמו ראשון ואותי... אותי הוא בכלל לא היה שם, כי טריקו אפור זה לא נכנס לדירוג שלו. אז כל אחד מדרג את עצמו למעלה. וזה אולי כל מה שיש פה. ארבע תמונות, ושש מראות.</w:t>
       </w:r>
     </w:p>
     <w:p>
@@ -8093,7 +8093,7 @@
           <w:szCs w:val="24"/>
           <w:rtl/>
         </w:rPr>
-        <w:t xml:space="preserve">מנסה להיראות עשיר: הבחור והבחורה, מובהק, זה כל הלוק. עשיר בלי להתאמץ: הגבר. ואולי זה כי הוא גבר, וגברים שלא מתאמצים זה הנורמה, אף אחד לא שואל אותם למה. האישה בבז', האמת, לא בטוחה שהיא נראית עשירה בכלל. מסודרת, כן. אם היא עשירה, היא מסתירה טוב. אז שניים מנסים ומצליחים להיראות עשירים, ושניים לא מנסים ולא נראים עשירים, ונראים משהו אחר. משכילים. רציניים. ובעיניי זה שווה יותר. אבל אני יודעת שזה בעיניי.</w:t>
+        <w:t xml:space="preserve">מנסה להיראות עשיר: הבחור והבחורה, מובהק, זה כל הלוק, הם היו מסכימים איתי, אני חושבת, הם לא מתביישים בזה. עשיר בלי להתאמץ: הגבר. ואולי זה כי הוא גבר, וגברים שלא מתאמצים זה הנורמה, אף אחד לא שואל אותם למה, ואישה שלא מתאמצת, שואלים. האישה בבז', האמת, לא בטוחה שהיא נראית עשירה בכלל. מסודרת, כן. אם היא עשירה, היא מסתירה טוב, והשאלה היא ממי, ועכשיו אני חושבת שממני. אז שניים מנסים ומצליחים להיראות עשירים, ושניים לא מנסים ולא נראים עשירים, ונראים משהו אחר. משכילים. רציניים. ובעיניי זה שווה יותר. אבל אני יודעת שזה בעיניי. ובעיני אמא של הבחור בטרנינג, הבן שלה הצליח והבחור בחולצה הכחולה הוא פקיד. ואני לא יכולה להגיד לה שהיא טועה. אני יכולה רק להגיד שאנחנו מסתכלות ממקומות שונים.</w:t>
       </w:r>
     </w:p>
     <w:p>
@@ -8153,7 +8153,7 @@
           <w:szCs w:val="24"/>
           <w:rtl/>
         </w:rPr>
-        <w:t xml:space="preserve">לעבוד, האישה, בלי ספק. היא נראית כמו המנהלת הכי טובה שהייתה לי, אישה שקטה שידעה הכול ולא הרימה קול אף פעם. חברה, גם איתה, או עם הגבר. אני מתחברת לאנשים שקטים, אני לא יודעת מה לעשות עם אנשים רועשים. עם השניים הראשונים, לא זה ולא זה, ואני יודעת שזה לא הוגן, אני לא מכירה אותם, אבל זאת התשובה האמיתית. לא הייתי יודעת על מה לדבר איתם. והם, כנראה, לא היו רוצים לדבר איתי. אז לפחות זה הדדי.</w:t>
+        <w:t xml:space="preserve">לעבוד, האישה, בלי ספק. היא נראית כמו המנהלת הכי טובה שהייתה לי, אישה שקטה שידעה הכול ולא הרימה קול אף פעם, ושכשטעיתי קראה לי לחדר ואמרה "תסבירי לי", ולא "למה". חברה, גם איתה, או עם הגבר. אני מתחברת לאנשים שקטים, אני לא יודעת מה לעשות עם אנשים רועשים, אני מתעייפת. עם השניים הראשונים, לא זה ולא זה, ואני יודעת שזה לא הוגן, אני לא מכירה אותם, אבל זאת התשובה האמיתית. לא הייתי יודעת על מה לדבר איתם. והם, כנראה, לא היו רוצים לדבר איתי. אז לפחות זה הדדי. ואולי, אם הייתי יושבת עם הבחורה שעה, הייתי מגלה שהיא קוראת ספרים ואני לא. זה קורה. זה קרה לי עם מישהי מהעבודה. אז אני אומרת "לא" ויודעת שה"לא" הזה הוא על בסיס תמונה. ובכל זאת "לא".</w:t>
       </w:r>
     </w:p>
     <w:p>
@@ -8251,7 +8251,7 @@
           <w:szCs w:val="24"/>
           <w:rtl/>
         </w:rPr>
-        <w:t xml:space="preserve">מפתיע אותי במובן אחד: את המחירים של השקטים לא הייתי מנחשת. חשבתי שהם לובשים בגדים רגילים ממקומות רגילים, וזה מה שאהבתי בהם. זה לא משנה את הדעה על האנשים, אבל זה משנה משהו בהיגיון. כי אם הסוודר עולה שמונת אלפים שקל, והמטרה שלו היא שאני לא אדע, אז זה בזבוז מאוד מתוחכם. ואני שואלת מה הפונקציה, ואין לי תשובה טובה, חוץ מזה שהפונקציה היא לדבר עם אנשים אחרים, לא איתי. ואם זה ככה, אז היוקרה השקטה היא אולי אפילו יותר מתנשאת מהלוגו, כי היא בוחרת מי יראה. הלוגו, לפחות, הוא דמוקרטי. כולם רואים. גם זה שלא רציתי לשבת לידו באוטובוס. אז עכשיו אני פחות בטוחה במה שאמרתי עליו. תרשמי.</w:t>
+        <w:t xml:space="preserve">מפתיע אותי במובן אחד: את המחירים של השקטים לא הייתי מנחשת. חשבתי שהם לובשים בגדים רגילים ממקומות רגילים, וזה מה שאהבתי בהם, שהם כמוני, רק מסודרים יותר. זה לא משנה את הדעה על האנשים, אבל זה משנה משהו בהיגיון. כי אם הסוודר עולה שמונת אלפים שקל, והמטרה שלו היא שאני לא אדע, אז זה בזבוז מאוד מתוחכם. ואני שואלת מה הפונקציה, ואין לי תשובה טובה, חוץ מזה שהפונקציה היא לדבר עם אנשים אחרים, לא איתי. ואם זה ככה, אז היוקרה השקטה היא אולי אפילו יותר מתנשאת מהלוגו, כי היא בוחרת מי יראה, והיא בחרה שלא אני. הלוגו, לפחות, הוא דמוקרטי. כולם רואים. גם זה שלא רציתי לשבת לידו באוטובוס. הוא לא הסתיר ממני כלום. אז עכשיו אני פחות בטוחה במה שאמרתי עליו. תרשמי. ותרשמי שאני לא אוהבת שאני צריכה לחזור בי, ואני חוזרת.</w:t>
       </w:r>
     </w:p>
     <w:p>
@@ -8311,7 +8311,7 @@
           <w:szCs w:val="24"/>
           <w:rtl/>
         </w:rPr>
-        <w:t xml:space="preserve">"בשביל מי זה." זה מה שעובר. כי אף אחד לא לובש לוגו גדול בשביל עצמו, בבית, לבד. הוא לובש בשביל מי שיסתכל. ואז אני שואלת מי קהל היעד, והתשובה היא בדרך כלל אנשים שגם הם מודדים לפי לוגו. ואני לא בקהל הזה, אז הלוגו לא עובד עליי, הוא עובד נגדו. אבל, ואני רוצה שזה יהיה בראיון, אני זוכרת את ההורים שלי בשנות התשעים, שרצו מאוד דברים עם שמות, כי זה היה הסימן שהם הגיעו למקום שיש בו. ואני לא יכולה לשפוט אותם, ואז אני לא יכולה גם אותו. אז יש הבנה. רק לא הערכה. ואולי גם זה יבוא.</w:t>
+        <w:t xml:space="preserve">"בשביל מי זה." זה מה שעובר. כי אף אחד לא לובש לוגו גדול בשביל עצמו, בבית, לבד, מול הטלוויזיה. הוא לובש בשביל מי שיסתכל. ואז אני שואלת מי קהל היעד, והתשובה היא בדרך כלל אנשים שגם הם מודדים לפי לוגו. ואני לא בקהל הזה, אז הלוגו לא עובד עליי, הוא עובד נגדו. אבל, ואני רוצה שזה יהיה בראיון, אני זוכרת את ההורים שלי בשנות התשעים, שרצו מאוד דברים עם שמות, כי זה היה הסימן שהם הגיעו למקום שיש בו, אחרי שנים של אין. אבא שלי קנה ג'ינס ליוויס ראשון בגיל ארבעים ושתיים ולבש אותו לחתונות. ואני לא יכולה לשפוט אותו, ואז אני לא יכולה גם את הבחור בטרנינג. אז יש הבנה. רק לא הערכה. ואולי גם זה יבוא. אולי בעוד עשר שנים, כשהבת שלי תקנה משהו עם לוגו במשכורת הראשונה שלה, אני אבין גם את זה.</w:t>
       </w:r>
     </w:p>
     <w:p>
@@ -8371,7 +8371,7 @@
           <w:szCs w:val="24"/>
           <w:rtl/>
         </w:rPr>
-        <w:t xml:space="preserve">כן. שהראיון שלך הראה לי שאני מאוד שיפוטית, ושאני שופטת לפי קוד שלמדתי בטכניון ובהייטק, שבו פשטות זה מעמד. ואני חושבת שהקוד הזה לא יותר נכון מהקוד של הבחור בטרנינג. הוא רק הקוד של הקבוצה שלי. אז אם המחקר שלך הוא על רושם ראשוני, הייתי אומרת שהרושם הראשוני אומר יותר על מי שמסתכל מאשר על מי שלובש. וזה כנראה מה שגילית גם מהאחרות. ואם לא, אז זה מה שגילית ממני.</w:t>
+        <w:t xml:space="preserve">כן. שהראיון שלך הראה לי שאני מאוד שיפוטית, ושאני שופטת לפי קוד שלמדתי בטכניון ובהייטק, שבו פשטות זה מעמד, והקוד הזה בא מהבית, מההורים שקראו ספרים בין משמרות ניקיון. ואני חושבת שהקוד הזה לא יותר נכון מהקוד של הבחור בטרנינג. הוא רק הקוד של הקבוצה שלי. ושתי הקבוצות מסתכלות אחת על השנייה ואומרות "הם לא מבינים". אז אם המחקר שלך הוא על רושם ראשוני, הייתי אומרת שהרושם הראשוני אומר יותר על מי שמסתכל מאשר על מי שלובש. וזה כנראה מה שגילית גם מהאחרות. ואם לא, אז זה מה שגילית ממני. ואם תרצי, תשלחי לי מה אמרו האחרות. מעניין אותי אם מישהי דירגה את הבחור בטרנינג ראשון. אני מקווה שכן. זה יעשה לי טוב לדעת שאני לא צודקת.</w:t>
       </w:r>
     </w:p>
     <w:p>
@@ -8427,7 +8427,7 @@
           <w:szCs w:val="24"/>
           <w:rtl/>
         </w:rPr>
-        <w:t xml:space="preserve">תאריך: 11.10.2026    משך: 25 דקות    מקום: ספריית האוניברסיטה, חיפה    הקלטה: בטלפון, בהסכמה</w:t>
+        <w:t xml:space="preserve">תאריך: 11.10.2026    משך: 29 דקות    מקום: ספריית האוניברסיטה, חיפה    הקלטה: בטלפון, בהסכמה</w:t>
       </w:r>
     </w:p>
     <w:p>
@@ -8506,7 +8506,7 @@
           <w:szCs w:val="24"/>
           <w:rtl/>
         </w:rPr>
-        <w:t xml:space="preserve">עשרים ושתיים. שנה שנייה פסיכולוגיה באוניברסיטת חיפה. גרה בעתלית אצל ההורים, נוסעת כל יום, שעה לכל כיוון, ברכבת. בסופי שבוע מלצרית במסעדה על החוף. השתחררתי לפני שנתיים, הייתי מש"קית חינוך. בזוגיות, אוהבת ים, אוהבת מוזיקה. ואני אחת מהאנשים שבאמת מתעניינים במה שאת שואלת, כי זה בדיוק מה שאני לומדת, אז סליחה מראש אם אני אנתח יותר מדי.</w:t>
+        <w:t xml:space="preserve">עשרים ושתיים. שנה שנייה פסיכולוגיה באוניברסיטת חיפה. גרה בעתלית אצל ההורים, נוסעת כל יום, שעה לכל כיוון, ברכבת, זה הזמן שבו אני בטלפון, כלומר באינסטגרם. בסופי שבוע מלצרית במסעדה על החוף, שנה וחצי, וגם שם אני רואה בגדים כל היום, מי מזמין מה ומי משאיר טיפ. השתחררתי לפני שנתיים, הייתי מש"קית חינוך, שזה אומר שעמדתי מול חיילים ודיברתי, אז אני רגילה לדבר. בזוגיות, שנה. אוהבת ים, אוהבת מוזיקה, אוהבת לנתח אנשים, וזה בדיוק מה שאת שואלת, אז סליחה מראש אם אני אנתח יותר מדי, זה מחלה של השנה השנייה.</w:t>
       </w:r>
     </w:p>
     <w:p>
@@ -8566,7 +8566,7 @@
           <w:szCs w:val="24"/>
           <w:rtl/>
         </w:rPr>
-        <w:t xml:space="preserve">ארבע. אוהבת אופנה, מסתכלת המון, יודעת מה הולך, ואין לי כסף לקנות כלום ממה שאני אוהבת, אז הכול בראש ובטיקטוק. אני כן יודעת מותגים, יודעת מה זה יוקרה שקטה ומה זה לוגומניה, זה דיון שלם ברשתות כבר שנתיים, והוא מעניין אותי גם מהצד של מה אנשים מנסים להגיד דרך זה. אז ארבע, ואם היה "ארבע בראש וחמש בלי כסף", הייתי לוקחת.</w:t>
+        <w:t xml:space="preserve">ארבע. אוהבת אופנה, מסתכלת המון, יודעת מה הולך, ואין לי כסף לקנות כלום ממה שאני אוהבת, אז הכול בראש ובטיקטוק, יש לי תיקייה שלמה של "כשיהיה כסף". אני כן יודעת מותגים, יודעת מה זה יוקרה שקטה ומה זה לוגומניה, זה דיון שלם ברשתות כבר שנתיים, ובטיקטוק יש סרטונים שמסבירים לך איך "לזהות כסף ישן", והוא מעניין אותי גם מהצד של מה אנשים מנסים להגיד דרך זה. אז ארבע, ואם היה "ארבע בראש וחמש בלי כסף", הייתי לוקחת. ובעבודה, במסעדה, זה חמש, כי אני צריכה לדעת מי ישאיר טיפ, וזה קשור, האמת. תלוי בבגדים. ולא כמו שחושבים.</w:t>
       </w:r>
     </w:p>
     <w:p>
@@ -8664,7 +8664,7 @@
           <w:szCs w:val="24"/>
           <w:rtl/>
         </w:rPr>
-        <w:t xml:space="preserve">אני מסתכלת עליו ורואה מישהו שלמד איך להיות עשיר מטיקטוק. הלוק הזה הוא בדיוק מה שמראים ברשתות כ"לוק של מצליחנים", והוא לבש אותו שלם, מהראש עד הנעליים, כמו מדים. בן עשרים ושמונה בערך. בטוח כלפי חוץ. ומאוד, מאוד תלוי במה אחרים חושבים. אם הייתי צריכה לנחש, הוא בודק עכשיו כמה לייקים קיבלה התמונה הזאת. וזה לא ביקורת. גם אני בודקת.</w:t>
+        <w:t xml:space="preserve">אני מסתכלת עליו ורואה מישהו שלמד איך להיות עשיר מטיקטוק. הלוק הזה הוא בדיוק מה שמראים ברשתות כ"לוק של מצליחנים", והוא לבש אותו שלם, מהראש עד הנעליים, כמו מדים. בן עשרים ושמונה בערך. בטוח כלפי חוץ. ומאוד, מאוד תלוי במה אחרים חושבים. אם הייתי צריכה לנחש, הוא בודק עכשיו כמה לייקים קיבלה התמונה הזאת. וזה לא ביקורת. גם אני בודקת. כולם בודקים. רק שהוא בודק עם שלושים אלף שקל על הגוף, ואני בודקת עם חולצה מזארה. ובמסעדה, הוא היה הלקוח שמזמין את הבקבוק היקר, וצועק קצת על המלצר, ומשאיר טיפ גדול, כי הטיפ הוא גם חלק מהלוק. תאמיני לי. הטיפ הוא פריט לבוש.</w:t>
       </w:r>
     </w:p>
     <w:p>
@@ -8724,7 +8724,7 @@
           <w:szCs w:val="24"/>
           <w:rtl/>
         </w:rPr>
-        <w:t xml:space="preserve">משהו שהוא היה קורא לו "יזם". אולי באמת מכניס כסף, דרופשיפינג, רכבים, נדל"ן, קריפטו. אולי הוא שכיר שמציג את עצמו כיזם, יש הרבה. אולי ספורטאי. אולי אבא עשיר והוא "מנהל" משהו. מה שבטוח, מישהו שהכסף הוא נושא מרכזי בשיחה שלו, גם כשלא שואלים.</w:t>
+        <w:t xml:space="preserve">משהו שהוא היה קורא לו "יזם". אולי באמת מכניס כסף, דרופשיפינג, רכבים, נדל"ן, קריפטו. אולי הוא שכיר שמציג את עצמו כיזם, יש הרבה, בטיקטוק כולם יזמים. אולי ספורטאי. אולי אבא עשיר והוא "מנהל" משהו. מה שבטוח, מישהו שהכסף הוא נושא מרכזי בשיחה שלו, גם כשלא שואלים. ואני מכירה כאלה מהצבא, מהמש"קים, שהיום הם "בתחום הנדל"ן" ומעלים סטוריז מהאוטו. ואני אוהבת אותם, חלקם. אבל אני יודעת שהלוק הזה בא לפני הכסף, לא אחרי. קודם קונים את הקפוצ'ון, ואז מנסים להגיע למקום שבו הוא מוצדק.</w:t>
       </w:r>
     </w:p>
     <w:p>
@@ -8784,7 +8784,7 @@
           <w:szCs w:val="24"/>
           <w:rtl/>
         </w:rPr>
-        <w:t xml:space="preserve">כלכלית, יש כסף. הסט הזה עולה הרבה, ואני יודעת, כי אני רואה את המחירים כל יום בטלפון ובוכה. חברתית... אני לא אוהבת "נמוך". אני אגיד "כסף חדש": מעמד שעלה כלכלית ועוד לא עלה חברתית, ומנסה לסגור את הפער עם לוגו. ואני לא שופטת, ממש לא, זה הנושא של הקורס שלי בפסיכולוגיה חברתית, צורך בהכרה, ואין דבר יותר אנושי מזה. רק שאצלו זה כתוב על החזה באותיות של שלושים סנטימטר.</w:t>
+        <w:t xml:space="preserve">כלכלית, יש כסף. הסט הזה עולה הרבה, ואני יודעת, כי אני רואה את המחירים כל יום בטלפון ובוכה בשקט. חברתית... אני לא אוהבת "נמוך". אני אגיד "כסף חדש": מעמד שעלה כלכלית ועוד לא עלה חברתית, ומנסה לסגור את הפער עם לוגו. ואני לא שופטת, ממש לא, זה הנושא של הקורס שלי בפסיכולוגיה חברתית, צורך בהכרה, ואין דבר יותר אנושי מזה, כולנו רוצים שיראו אותנו. רק שאצלו זה כתוב על החזה באותיות של שלושים סנטימטר. ואצל האישה בתמונה 3, שאני מנחשת שאת תראי לי, זה כתוב באותיות שרק מי שיודע קורא. ושניהם כותבים. רק אחד צועק ואחת לוחשת. ולוחשים, בחברה שלנו, זה מעמד גבוה יותר. למה? כי לוחשים יכולים להרשות לעצמם שלא ישמעו.</w:t>
       </w:r>
     </w:p>
     <w:p>
@@ -8844,7 +8844,7 @@
           <w:szCs w:val="24"/>
           <w:rtl/>
         </w:rPr>
-        <w:t xml:space="preserve">הלוגו, שהוא לא לוגו, הוא שלט. השעון, שהוא לא שעון, הוא הצהרה. הסניקרס, שהם הסניקרס שכולם מזהים. ובעיקר, שהלוק שלם. אין פריט אחד שהוא "סתם", שהוא מהבית, שהוא נוח. כשכל פריט נבחר כדי לסמן, אני מבינה שהסימון הוא המטרה. בגד אחד עם לוגו אומר "אהבתי את הבגד". ארבעה אומרים "אני רוצה שתדעו". וחמישה היו אומרים "אני מפחד שלא תדעו".</w:t>
+        <w:t xml:space="preserve">הלוגו, שהוא לא לוגו, הוא שלט. השעון, שהוא לא שעון, הוא הצהרה. הסניקרס, שהם הסניקרס שכולם מזהים, שהיו בכל סרטון לפני שנתיים. ובעיקר, שהלוק שלם. אין פריט אחד שהוא "סתם", שהוא מהבית, שהוא נוח, שהוא ירושה. כשכל פריט נבחר כדי לסמן, אני מבינה שהסימון הוא המטרה. בגד אחד עם לוגו אומר "אהבתי את הבגד". ארבעה אומרים "אני רוצה שתדעו". וחמישה היו אומרים "אני מפחד שלא תדעו". (המראיינת: והוא בארבעה?) הוא בארבעה וחצי. השעון זה החצי. השעון הוא הפריט שהופך "רוצה" ל"צריך". בלי השעון הייתי אומרת שהוא אוהב את המותג. עם השעון אני אומרת שהוא צריך אותו.</w:t>
       </w:r>
     </w:p>
     <w:p>
@@ -8923,7 +8923,7 @@
           <w:szCs w:val="24"/>
           <w:rtl/>
         </w:rPr>
-        <w:t xml:space="preserve">זה הלוק שחצי מהבנות באוניברסיטה שואפות אליו, ואני אומרת את זה בלי שיפוט, כי בחלק מהימים גם אני. יפה, מטופחת, מודעת למצלמה, הכול מוכן. היא נראית לי נחמדה, ועובדת קשה על הלוק, ו... קצת כלואה בו. כאילו היא חייבת להיראות ככה כל יום, וביום שלא, משהו יקרה. אני מכירה אותה מהתיכון. לא אותה. אבל אותה.</w:t>
+        <w:t xml:space="preserve">זה הלוק שחצי מהבנות באוניברסיטה שואפות אליו, ואני אומרת את זה בלי שיפוט, כי בחלק מהימים גם אני, בעיקר בימים שיש לי מבחן ואני רוצה להרגיש שאני מישהי. יפה, מטופחת, מודעת למצלמה, הכול מוכן, הכול בזווית. היא נראית לי נחמדה, ועובדת קשה על הלוק, ו... קצת כלואה בו. כאילו היא חייבת להיראות ככה כל יום, וביום שלא, משהו יקרה, מישהי תצלם, מישהו יגיד. אני מכירה אותה מהתיכון. לא אותה. אבל אותה. בכיתה שלי היו שלוש כאלה, ואחת מהן היום באמת משפיענית, ושתיים עובדות בקניון, ושלושתן עדיין נראות בדיוק ככה, וזה שמונה שנים.</w:t>
       </w:r>
     </w:p>
     <w:p>
@@ -8983,7 +8983,7 @@
           <w:szCs w:val="24"/>
           <w:rtl/>
         </w:rPr>
-        <w:t xml:space="preserve">יוצרת תוכן. או תחום היופי. או קמעונאות של מותגים, בחנות. או סטודנטית שההורים נותנים, גם זה. או שהיא עובדת במשהו רגיל לגמרי ומוציאה על זה את כל המשכורת, ואני מכירה כאלה, שתיים. הלוק לא אומר מה היא עושה. הוא אומר מה היא רוצה שיחשבו שהיא עושה.</w:t>
+        <w:t xml:space="preserve">יוצרת תוכן. או תחום היופי. או קמעונאות של מותגים, בחנות. או סטודנטית שההורים נותנים, גם זה, יש לנו כאלה בשנתון. או שהיא עובדת במשהו רגיל לגמרי ומוציאה על זה את כל המשכורת, ואני מכירה כאלה, שתיים, אחת מהן מלצרית איתי, ועם הטיפים היא קנתה את התיק הזה בדיוק, ואני ראיתי כמה משמרות זה לקח. הלוק לא אומר מה היא עושה. הוא אומר מה היא רוצה שיחשבו שהיא עושה. או מה היא רוצה שיחשבו שהיא יכולה להרשות לעצמה. וזה לא אותו דבר כמו מה היא יכולה.</w:t>
       </w:r>
     </w:p>
     <w:p>
@@ -9043,7 +9043,7 @@
           <w:szCs w:val="24"/>
           <w:rtl/>
         </w:rPr>
-        <w:t xml:space="preserve">כלכלית, אני לא בטוחה בכלל. זה הלוק הכי קל לחקות שיש, גם עם חיקויים וגם עם פריטי כניסה. חברתית, בינוני, אולי בינוני פלוס, והלוק מושך למעלה. ואני אומרת את זה מתוך הבנה מלאה, כי אם היה לי התיק הזה הייתי מצלמת אותו מארבע זוויות ומעלה. היא לא עושה משהו שאני לא הייתי עושה. היא רק עושה אותו בלי להתבייש.</w:t>
+        <w:t xml:space="preserve">כלכלית, אני לא בטוחה בכלל. זה הלוק הכי קל לחקות שיש, גם עם חיקויים וגם עם פריטי כניסה, ובכל סרטון טיקטוק מסבירים איך לבנות אותו בזול. חברתית, בינוני, אולי בינוני פלוס, והלוק מושך למעלה. ואני אומרת את זה מתוך הבנה מלאה, כי אם היה לי התיק הזה הייתי מצלמת אותו מארבע זוויות ומעלה ומתייגת את המותג. היא לא עושה משהו שאני לא הייתי עושה. היא רק עושה אותו בלי להתבייש. ואני הייתי עושה ומתביישת, ומצלמת בכל זאת. אז מי מאיתנו יותר כנה? היא.</w:t>
       </w:r>
     </w:p>
     <w:p>
@@ -9103,7 +9103,7 @@
           <w:szCs w:val="24"/>
           <w:rtl/>
         </w:rPr>
-        <w:t xml:space="preserve">התיק, המונוגרם, זה הפריט מספר אחת של "תראו שיש לי", בכל רשימה. החולצה עם הלוגו, שהיא בדיוק פריט הכניסה. המשקפיים. ואני שמה לב גם לציפורניים ולשיער, שהם לא בגדים אבל הם חלק מהחבילה: הכול מושלם, הכול מוכן לצילום. וזה לוק של רשתות, ולוק של רשתות נבנה כדי שיזהו אותו בשלוש שניות של גלילה. הוא לא בנוי לפגישה של שעה. הוא בנוי לשלוש שניות.</w:t>
+        <w:t xml:space="preserve">התיק, המונוגרם, זה הפריט מספר אחת של "תראו שיש לי", בכל רשימה, בכל סרטון. החולצה עם הלוגו, שהיא בדיוק פריט הכניסה, הדבר הראשון שקונים מהמותג כי זה מה שאפשר. המשקפיים. ואני שמה לב גם לציפורניים ולשיער, שהם לא בגדים אבל הם חלק מהחבילה: הכול מושלם, הכול מוכן לצילום, אין שערה. וזה לוק של רשתות, ולוק של רשתות נבנה כדי שיזהו אותו בשלוש שניות של גלילה. הוא לא בנוי לפגישה של שעה. הוא בנוי לשלוש שניות. ואם היית יושבת איתה שעה, אולי הלוק היה מתפרק, או אולי היא הייתה מתפרקת, לא יודעת. אבל בשלוש שניות הוא עובד מצוין. ואני, שגוללת, נותנת לו לייק. אז הוא עובד גם עליי.</w:t>
       </w:r>
     </w:p>
     <w:p>
@@ -9182,7 +9182,7 @@
           <w:szCs w:val="24"/>
           <w:rtl/>
         </w:rPr>
-        <w:t xml:space="preserve">יוקרה שקטה. קלאסי. אני מזהה את זה מיד, זה הטרנד הגדול של השנים האחרונות, ואני יודעת שהסוודר והתיק האלה עולים הון גם אם לא רואים, בעיקר כי לא רואים. היא נראית אלגנטית, מבוגרת, מסודרת, כזאת שלא צריכה כלום מאף אחד. ו... האמת? קצת משעממת. יפה, אבל משעממת. אין בה סיכון, אין בה טעות אחת. זה לוק שאומר "אני כבר שם", ומי שכבר שם לא צריך להיות מעניין.</w:t>
+        <w:t xml:space="preserve">יוקרה שקטה. קלאסי. אני מזהה את זה מיד, זה הטרנד הגדול של השנים האחרונות, ואני יודעת שהסוודר והתיק האלה עולים הון גם אם לא רואים, בעיקר כי לא רואים, זה כל הרעיון. היא נראית אלגנטית, מבוגרת, מסודרת, כזאת שלא צריכה כלום מאף אחד. ו... האמת? קצת משעממת. יפה, אבל משעממת. אין בה סיכון, אין בה טעות אחת, אין בה משהו שהיא בחרה כי "בא לי". זה לוק שאומר "אני כבר שם", ומי שכבר שם לא צריך להיות מעניין. (המראיינת: משעממת זה רע?) לא. זה מה שאני רוצה להיות בגיל ארבעים. משעממת ככה. אבל בגיל עשרים ושתיים, אם הייתי נראית ככה, היו שואלים אותי אם הכול בסדר.</w:t>
       </w:r>
     </w:p>
     <w:p>
@@ -9242,7 +9242,7 @@
           <w:szCs w:val="24"/>
           <w:rtl/>
         </w:rPr>
-        <w:t xml:space="preserve">מנהלת בכירה. עורכת דין. אולי אמנות, עיצוב, גלריה. אשת עסקים. אני רואה אותה במשרד עם נוף לים, או בארוחת ערב במסעדה שקטה שאין לה שלט בחוץ. או מרצה בכירה פה, יש לנו כמה כאלה, שנכנסות לכיתה ואף אחד לא מדבר.</w:t>
+        <w:t xml:space="preserve">מנהלת בכירה. עורכת דין. אולי אמנות, עיצוב, גלריה. אשת עסקים. אני רואה אותה במשרד עם נוף לים, או בארוחת ערב במסעדה שקטה שאין לה שלט בחוץ, מהסוג שאני לא מלצרית בו. או מרצה בכירה פה, יש לנו כמה כאלה, שנכנסות לכיתה ואף אחד לא מדבר, ולא כי הן מאיימות, כי הן לא צריכות. המרצה שלי לפסיכולוגיה חברתית נראית בדיוק ככה, אגב, ואני בטוחה שהיא הייתה אוהבת את הראיון הזה.</w:t>
       </w:r>
     </w:p>
     <w:p>
@@ -9302,7 +9302,7 @@
           <w:szCs w:val="24"/>
           <w:rtl/>
         </w:rPr>
-        <w:t xml:space="preserve">הכי גבוה מהארבעה. כלכלית וחברתית. כי הלוק הזה הוא לא רק כסף, הוא ידע. צריך לדעת מה לקנות כדי להיראות ככה, וצריך סביבה שבה זה נחשב, אחרת סתם שילמת. זה לוק של מעמד גבוה מבוסס, וזה בדיוק מה שהטרנד מנסה להגיד: "אני לא צריכה להראות, כי כולם כבר יודעים". ואני חושבת שחצי מהאנשים שלובשים את זה היום רק מחקים, כמו הבחורה בתמונה 2, רק מהכיוון השני. היא מחקה עשירים רועשים, הם מחקים עשירים שקטים. אותו דבר.</w:t>
+        <w:t xml:space="preserve">הכי גבוה מהארבעה. כלכלית וחברתית. כי הלוק הזה הוא לא רק כסף, הוא ידע. צריך לדעת מה לקנות כדי להיראות ככה, וצריך סביבה שבה זה נחשב, אחרת סתם שילמת. זה לוק של מעמד גבוה מבוסס, וזה בדיוק מה שהטרנד מנסה להגיד: "אני לא צריכה להראות, כי כולם כבר יודעים". ואני חושבת שחצי מהאנשים שלובשים את זה היום רק מחקים, כמו הבחורה בתמונה 2, רק מהכיוון השני. היא מחקה עשירים רועשים, הם מחקים עשירים שקטים. אותו דבר. אותו צורך. רק מודל אחר. והמודל השקט יקר יותר, אז המחקים שלו פחות. וזה כל מה ש"מעמד" אומר בעצם: כמה עולה לחקות אותך.</w:t>
       </w:r>
     </w:p>
     <w:p>
@@ -9362,7 +9362,7 @@
           <w:szCs w:val="24"/>
           <w:rtl/>
         </w:rPr>
-        <w:t xml:space="preserve">הבדים, הצבעים, האין-לוגו. הסוודר נראה קשמיר, המעיל צמר טוב, התיק עור רך. הכול בז' קאמל שחור, הפלטה של הטרנד, מילימטר. ובעיקר מה שאין: שום סימון. ואני יודעת שגם זה סימון. סימון למי שמכיר. הלוק הזה הוא לוגו בלתי נראה. מי שיודע, יודע. מי שלא, חושב שזה סוודר. ושתי הקבוצות האלה הן בדיוק מה שהיא רוצה להפריד.</w:t>
+        <w:t xml:space="preserve">הבדים, הצבעים, האין-לוגו. הסוודר נראה קשמיר, המעיל צמר טוב, התיק עור רך, ואני יודעת את זה מסרטונים, לא מנגיעה, אף פעם לא נגעתי בקשמיר אמיתי. הכול בז' קאמל שחור, הפלטה של הטרנד, מילימטר, אין סטייה. ובעיקר מה שאין: שום סימון. ואני יודעת שגם זה סימון. סימון למי שמכיר. הלוק הזה הוא לוגו בלתי נראה. מי שיודע, יודע. מי שלא, חושב שזה סוודר. ושתי הקבוצות האלה הן בדיוק מה שהיא רוצה להפריד. היא רוצה שאמא שלי תחשוב שזה סוודר, ושהמרצה שלי תדע שזה לא. וזה עובד. ואני באמצע: אני יודעת, ואני לא שייכת. אני כמו מישהי שלמדה את השפה מספר ואף פעם לא הייתה במדינה.</w:t>
       </w:r>
     </w:p>
     <w:p>
@@ -9441,7 +9441,7 @@
           <w:szCs w:val="24"/>
           <w:rtl/>
         </w:rPr>
-        <w:t xml:space="preserve">גבר שנראה כמו אבא של חברה שלי מהצבא, רופא, שבחיים לא ראיתי בלי חולצה מכופתרת, גם בבריכה כמעט. נעים, רגוע, לא מתאמץ. ובאמת לא מתאמץ, לא כמו האישה בתמונה 3 שמתאמצת להיראות שלא. יש בו משהו יציב. ואולי קצת כבד. כזה שאם תשאלי אותו מה הוא לובש, הוא לא יבין את השאלה.</w:t>
+        <w:t xml:space="preserve">גבר שנראה כמו אבא של חברה שלי מהצבא, רופא, שבחיים לא ראיתי בלי חולצה מכופתרת, גם בבריכה כמעט, גם ביום העצמאות. נעים, רגוע, לא מתאמץ. ובאמת לא מתאמץ, לא כמו האישה בתמונה 3 שמתאמצת להיראות שלא. יש בו משהו יציב. ואולי קצת כבד, כזה שהשיחה איתו היא על מה אני "מתכננת לעשות עם התואר". כזה שאם תשאלי אותו מה הוא לובש, הוא לא יבין את השאלה, ויסתכל על החולצה שלו כאילו רואה אותה בפעם הראשונה. ואני מאמינה לו. זה ההבדל בינו לבינה: לה אני לא מאמינה שהיא לא יודעת. לו כן.</w:t>
       </w:r>
     </w:p>
     <w:p>
@@ -9501,7 +9501,7 @@
           <w:szCs w:val="24"/>
           <w:rtl/>
         </w:rPr>
-        <w:t xml:space="preserve">רופא. עורך דין. מנהל. יזם ותיק. לא הייטק, בהייטק זה טי שירט. משהו ממוסד, עם משרד ומזכירה שקוראת לו "דוקטור" גם אם הוא לא. או אקדמאי. אדם שאנשים צעירים ממנו קוראים לו בשם משפחה.</w:t>
+        <w:t xml:space="preserve">רופא. עורך דין. מנהל. יזם ותיק. לא הייטק, בהייטק זה טי שירט, ובטכניון ממש טי שירט עם חור. משהו ממוסד, עם משרד ומזכירה שקוראת לו "דוקטור" גם אם הוא לא. או אקדמאי. אדם שאנשים צעירים ממנו קוראים לו בשם משפחה. ואני רואה אותו גם בהורים של מישהו שאני יוצאת איתו, בארוחת שישי, שואל אותי שאלות מנומסות ומחליט עליי תוך דקה, בדיוק כמו שאני מחליטה עליו עכשיו.</w:t>
       </w:r>
     </w:p>
     <w:p>
@@ -9561,7 +9561,7 @@
           <w:szCs w:val="24"/>
           <w:rtl/>
         </w:rPr>
-        <w:t xml:space="preserve">גבוה. בערך כמו האישה, אולי קצת מתחת כלכלית וקצת מעל חברתית, כי הלוק שלו הוא פחות טרנד ויותר "ככה מתלבשים, מה השאלה". הוא נראה כמו מישהו שהמעמד שלו לא תלוי בבגדים, והיה נראה אותו דבר גם בחולצה מזארה. היא, לא. אם הסוודר היה מזארה, זה היה נראה. זה מעמד שבא ממקום אחר, לא מהארון.</w:t>
+        <w:t xml:space="preserve">גבוה. בערך כמו האישה, אולי קצת מתחת כלכלית וקצת מעל חברתית, כי הלוק שלו הוא פחות טרנד ויותר "ככה מתלבשים, מה השאלה". הוא נראה כמו מישהו שהמעמד שלו לא תלוי בבגדים, והיה נראה אותו דבר גם בחולצה מזארה. היא, לא. אם הסוודר היה מזארה, זה היה נראה, היא הייתה יודעת, והיא הייתה מרגישה את זה כל היום. זה מעמד שבא ממקום אחר, לא מהארון. מהמשפחה, מהמקצוע, מעשרים שנה של להיות מישהו. והבגדים רק לא מפריעים. וזה, בעצם, הדבר הכי יקר: בגדים שלא מפריעים.</w:t>
       </w:r>
     </w:p>
     <w:p>
@@ -9621,7 +9621,7 @@
           <w:szCs w:val="24"/>
           <w:rtl/>
         </w:rPr>
-        <w:t xml:space="preserve">פשטות, אבל איכותית: הנעליים נראות טובות, החולצה יושבת, השעון דק. ושום לוגו. ואצל גברים ההיעדר אומר יותר, אני חושבת, כי הלחץ על גברים להראות הצלחה דרך מותג גדול יותר, לפחות ברשתות, שם כל "יזם" הוא בשעון. גבר שלא עושה את זה הוא או מישהו שלא אכפת לו, או מישהו שכבר לא צריך. הוא נראה לי השני. אולי כי אני רוצה שיהיה השני.</w:t>
+        <w:t xml:space="preserve">פשטות, אבל איכותית: הנעליים נראות טובות, החולצה יושבת, השעון דק. ושום לוגו. ואצל גברים ההיעדר אומר יותר, אני חושבת, כי הלחץ על גברים להראות הצלחה דרך מותג גדול יותר, לפחות ברשתות, שם כל "יזם" הוא בשעון, ובמסעדה, שם מי שמזמין את הבקבוק הכי יקר הוא תמיד עם לוגו. גבר שלא עושה את זה הוא או מישהו שלא אכפת לו, או מישהו שכבר לא צריך. הוא נראה לי השני. אולי כי אני רוצה שיהיה השני. כי אם הוא הראשון, אם פשוט לא אכפת לו, אז כל התיאוריה שלי על "מעמד" מתפרקת, והוא סתם גבר בחולצה. ואני צריכה שיהיה בזה יותר מזה, כנראה.</w:t>
       </w:r>
     </w:p>
     <w:p>
@@ -9700,7 +9700,7 @@
           <w:szCs w:val="24"/>
           <w:rtl/>
         </w:rPr>
-        <w:t xml:space="preserve">שלוש, ארבע, אחת, שתיים. האישה ביוקרה השקטה ראשונה, הלוק הכי יקר והכי "מעמדי", ואני יודעת כמה. הגבר שני, צמוד. הבחור בלוגו שלישי, יש כסף, אין מעמד, עדיין. הבחורה אחרונה, גם הכסף בספק. אבל... רגע. אני רוצה להגיד משהו על הדירוג הזה. זה בדיוק הדירוג שלימדו אותי לעשות. ברשתות, כל הדיון על יוקרה שקטה הוא בעצם דיון שאומר "כסף חדש זה וולגרי", וזה דיון שמישהו מרוויח ממנו, המותגים השקטים, והאנשים שכבר בפנים. ומישהו מפסיד ממנו, הבחור בטרנינג, שעשה בדיוק מה שאמרו לו שעושים כשמצליחים. אז אני מדרגת ככה. ואני גם רואה את היד שמדרגת. ואני לא יודעת מה לעשות עם זה חוץ מלהגיד לך.</w:t>
+        <w:t xml:space="preserve">שלוש, ארבע, אחת, שתיים. האישה ביוקרה השקטה ראשונה, הלוק הכי יקר והכי "מעמדי", ואני יודעת כמה. הגבר שני, צמוד. הבחור בלוגו שלישי, יש כסף, אין מעמד, עדיין. הבחורה אחרונה, גם הכסף בספק. אבל... רגע. אני רוצה להגיד משהו על הדירוג הזה. זה בדיוק הדירוג שלימדו אותי לעשות. ברשתות, כל הדיון על יוקרה שקטה הוא בעצם דיון שאומר "כסף חדש זה וולגרי", וזה דיון שמישהו מרוויח ממנו, המותגים השקטים, והאנשים שכבר בפנים. ומישהו מפסיד ממנו, הבחור בטרנינג, שעשה בדיוק מה שאמרו לו שעושים כשמצליחים, ועכשיו אומרים לו שזה וולגרי, ולא אמרו לו מתי החליפו את הכללים. אז אני מדרגת ככה. ואני גם רואה את היד שמדרגת. ואני לא יודעת מה לעשות עם זה חוץ מלהגיד לך. ואולי לכתוב על זה עבודה. אולי זאת העבודה שלי בשנה הבאה.</w:t>
       </w:r>
     </w:p>
     <w:p>
@@ -9760,7 +9760,7 @@
           <w:szCs w:val="24"/>
           <w:rtl/>
         </w:rPr>
-        <w:t xml:space="preserve">מנסה להיראות עשיר: הבחור והבחורה, ברור, זה כל הרעיון של הלוק, הם יודו בזה. עשיר בלי להתאמץ: הגבר. באמת. האישה בבז', לא, היא מתאמצת, רק שהמאמץ הוא להיראות שלא. יוקרה שקטה היא לא היעדר מאמץ, היא מאמץ מסוג אחר, יקר יותר, מתוחכם יותר, ועם הכחשה. ואני חושבת שזה הדבר הכי מעניין בארבע התמונות: שניים שמנסים להיראות עשירים בקול, אחת שמנסה להיראות עשירה בשקט, ואחד שאולי באמת לא מנסה. ורק את האחרון אי אפשר לחקות, כי אין מה לחקות.</w:t>
+        <w:t xml:space="preserve">מנסה להיראות עשיר: הבחור והבחורה, ברור, זה כל הרעיון של הלוק, הם יודו בזה אם תשאלי אותם, הם לא מסתירים. עשיר בלי להתאמץ: הגבר. באמת. האישה בבז', לא, היא מתאמצת, רק שהמאמץ הוא להיראות שלא. יוקרה שקטה היא לא היעדר מאמץ, היא מאמץ מסוג אחר, יקר יותר, מתוחכם יותר, ועם הכחשה. ואני חושבת שזה הדבר הכי מעניין בארבע התמונות: שניים שמנסים להיראות עשירים בקול, אחת שמנסה להיראות עשירה בשקט, ואחד שאולי באמת לא מנסה. ורק את האחרון אי אפשר לחקות, כי אין מה לחקות. ואולי בגלל זה הוא במקום השני ולא הראשון אצלי: כי מה שאי אפשר לחקות אי אפשר גם ללמוד, ואני רוצה ללמוד, ואותה אפשר ללמוד, ואותו לא. אז דירגתי למעלה את מי שאני יכולה להפוך להיות.</w:t>
       </w:r>
     </w:p>
     <w:p>
@@ -9820,7 +9820,7 @@
           <w:szCs w:val="24"/>
           <w:rtl/>
         </w:rPr>
-        <w:t xml:space="preserve">לעבוד, האישה, כי אני רוצה ללמוד איך עושים את זה, את הלוק ואת הביטחון, ואני חושבת שהיא קשה אבל הוגנת. חברה, בכנות, הבחורה בתמונה 2. היא הכי כיפית, הכי פתוחה, הכי קלה, והיא הייתה מצלמת אותי יפה. הגבר, לעבוד כן, הוא נראה הוגן, חברות לא, פער דורות, הוא היה שואל אותי מה אני "מתכננת". והבחור בטרנינג, אף אחד מהשניים. הוא נראה לי כמו מישהו שהחברות שלו היא תמיד גם קצת תצוגה, ואני כבר יש לי מספיק מזה בטלפון.</w:t>
+        <w:t xml:space="preserve">לעבוד, האישה, כי אני רוצה ללמוד איך עושים את זה, את הלוק ואת הביטחון, ואני חושבת שהיא קשה אבל הוגנת, כזאת שתגיד לי "לא טוב, תעשי שוב" ואני אעשה שוב ואודה לה. חברה, בכנות, הבחורה בתמונה 2. היא הכי כיפית, הכי פתוחה, הכי קלה, והיא הייתה מצלמת אותי יפה, ואומרת לי שאני מהממת, ואני הייתי מאמינה לה לרגע. הגבר, לעבוד כן, הוא נראה הוגן, חברות לא, פער דורות, הוא היה שואל אותי מה אני "מתכננת". והבחור בטרנינג, אף אחד מהשניים. הוא נראה לי כמו מישהו שהחברות שלו היא תמיד גם קצת תצוגה, ואני כבר יש לי מספיק מזה בטלפון. ואני שמה לב שבחרתי לעבוד עם מי שמעליי ולהיות חברה של מי שלידי. זה כנראה מה שכולם עושים. רק שאצלי זה יצא לפי בגדים.</w:t>
       </w:r>
     </w:p>
     <w:p>
@@ -9918,7 +9918,7 @@
           <w:szCs w:val="24"/>
           <w:rtl/>
         </w:rPr>
-        <w:t xml:space="preserve">לא מפתיע, כי זיהיתי את המותגים מהרגע הראשון, ואני יודעת שהשקטים יקרים יותר, יש על זה סרטונים שלמים. מה שמעניין אותי זה שאת בכלל הצטרכת לגלות, כי זה אומר שלרוב האנשים זה לא ברור. ואז, בעצם, הלוק של האישה בבז' לא "עובד" על רוב האנשים. הוא עובד רק על הקבוצה שלה. וזה בדיוק הרעיון שלו. זה לא משנה לי את הדעה, זה מחדד אותה: שני הלוקים הם אותו מנגנון, "תראו אותי", רק עם קהל יעד אחר. הלוגו פונה לכולם. היוקרה השקטה פונה למועדון. ומי שבמועדון קורא לזה "טעם", ומי שלא, קורא לזה "סוודר".</w:t>
+        <w:t xml:space="preserve">לא מפתיע, כי זיהיתי את המותגים מהרגע הראשון, ואני יודעת שהשקטים יקרים יותר, יש על זה סרטונים שלמים, עם מחירים. מה שמעניין אותי זה שאת בכלל הצטרכת לגלות, כי זה אומר שלרוב האנשים זה לא ברור. ואז, בעצם, הלוק של האישה בבז' לא "עובד" על רוב האנשים. הוא עובד רק על הקבוצה שלה. וזה בדיוק הרעיון שלו. זה לא משנה לי את הדעה, זה מחדד אותה: שני הלוקים הם אותו מנגנון, "תראו אותי", רק עם קהל יעד אחר. הלוגו פונה לכולם. היוקרה השקטה פונה למועדון. ומי שבמועדון קורא לזה "טעם", ומי שלא, קורא לזה "סוודר". ומי שבאמצע, כמוני, קורא לזה "יום אחד". ואני חושבת שהמותגים השקטים יודעים בדיוק שיש אנשים כמוני, שיודעים ולא יכולים, ושזה הקהל שהכי רוצה, כי אנחנו נחסוך שנה בשביל סוודר. ואני אחסוך. אני יודעת שאני אחסוך.</w:t>
       </w:r>
     </w:p>
     <w:p>
@@ -9978,7 +9978,7 @@
           <w:szCs w:val="24"/>
           <w:rtl/>
         </w:rPr>
-        <w:t xml:space="preserve">שלושה דברים, מהר, בסדר הזה. אחת, זיהוי: אני יודעת מה זה ומה זה עולה. שתיים, שאלה: למה אתה צריך שאני אדע. שלוש, רחמים קטנים, שאני לא גאה בהם, כאילו הבן אדם הזה צריך שהחולצה תדבר במקומו. ואז אני תופסת את עצמי, כי אני סטודנטית לפסיכולוגיה ואני יודעת בדיוק מה הרחמים האלה עושים: הם הדרך שלי להרגיש מעליו. וזה לא יותר יפה מהלוגו שלו. זה רק שקט יותר. אז התשובה הכנה: לוגו גדול מעורר בי תחושת עליונות, ואני לא אוהבת את זה בעצמי, ואני עדיין מרגישה אותה.</w:t>
+        <w:t xml:space="preserve">שלושה דברים, מהר, בסדר הזה. אחת, זיהוי: אני יודעת מה זה ומה זה עולה. שתיים, שאלה: למה אתה צריך שאני אדע. שלוש, רחמים קטנים, שאני לא גאה בהם, כאילו הבן אדם הזה צריך שהחולצה תדבר במקומו. ואז אני תופסת את עצמי, כי אני סטודנטית לפסיכולוגיה ואני יודעת בדיוק מה הרחמים האלה עושים: הם הדרך שלי להרגיש מעליו. וזה לא יותר יפה מהלוגו שלו. זה רק שקט יותר. זה הלוגו שלי. אז התשובה הכנה: לוגו גדול מעורר בי תחושת עליונות, ואני לא אוהבת את זה בעצמי, ואני עדיין מרגישה אותה. ובמסעדה, אגב, הלקוח עם הלוגו הגדול משאיר את הטיפ הכי גדול, כמעט תמיד. ואז אני אוהבת אותו מאוד. אז התחושה שלי כלפיו תלויה אם הוא משלם לי. וזה כנראה אומר משהו על "מעמד" שלא רוצים לדעת.</w:t>
       </w:r>
     </w:p>
     <w:p>
@@ -10038,7 +10038,7 @@
           <w:szCs w:val="24"/>
           <w:rtl/>
         </w:rPr>
-        <w:t xml:space="preserve">כן. שמה שאת חוקרת הוא לא רושם ראשוני מלבוש. זה איך אנשים משתמשים בלבוש כדי לדרג זה את זה, ואיך הם מרגישים טוב עם הדירוג. כל השש, אני מנחשת, דירגו את השקטים מעל הרועשים, וכולן הרגישו שזה דירוג "נכון". ואני חושבת שזה הממצא: לא שיוקרה שקטה נראית יותר עשירה, אלא שהיא נראית יותר ראויה. ושזאת בדיוק המטרה שלה. ותודה, זה היה הראיון הכי מעניין שהייתי בו, כולל אלה שאני עושה בעצמי בקורס, ואני אומרת את זה גם כי רציתי לראות איך את מגיבה למחמאה.</w:t>
+        <w:t xml:space="preserve">כן. שמה שאת חוקרת הוא לא רושם ראשוני מלבוש. זה איך אנשים משתמשים בלבוש כדי לדרג זה את זה, ואיך הם מרגישים טוב עם הדירוג, ואיך הם קוראים לדירוג "טעם" כדי לא לקרוא לו "דירוג". כל השש, אני מנחשת, דירגו את השקטים מעל הרועשים, וכולן הרגישו שזה דירוג "נכון". ואני חושבת שזה הממצא: לא שיוקרה שקטה נראית יותר עשירה, אלא שהיא נראית יותר ראויה. ושזאת בדיוק המטרה שלה. שהיא מכרה לנו "ראוי" במחיר של סוודר. ותודה, זה היה הראיון הכי מעניין שהייתי בו, כולל אלה שאני עושה בעצמי בקורס, ואני אומרת את זה גם כי רציתי לראות איך את מגיבה למחמאה. ואת הגבת בדיוק כמו שחשבתי. אז יש לך גם ממצא עלייך.</w:t>
       </w:r>
     </w:p>
     <w:p>

</xml_diff>